<commit_message>
feat(be-71): store tasks with a due and a repeat rule, and make the next one once
V18 adds table task: a due moment or a whole day, open or done, the repeat
rule in rec_* columns, a series id and the place in the series, with CHECKs
for every rule the code keeps. Task is a JPA aggregate; Recurrence becomes an
embeddable with converters for the weekdays and the time zone. TaskService
lists open tasks and those done in the last seven days, creates, renames,
sets the due and rule together, completes and opens again, and deletes, all
scoped to the owner (another user's task is TASK_NOT_FOUND).

Completing a repeating task stores its next occurrence in the same
transaction; next_created keeps done, open again, done again from making it
twice (D-159, found in review).

Co-Authored-By: Claude Opus 5.5 (1M context) <noreply@anthropic.com>
</commit_message>
<xml_diff>
--- a/docs/knowledge/phase-4-planner.docx
+++ b/docs/knowledge/phase-4-planner.docx
@@ -106,7 +106,7 @@
         <w:t xml:space="preserve">openspec/changes/f16-f17-tasks-calendar</w:t>
       </w:r>
       <w:r>
-        <w:t xml:space="preserve"> (việc cần làm có hạn và lặp lại, lịch hẹn, xem lịch theo khoảng ngày; chưa có nhắc nhở, chưa gắn tin nhắn): BE-70.</w:t>
+        <w:t xml:space="preserve"> (việc cần làm có hạn và lặp lại, lịch hẹn, xem lịch theo khoảng ngày; chưa có nhắc nhở, chưa gắn tin nhắn): BE-70, BE-71.</w:t>
         <w:br/>
       </w:r>
       <w:r>
@@ -500,6 +500,28 @@
             </w:r>
             <w:r>
               <w:t xml:space="preserve"> của canvas</w:t>
+            </w:r>
+          </w:p>
+        </w:tc>
+      </w:tr>
+      <w:tr>
+        <w:tc>
+          <w:tcPr>
+            <w:tcW w:w="4680" w:type="dxa"/>
+          </w:tcPr>
+          <w:p>
+            <w:r>
+              <w:t xml:space="preserve">D-159</w:t>
+            </w:r>
+          </w:p>
+        </w:tc>
+        <w:tc>
+          <w:tcPr>
+            <w:tcW w:w="4680" w:type="dxa"/>
+          </w:tcPr>
+          <w:p>
+            <w:r>
+              <w:t xml:space="preserve">Một việc sinh lần kế tiếp đúng một lần (sửa lỗi review BE-71)</w:t>
             </w:r>
           </w:p>
         </w:tc>
@@ -2165,6 +2187,1493 @@
       </w:r>
       <w:r>
         <w:t xml:space="preserve">).</w:t>
+      </w:r>
+    </w:p>
+    <w:p>
+      <w:pPr>
+        <w:pBdr>
+          <w:bottom w:val="single" w:sz="4" w:space="0" w:color="auto"/>
+        </w:pBdr>
+        <w:ind w:left="0"/>
+      </w:pPr>
+    </w:p>
+    <w:p>
+      <w:pPr>
+        <w:pStyle w:val="Heading2"/>
+      </w:pPr>
+      <w:r>
+        <w:t xml:space="preserve">2. Bảng </w:t>
+      </w:r>
+      <w:r>
+        <w:rPr>
+          <w:rFonts w:ascii="Consolas" w:eastAsia="Consolas" w:hAnsi="Consolas" w:cs="Consolas"/>
+        </w:rPr>
+        <w:t xml:space="preserve">task</w:t>
+      </w:r>
+      <w:r>
+        <w:t xml:space="preserve"> và </w:t>
+      </w:r>
+      <w:r>
+        <w:rPr>
+          <w:rFonts w:ascii="Consolas" w:eastAsia="Consolas" w:hAnsi="Consolas" w:cs="Consolas"/>
+        </w:rPr>
+        <w:t xml:space="preserve">TaskService</w:t>
+      </w:r>
+      <w:r>
+        <w:t xml:space="preserve"> (BE-71)</w:t>
+      </w:r>
+    </w:p>
+    <w:p>
+      <w:r>
+        <w:rPr>
+          <w:b/>
+          <w:bCs/>
+        </w:rPr>
+        <w:t xml:space="preserve">Ở đâu:</w:t>
+      </w:r>
+      <w:r>
+        <w:t xml:space="preserve"> migration </w:t>
+      </w:r>
+      <w:r>
+        <w:rPr>
+          <w:rFonts w:ascii="Consolas" w:eastAsia="Consolas" w:hAnsi="Consolas" w:cs="Consolas"/>
+        </w:rPr>
+        <w:t xml:space="preserve">V18__planner_create_task.sql</w:t>
+      </w:r>
+      <w:r>
+        <w:t xml:space="preserve">; </w:t>
+      </w:r>
+      <w:r>
+        <w:rPr>
+          <w:rFonts w:ascii="Consolas" w:eastAsia="Consolas" w:hAnsi="Consolas" w:cs="Consolas"/>
+        </w:rPr>
+        <w:t xml:space="preserve">planner/domain/Task</w:t>
+      </w:r>
+      <w:r>
+        <w:t xml:space="preserve">, </w:t>
+      </w:r>
+      <w:r>
+        <w:rPr>
+          <w:rFonts w:ascii="Consolas" w:eastAsia="Consolas" w:hAnsi="Consolas" w:cs="Consolas"/>
+        </w:rPr>
+        <w:t xml:space="preserve">Due</w:t>
+      </w:r>
+      <w:r>
+        <w:t xml:space="preserve">, </w:t>
+      </w:r>
+      <w:r>
+        <w:rPr>
+          <w:rFonts w:ascii="Consolas" w:eastAsia="Consolas" w:hAnsi="Consolas" w:cs="Consolas"/>
+        </w:rPr>
+        <w:t xml:space="preserve">TaskStatus</w:t>
+      </w:r>
+      <w:r>
+        <w:t xml:space="preserve">, </w:t>
+      </w:r>
+      <w:r>
+        <w:rPr>
+          <w:rFonts w:ascii="Consolas" w:eastAsia="Consolas" w:hAnsi="Consolas" w:cs="Consolas"/>
+        </w:rPr>
+        <w:t xml:space="preserve">WeekdaysConverter</w:t>
+      </w:r>
+      <w:r>
+        <w:t xml:space="preserve">, </w:t>
+      </w:r>
+      <w:r>
+        <w:rPr>
+          <w:rFonts w:ascii="Consolas" w:eastAsia="Consolas" w:hAnsi="Consolas" w:cs="Consolas"/>
+        </w:rPr>
+        <w:t xml:space="preserve">ZoneIdConverter</w:t>
+      </w:r>
+      <w:r>
+        <w:t xml:space="preserve"> (và chú thích JPA trên </w:t>
+      </w:r>
+      <w:r>
+        <w:rPr>
+          <w:rFonts w:ascii="Consolas" w:eastAsia="Consolas" w:hAnsi="Consolas" w:cs="Consolas"/>
+        </w:rPr>
+        <w:t xml:space="preserve">Recurrence</w:t>
+      </w:r>
+      <w:r>
+        <w:t xml:space="preserve">); </w:t>
+      </w:r>
+      <w:r>
+        <w:rPr>
+          <w:rFonts w:ascii="Consolas" w:eastAsia="Consolas" w:hAnsi="Consolas" w:cs="Consolas"/>
+        </w:rPr>
+        <w:t xml:space="preserve">planner/infrastructure/TaskRepository</w:t>
+      </w:r>
+      <w:r>
+        <w:t xml:space="preserve">; </w:t>
+      </w:r>
+      <w:r>
+        <w:rPr>
+          <w:rFonts w:ascii="Consolas" w:eastAsia="Consolas" w:hAnsi="Consolas" w:cs="Consolas"/>
+        </w:rPr>
+        <w:t xml:space="preserve">planner/application/TaskService</w:t>
+      </w:r>
+      <w:r>
+        <w:t xml:space="preserve">, </w:t>
+      </w:r>
+      <w:r>
+        <w:rPr>
+          <w:rFonts w:ascii="Consolas" w:eastAsia="Consolas" w:hAnsi="Consolas" w:cs="Consolas"/>
+        </w:rPr>
+        <w:t xml:space="preserve">NewTask</w:t>
+      </w:r>
+      <w:r>
+        <w:t xml:space="preserve">, </w:t>
+      </w:r>
+      <w:r>
+        <w:rPr>
+          <w:rFonts w:ascii="Consolas" w:eastAsia="Consolas" w:hAnsi="Consolas" w:cs="Consolas"/>
+        </w:rPr>
+        <w:t xml:space="preserve">RepeatRule</w:t>
+      </w:r>
+      <w:r>
+        <w:t xml:space="preserve">, </w:t>
+      </w:r>
+      <w:r>
+        <w:rPr>
+          <w:rFonts w:ascii="Consolas" w:eastAsia="Consolas" w:hAnsi="Consolas" w:cs="Consolas"/>
+        </w:rPr>
+        <w:t xml:space="preserve">CompletedTask</w:t>
+      </w:r>
+      <w:r>
+        <w:t xml:space="preserve">.</w:t>
+      </w:r>
+    </w:p>
+    <w:p>
+      <w:pPr>
+        <w:shd w:val="clear" w:color="auto" w:fill="F2F3F5"/>
+        <w:ind w:left="0"/>
+      </w:pPr>
+      <w:r>
+        <w:rPr>
+          <w:rFonts w:ascii="Consolas" w:eastAsia="Consolas" w:hAnsi="Consolas" w:cs="Consolas"/>
+          <w:sz w:val="19"/>
+          <w:szCs w:val="19"/>
+        </w:rPr>
+        <w:t xml:space="preserve">TaskService (mọi hàm nhận ownerId từ web, việc của người khác = TASK_NOT_FOUND)</w:t>
+        <w:br/>
+        <w:t xml:space="preserve">  list(owner)                    việc OPEN + việc DONE trong 7 ngày, cũ trước</w:t>
+        <w:br/>
+        <w:t xml:space="preserve">  create(owner, NewTask)         lưu; có quy tắc lặp thì chuỗi mang ID của chính việc này</w:t>
+        <w:br/>
+        <w:t xml:space="preserve">  update(owner, id, title, notes)  null = giữ nguyên</w:t>
+        <w:br/>
+        <w:t xml:space="preserve">  schedule(owner, id, due, rule) thay cả hạn lẫn quy tắc (D-153)</w:t>
+        <w:br/>
+        <w:t xml:space="preserve">  complete(owner, id)            DONE + lưu lần kế tiếp trong CÙNG transaction</w:t>
+        <w:br/>
+        <w:t xml:space="preserve">  reopen(owner, id)              OPEN lại; lần kế tiếp đã tạo vẫn còn (D-154)</w:t>
+        <w:br/>
+        <w:t xml:space="preserve">  delete(owner, id)              chỉ hàng đó</w:t>
+      </w:r>
+    </w:p>
+    <w:p>
+      <w:pPr>
+        <w:pStyle w:val="Heading3"/>
+      </w:pPr>
+      <w:r>
+        <w:t xml:space="preserve">2.1 Quy tắc lặp nằm ngay trong hàng: </w:t>
+      </w:r>
+      <w:r>
+        <w:rPr>
+          <w:rFonts w:ascii="Consolas" w:eastAsia="Consolas" w:hAnsi="Consolas" w:cs="Consolas"/>
+        </w:rPr>
+        <w:t xml:space="preserve">@Embeddable</w:t>
+      </w:r>
+      <w:r>
+        <w:t xml:space="preserve"> record</w:t>
+      </w:r>
+    </w:p>
+    <w:p>
+      <w:r>
+        <w:rPr>
+          <w:rFonts w:ascii="Consolas" w:eastAsia="Consolas" w:hAnsi="Consolas" w:cs="Consolas"/>
+        </w:rPr>
+        <w:t xml:space="preserve">Recurrence</w:t>
+      </w:r>
+      <w:r>
+        <w:t xml:space="preserve"> của BE-70 giờ có thêm chú thích JPA và trở thành một </w:t>
+      </w:r>
+      <w:r>
+        <w:rPr>
+          <w:b/>
+          <w:bCs/>
+        </w:rPr>
+        <w:t xml:space="preserve">embeddable</w:t>
+      </w:r>
+      <w:r>
+        <w:t xml:space="preserve">: không có bảng riêng, các trường của nó là các cột </w:t>
+      </w:r>
+      <w:r>
+        <w:rPr>
+          <w:rFonts w:ascii="Consolas" w:eastAsia="Consolas" w:hAnsi="Consolas" w:cs="Consolas"/>
+        </w:rPr>
+        <w:t xml:space="preserve">rec_*</w:t>
+      </w:r>
+      <w:r>
+        <w:t xml:space="preserve"> của bảng </w:t>
+      </w:r>
+      <w:r>
+        <w:rPr>
+          <w:rFonts w:ascii="Consolas" w:eastAsia="Consolas" w:hAnsi="Consolas" w:cs="Consolas"/>
+        </w:rPr>
+        <w:t xml:space="preserve">task</w:t>
+      </w:r>
+      <w:r>
+        <w:t xml:space="preserve"> (D-152). Trong </w:t>
+      </w:r>
+      <w:r>
+        <w:rPr>
+          <w:rFonts w:ascii="Consolas" w:eastAsia="Consolas" w:hAnsi="Consolas" w:cs="Consolas"/>
+        </w:rPr>
+        <w:t xml:space="preserve">Task</w:t>
+      </w:r>
+      <w:r>
+        <w:t xml:space="preserve"> chỉ cần:</w:t>
+      </w:r>
+    </w:p>
+    <w:p>
+      <w:pPr>
+        <w:shd w:val="clear" w:color="auto" w:fill="F2F3F5"/>
+        <w:ind w:left="0"/>
+      </w:pPr>
+      <w:r>
+        <w:rPr>
+          <w:rFonts w:ascii="Consolas" w:eastAsia="Consolas" w:hAnsi="Consolas" w:cs="Consolas"/>
+          <w:sz w:val="19"/>
+          <w:szCs w:val="19"/>
+        </w:rPr>
+        <w:t xml:space="preserve">@Embedded</w:t>
+        <w:br/>
+        <w:t xml:space="preserve">private Recurrence recurrence;</w:t>
+      </w:r>
+    </w:p>
+    <w:p>
+      <w:r>
+        <w:t xml:space="preserve">Hibernate 7 dựng được một </w:t>
+      </w:r>
+      <w:r>
+        <w:rPr>
+          <w:rFonts w:ascii="Consolas" w:eastAsia="Consolas" w:hAnsi="Consolas" w:cs="Consolas"/>
+        </w:rPr>
+        <w:t xml:space="preserve">record</w:t>
+      </w:r>
+      <w:r>
+        <w:t xml:space="preserve"> (gọi constructor đầy đủ của record). Khi </w:t>
+      </w:r>
+      <w:r>
+        <w:rPr>
+          <w:b/>
+          <w:bCs/>
+        </w:rPr>
+        <w:t xml:space="preserve">mọi</w:t>
+      </w:r>
+      <w:r>
+        <w:t xml:space="preserve"> cột </w:t>
+      </w:r>
+      <w:r>
+        <w:rPr>
+          <w:rFonts w:ascii="Consolas" w:eastAsia="Consolas" w:hAnsi="Consolas" w:cs="Consolas"/>
+        </w:rPr>
+        <w:t xml:space="preserve">rec_*</w:t>
+      </w:r>
+      <w:r>
+        <w:t xml:space="preserve"> đều trống, Hibernate trả </w:t>
+      </w:r>
+      <w:r>
+        <w:rPr>
+          <w:rFonts w:ascii="Consolas" w:eastAsia="Consolas" w:hAnsi="Consolas" w:cs="Consolas"/>
+        </w:rPr>
+        <w:t xml:space="preserve">recurrence = null</w:t>
+      </w:r>
+      <w:r>
+        <w:t xml:space="preserve">: đó là "việc không lặp".</w:t>
+      </w:r>
+    </w:p>
+    <w:p>
+      <w:r>
+        <w:t xml:space="preserve">Hai kiểu Java không có sẵn cột tương ứng nên cần </w:t>
+      </w:r>
+      <w:r>
+        <w:rPr>
+          <w:b/>
+          <w:bCs/>
+        </w:rPr>
+        <w:t xml:space="preserve">converter</w:t>
+      </w:r>
+      <w:r>
+        <w:t xml:space="preserve"> (</w:t>
+      </w:r>
+      <w:r>
+        <w:rPr>
+          <w:rFonts w:ascii="Consolas" w:eastAsia="Consolas" w:hAnsi="Consolas" w:cs="Consolas"/>
+        </w:rPr>
+        <w:t xml:space="preserve">AttributeConverter</w:t>
+      </w:r>
+      <w:r>
+        <w:t xml:space="preserve">):</w:t>
+      </w:r>
+    </w:p>
+    <w:tbl>
+      <w:tblPr>
+        <w:tblW w:w="9360" w:type="dxa"/>
+        <w:tblBorders>
+          <w:top w:val="single" w:sz="4" w:space="0" w:color="auto"/>
+          <w:left w:val="single" w:sz="4" w:space="0" w:color="auto"/>
+          <w:bottom w:val="single" w:sz="4" w:space="0" w:color="auto"/>
+          <w:right w:val="single" w:sz="4" w:space="0" w:color="auto"/>
+          <w:insideH w:val="single" w:sz="4" w:space="0" w:color="auto"/>
+          <w:insideV w:val="single" w:sz="4" w:space="0" w:color="auto"/>
+        </w:tblBorders>
+        <w:tblLayout w:type="fixed"/>
+      </w:tblPr>
+      <w:tblGrid>
+        <w:gridCol w:w="3120"/>
+        <w:gridCol w:w="3120"/>
+        <w:gridCol w:w="3120"/>
+      </w:tblGrid>
+      <w:tr>
+        <w:tc>
+          <w:tcPr>
+            <w:tcW w:w="3120" w:type="dxa"/>
+            <w:shd w:val="clear" w:color="auto" w:fill="F2F2F2"/>
+          </w:tcPr>
+          <w:p>
+            <w:r>
+              <w:t xml:space="preserve">Kiểu Java</w:t>
+            </w:r>
+          </w:p>
+        </w:tc>
+        <w:tc>
+          <w:tcPr>
+            <w:tcW w:w="3120" w:type="dxa"/>
+            <w:shd w:val="clear" w:color="auto" w:fill="F2F2F2"/>
+          </w:tcPr>
+          <w:p>
+            <w:r>
+              <w:t xml:space="preserve">Cột</w:t>
+            </w:r>
+          </w:p>
+        </w:tc>
+        <w:tc>
+          <w:tcPr>
+            <w:tcW w:w="3120" w:type="dxa"/>
+            <w:shd w:val="clear" w:color="auto" w:fill="F2F2F2"/>
+          </w:tcPr>
+          <w:p>
+            <w:r>
+              <w:t xml:space="preserve">Ví dụ</w:t>
+            </w:r>
+          </w:p>
+        </w:tc>
+      </w:tr>
+      <w:tr>
+        <w:tc>
+          <w:tcPr>
+            <w:tcW w:w="3120" w:type="dxa"/>
+          </w:tcPr>
+          <w:p>
+            <w:r>
+              <w:rPr>
+                <w:rFonts w:ascii="Consolas" w:eastAsia="Consolas" w:hAnsi="Consolas" w:cs="Consolas"/>
+              </w:rPr>
+              <w:t xml:space="preserve">Set&lt;DayOfWeek&gt;</w:t>
+            </w:r>
+          </w:p>
+        </w:tc>
+        <w:tc>
+          <w:tcPr>
+            <w:tcW w:w="3120" w:type="dxa"/>
+          </w:tcPr>
+          <w:p>
+            <w:r>
+              <w:rPr>
+                <w:rFonts w:ascii="Consolas" w:eastAsia="Consolas" w:hAnsi="Consolas" w:cs="Consolas"/>
+              </w:rPr>
+              <w:t xml:space="preserve">rec_by_weekdays varchar</w:t>
+            </w:r>
+          </w:p>
+        </w:tc>
+        <w:tc>
+          <w:tcPr>
+            <w:tcW w:w="3120" w:type="dxa"/>
+          </w:tcPr>
+          <w:p>
+            <w:r>
+              <w:rPr>
+                <w:rFonts w:ascii="Consolas" w:eastAsia="Consolas" w:hAnsi="Consolas" w:cs="Consolas"/>
+              </w:rPr>
+              <w:t xml:space="preserve">MONDAY,THURSDAY</w:t>
+            </w:r>
+          </w:p>
+        </w:tc>
+      </w:tr>
+      <w:tr>
+        <w:tc>
+          <w:tcPr>
+            <w:tcW w:w="3120" w:type="dxa"/>
+          </w:tcPr>
+          <w:p>
+            <w:r>
+              <w:rPr>
+                <w:rFonts w:ascii="Consolas" w:eastAsia="Consolas" w:hAnsi="Consolas" w:cs="Consolas"/>
+              </w:rPr>
+              <w:t xml:space="preserve">ZoneId</w:t>
+            </w:r>
+          </w:p>
+        </w:tc>
+        <w:tc>
+          <w:tcPr>
+            <w:tcW w:w="3120" w:type="dxa"/>
+          </w:tcPr>
+          <w:p>
+            <w:r>
+              <w:rPr>
+                <w:rFonts w:ascii="Consolas" w:eastAsia="Consolas" w:hAnsi="Consolas" w:cs="Consolas"/>
+              </w:rPr>
+              <w:t xml:space="preserve">rec_time_zone varchar</w:t>
+            </w:r>
+          </w:p>
+        </w:tc>
+        <w:tc>
+          <w:tcPr>
+            <w:tcW w:w="3120" w:type="dxa"/>
+          </w:tcPr>
+          <w:p>
+            <w:r>
+              <w:rPr>
+                <w:rFonts w:ascii="Consolas" w:eastAsia="Consolas" w:hAnsi="Consolas" w:cs="Consolas"/>
+              </w:rPr>
+              <w:t xml:space="preserve">Asia/Ho_Chi_Minh</w:t>
+            </w:r>
+          </w:p>
+        </w:tc>
+      </w:tr>
+    </w:tbl>
+    <w:p>
+      <w:r>
+        <w:t xml:space="preserve">Bẫy: converter của các thứ trả </w:t>
+      </w:r>
+      <w:r>
+        <w:rPr>
+          <w:rFonts w:ascii="Consolas" w:eastAsia="Consolas" w:hAnsi="Consolas" w:cs="Consolas"/>
+        </w:rPr>
+        <w:t xml:space="preserve">null</w:t>
+      </w:r>
+      <w:r>
+        <w:t xml:space="preserve"> cho tập rỗng, không trả chuỗi rỗng. Nếu trả </w:t>
+      </w:r>
+      <w:r>
+        <w:rPr>
+          <w:rFonts w:ascii="Consolas" w:eastAsia="Consolas" w:hAnsi="Consolas" w:cs="Consolas"/>
+        </w:rPr>
+        <w:t xml:space="preserve">""</w:t>
+      </w:r>
+      <w:r>
+        <w:t xml:space="preserve"> thì một việc không lặp sẽ có một cột </w:t>
+      </w:r>
+      <w:r>
+        <w:rPr>
+          <w:rFonts w:ascii="Consolas" w:eastAsia="Consolas" w:hAnsi="Consolas" w:cs="Consolas"/>
+        </w:rPr>
+        <w:t xml:space="preserve">rec_*</w:t>
+      </w:r>
+      <w:r>
+        <w:t xml:space="preserve"> không trống; Hibernate khi đọc lại sẽ cố dựng </w:t>
+      </w:r>
+      <w:r>
+        <w:rPr>
+          <w:rFonts w:ascii="Consolas" w:eastAsia="Consolas" w:hAnsi="Consolas" w:cs="Consolas"/>
+        </w:rPr>
+        <w:t xml:space="preserve">Recurrence</w:t>
+      </w:r>
+      <w:r>
+        <w:t xml:space="preserve"> với tần suất </w:t>
+      </w:r>
+      <w:r>
+        <w:rPr>
+          <w:rFonts w:ascii="Consolas" w:eastAsia="Consolas" w:hAnsi="Consolas" w:cs="Consolas"/>
+        </w:rPr>
+        <w:t xml:space="preserve">null</w:t>
+      </w:r>
+      <w:r>
+        <w:t xml:space="preserve"> và constructor ném lỗi.</w:t>
+      </w:r>
+    </w:p>
+    <w:p>
+      <w:pPr>
+        <w:pStyle w:val="Heading3"/>
+      </w:pPr>
+      <w:r>
+        <w:t xml:space="preserve">2.2 Ràng buộc ở cả Java lẫn database</w:t>
+      </w:r>
+    </w:p>
+    <w:p>
+      <w:r>
+        <w:t xml:space="preserve">Java kiểm khi tạo object (</w:t>
+      </w:r>
+      <w:r>
+        <w:rPr>
+          <w:rFonts w:ascii="Consolas" w:eastAsia="Consolas" w:hAnsi="Consolas" w:cs="Consolas"/>
+        </w:rPr>
+        <w:t xml:space="preserve">Task.create</w:t>
+      </w:r>
+      <w:r>
+        <w:t xml:space="preserve">, constructor của </w:t>
+      </w:r>
+      <w:r>
+        <w:rPr>
+          <w:rFonts w:ascii="Consolas" w:eastAsia="Consolas" w:hAnsi="Consolas" w:cs="Consolas"/>
+        </w:rPr>
+        <w:t xml:space="preserve">Recurrence</w:t>
+      </w:r>
+      <w:r>
+        <w:t xml:space="preserve">), còn database kiểm bằng </w:t>
+      </w:r>
+      <w:r>
+        <w:rPr>
+          <w:rFonts w:ascii="Consolas" w:eastAsia="Consolas" w:hAnsi="Consolas" w:cs="Consolas"/>
+        </w:rPr>
+        <w:t xml:space="preserve">CHECK</w:t>
+      </w:r>
+      <w:r>
+        <w:t xml:space="preserve">. Hai lớp đều cần: Java báo lỗi sớm và rõ, còn database chặn mọi đường ghi khác (SQL viết tay, một lỗi lập trình sau này).</w:t>
+      </w:r>
+    </w:p>
+    <w:p>
+      <w:pPr>
+        <w:shd w:val="clear" w:color="auto" w:fill="F2F3F5"/>
+        <w:ind w:left="0"/>
+      </w:pPr>
+      <w:r>
+        <w:rPr>
+          <w:rFonts w:ascii="Consolas" w:eastAsia="Consolas" w:hAnsi="Consolas" w:cs="Consolas"/>
+          <w:sz w:val="19"/>
+          <w:szCs w:val="19"/>
+        </w:rPr>
+        <w:t xml:space="preserve">CHECK (due_at IS NULL OR due_date IS NULL)                  -- không có cả hai kiểu hạn</w:t>
+        <w:br/>
+        <w:t xml:space="preserve">CHECK ((status = 'DONE') = (completed_at IS NOT NULL))      -- xong &lt;=&gt; có lúc xong</w:t>
+        <w:br/>
+        <w:t xml:space="preserve">CHECK ( (mọi rec_* trống) OR (rec_freq, rec_interval, rec_time_zone có đủ, có hạn, ...) )</w:t>
+      </w:r>
+    </w:p>
+    <w:p>
+      <w:r>
+        <w:t xml:space="preserve">Dòng thứ hai so hai biểu thức boolean bằng </w:t>
+      </w:r>
+      <w:r>
+        <w:rPr>
+          <w:rFonts w:ascii="Consolas" w:eastAsia="Consolas" w:hAnsi="Consolas" w:cs="Consolas"/>
+        </w:rPr>
+        <w:t xml:space="preserve">=</w:t>
+      </w:r>
+      <w:r>
+        <w:t xml:space="preserve">: đúng khi cả hai cùng đúng hoặc cùng sai. Bẫy của </w:t>
+      </w:r>
+      <w:r>
+        <w:rPr>
+          <w:rFonts w:ascii="Consolas" w:eastAsia="Consolas" w:hAnsi="Consolas" w:cs="Consolas"/>
+        </w:rPr>
+        <w:t xml:space="preserve">CHECK</w:t>
+      </w:r>
+      <w:r>
+        <w:t xml:space="preserve"> trong SQL: một biểu thức ra </w:t>
+      </w:r>
+      <w:r>
+        <w:rPr>
+          <w:rFonts w:ascii="Consolas" w:eastAsia="Consolas" w:hAnsi="Consolas" w:cs="Consolas"/>
+        </w:rPr>
+        <w:t xml:space="preserve">NULL</w:t>
+      </w:r>
+      <w:r>
+        <w:t xml:space="preserve"> (không biết) được coi là </w:t>
+      </w:r>
+      <w:r>
+        <w:rPr>
+          <w:b/>
+          <w:bCs/>
+        </w:rPr>
+        <w:t xml:space="preserve">qua</w:t>
+      </w:r>
+      <w:r>
+        <w:t xml:space="preserve">. Ví dụ </w:t>
+      </w:r>
+      <w:r>
+        <w:rPr>
+          <w:rFonts w:ascii="Consolas" w:eastAsia="Consolas" w:hAnsi="Consolas" w:cs="Consolas"/>
+        </w:rPr>
+        <w:t xml:space="preserve">rec_freq = 'WEEKLY'</w:t>
+      </w:r>
+      <w:r>
+        <w:t xml:space="preserve"> khi </w:t>
+      </w:r>
+      <w:r>
+        <w:rPr>
+          <w:rFonts w:ascii="Consolas" w:eastAsia="Consolas" w:hAnsi="Consolas" w:cs="Consolas"/>
+        </w:rPr>
+        <w:t xml:space="preserve">rec_freq</w:t>
+      </w:r>
+      <w:r>
+        <w:t xml:space="preserve"> trống cho </w:t>
+      </w:r>
+      <w:r>
+        <w:rPr>
+          <w:rFonts w:ascii="Consolas" w:eastAsia="Consolas" w:hAnsi="Consolas" w:cs="Consolas"/>
+        </w:rPr>
+        <w:t xml:space="preserve">NULL</w:t>
+      </w:r>
+      <w:r>
+        <w:t xml:space="preserve">, nên một ràng buộc viết hớ sẽ không chặn gì. Vì vậy ràng buộc quy tắc lặp tách hẳn nhánh "mọi cột trống" ra trước, các phép so sánh chỉ nằm trong nhánh </w:t>
+      </w:r>
+      <w:r>
+        <w:rPr>
+          <w:rFonts w:ascii="Consolas" w:eastAsia="Consolas" w:hAnsi="Consolas" w:cs="Consolas"/>
+        </w:rPr>
+        <w:t xml:space="preserve">rec_freq</w:t>
+      </w:r>
+      <w:r>
+        <w:t xml:space="preserve"> có giá trị. Test </w:t>
+      </w:r>
+      <w:r>
+        <w:rPr>
+          <w:rFonts w:ascii="Consolas" w:eastAsia="Consolas" w:hAnsi="Consolas" w:cs="Consolas"/>
+        </w:rPr>
+        <w:t xml:space="preserve">theDatabaseRefusesATaskThatBreaksItsRules</w:t>
+      </w:r>
+      <w:r>
+        <w:t xml:space="preserve"> chèn thẳng bằng SQL bốn hàng sai và cả bốn đều bị từ chối.</w:t>
+      </w:r>
+    </w:p>
+    <w:p>
+      <w:r>
+        <w:t xml:space="preserve">Các cột số dùng </w:t>
+      </w:r>
+      <w:r>
+        <w:rPr>
+          <w:rFonts w:ascii="Consolas" w:eastAsia="Consolas" w:hAnsi="Consolas" w:cs="Consolas"/>
+        </w:rPr>
+        <w:t xml:space="preserve">integer</w:t>
+      </w:r>
+      <w:r>
+        <w:t xml:space="preserve">, không </w:t>
+      </w:r>
+      <w:r>
+        <w:rPr>
+          <w:rFonts w:ascii="Consolas" w:eastAsia="Consolas" w:hAnsi="Consolas" w:cs="Consolas"/>
+        </w:rPr>
+        <w:t xml:space="preserve">smallint</w:t>
+      </w:r>
+      <w:r>
+        <w:t xml:space="preserve">: Hibernate chạy với </w:t>
+      </w:r>
+      <w:r>
+        <w:rPr>
+          <w:rFonts w:ascii="Consolas" w:eastAsia="Consolas" w:hAnsi="Consolas" w:cs="Consolas"/>
+        </w:rPr>
+        <w:t xml:space="preserve">ddl-auto: validate</w:t>
+      </w:r>
+      <w:r>
+        <w:t xml:space="preserve">, so kiểu cột với kiểu Java (</w:t>
+      </w:r>
+      <w:r>
+        <w:rPr>
+          <w:rFonts w:ascii="Consolas" w:eastAsia="Consolas" w:hAnsi="Consolas" w:cs="Consolas"/>
+        </w:rPr>
+        <w:t xml:space="preserve">int</w:t>
+      </w:r>
+      <w:r>
+        <w:t xml:space="preserve"> ↔ </w:t>
+      </w:r>
+      <w:r>
+        <w:rPr>
+          <w:rFonts w:ascii="Consolas" w:eastAsia="Consolas" w:hAnsi="Consolas" w:cs="Consolas"/>
+        </w:rPr>
+        <w:t xml:space="preserve">integer</w:t>
+      </w:r>
+      <w:r>
+        <w:t xml:space="preserve">); </w:t>
+      </w:r>
+      <w:r>
+        <w:rPr>
+          <w:rFonts w:ascii="Consolas" w:eastAsia="Consolas" w:hAnsi="Consolas" w:cs="Consolas"/>
+        </w:rPr>
+        <w:t xml:space="preserve">smallint</w:t>
+      </w:r>
+      <w:r>
+        <w:t xml:space="preserve"> sẽ làm ứng dụng không khởi động.</w:t>
+      </w:r>
+    </w:p>
+    <w:p>
+      <w:pPr>
+        <w:pStyle w:val="Heading3"/>
+      </w:pPr>
+      <w:r>
+        <w:t xml:space="preserve">2.3 ID của chuỗi: tạo ngay, không chờ lưu</w:t>
+      </w:r>
+    </w:p>
+    <w:p>
+      <w:r>
+        <w:t xml:space="preserve">Các lần của một việc lặp chung một </w:t>
+      </w:r>
+      <w:r>
+        <w:rPr>
+          <w:rFonts w:ascii="Consolas" w:eastAsia="Consolas" w:hAnsi="Consolas" w:cs="Consolas"/>
+        </w:rPr>
+        <w:t xml:space="preserve">series_id</w:t>
+      </w:r>
+      <w:r>
+        <w:t xml:space="preserve">. Bản đầu tiên đặt nó bằng ID của việc đầu tiên; nhưng ID là UUIDv7 do Hibernate sinh </w:t>
+      </w:r>
+      <w:r>
+        <w:rPr>
+          <w:b/>
+          <w:bCs/>
+        </w:rPr>
+        <w:t xml:space="preserve">lúc lưu</w:t>
+      </w:r>
+      <w:r>
+        <w:t xml:space="preserve">, nên phải lưu trước rồi mới đặt chuỗi, và Hibernate ghi thêm một câu </w:t>
+      </w:r>
+      <w:r>
+        <w:rPr>
+          <w:rFonts w:ascii="Consolas" w:eastAsia="Consolas" w:hAnsi="Consolas" w:cs="Consolas"/>
+        </w:rPr>
+        <w:t xml:space="preserve">UPDATE</w:t>
+      </w:r>
+      <w:r>
+        <w:t xml:space="preserve"> khi commit:</w:t>
+      </w:r>
+    </w:p>
+    <w:p>
+      <w:pPr>
+        <w:shd w:val="clear" w:color="auto" w:fill="F2F3F5"/>
+        <w:ind w:left="0"/>
+      </w:pPr>
+      <w:r>
+        <w:rPr>
+          <w:rFonts w:ascii="Consolas" w:eastAsia="Consolas" w:hAnsi="Consolas" w:cs="Consolas"/>
+          <w:sz w:val="19"/>
+          <w:szCs w:val="19"/>
+        </w:rPr>
+        <w:t xml:space="preserve">INSERT task (..., series_id = NULL, version = 0)</w:t>
+        <w:br/>
+        <w:t xml:space="preserve">UPDATE task SET series_id = &lt;id&gt;, version = 1      &lt;- thừa, và mọi nơi tạo việc phải nhớ gọi bước này</w:t>
+      </w:r>
+    </w:p>
+    <w:p>
+      <w:r>
+        <w:t xml:space="preserve">Review chỉ ra hai cái giá: một câu ghi thừa, và quy tắc "việc lặp luôn có chuỗi" phụ thuộc người gọi có nhớ bước thứ hai hay không. Bản hiện tại tạo </w:t>
+      </w:r>
+      <w:r>
+        <w:rPr>
+          <w:rFonts w:ascii="Consolas" w:eastAsia="Consolas" w:hAnsi="Consolas" w:cs="Consolas"/>
+        </w:rPr>
+        <w:t xml:space="preserve">series_id = UUID.randomUUID()</w:t>
+      </w:r>
+      <w:r>
+        <w:t xml:space="preserve"> ngay trong </w:t>
+      </w:r>
+      <w:r>
+        <w:rPr>
+          <w:rFonts w:ascii="Consolas" w:eastAsia="Consolas" w:hAnsi="Consolas" w:cs="Consolas"/>
+        </w:rPr>
+        <w:t xml:space="preserve">Task</w:t>
+      </w:r>
+      <w:r>
+        <w:t xml:space="preserve"> khi việc có quy tắc lặp lần đầu. Việc tạo chỉ còn một câu </w:t>
+      </w:r>
+      <w:r>
+        <w:rPr>
+          <w:rFonts w:ascii="Consolas" w:eastAsia="Consolas" w:hAnsi="Consolas" w:cs="Consolas"/>
+        </w:rPr>
+        <w:t xml:space="preserve">INSERT</w:t>
+      </w:r>
+      <w:r>
+        <w:t xml:space="preserve"> (test kiểm </w:t>
+      </w:r>
+      <w:r>
+        <w:rPr>
+          <w:rFonts w:ascii="Consolas" w:eastAsia="Consolas" w:hAnsi="Consolas" w:cs="Consolas"/>
+        </w:rPr>
+        <w:t xml:space="preserve">version = 0</w:t>
+      </w:r>
+      <w:r>
+        <w:t xml:space="preserve">), và database giữ quy tắc bằng </w:t>
+      </w:r>
+      <w:r>
+        <w:rPr>
+          <w:rFonts w:ascii="Consolas" w:eastAsia="Consolas" w:hAnsi="Consolas" w:cs="Consolas"/>
+        </w:rPr>
+        <w:t xml:space="preserve">CHECK (rec_freq IS NULL OR series_id IS NOT NULL)</w:t>
+      </w:r>
+      <w:r>
+        <w:t xml:space="preserve">. ID của chuỗi không cần trùng ID của việc nào: web chỉ so hai </w:t>
+      </w:r>
+      <w:r>
+        <w:rPr>
+          <w:rFonts w:ascii="Consolas" w:eastAsia="Consolas" w:hAnsi="Consolas" w:cs="Consolas"/>
+        </w:rPr>
+        <w:t xml:space="preserve">seriesId</w:t>
+      </w:r>
+      <w:r>
+        <w:t xml:space="preserve"> với nhau.</w:t>
+      </w:r>
+    </w:p>
+    <w:p>
+      <w:r>
+        <w:t xml:space="preserve">Cùng lúc, </w:t>
+      </w:r>
+      <w:r>
+        <w:rPr>
+          <w:rFonts w:ascii="Consolas" w:eastAsia="Consolas" w:hAnsi="Consolas" w:cs="Consolas"/>
+        </w:rPr>
+        <w:t xml:space="preserve">Task</w:t>
+      </w:r>
+      <w:r>
+        <w:t xml:space="preserve"> tự gọi </w:t>
+      </w:r>
+      <w:r>
+        <w:rPr>
+          <w:rFonts w:ascii="Consolas" w:eastAsia="Consolas" w:hAnsi="Consolas" w:cs="Consolas"/>
+        </w:rPr>
+        <w:t xml:space="preserve">recurrence.anchoredAt(...)</w:t>
+      </w:r>
+      <w:r>
+        <w:t xml:space="preserve"> khi nhận quy tắc. Không còn đường nào tạo ra một việc mang quy tắc không khớp hạn, kể cả khi sau này có code khác gọi </w:t>
+      </w:r>
+      <w:r>
+        <w:rPr>
+          <w:rFonts w:ascii="Consolas" w:eastAsia="Consolas" w:hAnsi="Consolas" w:cs="Consolas"/>
+        </w:rPr>
+        <w:t xml:space="preserve">Task.create</w:t>
+      </w:r>
+      <w:r>
+        <w:t xml:space="preserve">.</w:t>
+      </w:r>
+    </w:p>
+    <w:p>
+      <w:pPr>
+        <w:pStyle w:val="Heading3"/>
+      </w:pPr>
+      <w:r>
+        <w:t xml:space="preserve">2.4 Vì sao lần kế tiếp phải tạo cùng transaction với việc đánh dấu xong (câu gợi ý của task)</w:t>
+      </w:r>
+    </w:p>
+    <w:p>
+      <w:pPr>
+        <w:shd w:val="clear" w:color="auto" w:fill="F2F3F5"/>
+        <w:ind w:left="0"/>
+      </w:pPr>
+      <w:r>
+        <w:rPr>
+          <w:rFonts w:ascii="Consolas" w:eastAsia="Consolas" w:hAnsi="Consolas" w:cs="Consolas"/>
+          <w:sz w:val="19"/>
+          <w:szCs w:val="19"/>
+        </w:rPr>
+        <w:t xml:space="preserve">một transaction:   DONE việc này  +  INSERT lần kế tiếp   -&gt;  cả hai, hoặc không gì cả</w:t>
+        <w:br/>
+        <w:t xml:space="preserve">hai transaction:   DONE việc này  | (máy sập ở đây) |  INSERT lần kế tiếp</w:t>
+        <w:br/>
+        <w:t xml:space="preserve">                   -&gt; việc đã xong mà chuỗi mất lần sau; bấm "Xong" lại thì việc đã DONE nên không tạo nữa</w:t>
+      </w:r>
+    </w:p>
+    <w:p>
+      <w:r>
+        <w:t xml:space="preserve">Gọi </w:t>
+      </w:r>
+      <w:r>
+        <w:rPr>
+          <w:rFonts w:ascii="Consolas" w:eastAsia="Consolas" w:hAnsi="Consolas" w:cs="Consolas"/>
+        </w:rPr>
+        <w:t xml:space="preserve">complete</w:t>
+      </w:r>
+      <w:r>
+        <w:t xml:space="preserve"> hai lần (mạng chập chờn, bấm hai lần) cũng an toàn:</w:t>
+      </w:r>
+    </w:p>
+    <w:p>
+      <w:pPr>
+        <w:pStyle w:val="ListParagraph"/>
+        <w:numPr>
+          <w:ilvl w:val="0"/>
+          <w:numId w:val="1"/>
+        </w:numPr>
+      </w:pPr>
+      <w:r>
+        <w:t xml:space="preserve">lần sau thấy việc đã </w:t>
+      </w:r>
+      <w:r>
+        <w:rPr>
+          <w:rFonts w:ascii="Consolas" w:eastAsia="Consolas" w:hAnsi="Consolas" w:cs="Consolas"/>
+        </w:rPr>
+        <w:t xml:space="preserve">DONE</w:t>
+      </w:r>
+      <w:r>
+        <w:t xml:space="preserve">, trả </w:t>
+      </w:r>
+      <w:r>
+        <w:rPr>
+          <w:rFonts w:ascii="Consolas" w:eastAsia="Consolas" w:hAnsi="Consolas" w:cs="Consolas"/>
+        </w:rPr>
+        <w:t xml:space="preserve">next = null</w:t>
+      </w:r>
+      <w:r>
+        <w:t xml:space="preserve"> và không tạo gì (test </w:t>
+      </w:r>
+      <w:r>
+        <w:rPr>
+          <w:rFonts w:ascii="Consolas" w:eastAsia="Consolas" w:hAnsi="Consolas" w:cs="Consolas"/>
+        </w:rPr>
+        <w:t xml:space="preserve">completingARepeatingTaskMakesTheNextOccurrenceOnce</w:t>
+      </w:r>
+      <w:r>
+        <w:t xml:space="preserve">);</w:t>
+      </w:r>
+    </w:p>
+    <w:p>
+      <w:pPr>
+        <w:pStyle w:val="ListParagraph"/>
+        <w:numPr>
+          <w:ilvl w:val="0"/>
+          <w:numId w:val="1"/>
+        </w:numPr>
+      </w:pPr>
+      <w:r>
+        <w:t xml:space="preserve">nếu hai request tới </w:t>
+      </w:r>
+      <w:r>
+        <w:rPr>
+          <w:b/>
+          <w:bCs/>
+        </w:rPr>
+        <w:t xml:space="preserve">cùng lúc</w:t>
+      </w:r>
+      <w:r>
+        <w:t xml:space="preserve">, cả hai cùng đọc thấy </w:t>
+      </w:r>
+      <w:r>
+        <w:rPr>
+          <w:rFonts w:ascii="Consolas" w:eastAsia="Consolas" w:hAnsi="Consolas" w:cs="Consolas"/>
+        </w:rPr>
+        <w:t xml:space="preserve">OPEN</w:t>
+      </w:r>
+      <w:r>
+        <w:t xml:space="preserve">; request commit sau sẽ hỏng ở cột </w:t>
+      </w:r>
+      <w:r>
+        <w:rPr>
+          <w:rFonts w:ascii="Consolas" w:eastAsia="Consolas" w:hAnsi="Consolas" w:cs="Consolas"/>
+        </w:rPr>
+        <w:t xml:space="preserve">version</w:t>
+      </w:r>
+      <w:r>
+        <w:t xml:space="preserve"> (khóa lạc quan, </w:t>
+      </w:r>
+      <w:r>
+        <w:rPr>
+          <w:rFonts w:ascii="Consolas" w:eastAsia="Consolas" w:hAnsi="Consolas" w:cs="Consolas"/>
+        </w:rPr>
+        <w:t xml:space="preserve">@Version</w:t>
+      </w:r>
+      <w:r>
+        <w:t xml:space="preserve">) và rollback cả lần kế tiếp nó vừa tạo. Chuỗi vẫn chỉ có một lần kế tiếp.</w:t>
+      </w:r>
+    </w:p>
+    <w:p>
+      <w:pPr>
+        <w:pStyle w:val="Heading3"/>
+      </w:pPr>
+      <w:r>
+        <w:t xml:space="preserve">2.5 Xong, mở lại, xong lần nữa: lỗi review tìm ra (D-159)</w:t>
+      </w:r>
+    </w:p>
+    <w:p>
+      <w:r>
+        <w:t xml:space="preserve">Ô đánh dấu trên web bật / tắt được. Theo D-154, "Mở lại" giữ lần kế tiếp đã tạo. Bản đầu của </w:t>
+      </w:r>
+      <w:r>
+        <w:rPr>
+          <w:rFonts w:ascii="Consolas" w:eastAsia="Consolas" w:hAnsi="Consolas" w:cs="Consolas"/>
+        </w:rPr>
+        <w:t xml:space="preserve">complete</w:t>
+      </w:r>
+      <w:r>
+        <w:t xml:space="preserve"> chỉ chặn trường hợp việc </w:t>
+      </w:r>
+      <w:r>
+        <w:rPr>
+          <w:b/>
+          <w:bCs/>
+        </w:rPr>
+        <w:t xml:space="preserve">đang</w:t>
+      </w:r>
+      <w:r>
+        <w:t xml:space="preserve"> </w:t>
+      </w:r>
+      <w:r>
+        <w:rPr>
+          <w:rFonts w:ascii="Consolas" w:eastAsia="Consolas" w:hAnsi="Consolas" w:cs="Consolas"/>
+        </w:rPr>
+        <w:t xml:space="preserve">DONE</w:t>
+      </w:r>
+      <w:r>
+        <w:t xml:space="preserve">:</w:t>
+      </w:r>
+    </w:p>
+    <w:p>
+      <w:pPr>
+        <w:shd w:val="clear" w:color="auto" w:fill="F2F3F5"/>
+        <w:ind w:left="0"/>
+      </w:pPr>
+      <w:r>
+        <w:rPr>
+          <w:rFonts w:ascii="Consolas" w:eastAsia="Consolas" w:hAnsi="Consolas" w:cs="Consolas"/>
+          <w:sz w:val="19"/>
+          <w:szCs w:val="19"/>
+        </w:rPr>
+        <w:t xml:space="preserve">Xong      -&gt; DONE, tạo lần 12/10                (đúng)</w:t>
+        <w:br/>
+        <w:t xml:space="preserve">Mở lại    -&gt; OPEN, lần 12/10 vẫn còn            (đúng, D-154)</w:t>
+        <w:br/>
+        <w:t xml:space="preserve">Xong      -&gt; việc đang OPEN nên lại tạo lần 12/10  &lt;- trùng; bật tắt thêm thì trùng thêm</w:t>
+      </w:r>
+    </w:p>
+    <w:p>
+      <w:r>
+        <w:t xml:space="preserve">Không có gì ghi lại rằng việc này đã sinh lần kế tiếp. Sửa: cột </w:t>
+      </w:r>
+      <w:r>
+        <w:rPr>
+          <w:rFonts w:ascii="Consolas" w:eastAsia="Consolas" w:hAnsi="Consolas" w:cs="Consolas"/>
+        </w:rPr>
+        <w:t xml:space="preserve">next_created</w:t>
+      </w:r>
+      <w:r>
+        <w:t xml:space="preserve">, thành </w:t>
+      </w:r>
+      <w:r>
+        <w:rPr>
+          <w:rFonts w:ascii="Consolas" w:eastAsia="Consolas" w:hAnsi="Consolas" w:cs="Consolas"/>
+        </w:rPr>
+        <w:t xml:space="preserve">true</w:t>
+      </w:r>
+      <w:r>
+        <w:t xml:space="preserve"> khi tạo lần kế tiếp và không đổi khi mở lại; </w:t>
+      </w:r>
+      <w:r>
+        <w:rPr>
+          <w:rFonts w:ascii="Consolas" w:eastAsia="Consolas" w:hAnsi="Consolas" w:cs="Consolas"/>
+        </w:rPr>
+        <w:t xml:space="preserve">makeNextOccurrence</w:t>
+      </w:r>
+      <w:r>
+        <w:t xml:space="preserve"> thấy </w:t>
+      </w:r>
+      <w:r>
+        <w:rPr>
+          <w:rFonts w:ascii="Consolas" w:eastAsia="Consolas" w:hAnsi="Consolas" w:cs="Consolas"/>
+        </w:rPr>
+        <w:t xml:space="preserve">true</w:t>
+      </w:r>
+      <w:r>
+        <w:t xml:space="preserve"> thì không làm gì. Tên hàm cũng đổi từ </w:t>
+      </w:r>
+      <w:r>
+        <w:rPr>
+          <w:rFonts w:ascii="Consolas" w:eastAsia="Consolas" w:hAnsi="Consolas" w:cs="Consolas"/>
+        </w:rPr>
+        <w:t xml:space="preserve">nextOccurrence</w:t>
+      </w:r>
+      <w:r>
+        <w:t xml:space="preserve"> thành </w:t>
+      </w:r>
+      <w:r>
+        <w:rPr>
+          <w:rFonts w:ascii="Consolas" w:eastAsia="Consolas" w:hAnsi="Consolas" w:cs="Consolas"/>
+        </w:rPr>
+        <w:t xml:space="preserve">makeNextOccurrence</w:t>
+      </w:r>
+      <w:r>
+        <w:t xml:space="preserve">, vì nó </w:t>
+      </w:r>
+      <w:r>
+        <w:rPr>
+          <w:b/>
+          <w:bCs/>
+        </w:rPr>
+        <w:t xml:space="preserve">đổi</w:t>
+      </w:r>
+      <w:r>
+        <w:t xml:space="preserve"> trạng thái chứ không chỉ tính.</w:t>
+      </w:r>
+    </w:p>
+    <w:p>
+      <w:r>
+        <w:t xml:space="preserve">Vì sao không dùng ràng buộc unique </w:t>
+      </w:r>
+      <w:r>
+        <w:rPr>
+          <w:rFonts w:ascii="Consolas" w:eastAsia="Consolas" w:hAnsi="Consolas" w:cs="Consolas"/>
+        </w:rPr>
+        <w:t xml:space="preserve">(series_id, occurrence_index)</w:t>
+      </w:r>
+      <w:r>
+        <w:t xml:space="preserve">: đặt lại quy tắc cho một việc thì </w:t>
+      </w:r>
+      <w:r>
+        <w:rPr>
+          <w:rFonts w:ascii="Consolas" w:eastAsia="Consolas" w:hAnsi="Consolas" w:cs="Consolas"/>
+        </w:rPr>
+        <w:t xml:space="preserve">occurrence_index</w:t>
+      </w:r>
+      <w:r>
+        <w:t xml:space="preserve"> về 0 trong cùng chuỗi, nên hai việc hợp lệ có thể trùng cặp đó.</w:t>
+      </w:r>
+    </w:p>
+    <w:p>
+      <w:pPr>
+        <w:pStyle w:val="Heading3"/>
+      </w:pPr>
+      <w:r>
+        <w:t xml:space="preserve">2.6 Giới hạn đã biết: giờ không tồn tại khi đổi giờ mùa hè</w:t>
+      </w:r>
+    </w:p>
+    <w:p>
+      <w:r>
+        <w:t xml:space="preserve">Lần kế tiếp lấy giờ địa phương từ hạn của lần trước. Nếu giờ đó không có ở ngày mới (02:30 ở Berlin ngày cuối tháng 3, khi đồng hồ nhảy từ 02:00 lên 03:00), </w:t>
+      </w:r>
+      <w:r>
+        <w:rPr>
+          <w:rFonts w:ascii="Consolas" w:eastAsia="Consolas" w:hAnsi="Consolas" w:cs="Consolas"/>
+        </w:rPr>
+        <w:t xml:space="preserve">ZonedDateTime</w:t>
+      </w:r>
+      <w:r>
+        <w:t xml:space="preserve"> đẩy lên 03:30, và vì lần sau chép giờ của lần trước nên giữ luôn 03:30. Lịch hẹn lặp thì không bị, vì mỗi lần tính lại từ mốc. Chấp nhận vì múi giờ của Sino là </w:t>
+      </w:r>
+      <w:r>
+        <w:rPr>
+          <w:rFonts w:ascii="Consolas" w:eastAsia="Consolas" w:hAnsi="Consolas" w:cs="Consolas"/>
+        </w:rPr>
+        <w:t xml:space="preserve">Asia/Ho_Chi_Minh</w:t>
+      </w:r>
+      <w:r>
+        <w:t xml:space="preserve"> (không đổi giờ); Javadoc của </w:t>
+      </w:r>
+      <w:r>
+        <w:rPr>
+          <w:rFonts w:ascii="Consolas" w:eastAsia="Consolas" w:hAnsi="Consolas" w:cs="Consolas"/>
+        </w:rPr>
+        <w:t xml:space="preserve">makeNextOccurrence</w:t>
+      </w:r>
+      <w:r>
+        <w:t xml:space="preserve"> ghi rõ giới hạn này. Review lưu ý một thói quen cần bỏ: Javadoc không được hứa nhiều hơn code làm được ("luôn giữ giờ địa phương" là sai ở ca này).</w:t>
+      </w:r>
+    </w:p>
+    <w:p>
+      <w:pPr>
+        <w:pStyle w:val="Heading3"/>
+      </w:pPr>
+      <w:r>
+        <w:t xml:space="preserve">2.7 Việc của người khác là "không tìm thấy"</w:t>
+      </w:r>
+    </w:p>
+    <w:p>
+      <w:r>
+        <w:t xml:space="preserve">Mọi hàm tìm việc bằng </w:t>
+      </w:r>
+      <w:r>
+        <w:rPr>
+          <w:rFonts w:ascii="Consolas" w:eastAsia="Consolas" w:hAnsi="Consolas" w:cs="Consolas"/>
+        </w:rPr>
+        <w:t xml:space="preserve">findByIdAndOwnerId(id, ownerId)</w:t>
+      </w:r>
+      <w:r>
+        <w:t xml:space="preserve">, không bằng </w:t>
+      </w:r>
+      <w:r>
+        <w:rPr>
+          <w:rFonts w:ascii="Consolas" w:eastAsia="Consolas" w:hAnsi="Consolas" w:cs="Consolas"/>
+        </w:rPr>
+        <w:t xml:space="preserve">findById</w:t>
+      </w:r>
+      <w:r>
+        <w:t xml:space="preserve"> rồi mới so chủ. Việc của người khác và việc không tồn tại cho cùng một lỗi </w:t>
+      </w:r>
+      <w:r>
+        <w:rPr>
+          <w:rFonts w:ascii="Consolas" w:eastAsia="Consolas" w:hAnsi="Consolas" w:cs="Consolas"/>
+        </w:rPr>
+        <w:t xml:space="preserve">TASK_NOT_FOUND</w:t>
+      </w:r>
+      <w:r>
+        <w:t xml:space="preserve"> (sẽ là </w:t>
+      </w:r>
+      <w:r>
+        <w:rPr>
+          <w:rFonts w:ascii="Consolas" w:eastAsia="Consolas" w:hAnsi="Consolas" w:cs="Consolas"/>
+        </w:rPr>
+        <w:t xml:space="preserve">404</w:t>
+      </w:r>
+      <w:r>
+        <w:t xml:space="preserve">), nên không ai dò được ID nào có thật. Cùng cách với </w:t>
+      </w:r>
+      <w:r>
+        <w:rPr>
+          <w:rFonts w:ascii="Consolas" w:eastAsia="Consolas" w:hAnsi="Consolas" w:cs="Consolas"/>
+        </w:rPr>
+        <w:t xml:space="preserve">ACCOUNT_NOT_FOUND</w:t>
+      </w:r>
+      <w:r>
+        <w:t xml:space="preserve"> của F02.</w:t>
+      </w:r>
+    </w:p>
+    <w:p>
+      <w:pPr>
+        <w:pStyle w:val="Heading3"/>
+      </w:pPr>
+      <w:r>
+        <w:t xml:space="preserve">2.8 Test có đồng hồ chỉnh tay và hai transaction</w:t>
+      </w:r>
+    </w:p>
+    <w:p>
+      <w:pPr>
+        <w:pStyle w:val="ListParagraph"/>
+        <w:numPr>
+          <w:ilvl w:val="0"/>
+          <w:numId w:val="1"/>
+        </w:numPr>
+      </w:pPr>
+      <w:r>
+        <w:rPr>
+          <w:rFonts w:ascii="Consolas" w:eastAsia="Consolas" w:hAnsi="Consolas" w:cs="Consolas"/>
+        </w:rPr>
+        <w:t xml:space="preserve">TaskServiceTests</w:t>
+      </w:r>
+      <w:r>
+        <w:t xml:space="preserve"> thay bean </w:t>
+      </w:r>
+      <w:r>
+        <w:rPr>
+          <w:rFonts w:ascii="Consolas" w:eastAsia="Consolas" w:hAnsi="Consolas" w:cs="Consolas"/>
+        </w:rPr>
+        <w:t xml:space="preserve">Clock</w:t>
+      </w:r>
+      <w:r>
+        <w:t xml:space="preserve"> bằng một </w:t>
+      </w:r>
+      <w:r>
+        <w:rPr>
+          <w:rFonts w:ascii="Consolas" w:eastAsia="Consolas" w:hAnsi="Consolas" w:cs="Consolas"/>
+        </w:rPr>
+        <w:t xml:space="preserve">MovableClock</w:t>
+      </w:r>
+      <w:r>
+        <w:t xml:space="preserve"> (</w:t>
+      </w:r>
+      <w:r>
+        <w:rPr>
+          <w:rFonts w:ascii="Consolas" w:eastAsia="Consolas" w:hAnsi="Consolas" w:cs="Consolas"/>
+        </w:rPr>
+        <w:t xml:space="preserve">@Primary</w:t>
+      </w:r>
+      <w:r>
+        <w:t xml:space="preserve">): "xong 8 ngày trước" là đặt đồng hồ lùi 8 ngày rồi gọi </w:t>
+      </w:r>
+      <w:r>
+        <w:rPr>
+          <w:rFonts w:ascii="Consolas" w:eastAsia="Consolas" w:hAnsi="Consolas" w:cs="Consolas"/>
+        </w:rPr>
+        <w:t xml:space="preserve">complete</w:t>
+      </w:r>
+      <w:r>
+        <w:t xml:space="preserve">, không cần chờ hay sửa database.</w:t>
+      </w:r>
+    </w:p>
+    <w:p>
+      <w:pPr>
+        <w:pStyle w:val="ListParagraph"/>
+        <w:numPr>
+          <w:ilvl w:val="0"/>
+          <w:numId w:val="1"/>
+        </w:numPr>
+      </w:pPr>
+      <w:r>
+        <w:t xml:space="preserve">Test khóa lạc quan cần </w:t>
+      </w:r>
+      <w:r>
+        <w:rPr>
+          <w:b/>
+          <w:bCs/>
+        </w:rPr>
+        <w:t xml:space="preserve">hai</w:t>
+      </w:r>
+      <w:r>
+        <w:t xml:space="preserve"> transaction thật. Gọi </w:t>
+      </w:r>
+      <w:r>
+        <w:rPr>
+          <w:rFonts w:ascii="Consolas" w:eastAsia="Consolas" w:hAnsi="Consolas" w:cs="Consolas"/>
+        </w:rPr>
+        <w:t xml:space="preserve">service.update(...)</w:t>
+      </w:r>
+      <w:r>
+        <w:t xml:space="preserve"> ngay trong transaction của test sẽ không đủ: </w:t>
+      </w:r>
+      <w:r>
+        <w:rPr>
+          <w:rFonts w:ascii="Consolas" w:eastAsia="Consolas" w:hAnsi="Consolas" w:cs="Consolas"/>
+        </w:rPr>
+        <w:t xml:space="preserve">@Transactional</w:t>
+      </w:r>
+      <w:r>
+        <w:t xml:space="preserve"> mặc định </w:t>
+      </w:r>
+      <w:r>
+        <w:rPr>
+          <w:i/>
+          <w:iCs/>
+        </w:rPr>
+        <w:t xml:space="preserve">tham gia</w:t>
+      </w:r>
+      <w:r>
+        <w:t xml:space="preserve"> transaction đang có (</w:t>
+      </w:r>
+      <w:r>
+        <w:rPr>
+          <w:rFonts w:ascii="Consolas" w:eastAsia="Consolas" w:hAnsi="Consolas" w:cs="Consolas"/>
+        </w:rPr>
+        <w:t xml:space="preserve">REQUIRED</w:t>
+      </w:r>
+      <w:r>
+        <w:t xml:space="preserve">), nên hai lần đọc là cùng một object và không có xung đột nào. Test chạy lần sửa thứ hai trên một luồng khác (</w:t>
+      </w:r>
+      <w:r>
+        <w:rPr>
+          <w:rFonts w:ascii="Consolas" w:eastAsia="Consolas" w:hAnsi="Consolas" w:cs="Consolas"/>
+        </w:rPr>
+        <w:t xml:space="preserve">CompletableFuture.runAsync</w:t>
+      </w:r>
+      <w:r>
+        <w:t xml:space="preserve">), luồng đó có transaction riêng và commit trước; transaction của test ghi sau thì nhận </w:t>
+      </w:r>
+      <w:r>
+        <w:rPr>
+          <w:rFonts w:ascii="Consolas" w:eastAsia="Consolas" w:hAnsi="Consolas" w:cs="Consolas"/>
+        </w:rPr>
+        <w:t xml:space="preserve">OptimisticLockingFailureException</w:t>
+      </w:r>
+      <w:r>
+        <w:t xml:space="preserve">.</w:t>
+      </w:r>
+    </w:p>
+    <w:p>
+      <w:pPr>
+        <w:pStyle w:val="Heading3"/>
+      </w:pPr>
+      <w:r>
+        <w:t xml:space="preserve">2.9 Kiểm chứng (BE-71)</w:t>
+      </w:r>
+    </w:p>
+    <w:p>
+      <w:pPr>
+        <w:pStyle w:val="ListParagraph"/>
+        <w:numPr>
+          <w:ilvl w:val="0"/>
+          <w:numId w:val="1"/>
+        </w:numPr>
+      </w:pPr>
+      <w:r>
+        <w:t xml:space="preserve">RED: thân rỗng của </w:t>
+      </w:r>
+      <w:r>
+        <w:rPr>
+          <w:rFonts w:ascii="Consolas" w:eastAsia="Consolas" w:hAnsi="Consolas" w:cs="Consolas"/>
+        </w:rPr>
+        <w:t xml:space="preserve">Due</w:t>
+      </w:r>
+      <w:r>
+        <w:t xml:space="preserve">, </w:t>
+      </w:r>
+      <w:r>
+        <w:rPr>
+          <w:rFonts w:ascii="Consolas" w:eastAsia="Consolas" w:hAnsi="Consolas" w:cs="Consolas"/>
+        </w:rPr>
+        <w:t xml:space="preserve">Task</w:t>
+      </w:r>
+      <w:r>
+        <w:t xml:space="preserve">, </w:t>
+      </w:r>
+      <w:r>
+        <w:rPr>
+          <w:rFonts w:ascii="Consolas" w:eastAsia="Consolas" w:hAnsi="Consolas" w:cs="Consolas"/>
+        </w:rPr>
+        <w:t xml:space="preserve">TaskService</w:t>
+      </w:r>
+      <w:r>
+        <w:t xml:space="preserve"> (migration, ánh xạ và repository thật) → 30/31 test đỏ đúng lý do; GREEN ngay lần đầu.</w:t>
+      </w:r>
+    </w:p>
+    <w:p>
+      <w:pPr>
+        <w:pStyle w:val="ListParagraph"/>
+        <w:numPr>
+          <w:ilvl w:val="0"/>
+          <w:numId w:val="1"/>
+        </w:numPr>
+      </w:pPr>
+      <w:r>
+        <w:t xml:space="preserve">Review của agent </w:t>
+      </w:r>
+      <w:r>
+        <w:rPr>
+          <w:rFonts w:ascii="Consolas" w:eastAsia="Consolas" w:hAnsi="Consolas" w:cs="Consolas"/>
+        </w:rPr>
+        <w:t xml:space="preserve">senior-reviewer</w:t>
+      </w:r>
+      <w:r>
+        <w:t xml:space="preserve">: 1 HIGH (mục 2.5, đã sửa), 1 MEDIUM (mục 2.6, chấp nhận và ghi rõ), các LOW sửa phần lớn; 10 test mới đỏ trước khi sửa, xanh sau khi sửa.</w:t>
+      </w:r>
+    </w:p>
+    <w:p>
+      <w:pPr>
+        <w:pStyle w:val="ListParagraph"/>
+        <w:numPr>
+          <w:ilvl w:val="0"/>
+          <w:numId w:val="1"/>
+        </w:numPr>
+      </w:pPr>
+      <w:r>
+        <w:rPr>
+          <w:rFonts w:ascii="Consolas" w:eastAsia="Consolas" w:hAnsi="Consolas" w:cs="Consolas"/>
+        </w:rPr>
+        <w:t xml:space="preserve">./mvnw -B -ntp verify</w:t>
+      </w:r>
+      <w:r>
+        <w:t xml:space="preserve"> trên </w:t>
+      </w:r>
+      <w:r>
+        <w:rPr>
+          <w:rFonts w:ascii="Consolas" w:eastAsia="Consolas" w:hAnsi="Consolas" w:cs="Consolas"/>
+        </w:rPr>
+        <w:t xml:space="preserve">dev</w:t>
+      </w:r>
+      <w:r>
+        <w:t xml:space="preserve"> mới nhất (đã có V17 của F10): 1380 test, 0 lỗi, 4 bỏ qua; </w:t>
+      </w:r>
+      <w:r>
+        <w:rPr>
+          <w:rFonts w:ascii="Consolas" w:eastAsia="Consolas" w:hAnsi="Consolas" w:cs="Consolas"/>
+        </w:rPr>
+        <w:t xml:space="preserve">ModularityTests</w:t>
+      </w:r>
+      <w:r>
+        <w:t xml:space="preserve"> 2/2.</w:t>
       </w:r>
     </w:p>
     <w:p/>

</xml_diff>

<commit_message>
feat(be-72): REST API for tasks
/api/tasks lists the open tasks and those done in the last seven days,
reads one, creates (201 with Location), renames and changes notes (PATCH),
sets the due and the repeat rule together (PUT .../schedule), completes
(with the next occurrence of a repeating task), opens again and deletes.
The JSON follows the web's TaskItem contract; reminder, source and related
stay null for now.

Request bodies are checked with Bean Validation (400 per field, including
the NUL character PostgreSQL refuses); a rule that does not fit its due is
422 INVALID_RECURRENCE; another user's task is 404 TASK_NOT_FOUND.

Co-Authored-By: Claude Opus 5.5 (1M context) <noreply@anthropic.com>
</commit_message>
<xml_diff>
--- a/docs/knowledge/phase-4-planner.docx
+++ b/docs/knowledge/phase-4-planner.docx
@@ -106,7 +106,7 @@
         <w:t xml:space="preserve">openspec/changes/f16-f17-tasks-calendar</w:t>
       </w:r>
       <w:r>
-        <w:t xml:space="preserve"> (việc cần làm có hạn và lặp lại, lịch hẹn, xem lịch theo khoảng ngày; chưa có nhắc nhở, chưa gắn tin nhắn): BE-70, BE-71.</w:t>
+        <w:t xml:space="preserve"> (việc cần làm có hạn và lặp lại, lịch hẹn, xem lịch theo khoảng ngày; chưa có nhắc nhở, chưa gắn tin nhắn): BE-70, BE-71, BE-72.</w:t>
         <w:br/>
       </w:r>
       <w:r>
@@ -3674,6 +3674,1125 @@
       </w:r>
       <w:r>
         <w:t xml:space="preserve"> 2/2.</w:t>
+      </w:r>
+    </w:p>
+    <w:p>
+      <w:pPr>
+        <w:pBdr>
+          <w:bottom w:val="single" w:sz="4" w:space="0" w:color="auto"/>
+        </w:pBdr>
+        <w:ind w:left="0"/>
+      </w:pPr>
+    </w:p>
+    <w:p>
+      <w:pPr>
+        <w:pStyle w:val="Heading2"/>
+      </w:pPr>
+      <w:r>
+        <w:t xml:space="preserve">3. REST </w:t>
+      </w:r>
+      <w:r>
+        <w:rPr>
+          <w:rFonts w:ascii="Consolas" w:eastAsia="Consolas" w:hAnsi="Consolas" w:cs="Consolas"/>
+        </w:rPr>
+        <w:t xml:space="preserve">/api/tasks</w:t>
+      </w:r>
+      <w:r>
+        <w:t xml:space="preserve"> (BE-72)</w:t>
+      </w:r>
+    </w:p>
+    <w:p>
+      <w:r>
+        <w:rPr>
+          <w:b/>
+          <w:bCs/>
+        </w:rPr>
+        <w:t xml:space="preserve">Ở đâu:</w:t>
+      </w:r>
+      <w:r>
+        <w:t xml:space="preserve"> </w:t>
+      </w:r>
+      <w:r>
+        <w:rPr>
+          <w:rFonts w:ascii="Consolas" w:eastAsia="Consolas" w:hAnsi="Consolas" w:cs="Consolas"/>
+        </w:rPr>
+        <w:t xml:space="preserve">planner/api/TasksController</w:t>
+      </w:r>
+      <w:r>
+        <w:t xml:space="preserve">, các record request </w:t>
+      </w:r>
+      <w:r>
+        <w:rPr>
+          <w:rFonts w:ascii="Consolas" w:eastAsia="Consolas" w:hAnsi="Consolas" w:cs="Consolas"/>
+        </w:rPr>
+        <w:t xml:space="preserve">CreateTaskRequest</w:t>
+      </w:r>
+      <w:r>
+        <w:t xml:space="preserve">, </w:t>
+      </w:r>
+      <w:r>
+        <w:rPr>
+          <w:rFonts w:ascii="Consolas" w:eastAsia="Consolas" w:hAnsi="Consolas" w:cs="Consolas"/>
+        </w:rPr>
+        <w:t xml:space="preserve">UpdateTaskRequest</w:t>
+      </w:r>
+      <w:r>
+        <w:t xml:space="preserve">, </w:t>
+      </w:r>
+      <w:r>
+        <w:rPr>
+          <w:rFonts w:ascii="Consolas" w:eastAsia="Consolas" w:hAnsi="Consolas" w:cs="Consolas"/>
+        </w:rPr>
+        <w:t xml:space="preserve">ScheduleRequest</w:t>
+      </w:r>
+      <w:r>
+        <w:t xml:space="preserve">, </w:t>
+      </w:r>
+      <w:r>
+        <w:rPr>
+          <w:rFonts w:ascii="Consolas" w:eastAsia="Consolas" w:hAnsi="Consolas" w:cs="Consolas"/>
+        </w:rPr>
+        <w:t xml:space="preserve">RepeatBody</w:t>
+      </w:r>
+      <w:r>
+        <w:t xml:space="preserve">, record response </w:t>
+      </w:r>
+      <w:r>
+        <w:rPr>
+          <w:rFonts w:ascii="Consolas" w:eastAsia="Consolas" w:hAnsi="Consolas" w:cs="Consolas"/>
+        </w:rPr>
+        <w:t xml:space="preserve">TaskResponse</w:t>
+      </w:r>
+      <w:r>
+        <w:t xml:space="preserve">, hai lớp nhỏ </w:t>
+      </w:r>
+      <w:r>
+        <w:rPr>
+          <w:rFonts w:ascii="Consolas" w:eastAsia="Consolas" w:hAnsi="Consolas" w:cs="Consolas"/>
+        </w:rPr>
+        <w:t xml:space="preserve">Dues</w:t>
+      </w:r>
+      <w:r>
+        <w:t xml:space="preserve">, </w:t>
+      </w:r>
+      <w:r>
+        <w:rPr>
+          <w:rFonts w:ascii="Consolas" w:eastAsia="Consolas" w:hAnsi="Consolas" w:cs="Consolas"/>
+        </w:rPr>
+        <w:t xml:space="preserve">Texts</w:t>
+      </w:r>
+      <w:r>
+        <w:t xml:space="preserve">; README (bảng endpoint).</w:t>
+      </w:r>
+    </w:p>
+    <w:p>
+      <w:pPr>
+        <w:shd w:val="clear" w:color="auto" w:fill="F2F3F5"/>
+        <w:ind w:left="0"/>
+      </w:pPr>
+      <w:r>
+        <w:rPr>
+          <w:rFonts w:ascii="Consolas" w:eastAsia="Consolas" w:hAnsi="Consolas" w:cs="Consolas"/>
+          <w:sz w:val="19"/>
+          <w:szCs w:val="19"/>
+        </w:rPr>
+        <w:t xml:space="preserve">GET    /api/tasks                    -&gt; 200 {generatedAt, tasks}</w:t>
+        <w:br/>
+        <w:t xml:space="preserve">GET    /api/tasks/{id}               -&gt; 200 task</w:t>
+        <w:br/>
+        <w:t xml:space="preserve">POST   /api/tasks                    -&gt; 201 task + Location</w:t>
+        <w:br/>
+        <w:t xml:space="preserve">PATCH  /api/tasks/{id}               -&gt; 200 task          {title?, notes?}</w:t>
+        <w:br/>
+        <w:t xml:space="preserve">PUT    /api/tasks/{id}/schedule      -&gt; 200 task          {dueAt, dueDate, recurrence}</w:t>
+        <w:br/>
+        <w:t xml:space="preserve">POST   /api/tasks/{id}/complete      -&gt; 200 {task, next}</w:t>
+        <w:br/>
+        <w:t xml:space="preserve">POST   /api/tasks/{id}/reopen        -&gt; 200 task</w:t>
+        <w:br/>
+        <w:t xml:space="preserve">DELETE /api/tasks/{id}               -&gt; 204</w:t>
+      </w:r>
+    </w:p>
+    <w:p>
+      <w:r>
+        <w:t xml:space="preserve">Controller chỉ làm ba việc: lấy chủ sở hữu từ </w:t>
+      </w:r>
+      <w:r>
+        <w:rPr>
+          <w:rFonts w:ascii="Consolas" w:eastAsia="Consolas" w:hAnsi="Consolas" w:cs="Consolas"/>
+        </w:rPr>
+        <w:t xml:space="preserve">CurrentUser</w:t>
+      </w:r>
+      <w:r>
+        <w:t xml:space="preserve">, đổi request thành lời gọi </w:t>
+      </w:r>
+      <w:r>
+        <w:rPr>
+          <w:rFonts w:ascii="Consolas" w:eastAsia="Consolas" w:hAnsi="Consolas" w:cs="Consolas"/>
+        </w:rPr>
+        <w:t xml:space="preserve">TaskService</w:t>
+      </w:r>
+      <w:r>
+        <w:t xml:space="preserve">, đổi </w:t>
+      </w:r>
+      <w:r>
+        <w:rPr>
+          <w:rFonts w:ascii="Consolas" w:eastAsia="Consolas" w:hAnsi="Consolas" w:cs="Consolas"/>
+        </w:rPr>
+        <w:t xml:space="preserve">Task</w:t>
+      </w:r>
+      <w:r>
+        <w:t xml:space="preserve"> thành JSON. Không có logic nghiệp vụ nào ở đây.</w:t>
+      </w:r>
+    </w:p>
+    <w:p>
+      <w:pPr>
+        <w:pStyle w:val="Heading3"/>
+      </w:pPr>
+      <w:r>
+        <w:t xml:space="preserve">3.1 Ba lớp kiểm, mỗi lớp một loại lỗi</w:t>
+      </w:r>
+    </w:p>
+    <w:p>
+      <w:pPr>
+        <w:shd w:val="clear" w:color="auto" w:fill="F2F3F5"/>
+        <w:ind w:left="0"/>
+      </w:pPr>
+      <w:r>
+        <w:rPr>
+          <w:rFonts w:ascii="Consolas" w:eastAsia="Consolas" w:hAnsi="Consolas" w:cs="Consolas"/>
+          <w:sz w:val="19"/>
+          <w:szCs w:val="19"/>
+        </w:rPr>
+        <w:t xml:space="preserve">1. Bean Validation trên record request   -&gt; 400 VALIDATION_FAILED, kèm tên ô sai</w:t>
+        <w:br/>
+        <w:t xml:space="preserve">   (tiêu đề rỗng / quá 200, hai kiểu hạn, lặp mà không có hạn, mỗi 0 lần, hằng tuần mà không có thứ...)</w:t>
+        <w:br/>
+        <w:t xml:space="preserve">2. Domain: Recurrence.anchoredAt         -&gt; 422 INVALID_RECURRENCE</w:t>
+        <w:br/>
+        <w:t xml:space="preserve">   (quy tắc không khớp hạn: phải đổi hạn ra ngày theo múi giờ mới biết thứ mấy)</w:t>
+        <w:br/>
+        <w:t xml:space="preserve">3. Database: CHECK của V18                -&gt; chỉ là lưới cuối; API không bao giờ để lỗi rơi tới đây</w:t>
+      </w:r>
+    </w:p>
+    <w:p>
+      <w:r>
+        <w:t xml:space="preserve">Một ràng buộc dính tới </w:t>
+      </w:r>
+      <w:r>
+        <w:rPr>
+          <w:b/>
+          <w:bCs/>
+        </w:rPr>
+        <w:t xml:space="preserve">hai ô</w:t>
+      </w:r>
+      <w:r>
+        <w:t xml:space="preserve"> (ví dụ "có </w:t>
+      </w:r>
+      <w:r>
+        <w:rPr>
+          <w:rFonts w:ascii="Consolas" w:eastAsia="Consolas" w:hAnsi="Consolas" w:cs="Consolas"/>
+        </w:rPr>
+        <w:t xml:space="preserve">untilDate</w:t>
+      </w:r>
+      <w:r>
+        <w:t xml:space="preserve"> thì không có </w:t>
+      </w:r>
+      <w:r>
+        <w:rPr>
+          <w:rFonts w:ascii="Consolas" w:eastAsia="Consolas" w:hAnsi="Consolas" w:cs="Consolas"/>
+        </w:rPr>
+        <w:t xml:space="preserve">count</w:t>
+      </w:r>
+      <w:r>
+        <w:t xml:space="preserve">") viết bằng một hàm </w:t>
+      </w:r>
+      <w:r>
+        <w:rPr>
+          <w:rFonts w:ascii="Consolas" w:eastAsia="Consolas" w:hAnsi="Consolas" w:cs="Consolas"/>
+        </w:rPr>
+        <w:t xml:space="preserve">@AssertTrue</w:t>
+      </w:r>
+      <w:r>
+        <w:t xml:space="preserve"> trong record:</w:t>
+      </w:r>
+    </w:p>
+    <w:p>
+      <w:pPr>
+        <w:shd w:val="clear" w:color="auto" w:fill="F2F3F5"/>
+        <w:ind w:left="0"/>
+      </w:pPr>
+      <w:r>
+        <w:rPr>
+          <w:rFonts w:ascii="Consolas" w:eastAsia="Consolas" w:hAnsi="Consolas" w:cs="Consolas"/>
+          <w:sz w:val="19"/>
+          <w:szCs w:val="19"/>
+        </w:rPr>
+        <w:t xml:space="preserve">@AssertTrue(message = "give untilDate or count, not both")</w:t>
+        <w:br/>
+        <w:t xml:space="preserve">boolean isOneEndAtMost() {</w:t>
+        <w:br/>
+        <w:t xml:space="preserve">    return untilDate == null || count == null;</w:t>
+        <w:br/>
+        <w:t xml:space="preserve">}</w:t>
+      </w:r>
+    </w:p>
+    <w:p>
+      <w:r>
+        <w:t xml:space="preserve">Bean Validation gọi mọi hàm </w:t>
+      </w:r>
+      <w:r>
+        <w:rPr>
+          <w:rFonts w:ascii="Consolas" w:eastAsia="Consolas" w:hAnsi="Consolas" w:cs="Consolas"/>
+        </w:rPr>
+        <w:t xml:space="preserve">isXxx()</w:t>
+      </w:r>
+      <w:r>
+        <w:t xml:space="preserve"> có </w:t>
+      </w:r>
+      <w:r>
+        <w:rPr>
+          <w:rFonts w:ascii="Consolas" w:eastAsia="Consolas" w:hAnsi="Consolas" w:cs="Consolas"/>
+        </w:rPr>
+        <w:t xml:space="preserve">@AssertTrue</w:t>
+      </w:r>
+      <w:r>
+        <w:t xml:space="preserve">; trả </w:t>
+      </w:r>
+      <w:r>
+        <w:rPr>
+          <w:rFonts w:ascii="Consolas" w:eastAsia="Consolas" w:hAnsi="Consolas" w:cs="Consolas"/>
+        </w:rPr>
+        <w:t xml:space="preserve">false</w:t>
+      </w:r>
+      <w:r>
+        <w:t xml:space="preserve"> thì thành một lỗi ở "ô" tên </w:t>
+      </w:r>
+      <w:r>
+        <w:rPr>
+          <w:rFonts w:ascii="Consolas" w:eastAsia="Consolas" w:hAnsi="Consolas" w:cs="Consolas"/>
+        </w:rPr>
+        <w:t xml:space="preserve">oneEndAtMost</w:t>
+      </w:r>
+      <w:r>
+        <w:t xml:space="preserve">. </w:t>
+      </w:r>
+      <w:r>
+        <w:rPr>
+          <w:rFonts w:ascii="Consolas" w:eastAsia="Consolas" w:hAnsi="Consolas" w:cs="Consolas"/>
+        </w:rPr>
+        <w:t xml:space="preserve">RepeatBody</w:t>
+      </w:r>
+      <w:r>
+        <w:t xml:space="preserve"> nằm trong </w:t>
+      </w:r>
+      <w:r>
+        <w:rPr>
+          <w:rFonts w:ascii="Consolas" w:eastAsia="Consolas" w:hAnsi="Consolas" w:cs="Consolas"/>
+        </w:rPr>
+        <w:t xml:space="preserve">CreateTaskRequest</w:t>
+      </w:r>
+      <w:r>
+        <w:t xml:space="preserve"> và có </w:t>
+      </w:r>
+      <w:r>
+        <w:rPr>
+          <w:rFonts w:ascii="Consolas" w:eastAsia="Consolas" w:hAnsi="Consolas" w:cs="Consolas"/>
+        </w:rPr>
+        <w:t xml:space="preserve">@Valid</w:t>
+      </w:r>
+      <w:r>
+        <w:t xml:space="preserve"> đứng trước, nên các ràng buộc của nó cũng được kiểm.</w:t>
+      </w:r>
+    </w:p>
+    <w:p>
+      <w:r>
+        <w:t xml:space="preserve">Bẫy đã gặp lúc viết: </w:t>
+      </w:r>
+      <w:r>
+        <w:rPr>
+          <w:rFonts w:ascii="Consolas" w:eastAsia="Consolas" w:hAnsi="Consolas" w:cs="Consolas"/>
+        </w:rPr>
+        <w:t xml:space="preserve">EnumSet.copyOf(list)</w:t>
+      </w:r>
+      <w:r>
+        <w:t xml:space="preserve"> ném lỗi khi danh sách </w:t>
+      </w:r>
+      <w:r>
+        <w:rPr>
+          <w:b/>
+          <w:bCs/>
+        </w:rPr>
+        <w:t xml:space="preserve">rỗng</w:t>
+      </w:r>
+      <w:r>
+        <w:t xml:space="preserve">. Một quy tắc hằng ngày có thể gửi </w:t>
+      </w:r>
+      <w:r>
+        <w:rPr>
+          <w:rFonts w:ascii="Consolas" w:eastAsia="Consolas" w:hAnsi="Consolas" w:cs="Consolas"/>
+        </w:rPr>
+        <w:t xml:space="preserve">"byWeekdays": []</w:t>
+      </w:r>
+      <w:r>
+        <w:t xml:space="preserve"> (hợp lệ, vì không phải hằng tuần), nên phải đổi danh sách rỗng thành </w:t>
+      </w:r>
+      <w:r>
+        <w:rPr>
+          <w:rFonts w:ascii="Consolas" w:eastAsia="Consolas" w:hAnsi="Consolas" w:cs="Consolas"/>
+        </w:rPr>
+        <w:t xml:space="preserve">null</w:t>
+      </w:r>
+      <w:r>
+        <w:t xml:space="preserve"> trước khi chép.</w:t>
+      </w:r>
+    </w:p>
+    <w:p>
+      <w:pPr>
+        <w:pStyle w:val="Heading3"/>
+      </w:pPr>
+      <w:r>
+        <w:t xml:space="preserve">3.2 Vì sao </w:t>
+      </w:r>
+      <w:r>
+        <w:rPr>
+          <w:rFonts w:ascii="Consolas" w:eastAsia="Consolas" w:hAnsi="Consolas" w:cs="Consolas"/>
+        </w:rPr>
+        <w:t xml:space="preserve">PATCH</w:t>
+      </w:r>
+      <w:r>
+        <w:t xml:space="preserve"> không xóa được hạn mà phải có </w:t>
+      </w:r>
+      <w:r>
+        <w:rPr>
+          <w:rFonts w:ascii="Consolas" w:eastAsia="Consolas" w:hAnsi="Consolas" w:cs="Consolas"/>
+        </w:rPr>
+        <w:t xml:space="preserve">PUT …/schedule</w:t>
+      </w:r>
+      <w:r>
+        <w:t xml:space="preserve"> (câu gợi ý của task)</w:t>
+      </w:r>
+    </w:p>
+    <w:p>
+      <w:r>
+        <w:t xml:space="preserve">Jackson đọc JSON vào record. Với record, hai body dưới đây cho </w:t>
+      </w:r>
+      <w:r>
+        <w:rPr>
+          <w:b/>
+          <w:bCs/>
+        </w:rPr>
+        <w:t xml:space="preserve">cùng một</w:t>
+      </w:r>
+      <w:r>
+        <w:t xml:space="preserve"> object, </w:t>
+      </w:r>
+      <w:r>
+        <w:rPr>
+          <w:rFonts w:ascii="Consolas" w:eastAsia="Consolas" w:hAnsi="Consolas" w:cs="Consolas"/>
+        </w:rPr>
+        <w:t xml:space="preserve">dueAt == null</w:t>
+      </w:r>
+      <w:r>
+        <w:t xml:space="preserve">:</w:t>
+      </w:r>
+    </w:p>
+    <w:p>
+      <w:pPr>
+        <w:shd w:val="clear" w:color="auto" w:fill="F2F3F5"/>
+        <w:ind w:left="0"/>
+      </w:pPr>
+      <w:r>
+        <w:rPr>
+          <w:rFonts w:ascii="Consolas" w:eastAsia="Consolas" w:hAnsi="Consolas" w:cs="Consolas"/>
+          <w:sz w:val="19"/>
+          <w:szCs w:val="19"/>
+        </w:rPr>
+        <w:t xml:space="preserve">{"title": "A"}                    -&gt; UpdateTaskRequest(title = "A", ..., dueAt = null)</w:t>
+        <w:br/>
+        <w:t xml:space="preserve">{"title": "A", "dueAt": null}     -&gt; UpdateTaskRequest(title = "A", ..., dueAt = null)</w:t>
+      </w:r>
+    </w:p>
+    <w:p>
+      <w:r>
+        <w:t xml:space="preserve">Nên một </w:t>
+      </w:r>
+      <w:r>
+        <w:rPr>
+          <w:rFonts w:ascii="Consolas" w:eastAsia="Consolas" w:hAnsi="Consolas" w:cs="Consolas"/>
+        </w:rPr>
+        <w:t xml:space="preserve">PATCH</w:t>
+      </w:r>
+      <w:r>
+        <w:t xml:space="preserve"> kiểu "thiếu hoặc </w:t>
+      </w:r>
+      <w:r>
+        <w:rPr>
+          <w:rFonts w:ascii="Consolas" w:eastAsia="Consolas" w:hAnsi="Consolas" w:cs="Consolas"/>
+        </w:rPr>
+        <w:t xml:space="preserve">null</w:t>
+      </w:r>
+      <w:r>
+        <w:t xml:space="preserve"> là giữ nguyên" (như </w:t>
+      </w:r>
+      <w:r>
+        <w:rPr>
+          <w:rFonts w:ascii="Consolas" w:eastAsia="Consolas" w:hAnsi="Consolas" w:cs="Consolas"/>
+        </w:rPr>
+        <w:t xml:space="preserve">PATCH /api/accounts/{id}</w:t>
+      </w:r>
+      <w:r>
+        <w:t xml:space="preserve">) không có cách nào nói "xóa hạn". Có hai lối ra:</w:t>
+      </w:r>
+    </w:p>
+    <w:p>
+      <w:pPr>
+        <w:pStyle w:val="ListParagraph"/>
+        <w:numPr>
+          <w:ilvl w:val="0"/>
+          <w:numId w:val="1"/>
+        </w:numPr>
+      </w:pPr>
+      <w:r>
+        <w:t xml:space="preserve">Đọc JSON thô để biết ô nào có mặt (JSON Merge Patch, </w:t>
+      </w:r>
+      <w:r>
+        <w:rPr>
+          <w:rFonts w:ascii="Consolas" w:eastAsia="Consolas" w:hAnsi="Consolas" w:cs="Consolas"/>
+        </w:rPr>
+        <w:t xml:space="preserve">JsonNullable</w:t>
+      </w:r>
+      <w:r>
+        <w:t xml:space="preserve">): phức tạp, chỉ để dùng ở một chỗ.</w:t>
+      </w:r>
+    </w:p>
+    <w:p>
+      <w:pPr>
+        <w:pStyle w:val="ListParagraph"/>
+        <w:numPr>
+          <w:ilvl w:val="0"/>
+          <w:numId w:val="1"/>
+        </w:numPr>
+      </w:pPr>
+      <w:r>
+        <w:rPr>
+          <w:b/>
+          <w:bCs/>
+        </w:rPr>
+        <w:t xml:space="preserve">Tách ra một endpoint thay cả cụm</w:t>
+      </w:r>
+      <w:r>
+        <w:t xml:space="preserve"> (Sino chọn, D-153): </w:t>
+      </w:r>
+      <w:r>
+        <w:rPr>
+          <w:rFonts w:ascii="Consolas" w:eastAsia="Consolas" w:hAnsi="Consolas" w:cs="Consolas"/>
+        </w:rPr>
+        <w:t xml:space="preserve">PUT /api/tasks/{id}/schedule</w:t>
+      </w:r>
+      <w:r>
+        <w:t xml:space="preserve"> nhận </w:t>
+      </w:r>
+      <w:r>
+        <w:rPr>
+          <w:rFonts w:ascii="Consolas" w:eastAsia="Consolas" w:hAnsi="Consolas" w:cs="Consolas"/>
+        </w:rPr>
+        <w:t xml:space="preserve">{dueAt, dueDate, recurrence}</w:t>
+      </w:r>
+      <w:r>
+        <w:t xml:space="preserve">, và ô nào thiếu nghĩa là "không có". </w:t>
+      </w:r>
+      <w:r>
+        <w:rPr>
+          <w:rFonts w:ascii="Consolas" w:eastAsia="Consolas" w:hAnsi="Consolas" w:cs="Consolas"/>
+        </w:rPr>
+        <w:t xml:space="preserve">{}</w:t>
+      </w:r>
+      <w:r>
+        <w:t xml:space="preserve"> xóa cả hạn lẫn quy tắc.</w:t>
+      </w:r>
+    </w:p>
+    <w:p>
+      <w:r>
+        <w:t xml:space="preserve">Hạn và quy tắc vốn phải đi cùng nhau (có lặp thì phải có hạn, ngày gốc lấy từ hạn), nên gom chúng vào một lệnh </w:t>
+      </w:r>
+      <w:r>
+        <w:rPr>
+          <w:rFonts w:ascii="Consolas" w:eastAsia="Consolas" w:hAnsi="Consolas" w:cs="Consolas"/>
+        </w:rPr>
+        <w:t xml:space="preserve">PUT</w:t>
+      </w:r>
+      <w:r>
+        <w:t xml:space="preserve"> cũng đúng với nghĩa của chúng.</w:t>
+      </w:r>
+    </w:p>
+    <w:p>
+      <w:pPr>
+        <w:pStyle w:val="Heading3"/>
+      </w:pPr>
+      <w:r>
+        <w:t xml:space="preserve">3.3 Ký tự NUL: một lỗi 500 chặn trước bằng </w:t>
+      </w:r>
+      <w:r>
+        <w:rPr>
+          <w:rFonts w:ascii="Consolas" w:eastAsia="Consolas" w:hAnsi="Consolas" w:cs="Consolas"/>
+        </w:rPr>
+        <w:t xml:space="preserve">@Pattern</w:t>
+      </w:r>
+    </w:p>
+    <w:p>
+      <w:r>
+        <w:t xml:space="preserve">PostgreSQL không nhận ký tự </w:t>
+      </w:r>
+      <w:r>
+        <w:rPr>
+          <w:rFonts w:ascii="Consolas" w:eastAsia="Consolas" w:hAnsi="Consolas" w:cs="Consolas"/>
+        </w:rPr>
+        <w:t xml:space="preserve">U+0000</w:t>
+      </w:r>
+      <w:r>
+        <w:t xml:space="preserve"> trong </w:t>
+      </w:r>
+      <w:r>
+        <w:rPr>
+          <w:rFonts w:ascii="Consolas" w:eastAsia="Consolas" w:hAnsi="Consolas" w:cs="Consolas"/>
+        </w:rPr>
+        <w:t xml:space="preserve">text</w:t>
+      </w:r>
+      <w:r>
+        <w:t xml:space="preserve"> / </w:t>
+      </w:r>
+      <w:r>
+        <w:rPr>
+          <w:rFonts w:ascii="Consolas" w:eastAsia="Consolas" w:hAnsi="Consolas" w:cs="Consolas"/>
+        </w:rPr>
+        <w:t xml:space="preserve">varchar</w:t>
+      </w:r>
+      <w:r>
+        <w:t xml:space="preserve">. Nếu để lọt, câu </w:t>
+      </w:r>
+      <w:r>
+        <w:rPr>
+          <w:rFonts w:ascii="Consolas" w:eastAsia="Consolas" w:hAnsi="Consolas" w:cs="Consolas"/>
+        </w:rPr>
+        <w:t xml:space="preserve">INSERT</w:t>
+      </w:r>
+      <w:r>
+        <w:t xml:space="preserve"> hỏng và người dùng nhận </w:t>
+      </w:r>
+      <w:r>
+        <w:rPr>
+          <w:rFonts w:ascii="Consolas" w:eastAsia="Consolas" w:hAnsi="Consolas" w:cs="Consolas"/>
+        </w:rPr>
+        <w:t xml:space="preserve">500</w:t>
+      </w:r>
+      <w:r>
+        <w:t xml:space="preserve"> thay vì </w:t>
+      </w:r>
+      <w:r>
+        <w:rPr>
+          <w:rFonts w:ascii="Consolas" w:eastAsia="Consolas" w:hAnsi="Consolas" w:cs="Consolas"/>
+        </w:rPr>
+        <w:t xml:space="preserve">400</w:t>
+      </w:r>
+      <w:r>
+        <w:t xml:space="preserve">. Mọi ô chữ của request có:</w:t>
+      </w:r>
+    </w:p>
+    <w:p>
+      <w:pPr>
+        <w:shd w:val="clear" w:color="auto" w:fill="F2F3F5"/>
+        <w:ind w:left="0"/>
+      </w:pPr>
+      <w:r>
+        <w:rPr>
+          <w:rFonts w:ascii="Consolas" w:eastAsia="Consolas" w:hAnsi="Consolas" w:cs="Consolas"/>
+          <w:sz w:val="19"/>
+          <w:szCs w:val="19"/>
+        </w:rPr>
+        <w:t xml:space="preserve">@Pattern(regexp = Texts.WITHOUT_NUL, message = Texts.WITHOUT_NUL_MESSAGE)   // "[^\\x00]*"</w:t>
+      </w:r>
+    </w:p>
+    <w:p>
+      <w:r>
+        <w:t xml:space="preserve">Lớp ký tự </w:t>
+      </w:r>
+      <w:r>
+        <w:rPr>
+          <w:rFonts w:ascii="Consolas" w:eastAsia="Consolas" w:hAnsi="Consolas" w:cs="Consolas"/>
+        </w:rPr>
+        <w:t xml:space="preserve">[^\x00]</w:t>
+      </w:r>
+      <w:r>
+        <w:t xml:space="preserve"> khớp mọi ký tự trừ NUL, kể cả xuống dòng, nên ghi chú nhiều dòng vẫn qua. (Bẫy lúc viết: tạo file Java bằng heredoc của shell làm </w:t>
+      </w:r>
+      <w:r>
+        <w:rPr>
+          <w:rFonts w:ascii="Consolas" w:eastAsia="Consolas" w:hAnsi="Consolas" w:cs="Consolas"/>
+        </w:rPr>
+        <w:t xml:space="preserve">\\</w:t>
+      </w:r>
+      <w:r>
+        <w:t xml:space="preserve"> rút còn </w:t>
+      </w:r>
+      <w:r>
+        <w:rPr>
+          <w:rFonts w:ascii="Consolas" w:eastAsia="Consolas" w:hAnsi="Consolas" w:cs="Consolas"/>
+        </w:rPr>
+        <w:t xml:space="preserve">\</w:t>
+      </w:r>
+      <w:r>
+        <w:t xml:space="preserve">, ra một chuỗi Java không biên dịch được; file này được viết lại bằng công cụ ghi file.)</w:t>
+      </w:r>
+    </w:p>
+    <w:p>
+      <w:pPr>
+        <w:pStyle w:val="Heading3"/>
+      </w:pPr>
+      <w:r>
+        <w:t xml:space="preserve">3.4 JSON theo hợp đồng của web</w:t>
+      </w:r>
+    </w:p>
+    <w:p>
+      <w:r>
+        <w:rPr>
+          <w:rFonts w:ascii="Consolas" w:eastAsia="Consolas" w:hAnsi="Consolas" w:cs="Consolas"/>
+        </w:rPr>
+        <w:t xml:space="preserve">TaskResponse</w:t>
+      </w:r>
+      <w:r>
+        <w:t xml:space="preserve"> có đúng các ô của kiểu </w:t>
+      </w:r>
+      <w:r>
+        <w:rPr>
+          <w:rFonts w:ascii="Consolas" w:eastAsia="Consolas" w:hAnsi="Consolas" w:cs="Consolas"/>
+        </w:rPr>
+        <w:t xml:space="preserve">TaskItem</w:t>
+      </w:r>
+      <w:r>
+        <w:t xml:space="preserve"> mà màn web đã dùng với dữ liệu mẫu (</w:t>
+      </w:r>
+      <w:r>
+        <w:rPr>
+          <w:rFonts w:ascii="Consolas" w:eastAsia="Consolas" w:hAnsi="Consolas" w:cs="Consolas"/>
+        </w:rPr>
+        <w:t xml:space="preserve">fe-ui-tasks</w:t>
+      </w:r>
+      <w:r>
+        <w:t xml:space="preserve">):</w:t>
+      </w:r>
+    </w:p>
+    <w:p>
+      <w:pPr>
+        <w:pStyle w:val="ListParagraph"/>
+        <w:numPr>
+          <w:ilvl w:val="0"/>
+          <w:numId w:val="1"/>
+        </w:numPr>
+      </w:pPr>
+      <w:r>
+        <w:rPr>
+          <w:rFonts w:ascii="Consolas" w:eastAsia="Consolas" w:hAnsi="Consolas" w:cs="Consolas"/>
+        </w:rPr>
+        <w:t xml:space="preserve">reminder</w:t>
+      </w:r>
+      <w:r>
+        <w:t xml:space="preserve">, </w:t>
+      </w:r>
+      <w:r>
+        <w:rPr>
+          <w:rFonts w:ascii="Consolas" w:eastAsia="Consolas" w:hAnsi="Consolas" w:cs="Consolas"/>
+        </w:rPr>
+        <w:t xml:space="preserve">source</w:t>
+      </w:r>
+      <w:r>
+        <w:t xml:space="preserve">, </w:t>
+      </w:r>
+      <w:r>
+        <w:rPr>
+          <w:rFonts w:ascii="Consolas" w:eastAsia="Consolas" w:hAnsi="Consolas" w:cs="Consolas"/>
+        </w:rPr>
+        <w:t xml:space="preserve">related</w:t>
+      </w:r>
+      <w:r>
+        <w:t xml:space="preserve"> luôn là </w:t>
+      </w:r>
+      <w:r>
+        <w:rPr>
+          <w:rFonts w:ascii="Consolas" w:eastAsia="Consolas" w:hAnsi="Consolas" w:cs="Consolas"/>
+        </w:rPr>
+        <w:t xml:space="preserve">null</w:t>
+      </w:r>
+      <w:r>
+        <w:t xml:space="preserve"> ở đợt này. Ô vẫn có mặt để web không phải đổi kiểu khi các phần đó có sau.</w:t>
+      </w:r>
+    </w:p>
+    <w:p>
+      <w:pPr>
+        <w:pStyle w:val="ListParagraph"/>
+        <w:numPr>
+          <w:ilvl w:val="0"/>
+          <w:numId w:val="1"/>
+        </w:numPr>
+      </w:pPr>
+      <w:r>
+        <w:rPr>
+          <w:rFonts w:ascii="Consolas" w:eastAsia="Consolas" w:hAnsi="Consolas" w:cs="Consolas"/>
+        </w:rPr>
+        <w:t xml:space="preserve">recurrence.byWeekdays</w:t>
+      </w:r>
+      <w:r>
+        <w:t xml:space="preserve"> là </w:t>
+      </w:r>
+      <w:r>
+        <w:rPr>
+          <w:rFonts w:ascii="Consolas" w:eastAsia="Consolas" w:hAnsi="Consolas" w:cs="Consolas"/>
+        </w:rPr>
+        <w:t xml:space="preserve">null</w:t>
+      </w:r>
+      <w:r>
+        <w:t xml:space="preserve"> khi không phải hằng tuần, và luôn xếp thứ Hai trước (lấy từ </w:t>
+      </w:r>
+      <w:r>
+        <w:rPr>
+          <w:rFonts w:ascii="Consolas" w:eastAsia="Consolas" w:hAnsi="Consolas" w:cs="Consolas"/>
+        </w:rPr>
+        <w:t xml:space="preserve">EnumSet</w:t>
+      </w:r>
+      <w:r>
+        <w:t xml:space="preserve">).</w:t>
+      </w:r>
+    </w:p>
+    <w:p>
+      <w:pPr>
+        <w:pStyle w:val="ListParagraph"/>
+        <w:numPr>
+          <w:ilvl w:val="0"/>
+          <w:numId w:val="1"/>
+        </w:numPr>
+      </w:pPr>
+      <w:r>
+        <w:t xml:space="preserve">Múi giờ của quy tắc không ra JSON: web không cần, và đó là chi tiết của máy chủ.</w:t>
+      </w:r>
+    </w:p>
+    <w:p>
+      <w:r>
+        <w:rPr>
+          <w:rFonts w:ascii="Consolas" w:eastAsia="Consolas" w:hAnsi="Consolas" w:cs="Consolas"/>
+        </w:rPr>
+        <w:t xml:space="preserve">POST</w:t>
+      </w:r>
+      <w:r>
+        <w:t xml:space="preserve"> trả </w:t>
+      </w:r>
+      <w:r>
+        <w:rPr>
+          <w:rFonts w:ascii="Consolas" w:eastAsia="Consolas" w:hAnsi="Consolas" w:cs="Consolas"/>
+        </w:rPr>
+        <w:t xml:space="preserve">201 Created</w:t>
+      </w:r>
+      <w:r>
+        <w:t xml:space="preserve"> kèm header </w:t>
+      </w:r>
+      <w:r>
+        <w:rPr>
+          <w:rFonts w:ascii="Consolas" w:eastAsia="Consolas" w:hAnsi="Consolas" w:cs="Consolas"/>
+        </w:rPr>
+        <w:t xml:space="preserve">Location: http://…/api/tasks/{id}</w:t>
+      </w:r>
+      <w:r>
+        <w:t xml:space="preserve">. Vì </w:t>
+      </w:r>
+      <w:r>
+        <w:rPr>
+          <w:rFonts w:ascii="Consolas" w:eastAsia="Consolas" w:hAnsi="Consolas" w:cs="Consolas"/>
+        </w:rPr>
+        <w:t xml:space="preserve">Location</w:t>
+      </w:r>
+      <w:r>
+        <w:t xml:space="preserve"> phải trỏ tới thứ đọc được, đợt này thêm </w:t>
+      </w:r>
+      <w:r>
+        <w:rPr>
+          <w:rFonts w:ascii="Consolas" w:eastAsia="Consolas" w:hAnsi="Consolas" w:cs="Consolas"/>
+        </w:rPr>
+        <w:t xml:space="preserve">GET /api/tasks/{id}</w:t>
+      </w:r>
+      <w:r>
+        <w:t xml:space="preserve"> (bảng thiết kế ban đầu không có).</w:t>
+      </w:r>
+    </w:p>
+    <w:p>
+      <w:pPr>
+        <w:pStyle w:val="Heading3"/>
+      </w:pPr>
+      <w:r>
+        <w:t xml:space="preserve">3.5 Module test phải nạp thêm </w:t>
+      </w:r>
+      <w:r>
+        <w:rPr>
+          <w:rFonts w:ascii="Consolas" w:eastAsia="Consolas" w:hAnsi="Consolas" w:cs="Consolas"/>
+        </w:rPr>
+        <w:t xml:space="preserve">identity</w:t>
+      </w:r>
+    </w:p>
+    <w:p>
+      <w:r>
+        <w:rPr>
+          <w:rFonts w:ascii="Consolas" w:eastAsia="Consolas" w:hAnsi="Consolas" w:cs="Consolas"/>
+        </w:rPr>
+        <w:t xml:space="preserve">TaskServiceTests</w:t>
+      </w:r>
+      <w:r>
+        <w:t xml:space="preserve"> là </w:t>
+      </w:r>
+      <w:r>
+        <w:rPr>
+          <w:rFonts w:ascii="Consolas" w:eastAsia="Consolas" w:hAnsi="Consolas" w:cs="Consolas"/>
+        </w:rPr>
+        <w:t xml:space="preserve">@ApplicationModuleTest</w:t>
+      </w:r>
+      <w:r>
+        <w:t xml:space="preserve">: mặc định chỉ nạp các bean của module </w:t>
+      </w:r>
+      <w:r>
+        <w:rPr>
+          <w:rFonts w:ascii="Consolas" w:eastAsia="Consolas" w:hAnsi="Consolas" w:cs="Consolas"/>
+        </w:rPr>
+        <w:t xml:space="preserve">planner</w:t>
+      </w:r>
+      <w:r>
+        <w:t xml:space="preserve">. Từ khi có </w:t>
+      </w:r>
+      <w:r>
+        <w:rPr>
+          <w:rFonts w:ascii="Consolas" w:eastAsia="Consolas" w:hAnsi="Consolas" w:cs="Consolas"/>
+        </w:rPr>
+        <w:t xml:space="preserve">TasksController</w:t>
+      </w:r>
+      <w:r>
+        <w:t xml:space="preserve"> (cần </w:t>
+      </w:r>
+      <w:r>
+        <w:rPr>
+          <w:rFonts w:ascii="Consolas" w:eastAsia="Consolas" w:hAnsi="Consolas" w:cs="Consolas"/>
+        </w:rPr>
+        <w:t xml:space="preserve">CurrentUser</w:t>
+      </w:r>
+      <w:r>
+        <w:t xml:space="preserve"> của module </w:t>
+      </w:r>
+      <w:r>
+        <w:rPr>
+          <w:rFonts w:ascii="Consolas" w:eastAsia="Consolas" w:hAnsi="Consolas" w:cs="Consolas"/>
+        </w:rPr>
+        <w:t xml:space="preserve">identity</w:t>
+      </w:r>
+      <w:r>
+        <w:t xml:space="preserve">), context không dựng được nữa. Test chuyển sang </w:t>
+      </w:r>
+      <w:r>
+        <w:rPr>
+          <w:rFonts w:ascii="Consolas" w:eastAsia="Consolas" w:hAnsi="Consolas" w:cs="Consolas"/>
+        </w:rPr>
+        <w:t xml:space="preserve">BootstrapMode.DIRECT_DEPENDENCIES</w:t>
+      </w:r>
+      <w:r>
+        <w:t xml:space="preserve"> (nạp thêm các module mà </w:t>
+      </w:r>
+      <w:r>
+        <w:rPr>
+          <w:rFonts w:ascii="Consolas" w:eastAsia="Consolas" w:hAnsi="Consolas" w:cs="Consolas"/>
+        </w:rPr>
+        <w:t xml:space="preserve">planner</w:t>
+      </w:r>
+      <w:r>
+        <w:t xml:space="preserve"> dùng trực tiếp), giống các module test của </w:t>
+      </w:r>
+      <w:r>
+        <w:rPr>
+          <w:rFonts w:ascii="Consolas" w:eastAsia="Consolas" w:hAnsi="Consolas" w:cs="Consolas"/>
+        </w:rPr>
+        <w:t xml:space="preserve">account</w:t>
+      </w:r>
+      <w:r>
+        <w:t xml:space="preserve">.</w:t>
+      </w:r>
+    </w:p>
+    <w:p>
+      <w:pPr>
+        <w:pStyle w:val="Heading3"/>
+      </w:pPr>
+      <w:r>
+        <w:t xml:space="preserve">3.6 Kiểm chứng (BE-72)</w:t>
+      </w:r>
+    </w:p>
+    <w:p>
+      <w:pPr>
+        <w:pStyle w:val="ListParagraph"/>
+        <w:numPr>
+          <w:ilvl w:val="0"/>
+          <w:numId w:val="1"/>
+        </w:numPr>
+      </w:pPr>
+      <w:r>
+        <w:t xml:space="preserve">RED: chưa có controller → 36/38 test API đỏ (</w:t>
+      </w:r>
+      <w:r>
+        <w:rPr>
+          <w:rFonts w:ascii="Consolas" w:eastAsia="Consolas" w:hAnsi="Consolas" w:cs="Consolas"/>
+        </w:rPr>
+        <w:t xml:space="preserve">404</w:t>
+      </w:r>
+      <w:r>
+        <w:t xml:space="preserve">); hai test xanh sẵn là </w:t>
+      </w:r>
+      <w:r>
+        <w:rPr>
+          <w:rFonts w:ascii="Consolas" w:eastAsia="Consolas" w:hAnsi="Consolas" w:cs="Consolas"/>
+        </w:rPr>
+        <w:t xml:space="preserve">401</w:t>
+      </w:r>
+      <w:r>
+        <w:t xml:space="preserve"> và thiếu CSRF, vì lớp bảo mật đứng trước controller.</w:t>
+      </w:r>
+    </w:p>
+    <w:p>
+      <w:pPr>
+        <w:pStyle w:val="ListParagraph"/>
+        <w:numPr>
+          <w:ilvl w:val="0"/>
+          <w:numId w:val="1"/>
+        </w:numPr>
+      </w:pPr>
+      <w:r>
+        <w:t xml:space="preserve">GREEN: 38/38 test API (21 ca dữ liệu sai thành </w:t>
+      </w:r>
+      <w:r>
+        <w:rPr>
+          <w:rFonts w:ascii="Consolas" w:eastAsia="Consolas" w:hAnsi="Consolas" w:cs="Consolas"/>
+        </w:rPr>
+        <w:t xml:space="preserve">400</w:t>
+      </w:r>
+      <w:r>
+        <w:t xml:space="preserve">, </w:t>
+      </w:r>
+      <w:r>
+        <w:rPr>
+          <w:rFonts w:ascii="Consolas" w:eastAsia="Consolas" w:hAnsi="Consolas" w:cs="Consolas"/>
+        </w:rPr>
+        <w:t xml:space="preserve">422</w:t>
+      </w:r>
+      <w:r>
+        <w:t xml:space="preserve">, </w:t>
+      </w:r>
+      <w:r>
+        <w:rPr>
+          <w:rFonts w:ascii="Consolas" w:eastAsia="Consolas" w:hAnsi="Consolas" w:cs="Consolas"/>
+        </w:rPr>
+        <w:t xml:space="preserve">404</w:t>
+      </w:r>
+      <w:r>
+        <w:t xml:space="preserve">, </w:t>
+      </w:r>
+      <w:r>
+        <w:rPr>
+          <w:rFonts w:ascii="Consolas" w:eastAsia="Consolas" w:hAnsi="Consolas" w:cs="Consolas"/>
+        </w:rPr>
+        <w:t xml:space="preserve">409</w:t>
+      </w:r>
+      <w:r>
+        <w:t xml:space="preserve">, </w:t>
+      </w:r>
+      <w:r>
+        <w:rPr>
+          <w:rFonts w:ascii="Consolas" w:eastAsia="Consolas" w:hAnsi="Consolas" w:cs="Consolas"/>
+        </w:rPr>
+        <w:t xml:space="preserve">401</w:t>
+      </w:r>
+      <w:r>
+        <w:t xml:space="preserve">, </w:t>
+      </w:r>
+      <w:r>
+        <w:rPr>
+          <w:rFonts w:ascii="Consolas" w:eastAsia="Consolas" w:hAnsi="Consolas" w:cs="Consolas"/>
+        </w:rPr>
+        <w:t xml:space="preserve">403</w:t>
+      </w:r>
+      <w:r>
+        <w:t xml:space="preserve">, </w:t>
+      </w:r>
+      <w:r>
+        <w:rPr>
+          <w:rFonts w:ascii="Consolas" w:eastAsia="Consolas" w:hAnsi="Consolas" w:cs="Consolas"/>
+        </w:rPr>
+        <w:t xml:space="preserve">201</w:t>
+      </w:r>
+      <w:r>
+        <w:t xml:space="preserve"> + </w:t>
+      </w:r>
+      <w:r>
+        <w:rPr>
+          <w:rFonts w:ascii="Consolas" w:eastAsia="Consolas" w:hAnsi="Consolas" w:cs="Consolas"/>
+        </w:rPr>
+        <w:t xml:space="preserve">Location</w:t>
+      </w:r>
+      <w:r>
+        <w:t xml:space="preserve">, JSON đúng hợp đồng).</w:t>
+      </w:r>
+    </w:p>
+    <w:p>
+      <w:pPr>
+        <w:pStyle w:val="ListParagraph"/>
+        <w:numPr>
+          <w:ilvl w:val="0"/>
+          <w:numId w:val="1"/>
+        </w:numPr>
+      </w:pPr>
+      <w:r>
+        <w:rPr>
+          <w:rFonts w:ascii="Consolas" w:eastAsia="Consolas" w:hAnsi="Consolas" w:cs="Consolas"/>
+        </w:rPr>
+        <w:t xml:space="preserve">./mvnw -B -ntp verify</w:t>
+      </w:r>
+      <w:r>
+        <w:t xml:space="preserve">: 1418 test, 0 lỗi, 4 bỏ qua; </w:t>
+      </w:r>
+      <w:r>
+        <w:rPr>
+          <w:rFonts w:ascii="Consolas" w:eastAsia="Consolas" w:hAnsi="Consolas" w:cs="Consolas"/>
+        </w:rPr>
+        <w:t xml:space="preserve">ModularityTests</w:t>
+      </w:r>
+      <w:r>
+        <w:t xml:space="preserve"> 2/2 (</w:t>
+      </w:r>
+      <w:r>
+        <w:rPr>
+          <w:rFonts w:ascii="Consolas" w:eastAsia="Consolas" w:hAnsi="Consolas" w:cs="Consolas"/>
+        </w:rPr>
+        <w:t xml:space="preserve">planner</w:t>
+      </w:r>
+      <w:r>
+        <w:t xml:space="preserve"> giờ phụ thuộc </w:t>
+      </w:r>
+      <w:r>
+        <w:rPr>
+          <w:rFonts w:ascii="Consolas" w:eastAsia="Consolas" w:hAnsi="Consolas" w:cs="Consolas"/>
+        </w:rPr>
+        <w:t xml:space="preserve">identity</w:t>
+      </w:r>
+      <w:r>
+        <w:t xml:space="preserve"> và </w:t>
+      </w:r>
+      <w:r>
+        <w:rPr>
+          <w:rFonts w:ascii="Consolas" w:eastAsia="Consolas" w:hAnsi="Consolas" w:cs="Consolas"/>
+        </w:rPr>
+        <w:t xml:space="preserve">common</w:t>
+      </w:r>
+      <w:r>
+        <w:t xml:space="preserve">).</w:t>
       </w:r>
     </w:p>
     <w:p/>

</xml_diff>

<commit_message>
feat(fe-70): the Việc cần làm screen on the task API
The screen reads /api/tasks and /api/providers and adds, completes, opens
again and saves notes through the API; a repeating task shows the next
occurrence the server made. The navigation counts due tasks from the task
list on every screen (AppShell, D-83), so the count is real before the
screen is opened. A refused change puts the list back and says so; a refused
new task comes back into the box. Task changes refresh the calendar ranges
in the cache. The reminder line, "Thêm thao tác" and "Nhắc lại sau…" only
show when there is something behind them.

The tests written on the canvas sample keep it through sampleTasksApi; new
tests run the screen on an in-memory API through MSW.

Co-Authored-By: Claude Opus 5.5 (1M context) <noreply@anthropic.com>
</commit_message>
<xml_diff>
--- a/docs/knowledge/phase-4-planner.docx
+++ b/docs/knowledge/phase-4-planner.docx
@@ -106,7 +106,7 @@
         <w:t xml:space="preserve">openspec/changes/f16-f17-tasks-calendar</w:t>
       </w:r>
       <w:r>
-        <w:t xml:space="preserve"> (việc cần làm có hạn và lặp lại, lịch hẹn, xem lịch theo khoảng ngày; chưa có nhắc nhở, chưa gắn tin nhắn): BE-70, BE-71, BE-72.</w:t>
+        <w:t xml:space="preserve"> (việc cần làm có hạn và lặp lại, lịch hẹn, xem lịch theo khoảng ngày; chưa có nhắc nhở, chưa gắn tin nhắn): BE-70, BE-71, BE-72, FE-70.</w:t>
         <w:br/>
       </w:r>
       <w:r>
@@ -4793,6 +4793,585 @@
       </w:r>
       <w:r>
         <w:t xml:space="preserve">).</w:t>
+      </w:r>
+    </w:p>
+    <w:p>
+      <w:pPr>
+        <w:pBdr>
+          <w:bottom w:val="single" w:sz="4" w:space="0" w:color="auto"/>
+        </w:pBdr>
+        <w:ind w:left="0"/>
+      </w:pPr>
+    </w:p>
+    <w:p>
+      <w:pPr>
+        <w:pStyle w:val="Heading2"/>
+      </w:pPr>
+      <w:r>
+        <w:t xml:space="preserve">4. Màn Việc cần làm trên API thật (FE-70)</w:t>
+      </w:r>
+    </w:p>
+    <w:p>
+      <w:r>
+        <w:rPr>
+          <w:b/>
+          <w:bCs/>
+        </w:rPr>
+        <w:t xml:space="preserve">Ở đâu</w:t>
+      </w:r>
+      <w:r>
+        <w:t xml:space="preserve"> (tính từ </w:t>
+      </w:r>
+      <w:r>
+        <w:rPr>
+          <w:rFonts w:ascii="Consolas" w:eastAsia="Consolas" w:hAnsi="Consolas" w:cs="Consolas"/>
+        </w:rPr>
+        <w:t xml:space="preserve">apps/sino-web/src/</w:t>
+      </w:r>
+      <w:r>
+        <w:t xml:space="preserve">): </w:t>
+      </w:r>
+      <w:r>
+        <w:rPr>
+          <w:rFonts w:ascii="Consolas" w:eastAsia="Consolas" w:hAnsi="Consolas" w:cs="Consolas"/>
+        </w:rPr>
+        <w:t xml:space="preserve">features/tasks/tasks.api.ts</w:t>
+      </w:r>
+      <w:r>
+        <w:t xml:space="preserve">, </w:t>
+      </w:r>
+      <w:r>
+        <w:rPr>
+          <w:rFonts w:ascii="Consolas" w:eastAsia="Consolas" w:hAnsi="Consolas" w:cs="Consolas"/>
+        </w:rPr>
+        <w:t xml:space="preserve">useTasks.ts</w:t>
+      </w:r>
+      <w:r>
+        <w:t xml:space="preserve">, </w:t>
+      </w:r>
+      <w:r>
+        <w:rPr>
+          <w:rFonts w:ascii="Consolas" w:eastAsia="Consolas" w:hAnsi="Consolas" w:cs="Consolas"/>
+        </w:rPr>
+        <w:t xml:space="preserve">TasksPage.tsx</w:t>
+      </w:r>
+      <w:r>
+        <w:t xml:space="preserve">, </w:t>
+      </w:r>
+      <w:r>
+        <w:rPr>
+          <w:rFonts w:ascii="Consolas" w:eastAsia="Consolas" w:hAnsi="Consolas" w:cs="Consolas"/>
+        </w:rPr>
+        <w:t xml:space="preserve">components/QuickAdd.tsx</w:t>
+      </w:r>
+      <w:r>
+        <w:t xml:space="preserve">, </w:t>
+      </w:r>
+      <w:r>
+        <w:rPr>
+          <w:rFonts w:ascii="Consolas" w:eastAsia="Consolas" w:hAnsi="Consolas" w:cs="Consolas"/>
+        </w:rPr>
+        <w:t xml:space="preserve">components/TaskDetail.tsx</w:t>
+      </w:r>
+      <w:r>
+        <w:t xml:space="preserve">; </w:t>
+      </w:r>
+      <w:r>
+        <w:rPr>
+          <w:rFonts w:ascii="Consolas" w:eastAsia="Consolas" w:hAnsi="Consolas" w:cs="Consolas"/>
+        </w:rPr>
+        <w:t xml:space="preserve">app/shell/AppShell.tsx</w:t>
+      </w:r>
+      <w:r>
+        <w:t xml:space="preserve">; test: </w:t>
+      </w:r>
+      <w:r>
+        <w:rPr>
+          <w:rFonts w:ascii="Consolas" w:eastAsia="Consolas" w:hAnsi="Consolas" w:cs="Consolas"/>
+        </w:rPr>
+        <w:t xml:space="preserve">test/tasksSampleApi.ts</w:t>
+      </w:r>
+      <w:r>
+        <w:t xml:space="preserve">, </w:t>
+      </w:r>
+      <w:r>
+        <w:rPr>
+          <w:rFonts w:ascii="Consolas" w:eastAsia="Consolas" w:hAnsi="Consolas" w:cs="Consolas"/>
+        </w:rPr>
+        <w:t xml:space="preserve">test/fixtures/tasksApi.ts</w:t>
+      </w:r>
+      <w:r>
+        <w:t xml:space="preserve">, </w:t>
+      </w:r>
+      <w:r>
+        <w:rPr>
+          <w:rFonts w:ascii="Consolas" w:eastAsia="Consolas" w:hAnsi="Consolas" w:cs="Consolas"/>
+        </w:rPr>
+        <w:t xml:space="preserve">features/tasks/tasks.api.test.ts</w:t>
+      </w:r>
+      <w:r>
+        <w:t xml:space="preserve">, </w:t>
+      </w:r>
+      <w:r>
+        <w:rPr>
+          <w:rFonts w:ascii="Consolas" w:eastAsia="Consolas" w:hAnsi="Consolas" w:cs="Consolas"/>
+        </w:rPr>
+        <w:t xml:space="preserve">TasksOnApi.test.tsx</w:t>
+      </w:r>
+      <w:r>
+        <w:t xml:space="preserve">.</w:t>
+      </w:r>
+    </w:p>
+    <w:p>
+      <w:pPr>
+        <w:shd w:val="clear" w:color="auto" w:fill="F2F3F5"/>
+        <w:ind w:left="0"/>
+      </w:pPr>
+      <w:r>
+        <w:rPr>
+          <w:rFonts w:ascii="Consolas" w:eastAsia="Consolas" w:hAnsi="Consolas" w:cs="Consolas"/>
+          <w:sz w:val="19"/>
+          <w:szCs w:val="19"/>
+        </w:rPr>
+        <w:t xml:space="preserve">màn Việc cần làm ──&gt; useTasks (TanStack Query, khóa ['tasks'])</w:t>
+        <w:br/>
+        <w:t xml:space="preserve">                        |  queryFn = fetchTasks: GET /api/tasks + GET /api/providers</w:t>
+        <w:br/>
+        <w:t xml:space="preserve">                        |  thay đổi = addTask / completeTask / reopenTask / saveTaskNotes</w:t>
+        <w:br/>
+        <w:t xml:space="preserve">                        v</w:t>
+        <w:br/>
+        <w:t xml:space="preserve">                     tasks.api.ts ──&gt; shared/api/client (cookie phiên, CSRF) ──&gt; /api/tasks/**</w:t>
+        <w:br/>
+        <w:t xml:space="preserve">AppShell ──&gt; cũng đọc ['tasks'] ──&gt; số "tới hạn" trên điều hướng của mọi màn</w:t>
+      </w:r>
+    </w:p>
+    <w:p>
+      <w:pPr>
+        <w:pStyle w:val="Heading3"/>
+      </w:pPr>
+      <w:r>
+        <w:t xml:space="preserve">4.1 Hợp đồng dữ liệu trả công: chỉ đổi thân hàm</w:t>
+      </w:r>
+    </w:p>
+    <w:p>
+      <w:r>
+        <w:t xml:space="preserve">Lúc dựng giao diện trước (Phase 1), màn này đã có kiểu </w:t>
+      </w:r>
+      <w:r>
+        <w:rPr>
+          <w:rFonts w:ascii="Consolas" w:eastAsia="Consolas" w:hAnsi="Consolas" w:cs="Consolas"/>
+        </w:rPr>
+        <w:t xml:space="preserve">TaskItem</w:t>
+      </w:r>
+      <w:r>
+        <w:t xml:space="preserve"> làm "hợp đồng" giao cho backend, và BE-72 trả JSON đúng hình dạng đó. Vì vậy FE-70 chỉ thay </w:t>
+      </w:r>
+      <w:r>
+        <w:rPr>
+          <w:b/>
+          <w:bCs/>
+        </w:rPr>
+        <w:t xml:space="preserve">thân</w:t>
+      </w:r>
+      <w:r>
+        <w:t xml:space="preserve"> các hàm trong </w:t>
+      </w:r>
+      <w:r>
+        <w:rPr>
+          <w:rFonts w:ascii="Consolas" w:eastAsia="Consolas" w:hAnsi="Consolas" w:cs="Consolas"/>
+        </w:rPr>
+        <w:t xml:space="preserve">tasks.api.ts</w:t>
+      </w:r>
+      <w:r>
+        <w:t xml:space="preserve">: tên hàm, tham số và kiểu trả về giữ nguyên, nên hook và component không phải sửa vì dữ liệu.</w:t>
+      </w:r>
+    </w:p>
+    <w:p>
+      <w:pPr>
+        <w:shd w:val="clear" w:color="auto" w:fill="F2F3F5"/>
+        <w:ind w:left="0"/>
+      </w:pPr>
+      <w:r>
+        <w:rPr>
+          <w:rFonts w:ascii="Consolas" w:eastAsia="Consolas" w:hAnsi="Consolas" w:cs="Consolas"/>
+          <w:sz w:val="19"/>
+          <w:szCs w:val="19"/>
+        </w:rPr>
+        <w:t xml:space="preserve">export async function completeTask(task: TaskItem): Promise&lt;CompletedTask&gt; {</w:t>
+        <w:br/>
+        <w:t xml:space="preserve">  return api.post&lt;CompletedTask&gt;(path(task, '/complete'))   // trước: tự tính lần kế tiếp từ dữ liệu mẫu</w:t>
+        <w:br/>
+        <w:t xml:space="preserve">}</w:t>
+      </w:r>
+    </w:p>
+    <w:p>
+      <w:pPr>
+        <w:pStyle w:val="Heading3"/>
+      </w:pPr>
+      <w:r>
+        <w:t xml:space="preserve">4.2 Test cũ vẫn chạy trên dữ liệu mẫu: </w:t>
+      </w:r>
+      <w:r>
+        <w:rPr>
+          <w:rFonts w:ascii="Consolas" w:eastAsia="Consolas" w:hAnsi="Consolas" w:cs="Consolas"/>
+        </w:rPr>
+        <w:t xml:space="preserve">sampleTasksApi</w:t>
+      </w:r>
+    </w:p>
+    <w:p>
+      <w:r>
+        <w:t xml:space="preserve">Các test viết lúc dựng giao diện (nhóm, lọc, chữ trên dòng…) dựa vào dữ liệu mẫu của canvas. Logic mẫu cũ được dời sang </w:t>
+      </w:r>
+      <w:r>
+        <w:rPr>
+          <w:rFonts w:ascii="Consolas" w:eastAsia="Consolas" w:hAnsi="Consolas" w:cs="Consolas"/>
+        </w:rPr>
+        <w:t xml:space="preserve">test/tasksSampleApi.ts</w:t>
+      </w:r>
+      <w:r>
+        <w:t xml:space="preserve">, và các file test đó thay module thật bằng bản mẫu:</w:t>
+      </w:r>
+    </w:p>
+    <w:p>
+      <w:pPr>
+        <w:shd w:val="clear" w:color="auto" w:fill="F2F3F5"/>
+        <w:ind w:left="0"/>
+      </w:pPr>
+      <w:r>
+        <w:rPr>
+          <w:rFonts w:ascii="Consolas" w:eastAsia="Consolas" w:hAnsi="Consolas" w:cs="Consolas"/>
+          <w:sz w:val="19"/>
+          <w:szCs w:val="19"/>
+        </w:rPr>
+        <w:t xml:space="preserve">vi.mock('./tasks.api', async (importOriginal) =&gt;</w:t>
+        <w:br/>
+        <w:t xml:space="preserve">  (await import('@/test/tasksSampleApi')).sampleTasksApi(await importOriginal()))</w:t>
+      </w:r>
+    </w:p>
+    <w:p>
+      <w:r>
+        <w:t xml:space="preserve">Bẫy: </w:t>
+      </w:r>
+      <w:r>
+        <w:rPr>
+          <w:rFonts w:ascii="Consolas" w:eastAsia="Consolas" w:hAnsi="Consolas" w:cs="Consolas"/>
+        </w:rPr>
+        <w:t xml:space="preserve">vi.mock</w:t>
+      </w:r>
+      <w:r>
+        <w:t xml:space="preserve"> được Vitest </w:t>
+      </w:r>
+      <w:r>
+        <w:rPr>
+          <w:b/>
+          <w:bCs/>
+        </w:rPr>
+        <w:t xml:space="preserve">kéo lên đầu file</w:t>
+      </w:r>
+      <w:r>
+        <w:t xml:space="preserve">, chạy trước mọi </w:t>
+      </w:r>
+      <w:r>
+        <w:rPr>
+          <w:rFonts w:ascii="Consolas" w:eastAsia="Consolas" w:hAnsi="Consolas" w:cs="Consolas"/>
+        </w:rPr>
+        <w:t xml:space="preserve">import</w:t>
+      </w:r>
+      <w:r>
+        <w:t xml:space="preserve">. Viết </w:t>
+      </w:r>
+      <w:r>
+        <w:rPr>
+          <w:rFonts w:ascii="Consolas" w:eastAsia="Consolas" w:hAnsi="Consolas" w:cs="Consolas"/>
+        </w:rPr>
+        <w:t xml:space="preserve">import { sampleTasksApi } from …</w:t>
+      </w:r>
+      <w:r>
+        <w:t xml:space="preserve"> ở đầu file rồi dùng trong factory sẽ hỏng ("Cannot access … before initialization"); phải </w:t>
+      </w:r>
+      <w:r>
+        <w:rPr>
+          <w:rFonts w:ascii="Consolas" w:eastAsia="Consolas" w:hAnsi="Consolas" w:cs="Consolas"/>
+        </w:rPr>
+        <w:t xml:space="preserve">await import(...)</w:t>
+      </w:r>
+      <w:r>
+        <w:t xml:space="preserve"> ngay bên trong factory, như các test của Hộp thư.</w:t>
+      </w:r>
+    </w:p>
+    <w:p>
+      <w:r>
+        <w:t xml:space="preserve">Test mới (</w:t>
+      </w:r>
+      <w:r>
+        <w:rPr>
+          <w:rFonts w:ascii="Consolas" w:eastAsia="Consolas" w:hAnsi="Consolas" w:cs="Consolas"/>
+        </w:rPr>
+        <w:t xml:space="preserve">TasksOnApi.test.tsx</w:t>
+      </w:r>
+      <w:r>
+        <w:t xml:space="preserve">) thì đi qua mạng giả MSW: một "backend" giữ danh sách việc trong bộ nhớ, trả lời đúng như BE-72, và có chế độ </w:t>
+      </w:r>
+      <w:r>
+        <w:rPr>
+          <w:rFonts w:ascii="Consolas" w:eastAsia="Consolas" w:hAnsi="Consolas" w:cs="Consolas"/>
+        </w:rPr>
+        <w:t xml:space="preserve">refuse</w:t>
+      </w:r>
+      <w:r>
+        <w:t xml:space="preserve"> để thử đường lỗi.</w:t>
+      </w:r>
+    </w:p>
+    <w:p>
+      <w:pPr>
+        <w:pStyle w:val="Heading3"/>
+      </w:pPr>
+      <w:r>
+        <w:t xml:space="preserve">4.3 Số trên điều hướng: một nguồn duy nhất</w:t>
+      </w:r>
+    </w:p>
+    <w:p>
+      <w:r>
+        <w:t xml:space="preserve">Trước đây hook chép số "tới hạn" vào cache của khung app sau mỗi thay đổi. Cách đó có hai lỗ: chưa mở màn Việc cần làm thì số trên điều hướng vẫn là số mẫu, và hai bản số có thể lệch nhau. Giờ </w:t>
+      </w:r>
+      <w:r>
+        <w:rPr>
+          <w:rFonts w:ascii="Consolas" w:eastAsia="Consolas" w:hAnsi="Consolas" w:cs="Consolas"/>
+        </w:rPr>
+        <w:t xml:space="preserve">AppShell</w:t>
+      </w:r>
+      <w:r>
+        <w:t xml:space="preserve"> đọc chính danh sách việc và tự đếm:</w:t>
+      </w:r>
+    </w:p>
+    <w:p>
+      <w:pPr>
+        <w:shd w:val="clear" w:color="auto" w:fill="F2F3F5"/>
+        <w:ind w:left="0"/>
+      </w:pPr>
+      <w:r>
+        <w:rPr>
+          <w:rFonts w:ascii="Consolas" w:eastAsia="Consolas" w:hAnsi="Consolas" w:cs="Consolas"/>
+          <w:sz w:val="19"/>
+          <w:szCs w:val="19"/>
+        </w:rPr>
+        <w:t xml:space="preserve">const { tasks } = useTasks()</w:t>
+        <w:br/>
+        <w:t xml:space="preserve">const now = useNow()                          // đổi mỗi phút: việc hạn 12:00 thành quá hạn khi qua 12:00</w:t>
+        <w:br/>
+        <w:t xml:space="preserve">... tasks === undefined ? {} : navCountsOf(tasks, now)</w:t>
+      </w:r>
+    </w:p>
+    <w:p>
+      <w:r>
+        <w:t xml:space="preserve">Đánh dấu xong một việc làm đổi danh sách trong cache, nên số trên điều hướng đổi theo mà không cần ai "báo". Bẫy đã gặp: gọi </w:t>
+      </w:r>
+      <w:r>
+        <w:rPr>
+          <w:rFonts w:ascii="Consolas" w:eastAsia="Consolas" w:hAnsi="Consolas" w:cs="Consolas"/>
+        </w:rPr>
+        <w:t xml:space="preserve">new Date()</w:t>
+      </w:r>
+      <w:r>
+        <w:t xml:space="preserve"> thẳng trong lúc render bị lint (</w:t>
+      </w:r>
+      <w:r>
+        <w:rPr>
+          <w:rFonts w:ascii="Consolas" w:eastAsia="Consolas" w:hAnsi="Consolas" w:cs="Consolas"/>
+        </w:rPr>
+        <w:t xml:space="preserve">react(purity)</w:t>
+      </w:r>
+      <w:r>
+        <w:t xml:space="preserve">) chặn, vì mỗi lần render ra một giá trị khác; dùng hook </w:t>
+      </w:r>
+      <w:r>
+        <w:rPr>
+          <w:rFonts w:ascii="Consolas" w:eastAsia="Consolas" w:hAnsi="Consolas" w:cs="Consolas"/>
+        </w:rPr>
+        <w:t xml:space="preserve">useNow</w:t>
+      </w:r>
+      <w:r>
+        <w:t xml:space="preserve"> có sẵn.</w:t>
+      </w:r>
+    </w:p>
+    <w:p>
+      <w:pPr>
+        <w:pStyle w:val="Heading3"/>
+      </w:pPr>
+      <w:r>
+        <w:t xml:space="preserve">4.4 Đổi ngay, trả lại khi lỗi, và nói cho người dùng biết</w:t>
+      </w:r>
+    </w:p>
+    <w:p>
+      <w:r>
+        <w:t xml:space="preserve">Đánh dấu xong hiện ngay trên màn (optimistic update) rồi mới chờ máy chủ. Máy chủ từ chối thì danh sách quay về bản đã lưu trước đó, và từ FE-70 có thêm một dòng </w:t>
+      </w:r>
+      <w:r>
+        <w:rPr>
+          <w:rFonts w:ascii="Consolas" w:eastAsia="Consolas" w:hAnsi="Consolas" w:cs="Consolas"/>
+        </w:rPr>
+        <w:t xml:space="preserve">role="alert"</w:t>
+      </w:r>
+      <w:r>
+        <w:t xml:space="preserve">: "Không lưu được thay đổi. Hãy thử lại.". Thêm nhanh thì làm ngược lại: ô trống ngay để gõ tiếp, nhưng nếu máy chủ từ chối thì tiêu đề quay lại ô (trừ khi người dùng đã gõ cái mới) cùng câu "Không thêm được việc. Hãy thử lại.". </w:t>
+      </w:r>
+      <w:r>
+        <w:rPr>
+          <w:rFonts w:ascii="Consolas" w:eastAsia="Consolas" w:hAnsi="Consolas" w:cs="Consolas"/>
+        </w:rPr>
+        <w:t xml:space="preserve">QuickAdd</w:t>
+      </w:r>
+      <w:r>
+        <w:t xml:space="preserve"> nhận một hàm trả </w:t>
+      </w:r>
+      <w:r>
+        <w:rPr>
+          <w:rFonts w:ascii="Consolas" w:eastAsia="Consolas" w:hAnsi="Consolas" w:cs="Consolas"/>
+        </w:rPr>
+        <w:t xml:space="preserve">Promise</w:t>
+      </w:r>
+      <w:r>
+        <w:t xml:space="preserve"> (</w:t>
+      </w:r>
+      <w:r>
+        <w:rPr>
+          <w:rFonts w:ascii="Consolas" w:eastAsia="Consolas" w:hAnsi="Consolas" w:cs="Consolas"/>
+        </w:rPr>
+        <w:t xml:space="preserve">mutateAsync</w:t>
+      </w:r>
+      <w:r>
+        <w:t xml:space="preserve">) để biết kết quả.</w:t>
+      </w:r>
+    </w:p>
+    <w:p>
+      <w:pPr>
+        <w:pStyle w:val="Heading3"/>
+      </w:pPr>
+      <w:r>
+        <w:t xml:space="preserve">4.5 Việc đổi thì Lịch đọc lại</w:t>
+      </w:r>
+    </w:p>
+    <w:p>
+      <w:r>
+        <w:t xml:space="preserve">Màn Lịch cũng hiện việc có hạn. Sau mỗi thay đổi việc, hook gọi </w:t>
+      </w:r>
+      <w:r>
+        <w:rPr>
+          <w:rFonts w:ascii="Consolas" w:eastAsia="Consolas" w:hAnsi="Consolas" w:cs="Consolas"/>
+        </w:rPr>
+        <w:t xml:space="preserve">invalidateQueries({ queryKey: ['calendar'] })</w:t>
+      </w:r>
+      <w:r>
+        <w:t xml:space="preserve">: mọi khoảng Lịch đang có trong cache bị đánh dấu cũ, lần tới mở Lịch sẽ đọc lại. Gọi ở </w:t>
+      </w:r>
+      <w:r>
+        <w:rPr>
+          <w:rFonts w:ascii="Consolas" w:eastAsia="Consolas" w:hAnsi="Consolas" w:cs="Consolas"/>
+        </w:rPr>
+        <w:t xml:space="preserve">onSettled</w:t>
+      </w:r>
+      <w:r>
+        <w:t xml:space="preserve"> (cả khi lỗi), vì một yêu cầu "lỗi" vẫn có thể đã được máy chủ làm.</w:t>
+      </w:r>
+    </w:p>
+    <w:p>
+      <w:pPr>
+        <w:pStyle w:val="Heading3"/>
+      </w:pPr>
+      <w:r>
+        <w:t xml:space="preserve">4.6 Chạy thật mà không đụng ai</w:t>
+      </w:r>
+    </w:p>
+    <w:p>
+      <w:r>
+        <w:t xml:space="preserve">Để thấy màn chạy với backend thật mà không làm phiền app IntelliJ của người dùng (cổng 8080) hay database dùng chung, lượt kiểm dùng: jar build từ git worktree riêng chạy cổng 8091, một PostgreSQL 18 tạm trong Docker (Flyway dựng từ V1 tới V18), vite cổng 5179 với proxy </w:t>
+      </w:r>
+      <w:r>
+        <w:rPr>
+          <w:rFonts w:ascii="Consolas" w:eastAsia="Consolas" w:hAnsi="Consolas" w:cs="Consolas"/>
+        </w:rPr>
+        <w:t xml:space="preserve">/api</w:t>
+      </w:r>
+      <w:r>
+        <w:t xml:space="preserve"> sang 8091, và các giá trị cấu hình giả chỉ cho lượt này. Xong thì dừng tiến trình và xóa container.</w:t>
+      </w:r>
+    </w:p>
+    <w:p>
+      <w:pPr>
+        <w:pStyle w:val="Heading3"/>
+      </w:pPr>
+      <w:r>
+        <w:t xml:space="preserve">4.7 Kiểm chứng (FE-70)</w:t>
+      </w:r>
+    </w:p>
+    <w:p>
+      <w:pPr>
+        <w:pStyle w:val="ListParagraph"/>
+        <w:numPr>
+          <w:ilvl w:val="0"/>
+          <w:numId w:val="1"/>
+        </w:numPr>
+      </w:pPr>
+      <w:r>
+        <w:t xml:space="preserve">RED 15 test, GREEN; </w:t>
+      </w:r>
+      <w:r>
+        <w:rPr>
+          <w:rFonts w:ascii="Consolas" w:eastAsia="Consolas" w:hAnsi="Consolas" w:cs="Consolas"/>
+        </w:rPr>
+        <w:t xml:space="preserve">pnpm lint</w:t>
+      </w:r>
+      <w:r>
+        <w:t xml:space="preserve"> 0 cảnh báo, </w:t>
+      </w:r>
+      <w:r>
+        <w:rPr>
+          <w:rFonts w:ascii="Consolas" w:eastAsia="Consolas" w:hAnsi="Consolas" w:cs="Consolas"/>
+        </w:rPr>
+        <w:t xml:space="preserve">tsc -b</w:t>
+      </w:r>
+      <w:r>
+        <w:t xml:space="preserve"> 0, </w:t>
+      </w:r>
+      <w:r>
+        <w:rPr>
+          <w:rFonts w:ascii="Consolas" w:eastAsia="Consolas" w:hAnsi="Consolas" w:cs="Consolas"/>
+        </w:rPr>
+        <w:t xml:space="preserve">vitest</w:t>
+      </w:r>
+      <w:r>
+        <w:t xml:space="preserve"> 556/556, </w:t>
+      </w:r>
+      <w:r>
+        <w:rPr>
+          <w:rFonts w:ascii="Consolas" w:eastAsia="Consolas" w:hAnsi="Consolas" w:cs="Consolas"/>
+        </w:rPr>
+        <w:t xml:space="preserve">pnpm build</w:t>
+      </w:r>
+      <w:r>
+        <w:t xml:space="preserve"> 0.</w:t>
+      </w:r>
+    </w:p>
+    <w:p>
+      <w:pPr>
+        <w:pStyle w:val="ListParagraph"/>
+        <w:numPr>
+          <w:ilvl w:val="0"/>
+          <w:numId w:val="1"/>
+        </w:numPr>
+      </w:pPr>
+      <w:r>
+        <w:t xml:space="preserve">Chrome với backend thật: thêm, xong (máy chủ tạo lần kế tiếp T5 12/11), ghi chú (</w:t>
+      </w:r>
+      <w:r>
+        <w:rPr>
+          <w:rFonts w:ascii="Consolas" w:eastAsia="Consolas" w:hAnsi="Consolas" w:cs="Consolas"/>
+        </w:rPr>
+        <w:t xml:space="preserve">PATCH</w:t>
+      </w:r>
+      <w:r>
+        <w:t xml:space="preserve"> 200), tải lại vẫn còn; số trên điều hướng theo dữ liệu thật; 1440 và 390 (iframe 390 px), không cuộn ngang, không lỗi console.</w:t>
       </w:r>
     </w:p>
     <w:p/>

</xml_diff>

<commit_message>
feat(fe-71): the task form for due, time and repeat, and deleting a task
"Sửa" opens /tasks/:taskId/edit: a dialog from 768 px and a page of its own
below, as the canvas InboxTask without the reminder and the message link.
Giờ is a select as on the canvas, with "Giờ khác…" for a time of one's own;
"Tùy chỉnh…" sets every N, the weekdays and the end. The form sends only
what changed: the due and the rule first, then the title and the notes; a
rule that does not fit the due is said at Lặp lại. "Xóa task" asks again,
then goes back to the list in place of the detail. timeZoneLabel moves to
shared/time so the task form and Lịch share it.

Co-Authored-By: Claude Opus 5.5 (1M context) <noreply@anthropic.com>
</commit_message>
<xml_diff>
--- a/docs/knowledge/phase-4-planner.docx
+++ b/docs/knowledge/phase-4-planner.docx
@@ -106,7 +106,7 @@
         <w:t xml:space="preserve">openspec/changes/f16-f17-tasks-calendar</w:t>
       </w:r>
       <w:r>
-        <w:t xml:space="preserve"> (việc cần làm có hạn và lặp lại, lịch hẹn, xem lịch theo khoảng ngày; chưa có nhắc nhở, chưa gắn tin nhắn): BE-70, BE-71, BE-72, FE-70.</w:t>
+        <w:t xml:space="preserve"> (việc cần làm có hạn và lặp lại, lịch hẹn, xem lịch theo khoảng ngày; chưa có nhắc nhở, chưa gắn tin nhắn): BE-70, BE-71, BE-72, FE-70, FE-71.</w:t>
         <w:br/>
       </w:r>
       <w:r>
@@ -5372,6 +5372,1048 @@
       </w:r>
       <w:r>
         <w:t xml:space="preserve"> 200), tải lại vẫn còn; số trên điều hướng theo dữ liệu thật; 1440 và 390 (iframe 390 px), không cuộn ngang, không lỗi console.</w:t>
+      </w:r>
+    </w:p>
+    <w:p>
+      <w:pPr>
+        <w:pBdr>
+          <w:bottom w:val="single" w:sz="4" w:space="0" w:color="auto"/>
+        </w:pBdr>
+        <w:ind w:left="0"/>
+      </w:pPr>
+    </w:p>
+    <w:p>
+      <w:pPr>
+        <w:pStyle w:val="Heading2"/>
+      </w:pPr>
+      <w:r>
+        <w:t xml:space="preserve">5. Biểu mẫu sửa việc và xóa việc (FE-71)</w:t>
+      </w:r>
+    </w:p>
+    <w:p>
+      <w:r>
+        <w:rPr>
+          <w:b/>
+          <w:bCs/>
+        </w:rPr>
+        <w:t xml:space="preserve">Ở đâu</w:t>
+      </w:r>
+      <w:r>
+        <w:t xml:space="preserve"> (tính từ </w:t>
+      </w:r>
+      <w:r>
+        <w:rPr>
+          <w:rFonts w:ascii="Consolas" w:eastAsia="Consolas" w:hAnsi="Consolas" w:cs="Consolas"/>
+        </w:rPr>
+        <w:t xml:space="preserve">apps/sino-web/src/</w:t>
+      </w:r>
+      <w:r>
+        <w:t xml:space="preserve">): </w:t>
+      </w:r>
+      <w:r>
+        <w:rPr>
+          <w:rFonts w:ascii="Consolas" w:eastAsia="Consolas" w:hAnsi="Consolas" w:cs="Consolas"/>
+        </w:rPr>
+        <w:t xml:space="preserve">features/tasks/taskForm.ts</w:t>
+      </w:r>
+      <w:r>
+        <w:t xml:space="preserve">; </w:t>
+      </w:r>
+      <w:r>
+        <w:rPr>
+          <w:rFonts w:ascii="Consolas" w:eastAsia="Consolas" w:hAnsi="Consolas" w:cs="Consolas"/>
+        </w:rPr>
+        <w:t xml:space="preserve">features/tasks/components/TaskForm.tsx</w:t>
+      </w:r>
+      <w:r>
+        <w:t xml:space="preserve">, </w:t>
+      </w:r>
+      <w:r>
+        <w:rPr>
+          <w:rFonts w:ascii="Consolas" w:eastAsia="Consolas" w:hAnsi="Consolas" w:cs="Consolas"/>
+        </w:rPr>
+        <w:t xml:space="preserve">RecurrenceField.tsx</w:t>
+      </w:r>
+      <w:r>
+        <w:t xml:space="preserve">, </w:t>
+      </w:r>
+      <w:r>
+        <w:rPr>
+          <w:rFonts w:ascii="Consolas" w:eastAsia="Consolas" w:hAnsi="Consolas" w:cs="Consolas"/>
+        </w:rPr>
+        <w:t xml:space="preserve">DeleteTaskDialog.tsx</w:t>
+      </w:r>
+      <w:r>
+        <w:t xml:space="preserve">, </w:t>
+      </w:r>
+      <w:r>
+        <w:rPr>
+          <w:rFonts w:ascii="Consolas" w:eastAsia="Consolas" w:hAnsi="Consolas" w:cs="Consolas"/>
+        </w:rPr>
+        <w:t xml:space="preserve">fields.tsx</w:t>
+      </w:r>
+      <w:r>
+        <w:t xml:space="preserve">, </w:t>
+      </w:r>
+      <w:r>
+        <w:rPr>
+          <w:rFonts w:ascii="Consolas" w:eastAsia="Consolas" w:hAnsi="Consolas" w:cs="Consolas"/>
+        </w:rPr>
+        <w:t xml:space="preserve">fieldProps.ts</w:t>
+      </w:r>
+      <w:r>
+        <w:t xml:space="preserve">; </w:t>
+      </w:r>
+      <w:r>
+        <w:rPr>
+          <w:rFonts w:ascii="Consolas" w:eastAsia="Consolas" w:hAnsi="Consolas" w:cs="Consolas"/>
+        </w:rPr>
+        <w:t xml:space="preserve">tasks.api.ts</w:t>
+      </w:r>
+      <w:r>
+        <w:t xml:space="preserve"> (</w:t>
+      </w:r>
+      <w:r>
+        <w:rPr>
+          <w:rFonts w:ascii="Consolas" w:eastAsia="Consolas" w:hAnsi="Consolas" w:cs="Consolas"/>
+        </w:rPr>
+        <w:t xml:space="preserve">updateTask</w:t>
+      </w:r>
+      <w:r>
+        <w:t xml:space="preserve">, </w:t>
+      </w:r>
+      <w:r>
+        <w:rPr>
+          <w:rFonts w:ascii="Consolas" w:eastAsia="Consolas" w:hAnsi="Consolas" w:cs="Consolas"/>
+        </w:rPr>
+        <w:t xml:space="preserve">scheduleTask</w:t>
+      </w:r>
+      <w:r>
+        <w:t xml:space="preserve">, </w:t>
+      </w:r>
+      <w:r>
+        <w:rPr>
+          <w:rFonts w:ascii="Consolas" w:eastAsia="Consolas" w:hAnsi="Consolas" w:cs="Consolas"/>
+        </w:rPr>
+        <w:t xml:space="preserve">deleteTask</w:t>
+      </w:r>
+      <w:r>
+        <w:t xml:space="preserve">); </w:t>
+      </w:r>
+      <w:r>
+        <w:rPr>
+          <w:rFonts w:ascii="Consolas" w:eastAsia="Consolas" w:hAnsi="Consolas" w:cs="Consolas"/>
+        </w:rPr>
+        <w:t xml:space="preserve">useTasks.ts</w:t>
+      </w:r>
+      <w:r>
+        <w:t xml:space="preserve"> (</w:t>
+      </w:r>
+      <w:r>
+        <w:rPr>
+          <w:rFonts w:ascii="Consolas" w:eastAsia="Consolas" w:hAnsi="Consolas" w:cs="Consolas"/>
+        </w:rPr>
+        <w:t xml:space="preserve">useUpdateTask</w:t>
+      </w:r>
+      <w:r>
+        <w:t xml:space="preserve">, </w:t>
+      </w:r>
+      <w:r>
+        <w:rPr>
+          <w:rFonts w:ascii="Consolas" w:eastAsia="Consolas" w:hAnsi="Consolas" w:cs="Consolas"/>
+        </w:rPr>
+        <w:t xml:space="preserve">useDeleteTask</w:t>
+      </w:r>
+      <w:r>
+        <w:t xml:space="preserve">); </w:t>
+      </w:r>
+      <w:r>
+        <w:rPr>
+          <w:rFonts w:ascii="Consolas" w:eastAsia="Consolas" w:hAnsi="Consolas" w:cs="Consolas"/>
+        </w:rPr>
+        <w:t xml:space="preserve">TasksPage.tsx</w:t>
+      </w:r>
+      <w:r>
+        <w:t xml:space="preserve">; </w:t>
+      </w:r>
+      <w:r>
+        <w:rPr>
+          <w:rFonts w:ascii="Consolas" w:eastAsia="Consolas" w:hAnsi="Consolas" w:cs="Consolas"/>
+        </w:rPr>
+        <w:t xml:space="preserve">app/router.tsx</w:t>
+      </w:r>
+      <w:r>
+        <w:t xml:space="preserve"> (route </w:t>
+      </w:r>
+      <w:r>
+        <w:rPr>
+          <w:rFonts w:ascii="Consolas" w:eastAsia="Consolas" w:hAnsi="Consolas" w:cs="Consolas"/>
+        </w:rPr>
+        <w:t xml:space="preserve">tasks/:taskId/edit</w:t>
+      </w:r>
+      <w:r>
+        <w:t xml:space="preserve">); </w:t>
+      </w:r>
+      <w:r>
+        <w:rPr>
+          <w:rFonts w:ascii="Consolas" w:eastAsia="Consolas" w:hAnsi="Consolas" w:cs="Consolas"/>
+        </w:rPr>
+        <w:t xml:space="preserve">shared/time/local.ts</w:t>
+      </w:r>
+      <w:r>
+        <w:t xml:space="preserve"> (</w:t>
+      </w:r>
+      <w:r>
+        <w:rPr>
+          <w:rFonts w:ascii="Consolas" w:eastAsia="Consolas" w:hAnsi="Consolas" w:cs="Consolas"/>
+        </w:rPr>
+        <w:t xml:space="preserve">timeZoneLabel</w:t>
+      </w:r>
+      <w:r>
+        <w:t xml:space="preserve">, chuyển từ Lịch sang). Test: </w:t>
+      </w:r>
+      <w:r>
+        <w:rPr>
+          <w:rFonts w:ascii="Consolas" w:eastAsia="Consolas" w:hAnsi="Consolas" w:cs="Consolas"/>
+        </w:rPr>
+        <w:t xml:space="preserve">taskForm.test.ts</w:t>
+      </w:r>
+      <w:r>
+        <w:t xml:space="preserve">, </w:t>
+      </w:r>
+      <w:r>
+        <w:rPr>
+          <w:rFonts w:ascii="Consolas" w:eastAsia="Consolas" w:hAnsi="Consolas" w:cs="Consolas"/>
+        </w:rPr>
+        <w:t xml:space="preserve">TaskForm.test.tsx</w:t>
+      </w:r>
+      <w:r>
+        <w:t xml:space="preserve">, </w:t>
+      </w:r>
+      <w:r>
+        <w:rPr>
+          <w:rFonts w:ascii="Consolas" w:eastAsia="Consolas" w:hAnsi="Consolas" w:cs="Consolas"/>
+        </w:rPr>
+        <w:t xml:space="preserve">test/tasksBackend.ts</w:t>
+      </w:r>
+      <w:r>
+        <w:t xml:space="preserve">.</w:t>
+      </w:r>
+    </w:p>
+    <w:p>
+      <w:pPr>
+        <w:shd w:val="clear" w:color="auto" w:fill="F2F3F5"/>
+        <w:ind w:left="0"/>
+      </w:pPr>
+      <w:r>
+        <w:rPr>
+          <w:rFonts w:ascii="Consolas" w:eastAsia="Consolas" w:hAnsi="Consolas" w:cs="Consolas"/>
+          <w:sz w:val="19"/>
+          <w:szCs w:val="19"/>
+        </w:rPr>
+        <w:t xml:space="preserve">"Sửa" trong chi tiết ──&gt; /tasks/:id/edit ──&gt; TasksPage</w:t>
+        <w:br/>
+        <w:t xml:space="preserve">                                               |  từ 768 px : TaskFormDialog (hộp thoại trên trang)</w:t>
+        <w:br/>
+        <w:t xml:space="preserve">                                               |  dưới 768 px: TaskFormPage (trang riêng, "Lưu" trên đầu)</w:t>
+        <w:br/>
+        <w:t xml:space="preserve">                                               v</w:t>
+        <w:br/>
+        <w:t xml:space="preserve">                          useTaskForm: values = formOf(task)</w:t>
+        <w:br/>
+        <w:t xml:space="preserve">                                               |  "Lưu": validate(values) --lỗi--&gt; hiện cạnh ô, không gửi</w:t>
+        <w:br/>
+        <w:t xml:space="preserve">                                               |  scheduleOf(values) khác của việc? --&gt; PUT /api/tasks/{id}/schedule</w:t>
+        <w:br/>
+        <w:t xml:space="preserve">                                               |  tiêu đề / ghi chú khác?           --&gt; PATCH /api/tasks/{id}</w:t>
+        <w:br/>
+        <w:t xml:space="preserve">                                               v</w:t>
+        <w:br/>
+        <w:t xml:space="preserve">                          xong: đóng biểu mẫu | lỗi: errorsOf(error) --&gt; cạnh ô, hoặc dưới biểu mẫu</w:t>
+      </w:r>
+    </w:p>
+    <w:p>
+      <w:pPr>
+        <w:pStyle w:val="Heading3"/>
+      </w:pPr>
+      <w:r>
+        <w:t xml:space="preserve">5.1 Logic thuần tách khỏi giao diện</w:t>
+      </w:r>
+    </w:p>
+    <w:p>
+      <w:r>
+        <w:rPr>
+          <w:b/>
+          <w:bCs/>
+        </w:rPr>
+        <w:t xml:space="preserve">Là gì:</w:t>
+      </w:r>
+      <w:r>
+        <w:t xml:space="preserve"> </w:t>
+      </w:r>
+      <w:r>
+        <w:rPr>
+          <w:rFonts w:ascii="Consolas" w:eastAsia="Consolas" w:hAnsi="Consolas" w:cs="Consolas"/>
+        </w:rPr>
+        <w:t xml:space="preserve">taskForm.ts</w:t>
+      </w:r>
+      <w:r>
+        <w:t xml:space="preserve"> không có React: bốn hàm nhận dữ liệu, trả dữ liệu. </w:t>
+      </w:r>
+      <w:r>
+        <w:rPr>
+          <w:rFonts w:ascii="Consolas" w:eastAsia="Consolas" w:hAnsi="Consolas" w:cs="Consolas"/>
+        </w:rPr>
+        <w:t xml:space="preserve">formOf(task)</w:t>
+      </w:r>
+      <w:r>
+        <w:t xml:space="preserve"> đọc một việc thành giá trị của biểu mẫu; </w:t>
+      </w:r>
+      <w:r>
+        <w:rPr>
+          <w:rFonts w:ascii="Consolas" w:eastAsia="Consolas" w:hAnsi="Consolas" w:cs="Consolas"/>
+        </w:rPr>
+        <w:t xml:space="preserve">scheduleOf(values)</w:t>
+      </w:r>
+      <w:r>
+        <w:t xml:space="preserve"> dựng thân của </w:t>
+      </w:r>
+      <w:r>
+        <w:rPr>
+          <w:rFonts w:ascii="Consolas" w:eastAsia="Consolas" w:hAnsi="Consolas" w:cs="Consolas"/>
+        </w:rPr>
+        <w:t xml:space="preserve">PUT …/schedule</w:t>
+      </w:r>
+      <w:r>
+        <w:t xml:space="preserve">; </w:t>
+      </w:r>
+      <w:r>
+        <w:rPr>
+          <w:rFonts w:ascii="Consolas" w:eastAsia="Consolas" w:hAnsi="Consolas" w:cs="Consolas"/>
+        </w:rPr>
+        <w:t xml:space="preserve">validate(values)</w:t>
+      </w:r>
+      <w:r>
+        <w:t xml:space="preserve"> trả các lỗi trước khi gửi; </w:t>
+      </w:r>
+      <w:r>
+        <w:rPr>
+          <w:rFonts w:ascii="Consolas" w:eastAsia="Consolas" w:hAnsi="Consolas" w:cs="Consolas"/>
+        </w:rPr>
+        <w:t xml:space="preserve">errorsOf(error)</w:t>
+      </w:r>
+      <w:r>
+        <w:t xml:space="preserve"> đặt lỗi của máy chủ vào ô.</w:t>
+        <w:br/>
+      </w:r>
+      <w:r>
+        <w:rPr>
+          <w:b/>
+          <w:bCs/>
+        </w:rPr>
+        <w:t xml:space="preserve">Vì sao:</w:t>
+      </w:r>
+      <w:r>
+        <w:t xml:space="preserve"> phần khó của biểu mẫu là quy đổi (giờ địa phương sang UTC, lựa chọn "Hằng tuần" thành quy tắc, ngày gốc hằng tháng), không phải vẽ ô. Tách ra thì 15 test chạy trong vài mili giây, không cần dựng màn, và component chỉ còn nối ô với giá trị.</w:t>
+        <w:br/>
+      </w:r>
+      <w:r>
+        <w:rPr>
+          <w:b/>
+          <w:bCs/>
+        </w:rPr>
+        <w:t xml:space="preserve">Bẫy:</w:t>
+      </w:r>
+      <w:r>
+        <w:t xml:space="preserve"> </w:t>
+      </w:r>
+      <w:r>
+        <w:rPr>
+          <w:rFonts w:ascii="Consolas" w:eastAsia="Consolas" w:hAnsi="Consolas" w:cs="Consolas"/>
+        </w:rPr>
+        <w:t xml:space="preserve">new Date('2026-10-09T17:00:00')</w:t>
+      </w:r>
+      <w:r>
+        <w:t xml:space="preserve"> (không có </w:t>
+      </w:r>
+      <w:r>
+        <w:rPr>
+          <w:rFonts w:ascii="Consolas" w:eastAsia="Consolas" w:hAnsi="Consolas" w:cs="Consolas"/>
+        </w:rPr>
+        <w:t xml:space="preserve">Z</w:t>
+      </w:r>
+      <w:r>
+        <w:t xml:space="preserve">) là 17:00 </w:t>
+      </w:r>
+      <w:r>
+        <w:rPr>
+          <w:b/>
+          <w:bCs/>
+        </w:rPr>
+        <w:t xml:space="preserve">theo giờ của trình duyệt</w:t>
+      </w:r>
+      <w:r>
+        <w:t xml:space="preserve">, rồi </w:t>
+      </w:r>
+      <w:r>
+        <w:rPr>
+          <w:rFonts w:ascii="Consolas" w:eastAsia="Consolas" w:hAnsi="Consolas" w:cs="Consolas"/>
+        </w:rPr>
+        <w:t xml:space="preserve">toISOString()</w:t>
+      </w:r>
+      <w:r>
+        <w:t xml:space="preserve"> đổi sang UTC (</w:t>
+      </w:r>
+      <w:r>
+        <w:rPr>
+          <w:rFonts w:ascii="Consolas" w:eastAsia="Consolas" w:hAnsi="Consolas" w:cs="Consolas"/>
+        </w:rPr>
+        <w:t xml:space="preserve">10:00:00.000Z</w:t>
+      </w:r>
+      <w:r>
+        <w:t xml:space="preserve"> ở Việt Nam). Test chỉ đúng khi múi giờ cố định: </w:t>
+      </w:r>
+      <w:r>
+        <w:rPr>
+          <w:rFonts w:ascii="Consolas" w:eastAsia="Consolas" w:hAnsi="Consolas" w:cs="Consolas"/>
+        </w:rPr>
+        <w:t xml:space="preserve">vite.config.ts</w:t>
+      </w:r>
+      <w:r>
+        <w:t xml:space="preserve"> đặt </w:t>
+      </w:r>
+      <w:r>
+        <w:rPr>
+          <w:rFonts w:ascii="Consolas" w:eastAsia="Consolas" w:hAnsi="Consolas" w:cs="Consolas"/>
+        </w:rPr>
+        <w:t xml:space="preserve">TZ: 'Asia/Ho_Chi_Minh'</w:t>
+      </w:r>
+      <w:r>
+        <w:t xml:space="preserve"> cho Vitest, CI chạy UTC cũng ra cùng kết quả.</w:t>
+      </w:r>
+    </w:p>
+    <w:p>
+      <w:pPr>
+        <w:pStyle w:val="Heading3"/>
+      </w:pPr>
+      <w:r>
+        <w:t xml:space="preserve">5.2 Vì sao biểu mẫu có đường dẫn riêng chứ không chỉ là state của trang (câu gợi ý của task)</w:t>
+      </w:r>
+    </w:p>
+    <w:p>
+      <w:r>
+        <w:t xml:space="preserve">Nếu biểu mẫu chỉ là một biến </w:t>
+      </w:r>
+      <w:r>
+        <w:rPr>
+          <w:rFonts w:ascii="Consolas" w:eastAsia="Consolas" w:hAnsi="Consolas" w:cs="Consolas"/>
+        </w:rPr>
+        <w:t xml:space="preserve">open</w:t>
+      </w:r>
+      <w:r>
+        <w:t xml:space="preserve"> trong </w:t>
+      </w:r>
+      <w:r>
+        <w:rPr>
+          <w:rFonts w:ascii="Consolas" w:eastAsia="Consolas" w:hAnsi="Consolas" w:cs="Consolas"/>
+        </w:rPr>
+        <w:t xml:space="preserve">TasksPage</w:t>
+      </w:r>
+      <w:r>
+        <w:t xml:space="preserve">, ba thứ hỏng: trên điện thoại nút Back của máy rời cả màn Việc cần làm thay vì đóng biểu mẫu; tải lại trang mất biểu mẫu; không gửi được đường dẫn "mở biểu mẫu của việc này". Với </w:t>
+      </w:r>
+      <w:r>
+        <w:rPr>
+          <w:rFonts w:ascii="Consolas" w:eastAsia="Consolas" w:hAnsi="Consolas" w:cs="Consolas"/>
+        </w:rPr>
+        <w:t xml:space="preserve">/tasks/:id/edit</w:t>
+      </w:r>
+      <w:r>
+        <w:t xml:space="preserve">, trình duyệt giữ chỗ đang đứng như mọi trang khác (D-82, D-158).</w:t>
+        <w:br/>
+        <w:t xml:space="preserve">Đóng biểu mẫu cũng phải tính tới lịch sử. Mở từ nút "Sửa" thì lịch sử là </w:t>
+      </w:r>
+      <w:r>
+        <w:rPr>
+          <w:rFonts w:ascii="Consolas" w:eastAsia="Consolas" w:hAnsi="Consolas" w:cs="Consolas"/>
+        </w:rPr>
+        <w:t xml:space="preserve">[danh sách, chi tiết, biểu mẫu]</w:t>
+      </w:r>
+      <w:r>
+        <w:t xml:space="preserve">; nếu "Lưu" xong lại </w:t>
+      </w:r>
+      <w:r>
+        <w:rPr>
+          <w:i/>
+          <w:iCs/>
+        </w:rPr>
+        <w:t xml:space="preserve">đẩy</w:t>
+      </w:r>
+      <w:r>
+        <w:t xml:space="preserve"> thêm chi tiết thì Back sẽ mở lại biểu mẫu cũ. Nên nút "Sửa" gắn một dấu vào lịch sử, và lúc đóng thì:</w:t>
+      </w:r>
+    </w:p>
+    <w:p>
+      <w:pPr>
+        <w:shd w:val="clear" w:color="auto" w:fill="F2F3F5"/>
+        <w:ind w:left="0"/>
+      </w:pPr>
+      <w:r>
+        <w:rPr>
+          <w:rFonts w:ascii="Consolas" w:eastAsia="Consolas" w:hAnsi="Consolas" w:cs="Consolas"/>
+          <w:sz w:val="19"/>
+          <w:szCs w:val="19"/>
+        </w:rPr>
+        <w:t xml:space="preserve">const fromDetail: EditState = { fromDetail: true }</w:t>
+        <w:br/>
+        <w:t xml:space="preserve">&lt;Link to={edit} state={fromDetail}&gt;Sửa&lt;/Link&gt;</w:t>
+        <w:br/>
+        <w:t xml:space="preserve">...</w:t>
+        <w:br/>
+        <w:t xml:space="preserve">const closeForm = () =&gt; (location.state?.fromDetail ? navigate(-1) : navigate(detailPath, { replace: true }))</w:t>
+      </w:r>
+    </w:p>
+    <w:p>
+      <w:pPr>
+        <w:shd w:val="clear" w:color="auto" w:fill="F2F3F5"/>
+        <w:ind w:left="0"/>
+      </w:pPr>
+      <w:r>
+        <w:rPr>
+          <w:rFonts w:ascii="Consolas" w:eastAsia="Consolas" w:hAnsi="Consolas" w:cs="Consolas"/>
+          <w:sz w:val="19"/>
+          <w:szCs w:val="19"/>
+        </w:rPr>
+        <w:t xml:space="preserve">mở từ "Sửa":            [danh sách, chi tiết, biểu mẫu]  --navigate(-1)--&gt;  [danh sách, chi tiết]</w:t>
+        <w:br/>
+        <w:t xml:space="preserve">mở thẳng bằng địa chỉ:  [biểu mẫu]                        --replace-------&gt;  [chi tiết]</w:t>
+      </w:r>
+    </w:p>
+    <w:p>
+      <w:r>
+        <w:t xml:space="preserve">Xóa việc dùng cùng ý: về danh sách bằng </w:t>
+      </w:r>
+      <w:r>
+        <w:rPr>
+          <w:rFonts w:ascii="Consolas" w:eastAsia="Consolas" w:hAnsi="Consolas" w:cs="Consolas"/>
+        </w:rPr>
+        <w:t xml:space="preserve">replace</w:t>
+      </w:r>
+      <w:r>
+        <w:t xml:space="preserve">, nên Back không quay về trang chi tiết của một việc đã mất.</w:t>
+      </w:r>
+    </w:p>
+    <w:p>
+      <w:pPr>
+        <w:pStyle w:val="Heading3"/>
+      </w:pPr>
+      <w:r>
+        <w:t xml:space="preserve">5.3 Chỉ gửi phần đã đổi, và gửi hạn trước</w:t>
+      </w:r>
+    </w:p>
+    <w:p>
+      <w:r>
+        <w:t xml:space="preserve">Biểu mẫu so giá trị hiện tại với việc đang lưu, và chỉ gửi phần khác:</w:t>
+      </w:r>
+    </w:p>
+    <w:p>
+      <w:pPr>
+        <w:shd w:val="clear" w:color="auto" w:fill="F2F3F5"/>
+        <w:ind w:left="0"/>
+      </w:pPr>
+      <w:r>
+        <w:rPr>
+          <w:rFonts w:ascii="Consolas" w:eastAsia="Consolas" w:hAnsi="Consolas" w:cs="Consolas"/>
+          <w:sz w:val="19"/>
+          <w:szCs w:val="19"/>
+        </w:rPr>
+        <w:t xml:space="preserve">if (JSON.stringify(scheduleOf(values)) !== JSON.stringify(scheduleOf(formOf(task)))) changes.schedule = …</w:t>
+      </w:r>
+    </w:p>
+    <w:p>
+      <w:r>
+        <w:t xml:space="preserve">Cả hai vế đều đi qua </w:t>
+      </w:r>
+      <w:r>
+        <w:rPr>
+          <w:rFonts w:ascii="Consolas" w:eastAsia="Consolas" w:hAnsi="Consolas" w:cs="Consolas"/>
+        </w:rPr>
+        <w:t xml:space="preserve">formOf</w:t>
+      </w:r>
+      <w:r>
+        <w:t xml:space="preserve"> rồi </w:t>
+      </w:r>
+      <w:r>
+        <w:rPr>
+          <w:rFonts w:ascii="Consolas" w:eastAsia="Consolas" w:hAnsi="Consolas" w:cs="Consolas"/>
+        </w:rPr>
+        <w:t xml:space="preserve">scheduleOf</w:t>
+      </w:r>
+      <w:r>
+        <w:t xml:space="preserve">, nên biểu mẫu chưa đụng tới luôn "không đổi", kể cả khi máy chủ lưu dạng hơi khác (giây lẻ, thứ tự các thứ). </w:t>
+      </w:r>
+      <w:r>
+        <w:rPr>
+          <w:b/>
+          <w:bCs/>
+        </w:rPr>
+        <w:t xml:space="preserve">Vì sao:</w:t>
+      </w:r>
+      <w:r>
+        <w:t xml:space="preserve"> đặt lại quy tắc là bắt đầu chuỗi mới (BE-71, D-159), không nên xảy ra chỉ vì người dùng sửa tiêu đề; và một quy tắc cũ không còn khớp sẽ làm cả lần sửa tiêu đề bị 422.</w:t>
+        <w:br/>
+        <w:t xml:space="preserve">Thứ tự: </w:t>
+      </w:r>
+      <w:r>
+        <w:rPr>
+          <w:rFonts w:ascii="Consolas" w:eastAsia="Consolas" w:hAnsi="Consolas" w:cs="Consolas"/>
+        </w:rPr>
+        <w:t xml:space="preserve">PUT …/schedule</w:t>
+      </w:r>
+      <w:r>
+        <w:t xml:space="preserve"> trước, </w:t>
+      </w:r>
+      <w:r>
+        <w:rPr>
+          <w:rFonts w:ascii="Consolas" w:eastAsia="Consolas" w:hAnsi="Consolas" w:cs="Consolas"/>
+        </w:rPr>
+        <w:t xml:space="preserve">PATCH</w:t>
+      </w:r>
+      <w:r>
+        <w:t xml:space="preserve"> sau, vì 422 là lỗi hay gặp nhất; nó đến trước khi có gì được lưu. Mỗi câu trả lời thay việc trong cache ngay, nên nếu </w:t>
+      </w:r>
+      <w:r>
+        <w:rPr>
+          <w:rFonts w:ascii="Consolas" w:eastAsia="Consolas" w:hAnsi="Consolas" w:cs="Consolas"/>
+        </w:rPr>
+        <w:t xml:space="preserve">PUT</w:t>
+      </w:r>
+      <w:r>
+        <w:t xml:space="preserve"> được mà </w:t>
+      </w:r>
+      <w:r>
+        <w:rPr>
+          <w:rFonts w:ascii="Consolas" w:eastAsia="Consolas" w:hAnsi="Consolas" w:cs="Consolas"/>
+        </w:rPr>
+        <w:t xml:space="preserve">PATCH</w:t>
+      </w:r>
+      <w:r>
+        <w:t xml:space="preserve"> lỗi thì lần "Lưu" sau chỉ còn gửi </w:t>
+      </w:r>
+      <w:r>
+        <w:rPr>
+          <w:rFonts w:ascii="Consolas" w:eastAsia="Consolas" w:hAnsi="Consolas" w:cs="Consolas"/>
+        </w:rPr>
+        <w:t xml:space="preserve">PATCH</w:t>
+      </w:r>
+      <w:r>
+        <w:t xml:space="preserve">.</w:t>
+      </w:r>
+    </w:p>
+    <w:p>
+      <w:pPr>
+        <w:pStyle w:val="Heading3"/>
+      </w:pPr>
+      <w:r>
+        <w:t xml:space="preserve">5.4 Một quy tắc, hai cách nhìn: lựa chọn có sẵn và "Tùy chỉnh…"</w:t>
+      </w:r>
+    </w:p>
+    <w:p>
+      <w:r>
+        <w:t xml:space="preserve">Máy chủ chỉ biết một kiểu </w:t>
+      </w:r>
+      <w:r>
+        <w:rPr>
+          <w:rFonts w:ascii="Consolas" w:eastAsia="Consolas" w:hAnsi="Consolas" w:cs="Consolas"/>
+        </w:rPr>
+        <w:t xml:space="preserve">Recurrence</w:t>
+      </w:r>
+      <w:r>
+        <w:t xml:space="preserve">. Biểu mẫu nhìn nó theo hai cách: "Hằng ngày / tuần / tháng / năm" là quy tắc mỗi 1, không điểm kết thúc (hằng tuần thì đúng thứ của ngày hạn); mọi thứ khác là "Tùy chỉnh…" với mỗi N, các thứ, điểm kết thúc. Lựa chọn có sẵn được dựng lại từ ngày mỗi lần lưu, nên đổi hạn từ thứ Hai sang thứ Sáu thì "Hằng tuần" tự thành "mỗi thứ Sáu".</w:t>
+        <w:br/>
+        <w:t xml:space="preserve">Ngày gốc hằng tháng là chỗ tinh tế: quy tắc bắt đầu ngày 31, lần tháng 11 rơi vào 30/11. Biểu mẫu giữ </w:t>
+      </w:r>
+      <w:r>
+        <w:rPr>
+          <w:rFonts w:ascii="Consolas" w:eastAsia="Consolas" w:hAnsi="Consolas" w:cs="Consolas"/>
+        </w:rPr>
+        <w:t xml:space="preserve">byMonthDay = 31</w:t>
+      </w:r>
+      <w:r>
+        <w:t xml:space="preserve"> khi ngày còn "khớp" (bằng, hoặc lớn hơn và ngày là cuối tháng); người dùng dời sang 29/11 thì gửi </w:t>
+      </w:r>
+      <w:r>
+        <w:rPr>
+          <w:rFonts w:ascii="Consolas" w:eastAsia="Consolas" w:hAnsi="Consolas" w:cs="Consolas"/>
+        </w:rPr>
+        <w:t xml:space="preserve">null</w:t>
+      </w:r>
+      <w:r>
+        <w:t xml:space="preserve"> để máy chủ lấy ngày theo hạn mới.</w:t>
+      </w:r>
+    </w:p>
+    <w:p>
+      <w:pPr>
+        <w:pStyle w:val="Heading3"/>
+      </w:pPr>
+      <w:r>
+        <w:t xml:space="preserve">5.5 Lỗi hiện đúng chỗ</w:t>
+      </w:r>
+    </w:p>
+    <w:p>
+      <w:r>
+        <w:t xml:space="preserve">Hai nguồn lỗi, một cách hiện:</w:t>
+      </w:r>
+    </w:p>
+    <w:p>
+      <w:pPr>
+        <w:pStyle w:val="ListParagraph"/>
+        <w:numPr>
+          <w:ilvl w:val="0"/>
+          <w:numId w:val="1"/>
+        </w:numPr>
+      </w:pPr>
+      <w:r>
+        <w:rPr>
+          <w:rFonts w:ascii="Consolas" w:eastAsia="Consolas" w:hAnsi="Consolas" w:cs="Consolas"/>
+        </w:rPr>
+        <w:t xml:space="preserve">validate</w:t>
+      </w:r>
+      <w:r>
+        <w:t xml:space="preserve"> chặn trước khi gửi những gì chắc chắn sai (tiêu đề trống, giờ trống, mỗi N ngoài 1…99, hằng tuần không chọn thứ nào, ngày kết thúc trước hạn, số lần ngoài 1…999).</w:t>
+      </w:r>
+    </w:p>
+    <w:p>
+      <w:pPr>
+        <w:pStyle w:val="ListParagraph"/>
+        <w:numPr>
+          <w:ilvl w:val="0"/>
+          <w:numId w:val="1"/>
+        </w:numPr>
+      </w:pPr>
+      <w:r>
+        <w:rPr>
+          <w:rFonts w:ascii="Consolas" w:eastAsia="Consolas" w:hAnsi="Consolas" w:cs="Consolas"/>
+        </w:rPr>
+        <w:t xml:space="preserve">errorsOf</w:t>
+      </w:r>
+      <w:r>
+        <w:t xml:space="preserve"> đọc lỗi của máy chủ: </w:t>
+      </w:r>
+      <w:r>
+        <w:rPr>
+          <w:rFonts w:ascii="Consolas" w:eastAsia="Consolas" w:hAnsi="Consolas" w:cs="Consolas"/>
+        </w:rPr>
+        <w:t xml:space="preserve">422 INVALID_RECURRENCE</w:t>
+      </w:r>
+      <w:r>
+        <w:t xml:space="preserve"> đặt ở ô Lặp lại; </w:t>
+      </w:r>
+      <w:r>
+        <w:rPr>
+          <w:rFonts w:ascii="Consolas" w:eastAsia="Consolas" w:hAnsi="Consolas" w:cs="Consolas"/>
+        </w:rPr>
+        <w:t xml:space="preserve">400</w:t>
+      </w:r>
+      <w:r>
+        <w:t xml:space="preserve"> đọc tên trường trong Problem Details (</w:t>
+      </w:r>
+      <w:r>
+        <w:rPr>
+          <w:rFonts w:ascii="Consolas" w:eastAsia="Consolas" w:hAnsi="Consolas" w:cs="Consolas"/>
+        </w:rPr>
+        <w:t xml:space="preserve">title…</w:t>
+      </w:r>
+      <w:r>
+        <w:t xml:space="preserve">, </w:t>
+      </w:r>
+      <w:r>
+        <w:rPr>
+          <w:rFonts w:ascii="Consolas" w:eastAsia="Consolas" w:hAnsi="Consolas" w:cs="Consolas"/>
+        </w:rPr>
+        <w:t xml:space="preserve">dueAt</w:t>
+      </w:r>
+      <w:r>
+        <w:t xml:space="preserve">, </w:t>
+      </w:r>
+      <w:r>
+        <w:rPr>
+          <w:rFonts w:ascii="Consolas" w:eastAsia="Consolas" w:hAnsi="Consolas" w:cs="Consolas"/>
+        </w:rPr>
+        <w:t xml:space="preserve">oneDueAtMost</w:t>
+      </w:r>
+      <w:r>
+        <w:t xml:space="preserve">, </w:t>
+      </w:r>
+      <w:r>
+        <w:rPr>
+          <w:rFonts w:ascii="Consolas" w:eastAsia="Consolas" w:hAnsi="Consolas" w:cs="Consolas"/>
+        </w:rPr>
+        <w:t xml:space="preserve">recurrence.interval</w:t>
+      </w:r>
+      <w:r>
+        <w:t xml:space="preserve">, </w:t>
+      </w:r>
+      <w:r>
+        <w:rPr>
+          <w:rFonts w:ascii="Consolas" w:eastAsia="Consolas" w:hAnsi="Consolas" w:cs="Consolas"/>
+        </w:rPr>
+        <w:t xml:space="preserve">repeatingWithADue</w:t>
+      </w:r>
+      <w:r>
+        <w:t xml:space="preserve">…) để chọn ô; còn lại là một dòng dưới biểu mẫu. Câu chữ tiếng Việt nằm ở web; câu tiếng Anh của Bean Validation chỉ để lập trình viên đọc.</w:t>
+      </w:r>
+    </w:p>
+    <w:p>
+      <w:r>
+        <w:t xml:space="preserve">Mỗi ô lỗi có </w:t>
+      </w:r>
+      <w:r>
+        <w:rPr>
+          <w:rFonts w:ascii="Consolas" w:eastAsia="Consolas" w:hAnsi="Consolas" w:cs="Consolas"/>
+        </w:rPr>
+        <w:t xml:space="preserve">aria-invalid</w:t>
+      </w:r>
+      <w:r>
+        <w:t xml:space="preserve"> và </w:t>
+      </w:r>
+      <w:r>
+        <w:rPr>
+          <w:rFonts w:ascii="Consolas" w:eastAsia="Consolas" w:hAnsi="Consolas" w:cs="Consolas"/>
+        </w:rPr>
+        <w:t xml:space="preserve">aria-describedby</w:t>
+      </w:r>
+      <w:r>
+        <w:t xml:space="preserve"> trỏ tới dòng lỗi, nên trình đọc màn hình đọc cả lỗi khi vào ô. Form đặt </w:t>
+      </w:r>
+      <w:r>
+        <w:rPr>
+          <w:rFonts w:ascii="Consolas" w:eastAsia="Consolas" w:hAnsi="Consolas" w:cs="Consolas"/>
+        </w:rPr>
+        <w:t xml:space="preserve">noValidate</w:t>
+      </w:r>
+      <w:r>
+        <w:t xml:space="preserve">: không để trình duyệt hiện bong bóng kiểm tra của nó (tiếng Anh, mỗi trình duyệt một kiểu), mọi câu báo đều do biểu mẫu nói.</w:t>
+      </w:r>
+    </w:p>
+    <w:p>
+      <w:pPr>
+        <w:pStyle w:val="Heading3"/>
+      </w:pPr>
+      <w:r>
+        <w:t xml:space="preserve">5.6 Bẫy test: địa chỉ đổi trước khi màn vẽ lại</w:t>
+      </w:r>
+    </w:p>
+    <w:p>
+      <w:r>
+        <w:t xml:space="preserve">Hai bẫy gặp khi viết </w:t>
+      </w:r>
+      <w:r>
+        <w:rPr>
+          <w:rFonts w:ascii="Consolas" w:eastAsia="Consolas" w:hAnsi="Consolas" w:cs="Consolas"/>
+        </w:rPr>
+        <w:t xml:space="preserve">TaskForm.test.tsx</w:t>
+      </w:r>
+      <w:r>
+        <w:t xml:space="preserve">:</w:t>
+      </w:r>
+    </w:p>
+    <w:p>
+      <w:pPr>
+        <w:pStyle w:val="ListParagraph"/>
+        <w:numPr>
+          <w:ilvl w:val="0"/>
+          <w:numId w:val="1"/>
+        </w:numPr>
+      </w:pPr>
+      <w:r>
+        <w:t xml:space="preserve">Khi hộp thoại Radix mở, mọi phần khác của trang bị gắn </w:t>
+      </w:r>
+      <w:r>
+        <w:rPr>
+          <w:rFonts w:ascii="Consolas" w:eastAsia="Consolas" w:hAnsi="Consolas" w:cs="Consolas"/>
+        </w:rPr>
+        <w:t xml:space="preserve">aria-hidden</w:t>
+      </w:r>
+      <w:r>
+        <w:t xml:space="preserve">, nên </w:t>
+      </w:r>
+      <w:r>
+        <w:rPr>
+          <w:rFonts w:ascii="Consolas" w:eastAsia="Consolas" w:hAnsi="Consolas" w:cs="Consolas"/>
+        </w:rPr>
+        <w:t xml:space="preserve">getByRole('region', { name: 'Danh sách việc' })</w:t>
+      </w:r>
+      <w:r>
+        <w:t xml:space="preserve"> </w:t>
+      </w:r>
+      <w:r>
+        <w:rPr>
+          <w:b/>
+          <w:bCs/>
+        </w:rPr>
+        <w:t xml:space="preserve">không thấy</w:t>
+      </w:r>
+      <w:r>
+        <w:t xml:space="preserve"> danh sách. Test mở thẳng </w:t>
+      </w:r>
+      <w:r>
+        <w:rPr>
+          <w:rFonts w:ascii="Consolas" w:eastAsia="Consolas" w:hAnsi="Consolas" w:cs="Consolas"/>
+        </w:rPr>
+        <w:t xml:space="preserve">/tasks/:id/edit</w:t>
+      </w:r>
+      <w:r>
+        <w:t xml:space="preserve"> phải chờ hộp thoại, không chờ danh sách.</w:t>
+      </w:r>
+    </w:p>
+    <w:p>
+      <w:pPr>
+        <w:pStyle w:val="ListParagraph"/>
+        <w:numPr>
+          <w:ilvl w:val="0"/>
+          <w:numId w:val="1"/>
+        </w:numPr>
+      </w:pPr>
+      <w:r>
+        <w:rPr>
+          <w:rFonts w:ascii="Consolas" w:eastAsia="Consolas" w:hAnsi="Consolas" w:cs="Consolas"/>
+        </w:rPr>
+        <w:t xml:space="preserve">router.state.location</w:t>
+      </w:r>
+      <w:r>
+        <w:t xml:space="preserve"> đổi ngay khi gọi </w:t>
+      </w:r>
+      <w:r>
+        <w:rPr>
+          <w:rFonts w:ascii="Consolas" w:eastAsia="Consolas" w:hAnsi="Consolas" w:cs="Consolas"/>
+        </w:rPr>
+        <w:t xml:space="preserve">navigate</w:t>
+      </w:r>
+      <w:r>
+        <w:t xml:space="preserve">, còn React vẽ lại sau. Kiểm danh sách ngay sau khi địa chỉ đổi thì hộp thoại vẫn còn, danh sách vẫn bị ẩn. Test chờ hộp thoại biến mất (</w:t>
+      </w:r>
+      <w:r>
+        <w:rPr>
+          <w:rFonts w:ascii="Consolas" w:eastAsia="Consolas" w:hAnsi="Consolas" w:cs="Consolas"/>
+        </w:rPr>
+        <w:t xml:space="preserve">formClosed()</w:t>
+      </w:r>
+      <w:r>
+        <w:t xml:space="preserve">) rồi mới kiểm.</w:t>
+      </w:r>
+    </w:p>
+    <w:p>
+      <w:pPr>
+        <w:pStyle w:val="Heading3"/>
+      </w:pPr>
+      <w:r>
+        <w:t xml:space="preserve">5.7 Kiểm chứng (FE-71)</w:t>
+      </w:r>
+    </w:p>
+    <w:p>
+      <w:pPr>
+        <w:pStyle w:val="ListParagraph"/>
+        <w:numPr>
+          <w:ilvl w:val="0"/>
+          <w:numId w:val="1"/>
+        </w:numPr>
+      </w:pPr>
+      <w:r>
+        <w:t xml:space="preserve">RED 19 test và một file không nạp được (chưa có </w:t>
+      </w:r>
+      <w:r>
+        <w:rPr>
+          <w:rFonts w:ascii="Consolas" w:eastAsia="Consolas" w:hAnsi="Consolas" w:cs="Consolas"/>
+        </w:rPr>
+        <w:t xml:space="preserve">taskForm.ts</w:t>
+      </w:r>
+      <w:r>
+        <w:t xml:space="preserve">); GREEN; ca "Back không mở lại biểu mẫu" viết sau nên gài lỗi một lần (</w:t>
+      </w:r>
+      <w:r>
+        <w:rPr>
+          <w:rFonts w:ascii="Consolas" w:eastAsia="Consolas" w:hAnsi="Consolas" w:cs="Consolas"/>
+        </w:rPr>
+        <w:t xml:space="preserve">navigate(-1)</w:t>
+      </w:r>
+      <w:r>
+        <w:t xml:space="preserve"> thành </w:t>
+      </w:r>
+      <w:r>
+        <w:rPr>
+          <w:rFonts w:ascii="Consolas" w:eastAsia="Consolas" w:hAnsi="Consolas" w:cs="Consolas"/>
+        </w:rPr>
+        <w:t xml:space="preserve">replace</w:t>
+      </w:r>
+      <w:r>
+        <w:t xml:space="preserve">): test đỏ, trả code lại.</w:t>
+      </w:r>
+    </w:p>
+    <w:p>
+      <w:pPr>
+        <w:pStyle w:val="ListParagraph"/>
+        <w:numPr>
+          <w:ilvl w:val="0"/>
+          <w:numId w:val="1"/>
+        </w:numPr>
+      </w:pPr>
+      <w:r>
+        <w:rPr>
+          <w:rFonts w:ascii="Consolas" w:eastAsia="Consolas" w:hAnsi="Consolas" w:cs="Consolas"/>
+        </w:rPr>
+        <w:t xml:space="preserve">pnpm lint</w:t>
+      </w:r>
+      <w:r>
+        <w:t xml:space="preserve"> 0 cảnh báo (tách </w:t>
+      </w:r>
+      <w:r>
+        <w:rPr>
+          <w:rFonts w:ascii="Consolas" w:eastAsia="Consolas" w:hAnsi="Consolas" w:cs="Consolas"/>
+        </w:rPr>
+        <w:t xml:space="preserve">fieldProps.ts</w:t>
+      </w:r>
+      <w:r>
+        <w:t xml:space="preserve"> vì file component không nên export hàm thường), </w:t>
+      </w:r>
+      <w:r>
+        <w:rPr>
+          <w:rFonts w:ascii="Consolas" w:eastAsia="Consolas" w:hAnsi="Consolas" w:cs="Consolas"/>
+        </w:rPr>
+        <w:t xml:space="preserve">tsc -b</w:t>
+      </w:r>
+      <w:r>
+        <w:t xml:space="preserve"> 0, </w:t>
+      </w:r>
+      <w:r>
+        <w:rPr>
+          <w:rFonts w:ascii="Consolas" w:eastAsia="Consolas" w:hAnsi="Consolas" w:cs="Consolas"/>
+        </w:rPr>
+        <w:t xml:space="preserve">vitest</w:t>
+      </w:r>
+      <w:r>
+        <w:t xml:space="preserve"> 590/590, </w:t>
+      </w:r>
+      <w:r>
+        <w:rPr>
+          <w:rFonts w:ascii="Consolas" w:eastAsia="Consolas" w:hAnsi="Consolas" w:cs="Consolas"/>
+        </w:rPr>
+        <w:t xml:space="preserve">pnpm build</w:t>
+      </w:r>
+      <w:r>
+        <w:t xml:space="preserve"> 0.</w:t>
+      </w:r>
+    </w:p>
+    <w:p>
+      <w:pPr>
+        <w:pStyle w:val="ListParagraph"/>
+        <w:numPr>
+          <w:ilvl w:val="0"/>
+          <w:numId w:val="1"/>
+        </w:numPr>
+      </w:pPr>
+      <w:r>
+        <w:t xml:space="preserve">Chrome với backend thật: "Tùy chỉnh…" mỗi 2 tuần thứ Hai và thứ Năm sau 6 lần (máy chủ lưu đúng); dời hạn sang thứ Ba → 422 hiện cạnh ô Lặp lại; Esc không đổi gì; bỏ hạn → việc về "KHÔNG CÓ HẠN"; xóa có hỏi lại; 768 (hộp thoại) và 390 (trang riêng, thu chip để bảy thứ nằm một dòng); không lỗi console.</w:t>
       </w:r>
     </w:p>
     <w:p/>

</xml_diff>

<commit_message>
docs(f15): save diagram notes too, record BE-90 and the AUTO override
f15-notes now stores diagram notes with the text notes (kind + diagram jsonb,
D-179; D-171 superseded): proposal, design, specs notes and notes-screen, tasks.
BE-90 ticked with its evidence; F15.1 added to the Phase 4 knowledge file (md and
docx). project-mode.yaml: f15-notes runs in AUTO (user, 2026-10-19).

Co-Authored-By: Claude Sonnet 5.5 <noreply@anthropic.com>
</commit_message>
<xml_diff>
--- a/docs/knowledge/phase-4-planner.docx
+++ b/docs/knowledge/phase-4-planner.docx
@@ -7,7 +7,7 @@
         <w:pStyle w:val="Heading1"/>
       </w:pPr>
       <w:r>
-        <w:t xml:space="preserve">Kiến thức Phase 4 — Việc cần làm và Lịch</w:t>
+        <w:t xml:space="preserve">Kiến thức Phase 4 — Việc cần làm, Lịch và Ghi chú</w:t>
       </w:r>
     </w:p>
     <w:p>
@@ -106,7 +106,16 @@
         <w:t xml:space="preserve">openspec/changes/f16-f17-tasks-calendar</w:t>
       </w:r>
       <w:r>
-        <w:t xml:space="preserve"> (việc cần làm có hạn và lặp lại, lịch hẹn, xem lịch theo khoảng ngày; chưa có nhắc nhở, chưa gắn tin nhắn): BE-70, BE-71, BE-72, FE-70, FE-71.</w:t>
+        <w:t xml:space="preserve"> (việc cần làm có hạn và lặp lại, lịch hẹn, xem lịch theo khoảng ngày; chưa có nhắc nhở, chưa gắn tin nhắn): BE-70, BE-71, BE-72, FE-70, FE-71. Phần lõi của F15, </w:t>
+      </w:r>
+      <w:r>
+        <w:rPr>
+          <w:rFonts w:ascii="Consolas" w:eastAsia="Consolas" w:hAnsi="Consolas" w:cs="Consolas"/>
+        </w:rPr>
+        <w:t xml:space="preserve">openspec/changes/f15-notes</w:t>
+      </w:r>
+      <w:r>
+        <w:t xml:space="preserve"> (ghi chú chữ và ghi chú dạng sơ đồ lưu trong database, chưa gắn tin nhắn), nằm ở phần cuối, mục "Ghi chú (F15)": BE-90.</w:t>
         <w:br/>
       </w:r>
       <w:r>
@@ -117,7 +126,7 @@
         <w:t xml:space="preserve">Cập nhật:</w:t>
       </w:r>
       <w:r>
-        <w:t xml:space="preserve"> 2026-10-12. Đường dẫn backend tính từ </w:t>
+        <w:t xml:space="preserve"> 2026-10-19. Đường dẫn backend tính từ </w:t>
       </w:r>
       <w:r>
         <w:rPr>
@@ -6414,6 +6423,1764 @@
       </w:pPr>
       <w:r>
         <w:t xml:space="preserve">Chrome với backend thật: "Tùy chỉnh…" mỗi 2 tuần thứ Hai và thứ Năm sau 6 lần (máy chủ lưu đúng); dời hạn sang thứ Ba → 422 hiện cạnh ô Lặp lại; Esc không đổi gì; bỏ hạn → việc về "KHÔNG CÓ HẠN"; xóa có hỏi lại; 768 (hộp thoại) và 390 (trang riêng, thu chip để bảy thứ nằm một dòng); không lỗi console.</w:t>
+      </w:r>
+    </w:p>
+    <w:p>
+      <w:pPr>
+        <w:pBdr>
+          <w:bottom w:val="single" w:sz="4" w:space="0" w:color="auto"/>
+        </w:pBdr>
+        <w:ind w:left="0"/>
+      </w:pPr>
+    </w:p>
+    <w:p>
+      <w:pPr>
+        <w:pStyle w:val="Heading2"/>
+      </w:pPr>
+      <w:r>
+        <w:t xml:space="preserve">Ghi chú (F15)</w:t>
+      </w:r>
+    </w:p>
+    <w:p>
+      <w:r>
+        <w:t xml:space="preserve">Màn Ghi chú của web (ghi chú chữ và ghi chú dạng sơ đồ) dựng xong trên dữ liệu mẫu, nên tải lại trang là mất hết. F15 cho nó một chỗ lưu thật: module mới </w:t>
+      </w:r>
+      <w:r>
+        <w:rPr>
+          <w:rFonts w:ascii="Consolas" w:eastAsia="Consolas" w:hAnsi="Consolas" w:cs="Consolas"/>
+        </w:rPr>
+        <w:t xml:space="preserve">notes</w:t>
+      </w:r>
+      <w:r>
+        <w:t xml:space="preserve">, đứng riêng như </w:t>
+      </w:r>
+      <w:r>
+        <w:rPr>
+          <w:rFonts w:ascii="Consolas" w:eastAsia="Consolas" w:hAnsi="Consolas" w:cs="Consolas"/>
+        </w:rPr>
+        <w:t xml:space="preserve">planner</w:t>
+      </w:r>
+      <w:r>
+        <w:t xml:space="preserve">, chỉ phụ thuộc </w:t>
+      </w:r>
+      <w:r>
+        <w:rPr>
+          <w:rFonts w:ascii="Consolas" w:eastAsia="Consolas" w:hAnsi="Consolas" w:cs="Consolas"/>
+        </w:rPr>
+        <w:t xml:space="preserve">identity</w:t>
+      </w:r>
+      <w:r>
+        <w:t xml:space="preserve"> (ai đang gọi) và </w:t>
+      </w:r>
+      <w:r>
+        <w:rPr>
+          <w:rFonts w:ascii="Consolas" w:eastAsia="Consolas" w:hAnsi="Consolas" w:cs="Consolas"/>
+        </w:rPr>
+        <w:t xml:space="preserve">common</w:t>
+      </w:r>
+      <w:r>
+        <w:t xml:space="preserve">. Change: </w:t>
+      </w:r>
+      <w:r>
+        <w:rPr>
+          <w:rFonts w:ascii="Consolas" w:eastAsia="Consolas" w:hAnsi="Consolas" w:cs="Consolas"/>
+        </w:rPr>
+        <w:t xml:space="preserve">openspec/changes/f15-notes</w:t>
+      </w:r>
+      <w:r>
+        <w:t xml:space="preserve">.</w:t>
+      </w:r>
+    </w:p>
+    <w:tbl>
+      <w:tblPr>
+        <w:tblW w:w="9360" w:type="dxa"/>
+        <w:tblBorders>
+          <w:top w:val="single" w:sz="4" w:space="0" w:color="auto"/>
+          <w:left w:val="single" w:sz="4" w:space="0" w:color="auto"/>
+          <w:bottom w:val="single" w:sz="4" w:space="0" w:color="auto"/>
+          <w:right w:val="single" w:sz="4" w:space="0" w:color="auto"/>
+          <w:insideH w:val="single" w:sz="4" w:space="0" w:color="auto"/>
+          <w:insideV w:val="single" w:sz="4" w:space="0" w:color="auto"/>
+        </w:tblBorders>
+        <w:tblLayout w:type="fixed"/>
+      </w:tblPr>
+      <w:tblGrid>
+        <w:gridCol w:w="4680"/>
+        <w:gridCol w:w="4680"/>
+      </w:tblGrid>
+      <w:tr>
+        <w:tc>
+          <w:tcPr>
+            <w:tcW w:w="4680" w:type="dxa"/>
+            <w:shd w:val="clear" w:color="auto" w:fill="F2F2F2"/>
+          </w:tcPr>
+          <w:p>
+            <w:r>
+              <w:t xml:space="preserve">Quyết định</w:t>
+            </w:r>
+          </w:p>
+        </w:tc>
+        <w:tc>
+          <w:tcPr>
+            <w:tcW w:w="4680" w:type="dxa"/>
+            <w:shd w:val="clear" w:color="auto" w:fill="F2F2F2"/>
+          </w:tcPr>
+          <w:p>
+            <w:r>
+              <w:t xml:space="preserve">Nội dung</w:t>
+            </w:r>
+          </w:p>
+        </w:tc>
+      </w:tr>
+      <w:tr>
+        <w:tc>
+          <w:tcPr>
+            <w:tcW w:w="4680" w:type="dxa"/>
+          </w:tcPr>
+          <w:p>
+            <w:r>
+              <w:t xml:space="preserve">D-170</w:t>
+            </w:r>
+          </w:p>
+        </w:tc>
+        <w:tc>
+          <w:tcPr>
+            <w:tcW w:w="4680" w:type="dxa"/>
+          </w:tcPr>
+          <w:p>
+            <w:r>
+              <w:t xml:space="preserve">Ghi chú độc lập trước, gắn tin nhắn đợt sau (người dùng)</w:t>
+            </w:r>
+          </w:p>
+        </w:tc>
+      </w:tr>
+      <w:tr>
+        <w:tc>
+          <w:tcPr>
+            <w:tcW w:w="4680" w:type="dxa"/>
+          </w:tcPr>
+          <w:p>
+            <w:r>
+              <w:t xml:space="preserve">D-172</w:t>
+            </w:r>
+          </w:p>
+        </w:tc>
+        <w:tc>
+          <w:tcPr>
+            <w:tcW w:w="4680" w:type="dxa"/>
+          </w:tcPr>
+          <w:p>
+            <w:r>
+              <w:t xml:space="preserve">Lưu phải kèm </w:t>
+            </w:r>
+            <w:r>
+              <w:rPr>
+                <w:rFonts w:ascii="Consolas" w:eastAsia="Consolas" w:hAnsi="Consolas" w:cs="Consolas"/>
+              </w:rPr>
+              <w:t xml:space="preserve">version</w:t>
+            </w:r>
+            <w:r>
+              <w:t xml:space="preserve"> đã đọc; lệch thì </w:t>
+            </w:r>
+            <w:r>
+              <w:rPr>
+                <w:rFonts w:ascii="Consolas" w:eastAsia="Consolas" w:hAnsi="Consolas" w:cs="Consolas"/>
+              </w:rPr>
+              <w:t xml:space="preserve">409</w:t>
+            </w:r>
+            <w:r>
+              <w:t xml:space="preserve">, không ghi gì (người dùng)</w:t>
+            </w:r>
+          </w:p>
+        </w:tc>
+      </w:tr>
+      <w:tr>
+        <w:tc>
+          <w:tcPr>
+            <w:tcW w:w="4680" w:type="dxa"/>
+          </w:tcPr>
+          <w:p>
+            <w:r>
+              <w:t xml:space="preserve">D-173</w:t>
+            </w:r>
+          </w:p>
+        </w:tc>
+        <w:tc>
+          <w:tcPr>
+            <w:tcW w:w="4680" w:type="dxa"/>
+          </w:tcPr>
+          <w:p>
+            <w:r>
+              <w:t xml:space="preserve">Danh sách trả đủ nội dung; tìm và lọc ở trình duyệt (người dùng)</w:t>
+            </w:r>
+          </w:p>
+        </w:tc>
+      </w:tr>
+      <w:tr>
+        <w:tc>
+          <w:tcPr>
+            <w:tcW w:w="4680" w:type="dxa"/>
+          </w:tcPr>
+          <w:p>
+            <w:r>
+              <w:t xml:space="preserve">D-174</w:t>
+            </w:r>
+          </w:p>
+        </w:tc>
+        <w:tc>
+          <w:tcPr>
+            <w:tcW w:w="4680" w:type="dxa"/>
+          </w:tcPr>
+          <w:p>
+            <w:r>
+              <w:t xml:space="preserve">Ghi chú chữ bắt buộc có nội dung; tiêu đề tùy chọn (người dùng)</w:t>
+            </w:r>
+          </w:p>
+        </w:tc>
+      </w:tr>
+      <w:tr>
+        <w:tc>
+          <w:tcPr>
+            <w:tcW w:w="4680" w:type="dxa"/>
+          </w:tcPr>
+          <w:p>
+            <w:r>
+              <w:t xml:space="preserve">D-175</w:t>
+            </w:r>
+          </w:p>
+        </w:tc>
+        <w:tc>
+          <w:tcPr>
+            <w:tcW w:w="4680" w:type="dxa"/>
+          </w:tcPr>
+          <w:p>
+            <w:r>
+              <w:t xml:space="preserve">Ghim không phải một lần sửa: không đổi </w:t>
+            </w:r>
+            <w:r>
+              <w:rPr>
+                <w:rFonts w:ascii="Consolas" w:eastAsia="Consolas" w:hAnsi="Consolas" w:cs="Consolas"/>
+              </w:rPr>
+              <w:t xml:space="preserve">updated_at</w:t>
+            </w:r>
+            <w:r>
+              <w:t xml:space="preserve"> (người dùng duyệt)</w:t>
+            </w:r>
+          </w:p>
+        </w:tc>
+      </w:tr>
+      <w:tr>
+        <w:tc>
+          <w:tcPr>
+            <w:tcW w:w="4680" w:type="dxa"/>
+          </w:tcPr>
+          <w:p>
+            <w:r>
+              <w:t xml:space="preserve">D-179</w:t>
+            </w:r>
+          </w:p>
+        </w:tc>
+        <w:tc>
+          <w:tcPr>
+            <w:tcW w:w="4680" w:type="dxa"/>
+          </w:tcPr>
+          <w:p>
+            <w:r>
+              <w:t xml:space="preserve">Ghi chú sơ đồ nằm cùng bảng </w:t>
+            </w:r>
+            <w:r>
+              <w:rPr>
+                <w:rFonts w:ascii="Consolas" w:eastAsia="Consolas" w:hAnsi="Consolas" w:cs="Consolas"/>
+              </w:rPr>
+              <w:t xml:space="preserve">note</w:t>
+            </w:r>
+            <w:r>
+              <w:t xml:space="preserve">: cột </w:t>
+            </w:r>
+            <w:r>
+              <w:rPr>
+                <w:rFonts w:ascii="Consolas" w:eastAsia="Consolas" w:hAnsi="Consolas" w:cs="Consolas"/>
+              </w:rPr>
+              <w:t xml:space="preserve">kind</w:t>
+            </w:r>
+            <w:r>
+              <w:t xml:space="preserve"> và </w:t>
+            </w:r>
+            <w:r>
+              <w:rPr>
+                <w:rFonts w:ascii="Consolas" w:eastAsia="Consolas" w:hAnsi="Consolas" w:cs="Consolas"/>
+              </w:rPr>
+              <w:t xml:space="preserve">diagram jsonb</w:t>
+            </w:r>
+            <w:r>
+              <w:t xml:space="preserve"> (người dùng, 2026-10-19; thay D-171 "sơ đồ là change riêng")</w:t>
+            </w:r>
+          </w:p>
+        </w:tc>
+      </w:tr>
+    </w:tbl>
+    <w:p>
+      <w:pPr>
+        <w:pStyle w:val="Heading3"/>
+      </w:pPr>
+      <w:r>
+        <w:t xml:space="preserve">F15.1 Bảng </w:t>
+      </w:r>
+      <w:r>
+        <w:rPr>
+          <w:rFonts w:ascii="Consolas" w:eastAsia="Consolas" w:hAnsi="Consolas" w:cs="Consolas"/>
+        </w:rPr>
+        <w:t xml:space="preserve">note</w:t>
+      </w:r>
+      <w:r>
+        <w:t xml:space="preserve">, </w:t>
+      </w:r>
+      <w:r>
+        <w:rPr>
+          <w:rFonts w:ascii="Consolas" w:eastAsia="Consolas" w:hAnsi="Consolas" w:cs="Consolas"/>
+        </w:rPr>
+        <w:t xml:space="preserve">Note</w:t>
+      </w:r>
+      <w:r>
+        <w:t xml:space="preserve">, </w:t>
+      </w:r>
+      <w:r>
+        <w:rPr>
+          <w:rFonts w:ascii="Consolas" w:eastAsia="Consolas" w:hAnsi="Consolas" w:cs="Consolas"/>
+        </w:rPr>
+        <w:t xml:space="preserve">Diagram</w:t>
+      </w:r>
+      <w:r>
+        <w:t xml:space="preserve"> và </w:t>
+      </w:r>
+      <w:r>
+        <w:rPr>
+          <w:rFonts w:ascii="Consolas" w:eastAsia="Consolas" w:hAnsi="Consolas" w:cs="Consolas"/>
+        </w:rPr>
+        <w:t xml:space="preserve">NoteService</w:t>
+      </w:r>
+      <w:r>
+        <w:t xml:space="preserve"> (BE-90)</w:t>
+      </w:r>
+    </w:p>
+    <w:p>
+      <w:r>
+        <w:rPr>
+          <w:b/>
+          <w:bCs/>
+        </w:rPr>
+        <w:t xml:space="preserve">Ở đâu:</w:t>
+      </w:r>
+      <w:r>
+        <w:t xml:space="preserve"> </w:t>
+      </w:r>
+      <w:r>
+        <w:rPr>
+          <w:rFonts w:ascii="Consolas" w:eastAsia="Consolas" w:hAnsi="Consolas" w:cs="Consolas"/>
+        </w:rPr>
+        <w:t xml:space="preserve">notes/domain/{Note, NoteKind, Diagram, DiagramBlock, DiagramLink, Side, BlockColor, NotesErrorCode}</w:t>
+      </w:r>
+      <w:r>
+        <w:t xml:space="preserve">; </w:t>
+      </w:r>
+      <w:r>
+        <w:rPr>
+          <w:rFonts w:ascii="Consolas" w:eastAsia="Consolas" w:hAnsi="Consolas" w:cs="Consolas"/>
+        </w:rPr>
+        <w:t xml:space="preserve">notes/application/{NoteService, NewNote, NoteChange}</w:t>
+      </w:r>
+      <w:r>
+        <w:t xml:space="preserve">; </w:t>
+      </w:r>
+      <w:r>
+        <w:rPr>
+          <w:rFonts w:ascii="Consolas" w:eastAsia="Consolas" w:hAnsi="Consolas" w:cs="Consolas"/>
+        </w:rPr>
+        <w:t xml:space="preserve">notes/infrastructure/NoteRepository</w:t>
+      </w:r>
+      <w:r>
+        <w:t xml:space="preserve">; </w:t>
+      </w:r>
+      <w:r>
+        <w:rPr>
+          <w:rFonts w:ascii="Consolas" w:eastAsia="Consolas" w:hAnsi="Consolas" w:cs="Consolas"/>
+        </w:rPr>
+        <w:t xml:space="preserve">db/migration/V20__notes_create_note.sql</w:t>
+      </w:r>
+      <w:r>
+        <w:t xml:space="preserve">.</w:t>
+      </w:r>
+    </w:p>
+    <w:p>
+      <w:pPr>
+        <w:shd w:val="clear" w:color="auto" w:fill="F2F3F5"/>
+        <w:ind w:left="0"/>
+      </w:pPr>
+      <w:r>
+        <w:rPr>
+          <w:rFonts w:ascii="Consolas" w:eastAsia="Consolas" w:hAnsi="Consolas" w:cs="Consolas"/>
+          <w:sz w:val="19"/>
+          <w:szCs w:val="19"/>
+        </w:rPr>
+        <w:t xml:space="preserve">note</w:t>
+        <w:br/>
+        <w:t xml:space="preserve">  id  user_id  kind  title  body  diagram  pinned  created_at  updated_at  version</w:t>
+        <w:br/>
+        <w:t xml:space="preserve">                |             |       |</w:t>
+        <w:br/>
+        <w:t xml:space="preserve">                |             |       +-- jsonb: cả sơ đồ {"blocks":[...], "links":[...]}</w:t>
+        <w:br/>
+        <w:t xml:space="preserve">                |             +---------- chữ của ghi chú chữ; rỗng ('') với sơ đồ</w:t>
+        <w:br/>
+        <w:t xml:space="preserve">                +------------------------ TEXT | DIAGRAM, chọn lúc tạo, không bao giờ đổi</w:t>
+        <w:br/>
+        <w:br/>
+        <w:t xml:space="preserve">TEXT    : body có chữ, diagram = NULL</w:t>
+        <w:br/>
+        <w:t xml:space="preserve">DIAGRAM : body = '',   diagram là một object JSON</w:t>
+      </w:r>
+    </w:p>
+    <w:p>
+      <w:r>
+        <w:rPr>
+          <w:b/>
+          <w:bCs/>
+        </w:rPr>
+        <w:t xml:space="preserve">Vì sao một bảng và một cột jsonb (D-179).</w:t>
+      </w:r>
+      <w:r>
+        <w:t xml:space="preserve"> Web luôn gửi và nhận cả sơ đồ: mỗi lần tự lưu là thay toàn bộ. Không có chỗ nào cần đọc hay sửa một khối riêng. Một cột jsonb giữ sơ đồ nhất quán trong một lần ghi (không có chuyện đã lưu 3 khối trong 5 rồi lỗi), và dùng chung </w:t>
+      </w:r>
+      <w:r>
+        <w:rPr>
+          <w:rFonts w:ascii="Consolas" w:eastAsia="Consolas" w:hAnsi="Consolas" w:cs="Consolas"/>
+        </w:rPr>
+        <w:t xml:space="preserve">version</w:t>
+      </w:r>
+      <w:r>
+        <w:t xml:space="preserve">, </w:t>
+      </w:r>
+      <w:r>
+        <w:rPr>
+          <w:rFonts w:ascii="Consolas" w:eastAsia="Consolas" w:hAnsi="Consolas" w:cs="Consolas"/>
+        </w:rPr>
+        <w:t xml:space="preserve">409</w:t>
+      </w:r>
+      <w:r>
+        <w:t xml:space="preserve">, ghim, xóa, danh sách với ghi chú chữ. </w:t>
+      </w:r>
+      <w:r>
+        <w:rPr>
+          <w:b/>
+          <w:bCs/>
+        </w:rPr>
+        <w:t xml:space="preserve">Phương án bỏ:</w:t>
+      </w:r>
+      <w:r>
+        <w:t xml:space="preserve"> hai bảng </w:t>
+      </w:r>
+      <w:r>
+        <w:rPr>
+          <w:rFonts w:ascii="Consolas" w:eastAsia="Consolas" w:hAnsi="Consolas" w:cs="Consolas"/>
+        </w:rPr>
+        <w:t xml:space="preserve">note_block</w:t>
+      </w:r>
+      <w:r>
+        <w:t xml:space="preserve"> và </w:t>
+      </w:r>
+      <w:r>
+        <w:rPr>
+          <w:rFonts w:ascii="Consolas" w:eastAsia="Consolas" w:hAnsi="Consolas" w:cs="Consolas"/>
+        </w:rPr>
+        <w:t xml:space="preserve">note_link</w:t>
+      </w:r>
+      <w:r>
+        <w:t xml:space="preserve">: nhiều lệnh mỗi lần lưu, sơ đồ có thể dở dang khi lỗi giữa chừng, mà chưa ai truy vấn theo khối. Khi F11 (tìm toàn văn) cần tìm trong khối thì tách sau.</w:t>
+      </w:r>
+    </w:p>
+    <w:p>
+      <w:r>
+        <w:rPr>
+          <w:rFonts w:ascii="Consolas" w:eastAsia="Consolas" w:hAnsi="Consolas" w:cs="Consolas"/>
+          <w:b/>
+          <w:bCs/>
+        </w:rPr>
+        <w:t xml:space="preserve">Diagram</w:t>
+      </w:r>
+      <w:r>
+        <w:rPr>
+          <w:b/>
+          <w:bCs/>
+        </w:rPr>
+        <w:t xml:space="preserve"> là một </w:t>
+      </w:r>
+      <w:r>
+        <w:rPr>
+          <w:rFonts w:ascii="Consolas" w:eastAsia="Consolas" w:hAnsi="Consolas" w:cs="Consolas"/>
+          <w:b/>
+          <w:bCs/>
+        </w:rPr>
+        <w:t xml:space="preserve">record</w:t>
+      </w:r>
+      <w:r>
+        <w:rPr>
+          <w:b/>
+          <w:bCs/>
+        </w:rPr>
+        <w:t xml:space="preserve"> biết các luật nhìn xuyên.</w:t>
+      </w:r>
+      <w:r>
+        <w:t xml:space="preserve"> Mỗi khối và mỗi nối tự kiểm phần của mình (</w:t>
+      </w:r>
+      <w:r>
+        <w:rPr>
+          <w:rFonts w:ascii="Consolas" w:eastAsia="Consolas" w:hAnsi="Consolas" w:cs="Consolas"/>
+        </w:rPr>
+        <w:t xml:space="preserve">DiagramBlock</w:t>
+      </w:r>
+      <w:r>
+        <w:t xml:space="preserve">: chữ tối đa 2.000 ký tự, tọa độ là số hữu hạn; </w:t>
+      </w:r>
+      <w:r>
+        <w:rPr>
+          <w:rFonts w:ascii="Consolas" w:eastAsia="Consolas" w:hAnsi="Consolas" w:cs="Consolas"/>
+        </w:rPr>
+        <w:t xml:space="preserve">DiagramLink</w:t>
+      </w:r>
+      <w:r>
+        <w:t xml:space="preserve">: nhãn tối đa 80 ký tự). Những luật cần nhìn cả sơ đồ nằm một chỗ, trong compact constructor của </w:t>
+      </w:r>
+      <w:r>
+        <w:rPr>
+          <w:rFonts w:ascii="Consolas" w:eastAsia="Consolas" w:hAnsi="Consolas" w:cs="Consolas"/>
+        </w:rPr>
+        <w:t xml:space="preserve">Diagram</w:t>
+      </w:r>
+      <w:r>
+        <w:t xml:space="preserve">:</w:t>
+      </w:r>
+    </w:p>
+    <w:p>
+      <w:pPr>
+        <w:shd w:val="clear" w:color="auto" w:fill="F2F3F5"/>
+        <w:ind w:left="0"/>
+      </w:pPr>
+      <w:r>
+        <w:rPr>
+          <w:rFonts w:ascii="Consolas" w:eastAsia="Consolas" w:hAnsi="Consolas" w:cs="Consolas"/>
+          <w:sz w:val="19"/>
+          <w:szCs w:val="19"/>
+        </w:rPr>
+        <w:t xml:space="preserve">1 .. 300 khối, tối đa 600 nối</w:t>
+        <w:br/>
+        <w:t xml:space="preserve">mã khối không trùng, mã nối không trùng</w:t>
+        <w:br/>
+        <w:t xml:space="preserve">một nối nối hai khối KHÁC nhau, cả hai nằm trong sơ đồ</w:t>
+        <w:br/>
+        <w:t xml:space="preserve">một cặp (từ, tới) có tối đa một nối      (từ A tới B và từ B tới A là hai nối khác nhau)</w:t>
+      </w:r>
+    </w:p>
+    <w:p>
+      <w:r>
+        <w:t xml:space="preserve">Nhờ vậy không tạo được một </w:t>
+      </w:r>
+      <w:r>
+        <w:rPr>
+          <w:rFonts w:ascii="Consolas" w:eastAsia="Consolas" w:hAnsi="Consolas" w:cs="Consolas"/>
+        </w:rPr>
+        <w:t xml:space="preserve">Diagram</w:t>
+      </w:r>
+      <w:r>
+        <w:t xml:space="preserve"> hỏng ở bất kỳ đâu: API (BE-91) chỉ việc dựng nó, lỗi nào cũng ra từ một chỗ. </w:t>
+      </w:r>
+      <w:r>
+        <w:rPr>
+          <w:rFonts w:ascii="Consolas" w:eastAsia="Consolas" w:hAnsi="Consolas" w:cs="Consolas"/>
+        </w:rPr>
+        <w:t xml:space="preserve">List.copyOf</w:t>
+      </w:r>
+      <w:r>
+        <w:t xml:space="preserve"> trong constructor làm hai việc: sơ đồ không đổi được qua danh sách đã dùng để dựng nó, và </w:t>
+      </w:r>
+      <w:r>
+        <w:rPr>
+          <w:rFonts w:ascii="Consolas" w:eastAsia="Consolas" w:hAnsi="Consolas" w:cs="Consolas"/>
+        </w:rPr>
+        <w:t xml:space="preserve">null</w:t>
+      </w:r>
+      <w:r>
+        <w:t xml:space="preserve"> bị chặn ngay (NullPointerException).</w:t>
+      </w:r>
+    </w:p>
+    <w:p>
+      <w:r>
+        <w:rPr>
+          <w:rFonts w:ascii="Consolas" w:eastAsia="Consolas" w:hAnsi="Consolas" w:cs="Consolas"/>
+          <w:b/>
+          <w:bCs/>
+        </w:rPr>
+        <w:t xml:space="preserve">equals</w:t>
+      </w:r>
+      <w:r>
+        <w:rPr>
+          <w:b/>
+          <w:bCs/>
+        </w:rPr>
+        <w:t xml:space="preserve"> theo nội dung, và vì sao nó quan trọng.</w:t>
+      </w:r>
+      <w:r>
+        <w:t xml:space="preserve"> </w:t>
+      </w:r>
+      <w:r>
+        <w:rPr>
+          <w:rFonts w:ascii="Consolas" w:eastAsia="Consolas" w:hAnsi="Consolas" w:cs="Consolas"/>
+        </w:rPr>
+        <w:t xml:space="preserve">record</w:t>
+      </w:r>
+      <w:r>
+        <w:t xml:space="preserve"> so từng thành phần. Web gửi lại cả sơ đồ ở mỗi lần tự lưu, kể cả lần chẳng có gì đổi (ví dụ đổi tiêu đề). </w:t>
+      </w:r>
+      <w:r>
+        <w:rPr>
+          <w:rFonts w:ascii="Consolas" w:eastAsia="Consolas" w:hAnsi="Consolas" w:cs="Consolas"/>
+        </w:rPr>
+        <w:t xml:space="preserve">Note.edit</w:t>
+      </w:r>
+      <w:r>
+        <w:t xml:space="preserve"> so sơ đồ mới với sơ đồ đang lưu bằng </w:t>
+      </w:r>
+      <w:r>
+        <w:rPr>
+          <w:rFonts w:ascii="Consolas" w:eastAsia="Consolas" w:hAnsi="Consolas" w:cs="Consolas"/>
+        </w:rPr>
+        <w:t xml:space="preserve">Objects.equals</w:t>
+      </w:r>
+      <w:r>
+        <w:t xml:space="preserve">: bằng nhau thì không phải một lần sửa, </w:t>
+      </w:r>
+      <w:r>
+        <w:rPr>
+          <w:rFonts w:ascii="Consolas" w:eastAsia="Consolas" w:hAnsi="Consolas" w:cs="Consolas"/>
+        </w:rPr>
+        <w:t xml:space="preserve">updated_at</w:t>
+      </w:r>
+      <w:r>
+        <w:t xml:space="preserve"> và </w:t>
+      </w:r>
+      <w:r>
+        <w:rPr>
+          <w:rFonts w:ascii="Consolas" w:eastAsia="Consolas" w:hAnsi="Consolas" w:cs="Consolas"/>
+        </w:rPr>
+        <w:t xml:space="preserve">version</w:t>
+      </w:r>
+      <w:r>
+        <w:t xml:space="preserve"> giữ nguyên. Nếu so bằng tham chiếu (</w:t>
+      </w:r>
+      <w:r>
+        <w:rPr>
+          <w:rFonts w:ascii="Consolas" w:eastAsia="Consolas" w:hAnsi="Consolas" w:cs="Consolas"/>
+        </w:rPr>
+        <w:t xml:space="preserve">==</w:t>
+      </w:r>
+      <w:r>
+        <w:t xml:space="preserve">), mọi lần tự lưu đều tăng </w:t>
+      </w:r>
+      <w:r>
+        <w:rPr>
+          <w:rFonts w:ascii="Consolas" w:eastAsia="Consolas" w:hAnsi="Consolas" w:cs="Consolas"/>
+        </w:rPr>
+        <w:t xml:space="preserve">version</w:t>
+      </w:r>
+      <w:r>
+        <w:t xml:space="preserve">, và tab thứ hai sẽ bị </w:t>
+      </w:r>
+      <w:r>
+        <w:rPr>
+          <w:rFonts w:ascii="Consolas" w:eastAsia="Consolas" w:hAnsi="Consolas" w:cs="Consolas"/>
+        </w:rPr>
+        <w:t xml:space="preserve">409</w:t>
+      </w:r>
+      <w:r>
+        <w:t xml:space="preserve"> oan.</w:t>
+      </w:r>
+    </w:p>
+    <w:p>
+      <w:r>
+        <w:rPr>
+          <w:b/>
+          <w:bCs/>
+        </w:rPr>
+        <w:t xml:space="preserve">Hibernate lưu </w:t>
+      </w:r>
+      <w:r>
+        <w:rPr>
+          <w:rFonts w:ascii="Consolas" w:eastAsia="Consolas" w:hAnsi="Consolas" w:cs="Consolas"/>
+          <w:b/>
+          <w:bCs/>
+        </w:rPr>
+        <w:t xml:space="preserve">record</w:t>
+      </w:r>
+      <w:r>
+        <w:rPr>
+          <w:b/>
+          <w:bCs/>
+        </w:rPr>
+        <w:t xml:space="preserve"> lồng nhau vào jsonb.</w:t>
+      </w:r>
+      <w:r>
+        <w:t xml:space="preserve"> Chỉ cần hai dòng trên trường (</w:t>
+      </w:r>
+      <w:r>
+        <w:rPr>
+          <w:rFonts w:ascii="Consolas" w:eastAsia="Consolas" w:hAnsi="Consolas" w:cs="Consolas"/>
+        </w:rPr>
+        <w:t xml:space="preserve">@JdbcTypeCode(SqlTypes.JSON)</w:t>
+      </w:r>
+      <w:r>
+        <w:t xml:space="preserve"> và </w:t>
+      </w:r>
+      <w:r>
+        <w:rPr>
+          <w:rFonts w:ascii="Consolas" w:eastAsia="Consolas" w:hAnsi="Consolas" w:cs="Consolas"/>
+        </w:rPr>
+        <w:t xml:space="preserve">@Column(name = "diagram")</w:t>
+      </w:r>
+      <w:r>
+        <w:t xml:space="preserve">), như </w:t>
+      </w:r>
+      <w:r>
+        <w:rPr>
+          <w:rFonts w:ascii="Consolas" w:eastAsia="Consolas" w:hAnsi="Consolas" w:cs="Consolas"/>
+        </w:rPr>
+        <w:t xml:space="preserve">AccountCredential.scopes</w:t>
+      </w:r>
+      <w:r>
+        <w:t xml:space="preserve">. Điều chưa chắc là danh sách các record lồng nhau có đi qua Jackson 3 (Spring Boot 4) và quay lại đúng không, nên test </w:t>
+      </w:r>
+      <w:r>
+        <w:rPr>
+          <w:rFonts w:ascii="Consolas" w:eastAsia="Consolas" w:hAnsi="Consolas" w:cs="Consolas"/>
+        </w:rPr>
+        <w:t xml:space="preserve">NoteServiceTests</w:t>
+      </w:r>
+      <w:r>
+        <w:t xml:space="preserve"> lưu một sơ đồ có chữ Việt, emoji, dấu nháy kép, xuống dòng và số thập phân dài, đọc lại bằng một lần mở EntityManager khác, và so </w:t>
+      </w:r>
+      <w:r>
+        <w:rPr>
+          <w:rFonts w:ascii="Consolas" w:eastAsia="Consolas" w:hAnsi="Consolas" w:cs="Consolas"/>
+        </w:rPr>
+        <w:t xml:space="preserve">equals</w:t>
+      </w:r>
+      <w:r>
+        <w:t xml:space="preserve"> với bản gốc. Test còn hỏi thẳng jsonb bằng SQL (</w:t>
+      </w:r>
+      <w:r>
+        <w:rPr>
+          <w:rFonts w:ascii="Consolas" w:eastAsia="Consolas" w:hAnsi="Consolas" w:cs="Consolas"/>
+        </w:rPr>
+        <w:t xml:space="preserve">diagram -&gt; 'links' -&gt; 0 -&gt;&gt; 'fromSide'</w:t>
+      </w:r>
+      <w:r>
+        <w:t xml:space="preserve">) để chắc dạng JSON khớp hợp đồng D-211, không chỉ khớp với chính Java.</w:t>
+      </w:r>
+    </w:p>
+    <w:p>
+      <w:r>
+        <w:rPr>
+          <w:rFonts w:ascii="Consolas" w:eastAsia="Consolas" w:hAnsi="Consolas" w:cs="Consolas"/>
+          <w:b/>
+          <w:bCs/>
+        </w:rPr>
+        <w:t xml:space="preserve">kind</w:t>
+      </w:r>
+      <w:r>
+        <w:rPr>
+          <w:b/>
+          <w:bCs/>
+        </w:rPr>
+        <w:t xml:space="preserve"> không đổi, và dùng </w:t>
+      </w:r>
+      <w:r>
+        <w:rPr>
+          <w:rFonts w:ascii="Consolas" w:eastAsia="Consolas" w:hAnsi="Consolas" w:cs="Consolas"/>
+          <w:b/>
+          <w:bCs/>
+        </w:rPr>
+        <w:t xml:space="preserve">STRING</w:t>
+      </w:r>
+      <w:r>
+        <w:rPr>
+          <w:b/>
+          <w:bCs/>
+        </w:rPr>
+        <w:t xml:space="preserve"> chứ không </w:t>
+      </w:r>
+      <w:r>
+        <w:rPr>
+          <w:rFonts w:ascii="Consolas" w:eastAsia="Consolas" w:hAnsi="Consolas" w:cs="Consolas"/>
+          <w:b/>
+          <w:bCs/>
+        </w:rPr>
+        <w:t xml:space="preserve">ORDINAL</w:t>
+      </w:r>
+      <w:r>
+        <w:rPr>
+          <w:b/>
+          <w:bCs/>
+        </w:rPr>
+        <w:t xml:space="preserve">.</w:t>
+      </w:r>
+      <w:r>
+        <w:t xml:space="preserve"> </w:t>
+      </w:r>
+      <w:r>
+        <w:rPr>
+          <w:rFonts w:ascii="Consolas" w:eastAsia="Consolas" w:hAnsi="Consolas" w:cs="Consolas"/>
+        </w:rPr>
+        <w:t xml:space="preserve">@Column(updatable = false)</w:t>
+      </w:r>
+      <w:r>
+        <w:t xml:space="preserve">: Hibernate không bao giờ ghi lại cột này. </w:t>
+      </w:r>
+      <w:r>
+        <w:rPr>
+          <w:rFonts w:ascii="Consolas" w:eastAsia="Consolas" w:hAnsi="Consolas" w:cs="Consolas"/>
+        </w:rPr>
+        <w:t xml:space="preserve">@Enumerated(EnumType.STRING)</w:t>
+      </w:r>
+      <w:r>
+        <w:t xml:space="preserve"> lưu chữ </w:t>
+      </w:r>
+      <w:r>
+        <w:rPr>
+          <w:rFonts w:ascii="Consolas" w:eastAsia="Consolas" w:hAnsi="Consolas" w:cs="Consolas"/>
+        </w:rPr>
+        <w:t xml:space="preserve">TEXT</w:t>
+      </w:r>
+      <w:r>
+        <w:t xml:space="preserve"> / </w:t>
+      </w:r>
+      <w:r>
+        <w:rPr>
+          <w:rFonts w:ascii="Consolas" w:eastAsia="Consolas" w:hAnsi="Consolas" w:cs="Consolas"/>
+        </w:rPr>
+        <w:t xml:space="preserve">DIAGRAM</w:t>
+      </w:r>
+      <w:r>
+        <w:t xml:space="preserve">; </w:t>
+      </w:r>
+      <w:r>
+        <w:rPr>
+          <w:rFonts w:ascii="Consolas" w:eastAsia="Consolas" w:hAnsi="Consolas" w:cs="Consolas"/>
+        </w:rPr>
+        <w:t xml:space="preserve">ORDINAL</w:t>
+      </w:r>
+      <w:r>
+        <w:t xml:space="preserve"> lưu số thứ tự, và thêm một giá trị vào giữa enum sau này sẽ làm mọi hàng cũ đổi nghĩa trong im lặng.</w:t>
+      </w:r>
+    </w:p>
+    <w:p>
+      <w:r>
+        <w:rPr>
+          <w:b/>
+          <w:bCs/>
+        </w:rPr>
+        <w:t xml:space="preserve">Hai tầng chặn khi nhầm loại.</w:t>
+      </w:r>
+      <w:r>
+        <w:t xml:space="preserve"> Trong </w:t>
+      </w:r>
+      <w:r>
+        <w:rPr>
+          <w:rFonts w:ascii="Consolas" w:eastAsia="Consolas" w:hAnsi="Consolas" w:cs="Consolas"/>
+        </w:rPr>
+        <w:t xml:space="preserve">Note.edit</w:t>
+      </w:r>
+      <w:r>
+        <w:t xml:space="preserve"> (domain): gửi </w:t>
+      </w:r>
+      <w:r>
+        <w:rPr>
+          <w:rFonts w:ascii="Consolas" w:eastAsia="Consolas" w:hAnsi="Consolas" w:cs="Consolas"/>
+        </w:rPr>
+        <w:t xml:space="preserve">body</w:t>
+      </w:r>
+      <w:r>
+        <w:t xml:space="preserve"> cho ghi chú sơ đồ, hay </w:t>
+      </w:r>
+      <w:r>
+        <w:rPr>
+          <w:rFonts w:ascii="Consolas" w:eastAsia="Consolas" w:hAnsi="Consolas" w:cs="Consolas"/>
+        </w:rPr>
+        <w:t xml:space="preserve">diagram</w:t>
+      </w:r>
+      <w:r>
+        <w:t xml:space="preserve"> cho ghi chú chữ, ném </w:t>
+      </w:r>
+      <w:r>
+        <w:rPr>
+          <w:rFonts w:ascii="Consolas" w:eastAsia="Consolas" w:hAnsi="Consolas" w:cs="Consolas"/>
+        </w:rPr>
+        <w:t xml:space="preserve">IllegalArgumentException</w:t>
+      </w:r>
+      <w:r>
+        <w:t xml:space="preserve">: người gọi code sai. </w:t>
+      </w:r>
+      <w:r>
+        <w:rPr>
+          <w:rFonts w:ascii="Consolas" w:eastAsia="Consolas" w:hAnsi="Consolas" w:cs="Consolas"/>
+        </w:rPr>
+        <w:t xml:space="preserve">NoteService.update</w:t>
+      </w:r>
+      <w:r>
+        <w:t xml:space="preserve"> kiểm trước, và ném </w:t>
+      </w:r>
+      <w:r>
+        <w:rPr>
+          <w:rFonts w:ascii="Consolas" w:eastAsia="Consolas" w:hAnsi="Consolas" w:cs="Consolas"/>
+        </w:rPr>
+        <w:t xml:space="preserve">SinoException(NOTE_KIND_MISMATCH)</w:t>
+      </w:r>
+      <w:r>
+        <w:t xml:space="preserve">, mã </w:t>
+      </w:r>
+      <w:r>
+        <w:rPr>
+          <w:rFonts w:ascii="Consolas" w:eastAsia="Consolas" w:hAnsi="Consolas" w:cs="Consolas"/>
+        </w:rPr>
+        <w:t xml:space="preserve">422</w:t>
+      </w:r>
+      <w:r>
+        <w:t xml:space="preserve">. Thứ tự: không có ghi chú → </w:t>
+      </w:r>
+      <w:r>
+        <w:rPr>
+          <w:rFonts w:ascii="Consolas" w:eastAsia="Consolas" w:hAnsi="Consolas" w:cs="Consolas"/>
+        </w:rPr>
+        <w:t xml:space="preserve">404</w:t>
+      </w:r>
+      <w:r>
+        <w:t xml:space="preserve">; nhầm loại → </w:t>
+      </w:r>
+      <w:r>
+        <w:rPr>
+          <w:rFonts w:ascii="Consolas" w:eastAsia="Consolas" w:hAnsi="Consolas" w:cs="Consolas"/>
+        </w:rPr>
+        <w:t xml:space="preserve">422</w:t>
+      </w:r>
+      <w:r>
+        <w:t xml:space="preserve">; </w:t>
+      </w:r>
+      <w:r>
+        <w:rPr>
+          <w:rFonts w:ascii="Consolas" w:eastAsia="Consolas" w:hAnsi="Consolas" w:cs="Consolas"/>
+        </w:rPr>
+        <w:t xml:space="preserve">version</w:t>
+      </w:r>
+      <w:r>
+        <w:t xml:space="preserve"> lệch → </w:t>
+      </w:r>
+      <w:r>
+        <w:rPr>
+          <w:rFonts w:ascii="Consolas" w:eastAsia="Consolas" w:hAnsi="Consolas" w:cs="Consolas"/>
+        </w:rPr>
+        <w:t xml:space="preserve">409</w:t>
+      </w:r>
+      <w:r>
+        <w:t xml:space="preserve">. Nhầm loại được xét trước </w:t>
+      </w:r>
+      <w:r>
+        <w:rPr>
+          <w:rFonts w:ascii="Consolas" w:eastAsia="Consolas" w:hAnsi="Consolas" w:cs="Consolas"/>
+        </w:rPr>
+        <w:t xml:space="preserve">version</w:t>
+      </w:r>
+      <w:r>
+        <w:t xml:space="preserve"> vì không phiên bản nào làm cho yêu cầu đó đúng. </w:t>
+      </w:r>
+      <w:r>
+        <w:rPr>
+          <w:b/>
+          <w:bCs/>
+        </w:rPr>
+        <w:t xml:space="preserve">Vì sao </w:t>
+      </w:r>
+      <w:r>
+        <w:rPr>
+          <w:rFonts w:ascii="Consolas" w:eastAsia="Consolas" w:hAnsi="Consolas" w:cs="Consolas"/>
+          <w:b/>
+          <w:bCs/>
+        </w:rPr>
+        <w:t xml:space="preserve">422</w:t>
+      </w:r>
+      <w:r>
+        <w:rPr>
+          <w:b/>
+          <w:bCs/>
+        </w:rPr>
+        <w:t xml:space="preserve"> mà không </w:t>
+      </w:r>
+      <w:r>
+        <w:rPr>
+          <w:rFonts w:ascii="Consolas" w:eastAsia="Consolas" w:hAnsi="Consolas" w:cs="Consolas"/>
+          <w:b/>
+          <w:bCs/>
+        </w:rPr>
+        <w:t xml:space="preserve">400</w:t>
+      </w:r>
+      <w:r>
+        <w:rPr>
+          <w:b/>
+          <w:bCs/>
+        </w:rPr>
+        <w:t xml:space="preserve">:</w:t>
+      </w:r>
+      <w:r>
+        <w:t xml:space="preserve"> ở app này </w:t>
+      </w:r>
+      <w:r>
+        <w:rPr>
+          <w:rFonts w:ascii="Consolas" w:eastAsia="Consolas" w:hAnsi="Consolas" w:cs="Consolas"/>
+        </w:rPr>
+        <w:t xml:space="preserve">400 VALIDATION_FAILED</w:t>
+      </w:r>
+      <w:r>
+        <w:t xml:space="preserve"> chỉ đến từ Bean Validation trên request, tức là lỗi thấy được chỉ nhìn request. Nhầm loại phụ thuộc vào ghi chú đã lưu: request đúng dạng nhưng trái luật nghiệp vụ, đúng nhóm </w:t>
+      </w:r>
+      <w:r>
+        <w:rPr>
+          <w:rFonts w:ascii="Consolas" w:eastAsia="Consolas" w:hAnsi="Consolas" w:cs="Consolas"/>
+        </w:rPr>
+        <w:t xml:space="preserve">INVALID</w:t>
+      </w:r>
+      <w:r>
+        <w:t xml:space="preserve"> (</w:t>
+      </w:r>
+      <w:r>
+        <w:rPr>
+          <w:rFonts w:ascii="Consolas" w:eastAsia="Consolas" w:hAnsi="Consolas" w:cs="Consolas"/>
+        </w:rPr>
+        <w:t xml:space="preserve">422</w:t>
+      </w:r>
+      <w:r>
+        <w:t xml:space="preserve">) của </w:t>
+      </w:r>
+      <w:r>
+        <w:rPr>
+          <w:rFonts w:ascii="Consolas" w:eastAsia="Consolas" w:hAnsi="Consolas" w:cs="Consolas"/>
+        </w:rPr>
+        <w:t xml:space="preserve">ErrorCategory</w:t>
+      </w:r>
+      <w:r>
+        <w:t xml:space="preserve">. (</w:t>
+      </w:r>
+      <w:r>
+        <w:rPr>
+          <w:rFonts w:ascii="Consolas" w:eastAsia="Consolas" w:hAnsi="Consolas" w:cs="Consolas"/>
+        </w:rPr>
+        <w:t xml:space="preserve">POST</w:t>
+      </w:r>
+      <w:r>
+        <w:t xml:space="preserve"> có </w:t>
+      </w:r>
+      <w:r>
+        <w:rPr>
+          <w:rFonts w:ascii="Consolas" w:eastAsia="Consolas" w:hAnsi="Consolas" w:cs="Consolas"/>
+        </w:rPr>
+        <w:t xml:space="preserve">body</w:t>
+      </w:r>
+      <w:r>
+        <w:t xml:space="preserve"> cho sơ đồ thì chỉ nhìn request cũng thấy sai, nên đó là </w:t>
+      </w:r>
+      <w:r>
+        <w:rPr>
+          <w:rFonts w:ascii="Consolas" w:eastAsia="Consolas" w:hAnsi="Consolas" w:cs="Consolas"/>
+        </w:rPr>
+        <w:t xml:space="preserve">400</w:t>
+      </w:r>
+      <w:r>
+        <w:t xml:space="preserve">, kiểm ở BE-91 và ở </w:t>
+      </w:r>
+      <w:r>
+        <w:rPr>
+          <w:rFonts w:ascii="Consolas" w:eastAsia="Consolas" w:hAnsi="Consolas" w:cs="Consolas"/>
+        </w:rPr>
+        <w:t xml:space="preserve">NewNote</w:t>
+      </w:r>
+      <w:r>
+        <w:t xml:space="preserve">.)</w:t>
+      </w:r>
+    </w:p>
+    <w:p>
+      <w:r>
+        <w:rPr>
+          <w:b/>
+          <w:bCs/>
+        </w:rPr>
+        <w:t xml:space="preserve">Database giữ sàn dưới.</w:t>
+      </w:r>
+      <w:r>
+        <w:t xml:space="preserve"> </w:t>
+      </w:r>
+      <w:r>
+        <w:rPr>
+          <w:rFonts w:ascii="Consolas" w:eastAsia="Consolas" w:hAnsi="Consolas" w:cs="Consolas"/>
+        </w:rPr>
+        <w:t xml:space="preserve">V20</w:t>
+      </w:r>
+      <w:r>
+        <w:t xml:space="preserve"> có các CHECK, mỗi cái một tên để test kiểm đúng cái bị chặn:</w:t>
+      </w:r>
+    </w:p>
+    <w:p>
+      <w:pPr>
+        <w:shd w:val="clear" w:color="auto" w:fill="F2F3F5"/>
+        <w:ind w:left="0"/>
+      </w:pPr>
+      <w:r>
+        <w:rPr>
+          <w:rFonts w:ascii="Consolas" w:eastAsia="Consolas" w:hAnsi="Consolas" w:cs="Consolas"/>
+          <w:sz w:val="19"/>
+          <w:szCs w:val="19"/>
+        </w:rPr>
+        <w:t xml:space="preserve">note_kind_ck          kind IN ('TEXT','DIAGRAM')</w:t>
+        <w:br/>
+        <w:t xml:space="preserve">note_text_ck          kind &lt;&gt; 'TEXT'    OR (diagram IS NULL AND btrim(body) &lt;&gt; '')</w:t>
+        <w:br/>
+        <w:t xml:space="preserve">note_diagram_ck       kind &lt;&gt; 'DIAGRAM' OR (diagram IS NOT NULL AND jsonb_typeof(diagram) = 'object' AND body = '')</w:t>
+        <w:br/>
+        <w:t xml:space="preserve">note_body_length_ck   char_length(body) &lt;= 20000</w:t>
+        <w:br/>
+        <w:t xml:space="preserve">note_title_blank_ck   title IS NULL OR btrim(title) &lt;&gt; ''</w:t>
+      </w:r>
+    </w:p>
+    <w:p>
+      <w:r>
+        <w:rPr>
+          <w:rFonts w:ascii="Consolas" w:eastAsia="Consolas" w:hAnsi="Consolas" w:cs="Consolas"/>
+        </w:rPr>
+        <w:t xml:space="preserve">kind &lt;&gt; 'TEXT' OR (...)</w:t>
+      </w:r>
+      <w:r>
+        <w:t xml:space="preserve"> là cách viết "nếu là TEXT thì ..." trong SQL: chỉ khi </w:t>
+      </w:r>
+      <w:r>
+        <w:rPr>
+          <w:rFonts w:ascii="Consolas" w:eastAsia="Consolas" w:hAnsi="Consolas" w:cs="Consolas"/>
+        </w:rPr>
+        <w:t xml:space="preserve">kind</w:t>
+      </w:r>
+      <w:r>
+        <w:t xml:space="preserve"> là </w:t>
+      </w:r>
+      <w:r>
+        <w:rPr>
+          <w:rFonts w:ascii="Consolas" w:eastAsia="Consolas" w:hAnsi="Consolas" w:cs="Consolas"/>
+        </w:rPr>
+        <w:t xml:space="preserve">TEXT</w:t>
+      </w:r>
+      <w:r>
+        <w:t xml:space="preserve"> thì vế phải mới phải đúng. Bên trong sơ đồ (số khối, nối trỏ đúng) do ứng dụng kiểm, database không cố hiểu JSON. </w:t>
+      </w:r>
+      <w:r>
+        <w:rPr>
+          <w:b/>
+          <w:bCs/>
+        </w:rPr>
+        <w:t xml:space="preserve">Bẫy:</w:t>
+      </w:r>
+      <w:r>
+        <w:t xml:space="preserve"> </w:t>
+      </w:r>
+      <w:r>
+        <w:rPr>
+          <w:rFonts w:ascii="Consolas" w:eastAsia="Consolas" w:hAnsi="Consolas" w:cs="Consolas"/>
+        </w:rPr>
+        <w:t xml:space="preserve">insert ... values (?)</w:t>
+      </w:r>
+      <w:r>
+        <w:t xml:space="preserve"> với một chuỗi cho cột jsonb báo lỗi kiểu ("column is of type jsonb but expression is of type character varying"); phải viết </w:t>
+      </w:r>
+      <w:r>
+        <w:rPr>
+          <w:rFonts w:ascii="Consolas" w:eastAsia="Consolas" w:hAnsi="Consolas" w:cs="Consolas"/>
+        </w:rPr>
+        <w:t xml:space="preserve">?::jsonb</w:t>
+      </w:r>
+      <w:r>
+        <w:t xml:space="preserve">. Test dùng </w:t>
+      </w:r>
+      <w:r>
+        <w:rPr>
+          <w:rFonts w:ascii="Consolas" w:eastAsia="Consolas" w:hAnsi="Consolas" w:cs="Consolas"/>
+        </w:rPr>
+        <w:t xml:space="preserve">insertRow</w:t>
+      </w:r>
+      <w:r>
+        <w:t xml:space="preserve"> để chèn thẳng hàng hỏng nên gặp bẫy này.</w:t>
+      </w:r>
+    </w:p>
+    <w:p>
+      <w:r>
+        <w:rPr>
+          <w:b/>
+          <w:bCs/>
+        </w:rPr>
+        <w:t xml:space="preserve">Câu gợi ý của task: "vì sao so </w:t>
+      </w:r>
+      <w:r>
+        <w:rPr>
+          <w:rFonts w:ascii="Consolas" w:eastAsia="Consolas" w:hAnsi="Consolas" w:cs="Consolas"/>
+          <w:b/>
+          <w:bCs/>
+        </w:rPr>
+        <w:t xml:space="preserve">version</w:t>
+      </w:r>
+      <w:r>
+        <w:rPr>
+          <w:b/>
+          <w:bCs/>
+        </w:rPr>
+        <w:t xml:space="preserve"> trong service mà vẫn cần </w:t>
+      </w:r>
+      <w:r>
+        <w:rPr>
+          <w:rFonts w:ascii="Consolas" w:eastAsia="Consolas" w:hAnsi="Consolas" w:cs="Consolas"/>
+          <w:b/>
+          <w:bCs/>
+        </w:rPr>
+        <w:t xml:space="preserve">@Version</w:t>
+      </w:r>
+      <w:r>
+        <w:rPr>
+          <w:b/>
+          <w:bCs/>
+        </w:rPr>
+        <w:t xml:space="preserve"> của JPA?"</w:t>
+      </w:r>
+      <w:r>
+        <w:t xml:space="preserve"> Hai thứ bắt hai tình huống khác nhau:</w:t>
+      </w:r>
+    </w:p>
+    <w:p>
+      <w:pPr>
+        <w:pStyle w:val="ListParagraph"/>
+        <w:numPr>
+          <w:ilvl w:val="0"/>
+          <w:numId w:val="1"/>
+        </w:numPr>
+      </w:pPr>
+      <w:r>
+        <w:t xml:space="preserve">Service so </w:t>
+      </w:r>
+      <w:r>
+        <w:rPr>
+          <w:rFonts w:ascii="Consolas" w:eastAsia="Consolas" w:hAnsi="Consolas" w:cs="Consolas"/>
+        </w:rPr>
+        <w:t xml:space="preserve">version</w:t>
+      </w:r>
+      <w:r>
+        <w:t xml:space="preserve"> gửi lên với </w:t>
+      </w:r>
+      <w:r>
+        <w:rPr>
+          <w:rFonts w:ascii="Consolas" w:eastAsia="Consolas" w:hAnsi="Consolas" w:cs="Consolas"/>
+        </w:rPr>
+        <w:t xml:space="preserve">version</w:t>
+      </w:r>
+      <w:r>
+        <w:t xml:space="preserve"> đang lưu: bắt </w:t>
+      </w:r>
+      <w:r>
+        <w:rPr>
+          <w:b/>
+          <w:bCs/>
+        </w:rPr>
+        <w:t xml:space="preserve">tab cũ</w:t>
+      </w:r>
+      <w:r>
+        <w:t xml:space="preserve">. Tab A đọc ở version 3, tab B lưu thành 4, một lúc sau tab A lưu với version 3: service thấy 3 khác 4 và từ chối. Hai request cách nhau, JPA không thấy gì sai, vì nó chỉ biết version nó vừa đọc.</w:t>
+      </w:r>
+    </w:p>
+    <w:p>
+      <w:pPr>
+        <w:pStyle w:val="ListParagraph"/>
+        <w:numPr>
+          <w:ilvl w:val="0"/>
+          <w:numId w:val="1"/>
+        </w:numPr>
+      </w:pPr>
+      <w:r>
+        <w:rPr>
+          <w:rFonts w:ascii="Consolas" w:eastAsia="Consolas" w:hAnsi="Consolas" w:cs="Consolas"/>
+        </w:rPr>
+        <w:t xml:space="preserve">@Version</w:t>
+      </w:r>
+      <w:r>
+        <w:t xml:space="preserve"> bắt </w:t>
+      </w:r>
+      <w:r>
+        <w:rPr>
+          <w:b/>
+          <w:bCs/>
+        </w:rPr>
+        <w:t xml:space="preserve">hai request cùng lúc</w:t>
+      </w:r>
+      <w:r>
+        <w:t xml:space="preserve">, cùng đọc version 3 và cùng qua được bước so. Câu </w:t>
+      </w:r>
+      <w:r>
+        <w:rPr>
+          <w:rFonts w:ascii="Consolas" w:eastAsia="Consolas" w:hAnsi="Consolas" w:cs="Consolas"/>
+        </w:rPr>
+        <w:t xml:space="preserve">UPDATE ... WHERE version = 3</w:t>
+      </w:r>
+      <w:r>
+        <w:t xml:space="preserve"> của request thứ hai không còn hàng nào để sửa, JPA ném </w:t>
+      </w:r>
+      <w:r>
+        <w:rPr>
+          <w:rFonts w:ascii="Consolas" w:eastAsia="Consolas" w:hAnsi="Consolas" w:cs="Consolas"/>
+        </w:rPr>
+        <w:t xml:space="preserve">OptimisticLockingFailureException</w:t>
+      </w:r>
+      <w:r>
+        <w:t xml:space="preserve">. Test </w:t>
+      </w:r>
+      <w:r>
+        <w:rPr>
+          <w:rFonts w:ascii="Consolas" w:eastAsia="Consolas" w:hAnsi="Consolas" w:cs="Consolas"/>
+        </w:rPr>
+        <w:t xml:space="preserve">twoSavesOfTheSameVersionAtTheSameTimeEndInOneRefusal</w:t>
+      </w:r>
+      <w:r>
+        <w:t xml:space="preserve"> dựng đúng tình huống này bằng đồng hồ chỉnh tay có thể dừng lại giữa chừng.</w:t>
+      </w:r>
+    </w:p>
+    <w:p>
+      <w:r>
+        <w:t xml:space="preserve">Cả hai cùng ném </w:t>
+      </w:r>
+      <w:r>
+        <w:rPr>
+          <w:rFonts w:ascii="Consolas" w:eastAsia="Consolas" w:hAnsi="Consolas" w:cs="Consolas"/>
+        </w:rPr>
+        <w:t xml:space="preserve">OptimisticLockingFailureException</w:t>
+      </w:r>
+      <w:r>
+        <w:t xml:space="preserve">, nên handler sẵn có trả cùng một </w:t>
+      </w:r>
+      <w:r>
+        <w:rPr>
+          <w:rFonts w:ascii="Consolas" w:eastAsia="Consolas" w:hAnsi="Consolas" w:cs="Consolas"/>
+        </w:rPr>
+        <w:t xml:space="preserve">409 CONCURRENT_MODIFICATION</w:t>
+      </w:r>
+      <w:r>
+        <w:t xml:space="preserve">.</w:t>
+      </w:r>
+    </w:p>
+    <w:p>
+      <w:r>
+        <w:rPr>
+          <w:b/>
+          <w:bCs/>
+        </w:rPr>
+        <w:t xml:space="preserve">Kiểm chứng (BE-90).</w:t>
+      </w:r>
+    </w:p>
+    <w:p>
+      <w:pPr>
+        <w:pStyle w:val="ListParagraph"/>
+        <w:numPr>
+          <w:ilvl w:val="0"/>
+          <w:numId w:val="1"/>
+        </w:numPr>
+      </w:pPr>
+      <w:r>
+        <w:t xml:space="preserve">Xuất phát từ bản WIP </w:t>
+      </w:r>
+      <w:r>
+        <w:rPr>
+          <w:rFonts w:ascii="Consolas" w:eastAsia="Consolas" w:hAnsi="Consolas" w:cs="Consolas"/>
+        </w:rPr>
+        <w:t xml:space="preserve">f43fdd6</w:t>
+      </w:r>
+      <w:r>
+        <w:t xml:space="preserve"> (ghi chú chữ, chưa ai chạy): trong worktree mới, 49 test (</w:t>
+      </w:r>
+      <w:r>
+        <w:rPr>
+          <w:rFonts w:ascii="Consolas" w:eastAsia="Consolas" w:hAnsi="Consolas" w:cs="Consolas"/>
+        </w:rPr>
+        <w:t xml:space="preserve">NoteTests</w:t>
+      </w:r>
+      <w:r>
+        <w:t xml:space="preserve"> 25, </w:t>
+      </w:r>
+      <w:r>
+        <w:rPr>
+          <w:rFonts w:ascii="Consolas" w:eastAsia="Consolas" w:hAnsi="Consolas" w:cs="Consolas"/>
+        </w:rPr>
+        <w:t xml:space="preserve">NoteServiceTests</w:t>
+      </w:r>
+      <w:r>
+        <w:t xml:space="preserve"> 22, </w:t>
+      </w:r>
+      <w:r>
+        <w:rPr>
+          <w:rFonts w:ascii="Consolas" w:eastAsia="Consolas" w:hAnsi="Consolas" w:cs="Consolas"/>
+        </w:rPr>
+        <w:t xml:space="preserve">ModularityTests</w:t>
+      </w:r>
+      <w:r>
+        <w:t xml:space="preserve"> 2) xanh trước khi sửa gì, nên phần chữ là nền chắc.</w:t>
+      </w:r>
+    </w:p>
+    <w:p>
+      <w:pPr>
+        <w:pStyle w:val="ListParagraph"/>
+        <w:numPr>
+          <w:ilvl w:val="0"/>
+          <w:numId w:val="1"/>
+        </w:numPr>
+      </w:pPr>
+      <w:r>
+        <w:t xml:space="preserve">ĐỎ đúng lý do: test mới viết trước, </w:t>
+      </w:r>
+      <w:r>
+        <w:rPr>
+          <w:rFonts w:ascii="Consolas" w:eastAsia="Consolas" w:hAnsi="Consolas" w:cs="Consolas"/>
+        </w:rPr>
+        <w:t xml:space="preserve">test-compile</w:t>
+      </w:r>
+      <w:r>
+        <w:t xml:space="preserve"> chỉ báo thiếu </w:t>
+      </w:r>
+      <w:r>
+        <w:rPr>
+          <w:rFonts w:ascii="Consolas" w:eastAsia="Consolas" w:hAnsi="Consolas" w:cs="Consolas"/>
+        </w:rPr>
+        <w:t xml:space="preserve">Diagram</w:t>
+      </w:r>
+      <w:r>
+        <w:t xml:space="preserve">, </w:t>
+      </w:r>
+      <w:r>
+        <w:rPr>
+          <w:rFonts w:ascii="Consolas" w:eastAsia="Consolas" w:hAnsi="Consolas" w:cs="Consolas"/>
+        </w:rPr>
+        <w:t xml:space="preserve">DiagramBlock</w:t>
+      </w:r>
+      <w:r>
+        <w:t xml:space="preserve">, </w:t>
+      </w:r>
+      <w:r>
+        <w:rPr>
+          <w:rFonts w:ascii="Consolas" w:eastAsia="Consolas" w:hAnsi="Consolas" w:cs="Consolas"/>
+        </w:rPr>
+        <w:t xml:space="preserve">DiagramLink</w:t>
+      </w:r>
+      <w:r>
+        <w:t xml:space="preserve">, </w:t>
+      </w:r>
+      <w:r>
+        <w:rPr>
+          <w:rFonts w:ascii="Consolas" w:eastAsia="Consolas" w:hAnsi="Consolas" w:cs="Consolas"/>
+        </w:rPr>
+        <w:t xml:space="preserve">BlockColor</w:t>
+      </w:r>
+      <w:r>
+        <w:t xml:space="preserve">, </w:t>
+      </w:r>
+      <w:r>
+        <w:rPr>
+          <w:rFonts w:ascii="Consolas" w:eastAsia="Consolas" w:hAnsi="Consolas" w:cs="Consolas"/>
+        </w:rPr>
+        <w:t xml:space="preserve">Side</w:t>
+      </w:r>
+      <w:r>
+        <w:t xml:space="preserve">, </w:t>
+      </w:r>
+      <w:r>
+        <w:rPr>
+          <w:rFonts w:ascii="Consolas" w:eastAsia="Consolas" w:hAnsi="Consolas" w:cs="Consolas"/>
+        </w:rPr>
+        <w:t xml:space="preserve">NoteKind</w:t>
+      </w:r>
+      <w:r>
+        <w:t xml:space="preserve">, </w:t>
+      </w:r>
+      <w:r>
+        <w:rPr>
+          <w:rFonts w:ascii="Consolas" w:eastAsia="Consolas" w:hAnsi="Consolas" w:cs="Consolas"/>
+        </w:rPr>
+        <w:t xml:space="preserve">Note.diagram()</w:t>
+      </w:r>
+      <w:r>
+        <w:t xml:space="preserve">, </w:t>
+      </w:r>
+      <w:r>
+        <w:rPr>
+          <w:rFonts w:ascii="Consolas" w:eastAsia="Consolas" w:hAnsi="Consolas" w:cs="Consolas"/>
+        </w:rPr>
+        <w:t xml:space="preserve">Note.kind()</w:t>
+      </w:r>
+      <w:r>
+        <w:t xml:space="preserve">, </w:t>
+      </w:r>
+      <w:r>
+        <w:rPr>
+          <w:rFonts w:ascii="Consolas" w:eastAsia="Consolas" w:hAnsi="Consolas" w:cs="Consolas"/>
+        </w:rPr>
+        <w:t xml:space="preserve">NewNote.text(...)</w:t>
+      </w:r>
+      <w:r>
+        <w:t xml:space="preserve">: không có lỗi nào khác.</w:t>
+      </w:r>
+    </w:p>
+    <w:p>
+      <w:pPr>
+        <w:pStyle w:val="ListParagraph"/>
+        <w:numPr>
+          <w:ilvl w:val="0"/>
+          <w:numId w:val="1"/>
+        </w:numPr>
+      </w:pPr>
+      <w:r>
+        <w:t xml:space="preserve">XANH: </w:t>
+      </w:r>
+      <w:r>
+        <w:rPr>
+          <w:rFonts w:ascii="Consolas" w:eastAsia="Consolas" w:hAnsi="Consolas" w:cs="Consolas"/>
+        </w:rPr>
+        <w:t xml:space="preserve">NoteTests</w:t>
+      </w:r>
+      <w:r>
+        <w:t xml:space="preserve"> 34, </w:t>
+      </w:r>
+      <w:r>
+        <w:rPr>
+          <w:rFonts w:ascii="Consolas" w:eastAsia="Consolas" w:hAnsi="Consolas" w:cs="Consolas"/>
+        </w:rPr>
+        <w:t xml:space="preserve">DiagramTests</w:t>
+      </w:r>
+      <w:r>
+        <w:t xml:space="preserve"> 21, </w:t>
+      </w:r>
+      <w:r>
+        <w:rPr>
+          <w:rFonts w:ascii="Consolas" w:eastAsia="Consolas" w:hAnsi="Consolas" w:cs="Consolas"/>
+        </w:rPr>
+        <w:t xml:space="preserve">NewNoteTests</w:t>
+      </w:r>
+      <w:r>
+        <w:t xml:space="preserve"> 5, </w:t>
+      </w:r>
+      <w:r>
+        <w:rPr>
+          <w:rFonts w:ascii="Consolas" w:eastAsia="Consolas" w:hAnsi="Consolas" w:cs="Consolas"/>
+        </w:rPr>
+        <w:t xml:space="preserve">NoteServiceTests</w:t>
+      </w:r>
+      <w:r>
+        <w:t xml:space="preserve"> 40, </w:t>
+      </w:r>
+      <w:r>
+        <w:rPr>
+          <w:rFonts w:ascii="Consolas" w:eastAsia="Consolas" w:hAnsi="Consolas" w:cs="Consolas"/>
+        </w:rPr>
+        <w:t xml:space="preserve">ModularityTests</w:t>
+      </w:r>
+      <w:r>
+        <w:t xml:space="preserve"> 2 (module </w:t>
+      </w:r>
+      <w:r>
+        <w:rPr>
+          <w:rFonts w:ascii="Consolas" w:eastAsia="Consolas" w:hAnsi="Consolas" w:cs="Consolas"/>
+        </w:rPr>
+        <w:t xml:space="preserve">notes</w:t>
+      </w:r>
+      <w:r>
+        <w:t xml:space="preserve"> được nhận). Sơ đồ có chữ Việt, emoji, dấu nháy kép, xuống dòng và số thập phân dài lưu rồi đọc lại bằng EntityManager khác đều </w:t>
+      </w:r>
+      <w:r>
+        <w:rPr>
+          <w:rFonts w:ascii="Consolas" w:eastAsia="Consolas" w:hAnsi="Consolas" w:cs="Consolas"/>
+        </w:rPr>
+        <w:t xml:space="preserve">equals</w:t>
+      </w:r>
+      <w:r>
+        <w:t xml:space="preserve"> bản gốc.</w:t>
+      </w:r>
+    </w:p>
+    <w:p>
+      <w:pPr>
+        <w:pStyle w:val="ListParagraph"/>
+        <w:numPr>
+          <w:ilvl w:val="0"/>
+          <w:numId w:val="1"/>
+        </w:numPr>
+      </w:pPr>
+      <w:r>
+        <w:rPr>
+          <w:rFonts w:ascii="Consolas" w:eastAsia="Consolas" w:hAnsi="Consolas" w:cs="Consolas"/>
+        </w:rPr>
+        <w:t xml:space="preserve">./mvnw -B -ntp verify</w:t>
+      </w:r>
+      <w:r>
+        <w:t xml:space="preserve"> trong worktree: 1873 test, 0 lỗi, 0 error, 8 bỏ qua (sẵn có), BUILD SUCCESS.</w:t>
+      </w:r>
+    </w:p>
+    <w:p>
+      <w:pPr>
+        <w:pStyle w:val="ListParagraph"/>
+        <w:numPr>
+          <w:ilvl w:val="0"/>
+          <w:numId w:val="1"/>
+        </w:numPr>
+      </w:pPr>
+      <w:r>
+        <w:t xml:space="preserve">Gài lỗi (một lần cho </w:t>
+      </w:r>
+      <w:r>
+        <w:rPr>
+          <w:rFonts w:ascii="Consolas" w:eastAsia="Consolas" w:hAnsi="Consolas" w:cs="Consolas"/>
+        </w:rPr>
+        <w:t xml:space="preserve">Diagram</w:t>
+      </w:r>
+      <w:r>
+        <w:t xml:space="preserve"> và </w:t>
+      </w:r>
+      <w:r>
+        <w:rPr>
+          <w:rFonts w:ascii="Consolas" w:eastAsia="Consolas" w:hAnsi="Consolas" w:cs="Consolas"/>
+        </w:rPr>
+        <w:t xml:space="preserve">Note</w:t>
+      </w:r>
+      <w:r>
+        <w:t xml:space="preserve">): 13 lỗi gài, cả 13 làm đỏ đúng test của luật đó, rồi trả code lại. </w:t>
+      </w:r>
+      <w:r>
+        <w:rPr>
+          <w:rFonts w:ascii="Consolas" w:eastAsia="Consolas" w:hAnsi="Consolas" w:cs="Consolas"/>
+        </w:rPr>
+        <w:t xml:space="preserve">Diagram</w:t>
+      </w:r>
+      <w:r>
+        <w:t xml:space="preserve">: bỏ kiểm tự nối, trùng cặp, 301 khối, nối tới khối không có, sơ đồ rỗng, mã khối trùng, NUL trong chữ khối. </w:t>
+      </w:r>
+      <w:r>
+        <w:rPr>
+          <w:rFonts w:ascii="Consolas" w:eastAsia="Consolas" w:hAnsi="Consolas" w:cs="Consolas"/>
+        </w:rPr>
+        <w:t xml:space="preserve">Note</w:t>
+      </w:r>
+      <w:r>
+        <w:t xml:space="preserve">: </w:t>
+      </w:r>
+      <w:r>
+        <w:rPr>
+          <w:rFonts w:ascii="Consolas" w:eastAsia="Consolas" w:hAnsi="Consolas" w:cs="Consolas"/>
+        </w:rPr>
+        <w:t xml:space="preserve">edit</w:t>
+      </w:r>
+      <w:r>
+        <w:t xml:space="preserve"> bỏ qua sơ đồ, </w:t>
+      </w:r>
+      <w:r>
+        <w:rPr>
+          <w:rFonts w:ascii="Consolas" w:eastAsia="Consolas" w:hAnsi="Consolas" w:cs="Consolas"/>
+        </w:rPr>
+        <w:t xml:space="preserve">edit</w:t>
+      </w:r>
+      <w:r>
+        <w:t xml:space="preserve"> coi sơ đồ bằng nhau là đã đổi, bỏ chặn </w:t>
+      </w:r>
+      <w:r>
+        <w:rPr>
+          <w:rFonts w:ascii="Consolas" w:eastAsia="Consolas" w:hAnsi="Consolas" w:cs="Consolas"/>
+        </w:rPr>
+        <w:t xml:space="preserve">body</w:t>
+      </w:r>
+      <w:r>
+        <w:t xml:space="preserve"> cho sơ đồ, ghim đổi </w:t>
+      </w:r>
+      <w:r>
+        <w:rPr>
+          <w:rFonts w:ascii="Consolas" w:eastAsia="Consolas" w:hAnsi="Consolas" w:cs="Consolas"/>
+        </w:rPr>
+        <w:t xml:space="preserve">updated_at</w:t>
+      </w:r>
+      <w:r>
+        <w:t xml:space="preserve">. </w:t>
+      </w:r>
+      <w:r>
+        <w:rPr>
+          <w:rFonts w:ascii="Consolas" w:eastAsia="Consolas" w:hAnsi="Consolas" w:cs="Consolas"/>
+        </w:rPr>
+        <w:t xml:space="preserve">NoteService</w:t>
+      </w:r>
+      <w:r>
+        <w:t xml:space="preserve">: bỏ so </w:t>
+      </w:r>
+      <w:r>
+        <w:rPr>
+          <w:rFonts w:ascii="Consolas" w:eastAsia="Consolas" w:hAnsi="Consolas" w:cs="Consolas"/>
+        </w:rPr>
+        <w:t xml:space="preserve">version</w:t>
+      </w:r>
+      <w:r>
+        <w:t xml:space="preserve">, bỏ chuyển </w:t>
+      </w:r>
+      <w:r>
+        <w:rPr>
+          <w:rFonts w:ascii="Consolas" w:eastAsia="Consolas" w:hAnsi="Consolas" w:cs="Consolas"/>
+        </w:rPr>
+        <w:t xml:space="preserve">diagram</w:t>
+      </w:r>
+      <w:r>
+        <w:t xml:space="preserve"> xuống </w:t>
+      </w:r>
+      <w:r>
+        <w:rPr>
+          <w:rFonts w:ascii="Consolas" w:eastAsia="Consolas" w:hAnsi="Consolas" w:cs="Consolas"/>
+        </w:rPr>
+        <w:t xml:space="preserve">edit</w:t>
+      </w:r>
+      <w:r>
+        <w:t xml:space="preserve">. Một lỗi gài đầu (mã khối trùng) làm đỏ cả những test không liên quan vì nó bỏ luôn lệnh </w:t>
+      </w:r>
+      <w:r>
+        <w:rPr>
+          <w:rFonts w:ascii="Consolas" w:eastAsia="Consolas" w:hAnsi="Consolas" w:cs="Consolas"/>
+        </w:rPr>
+        <w:t xml:space="preserve">add</w:t>
+      </w:r>
+      <w:r>
+        <w:t xml:space="preserve"> vào tập mã; viết lại chỉ tắt phần báo lỗi thì chỉ còn </w:t>
+      </w:r>
+      <w:r>
+        <w:rPr>
+          <w:rFonts w:ascii="Consolas" w:eastAsia="Consolas" w:hAnsi="Consolas" w:cs="Consolas"/>
+        </w:rPr>
+        <w:t xml:space="preserve">twoBlocksCannotShareAnId</w:t>
+      </w:r>
+      <w:r>
+        <w:t xml:space="preserve"> đỏ.</w:t>
+      </w:r>
+    </w:p>
+    <w:p>
+      <w:pPr>
+        <w:pStyle w:val="ListParagraph"/>
+        <w:numPr>
+          <w:ilvl w:val="0"/>
+          <w:numId w:val="1"/>
+        </w:numPr>
+      </w:pPr>
+      <w:r>
+        <w:t xml:space="preserve">Bài học: lỗi gài tốt chỉ tắt một nhánh, không xóa lệnh có tác dụng phụ trong cùng điều kiện, nếu không "đỏ" không còn nói lên điều gì.</w:t>
       </w:r>
     </w:p>
     <w:p/>

</xml_diff>

<commit_message>
docs(f15): BE-91 done, F15.2 in the Phase 4 knowledge file
tasks.md 1.2 ticked with its evidence (69 API tests red first, clean verify
1965 tests, 10 injected faults, the stale compiled class found after a fault),
F15.2 added to phase-4-planner (md and docx), PROJECT_STATE row updated.

Co-Authored-By: Claude Sonnet 5.5 <noreply@anthropic.com>
</commit_message>
<xml_diff>
--- a/docs/knowledge/phase-4-planner.docx
+++ b/docs/knowledge/phase-4-planner.docx
@@ -115,7 +115,7 @@
         <w:t xml:space="preserve">openspec/changes/f15-notes</w:t>
       </w:r>
       <w:r>
-        <w:t xml:space="preserve"> (ghi chú chữ và ghi chú dạng sơ đồ lưu trong database, chưa gắn tin nhắn), nằm ở phần cuối, mục "Ghi chú (F15)": BE-90.</w:t>
+        <w:t xml:space="preserve"> (ghi chú chữ và ghi chú dạng sơ đồ lưu trong database, chưa gắn tin nhắn), nằm ở phần cuối, mục "Ghi chú (F15)": BE-90, BE-91.</w:t>
         <w:br/>
       </w:r>
       <w:r>
@@ -8181,6 +8181,1491 @@
       </w:pPr>
       <w:r>
         <w:t xml:space="preserve">Bài học: lỗi gài tốt chỉ tắt một nhánh, không xóa lệnh có tác dụng phụ trong cùng điều kiện, nếu không "đỏ" không còn nói lên điều gì.</w:t>
+      </w:r>
+    </w:p>
+    <w:p>
+      <w:pPr>
+        <w:pStyle w:val="Heading3"/>
+      </w:pPr>
+      <w:r>
+        <w:t xml:space="preserve">F15.2 REST </w:t>
+      </w:r>
+      <w:r>
+        <w:rPr>
+          <w:rFonts w:ascii="Consolas" w:eastAsia="Consolas" w:hAnsi="Consolas" w:cs="Consolas"/>
+        </w:rPr>
+        <w:t xml:space="preserve">/api/notes</w:t>
+      </w:r>
+      <w:r>
+        <w:t xml:space="preserve"> cho ghi chú chữ và sơ đồ (BE-91)</w:t>
+      </w:r>
+    </w:p>
+    <w:p>
+      <w:r>
+        <w:rPr>
+          <w:b/>
+          <w:bCs/>
+        </w:rPr>
+        <w:t xml:space="preserve">Ở đâu:</w:t>
+      </w:r>
+      <w:r>
+        <w:t xml:space="preserve"> </w:t>
+      </w:r>
+      <w:r>
+        <w:rPr>
+          <w:rFonts w:ascii="Consolas" w:eastAsia="Consolas" w:hAnsi="Consolas" w:cs="Consolas"/>
+        </w:rPr>
+        <w:t xml:space="preserve">notes/api/{NotesController, CreateNoteRequest, UpdateNoteRequest, NoteResponse, DiagramBody, FollowsDiagramRules, DiagramRules, Texts}</w:t>
+      </w:r>
+      <w:r>
+        <w:t xml:space="preserve">; </w:t>
+      </w:r>
+      <w:r>
+        <w:rPr>
+          <w:rFonts w:ascii="Consolas" w:eastAsia="Consolas" w:hAnsi="Consolas" w:cs="Consolas"/>
+        </w:rPr>
+        <w:t xml:space="preserve">apps/sino-api/README.md</w:t>
+      </w:r>
+      <w:r>
+        <w:t xml:space="preserve"> (năm dòng </w:t>
+      </w:r>
+      <w:r>
+        <w:rPr>
+          <w:rFonts w:ascii="Consolas" w:eastAsia="Consolas" w:hAnsi="Consolas" w:cs="Consolas"/>
+        </w:rPr>
+        <w:t xml:space="preserve">/api/notes</w:t>
+      </w:r>
+      <w:r>
+        <w:t xml:space="preserve">).</w:t>
+      </w:r>
+    </w:p>
+    <w:p>
+      <w:pPr>
+        <w:shd w:val="clear" w:color="auto" w:fill="F2F3F5"/>
+        <w:ind w:left="0"/>
+      </w:pPr>
+      <w:r>
+        <w:rPr>
+          <w:rFonts w:ascii="Consolas" w:eastAsia="Consolas" w:hAnsi="Consolas" w:cs="Consolas"/>
+          <w:sz w:val="19"/>
+          <w:szCs w:val="19"/>
+        </w:rPr>
+        <w:t xml:space="preserve">GET    /api/notes           -&gt; { generatedAt, notes: [NoteItem ...] }   mọi ghi chú, sửa gần nhất trước</w:t>
+        <w:br/>
+        <w:t xml:space="preserve">GET    /api/notes/{id}      -&gt; NoteItem</w:t>
+        <w:br/>
+        <w:t xml:space="preserve">POST   /api/notes           -&gt; 201 + Location + NoteItem                { kind?, title?, body? | diagram }</w:t>
+        <w:br/>
+        <w:t xml:space="preserve">PATCH  /api/notes/{id}      -&gt; NoteItem                                 { version, title?, body?, pinned?, diagram? }</w:t>
+        <w:br/>
+        <w:t xml:space="preserve">DELETE /api/notes/{id}      -&gt; 204</w:t>
+        <w:br/>
+        <w:br/>
+        <w:t xml:space="preserve">NoteItem = { id, kind, title, body, diagram, pinned, createdAt, updatedAt, version, anchor, quote, linked }</w:t>
+      </w:r>
+    </w:p>
+    <w:p>
+      <w:r>
+        <w:rPr>
+          <w:b/>
+          <w:bCs/>
+        </w:rPr>
+        <w:t xml:space="preserve">Ba lớp kiểm, mỗi lớp một loại lỗi (như F16 mục 3.1).</w:t>
+      </w:r>
+      <w:r>
+        <w:t xml:space="preserve"> Một yêu cầu đi qua ba chỗ, và chỗ nào bắt thì mã lỗi như thế:</w:t>
+      </w:r>
+    </w:p>
+    <w:tbl>
+      <w:tblPr>
+        <w:tblW w:w="9360" w:type="dxa"/>
+        <w:tblBorders>
+          <w:top w:val="single" w:sz="4" w:space="0" w:color="auto"/>
+          <w:left w:val="single" w:sz="4" w:space="0" w:color="auto"/>
+          <w:bottom w:val="single" w:sz="4" w:space="0" w:color="auto"/>
+          <w:right w:val="single" w:sz="4" w:space="0" w:color="auto"/>
+          <w:insideH w:val="single" w:sz="4" w:space="0" w:color="auto"/>
+          <w:insideV w:val="single" w:sz="4" w:space="0" w:color="auto"/>
+        </w:tblBorders>
+        <w:tblLayout w:type="fixed"/>
+      </w:tblPr>
+      <w:tblGrid>
+        <w:gridCol w:w="3120"/>
+        <w:gridCol w:w="3120"/>
+        <w:gridCol w:w="3120"/>
+      </w:tblGrid>
+      <w:tr>
+        <w:tc>
+          <w:tcPr>
+            <w:tcW w:w="3120" w:type="dxa"/>
+            <w:shd w:val="clear" w:color="auto" w:fill="F2F2F2"/>
+          </w:tcPr>
+          <w:p>
+            <w:r>
+              <w:t xml:space="preserve">Chỗ</w:t>
+            </w:r>
+          </w:p>
+        </w:tc>
+        <w:tc>
+          <w:tcPr>
+            <w:tcW w:w="3120" w:type="dxa"/>
+            <w:shd w:val="clear" w:color="auto" w:fill="F2F2F2"/>
+          </w:tcPr>
+          <w:p>
+            <w:r>
+              <w:t xml:space="preserve">Bắt gì</w:t>
+            </w:r>
+          </w:p>
+        </w:tc>
+        <w:tc>
+          <w:tcPr>
+            <w:tcW w:w="3120" w:type="dxa"/>
+            <w:shd w:val="clear" w:color="auto" w:fill="F2F2F2"/>
+          </w:tcPr>
+          <w:p>
+            <w:r>
+              <w:t xml:space="preserve">Trả</w:t>
+            </w:r>
+          </w:p>
+        </w:tc>
+      </w:tr>
+      <w:tr>
+        <w:tc>
+          <w:tcPr>
+            <w:tcW w:w="3120" w:type="dxa"/>
+          </w:tcPr>
+          <w:p>
+            <w:r>
+              <w:t xml:space="preserve">Jackson (đọc JSON)</w:t>
+            </w:r>
+          </w:p>
+        </w:tc>
+        <w:tc>
+          <w:tcPr>
+            <w:tcW w:w="3120" w:type="dxa"/>
+          </w:tcPr>
+          <w:p>
+            <w:r>
+              <w:t xml:space="preserve">giá trị không đọc được: </w:t>
+            </w:r>
+            <w:r>
+              <w:rPr>
+                <w:rFonts w:ascii="Consolas" w:eastAsia="Consolas" w:hAnsi="Consolas" w:cs="Consolas"/>
+              </w:rPr>
+              <w:t xml:space="preserve">kind</w:t>
+            </w:r>
+            <w:r>
+              <w:t xml:space="preserve"> / màu / cạnh lạ, mã khối không phải UUID, tọa độ là chữ</w:t>
+            </w:r>
+          </w:p>
+        </w:tc>
+        <w:tc>
+          <w:tcPr>
+            <w:tcW w:w="3120" w:type="dxa"/>
+          </w:tcPr>
+          <w:p>
+            <w:r>
+              <w:rPr>
+                <w:rFonts w:ascii="Consolas" w:eastAsia="Consolas" w:hAnsi="Consolas" w:cs="Consolas"/>
+              </w:rPr>
+              <w:t xml:space="preserve">400 MALFORMED_REQUEST</w:t>
+            </w:r>
+          </w:p>
+        </w:tc>
+      </w:tr>
+      <w:tr>
+        <w:tc>
+          <w:tcPr>
+            <w:tcW w:w="3120" w:type="dxa"/>
+          </w:tcPr>
+          <w:p>
+            <w:r>
+              <w:t xml:space="preserve">Bean Validation trên request</w:t>
+            </w:r>
+          </w:p>
+        </w:tc>
+        <w:tc>
+          <w:tcPr>
+            <w:tcW w:w="3120" w:type="dxa"/>
+          </w:tcPr>
+          <w:p>
+            <w:r>
+              <w:t xml:space="preserve">thiếu trường, quá dài, có NUL, </w:t>
+            </w:r>
+            <w:r>
+              <w:rPr>
+                <w:rFonts w:ascii="Consolas" w:eastAsia="Consolas" w:hAnsi="Consolas" w:cs="Consolas"/>
+              </w:rPr>
+              <w:t xml:space="preserve">PATCH</w:t>
+            </w:r>
+            <w:r>
+              <w:t xml:space="preserve"> rỗng hoặc thiếu </w:t>
+            </w:r>
+            <w:r>
+              <w:rPr>
+                <w:rFonts w:ascii="Consolas" w:eastAsia="Consolas" w:hAnsi="Consolas" w:cs="Consolas"/>
+              </w:rPr>
+              <w:t xml:space="preserve">version</w:t>
+            </w:r>
+            <w:r>
+              <w:t xml:space="preserve">, và </w:t>
+            </w:r>
+            <w:r>
+              <w:rPr>
+                <w:b/>
+                <w:bCs/>
+              </w:rPr>
+              <w:t xml:space="preserve">mọi luật của sơ đồ</w:t>
+            </w:r>
+          </w:p>
+        </w:tc>
+        <w:tc>
+          <w:tcPr>
+            <w:tcW w:w="3120" w:type="dxa"/>
+          </w:tcPr>
+          <w:p>
+            <w:r>
+              <w:rPr>
+                <w:rFonts w:ascii="Consolas" w:eastAsia="Consolas" w:hAnsi="Consolas" w:cs="Consolas"/>
+              </w:rPr>
+              <w:t xml:space="preserve">400 VALIDATION_FAILED</w:t>
+            </w:r>
+          </w:p>
+        </w:tc>
+      </w:tr>
+      <w:tr>
+        <w:tc>
+          <w:tcPr>
+            <w:tcW w:w="3120" w:type="dxa"/>
+          </w:tcPr>
+          <w:p>
+            <w:r>
+              <w:rPr>
+                <w:rFonts w:ascii="Consolas" w:eastAsia="Consolas" w:hAnsi="Consolas" w:cs="Consolas"/>
+              </w:rPr>
+              <w:t xml:space="preserve">NoteService</w:t>
+            </w:r>
+            <w:r>
+              <w:t xml:space="preserve"> (cần đọc ghi chú)</w:t>
+            </w:r>
+          </w:p>
+        </w:tc>
+        <w:tc>
+          <w:tcPr>
+            <w:tcW w:w="3120" w:type="dxa"/>
+          </w:tcPr>
+          <w:p>
+            <w:r>
+              <w:t xml:space="preserve">không có / của người khác, nhầm loại, </w:t>
+            </w:r>
+            <w:r>
+              <w:rPr>
+                <w:rFonts w:ascii="Consolas" w:eastAsia="Consolas" w:hAnsi="Consolas" w:cs="Consolas"/>
+              </w:rPr>
+              <w:t xml:space="preserve">version</w:t>
+            </w:r>
+            <w:r>
+              <w:t xml:space="preserve"> lệch</w:t>
+            </w:r>
+          </w:p>
+        </w:tc>
+        <w:tc>
+          <w:tcPr>
+            <w:tcW w:w="3120" w:type="dxa"/>
+          </w:tcPr>
+          <w:p>
+            <w:r>
+              <w:rPr>
+                <w:rFonts w:ascii="Consolas" w:eastAsia="Consolas" w:hAnsi="Consolas" w:cs="Consolas"/>
+              </w:rPr>
+              <w:t xml:space="preserve">404</w:t>
+            </w:r>
+            <w:r>
+              <w:t xml:space="preserve">, </w:t>
+            </w:r>
+            <w:r>
+              <w:rPr>
+                <w:rFonts w:ascii="Consolas" w:eastAsia="Consolas" w:hAnsi="Consolas" w:cs="Consolas"/>
+              </w:rPr>
+              <w:t xml:space="preserve">422 NOTE_KIND_MISMATCH</w:t>
+            </w:r>
+            <w:r>
+              <w:t xml:space="preserve">, </w:t>
+            </w:r>
+            <w:r>
+              <w:rPr>
+                <w:rFonts w:ascii="Consolas" w:eastAsia="Consolas" w:hAnsi="Consolas" w:cs="Consolas"/>
+              </w:rPr>
+              <w:t xml:space="preserve">409</w:t>
+            </w:r>
+          </w:p>
+        </w:tc>
+      </w:tr>
+    </w:tbl>
+    <w:p>
+      <w:r>
+        <w:t xml:space="preserve">Quy tắc chọn: lỗi nào chỉ nhìn request là thấy thì thuộc 400; lỗi cần biết ghi chú đang lưu thế nào thì thuộc service.</w:t>
+      </w:r>
+    </w:p>
+    <w:p>
+      <w:r>
+        <w:rPr>
+          <w:b/>
+          <w:bCs/>
+        </w:rPr>
+        <w:t xml:space="preserve">Vì sao </w:t>
+      </w:r>
+      <w:r>
+        <w:rPr>
+          <w:rFonts w:ascii="Consolas" w:eastAsia="Consolas" w:hAnsi="Consolas" w:cs="Consolas"/>
+          <w:b/>
+          <w:bCs/>
+        </w:rPr>
+        <w:t xml:space="preserve">DiagramBody</w:t>
+      </w:r>
+      <w:r>
+        <w:rPr>
+          <w:b/>
+          <w:bCs/>
+        </w:rPr>
+        <w:t xml:space="preserve"> là bản sao của </w:t>
+      </w:r>
+      <w:r>
+        <w:rPr>
+          <w:rFonts w:ascii="Consolas" w:eastAsia="Consolas" w:hAnsi="Consolas" w:cs="Consolas"/>
+          <w:b/>
+          <w:bCs/>
+        </w:rPr>
+        <w:t xml:space="preserve">Diagram</w:t>
+      </w:r>
+      <w:r>
+        <w:rPr>
+          <w:b/>
+          <w:bCs/>
+        </w:rPr>
+        <w:t xml:space="preserve"> chứ không để Jackson dựng thẳng </w:t>
+      </w:r>
+      <w:r>
+        <w:rPr>
+          <w:rFonts w:ascii="Consolas" w:eastAsia="Consolas" w:hAnsi="Consolas" w:cs="Consolas"/>
+          <w:b/>
+          <w:bCs/>
+        </w:rPr>
+        <w:t xml:space="preserve">Diagram</w:t>
+      </w:r>
+      <w:r>
+        <w:rPr>
+          <w:b/>
+          <w:bCs/>
+        </w:rPr>
+        <w:t xml:space="preserve">.</w:t>
+      </w:r>
+      <w:r>
+        <w:t xml:space="preserve"> Có hai lý do, và cả hai đều là lỗi im lặng:</w:t>
+      </w:r>
+    </w:p>
+    <w:p>
+      <w:pPr>
+        <w:pStyle w:val="ListParagraph"/>
+        <w:numPr>
+          <w:ilvl w:val="0"/>
+          <w:numId w:val="1"/>
+        </w:numPr>
+      </w:pPr>
+      <w:r>
+        <w:t xml:space="preserve">Jackson gọi constructor của </w:t>
+      </w:r>
+      <w:r>
+        <w:rPr>
+          <w:rFonts w:ascii="Consolas" w:eastAsia="Consolas" w:hAnsi="Consolas" w:cs="Consolas"/>
+        </w:rPr>
+        <w:t xml:space="preserve">record</w:t>
+      </w:r>
+      <w:r>
+        <w:t xml:space="preserve">. Nếu một luật bị phạm, </w:t>
+      </w:r>
+      <w:r>
+        <w:rPr>
+          <w:rFonts w:ascii="Consolas" w:eastAsia="Consolas" w:hAnsi="Consolas" w:cs="Consolas"/>
+        </w:rPr>
+        <w:t xml:space="preserve">IllegalArgumentException</w:t>
+      </w:r>
+      <w:r>
+        <w:t xml:space="preserve"> bị bọc thành lỗi đọc JSON, nên người dùng nhận </w:t>
+      </w:r>
+      <w:r>
+        <w:rPr>
+          <w:rFonts w:ascii="Consolas" w:eastAsia="Consolas" w:hAnsi="Consolas" w:cs="Consolas"/>
+        </w:rPr>
+        <w:t xml:space="preserve">MALFORMED_REQUEST</w:t>
+      </w:r>
+      <w:r>
+        <w:t xml:space="preserve"> và mất tên luật ("nối tới khối không có trong sơ đồ").</w:t>
+      </w:r>
+    </w:p>
+    <w:p>
+      <w:pPr>
+        <w:pStyle w:val="ListParagraph"/>
+        <w:numPr>
+          <w:ilvl w:val="0"/>
+          <w:numId w:val="1"/>
+        </w:numPr>
+      </w:pPr>
+      <w:r>
+        <w:t xml:space="preserve">Với </w:t>
+      </w:r>
+      <w:r>
+        <w:rPr>
+          <w:rFonts w:ascii="Consolas" w:eastAsia="Consolas" w:hAnsi="Consolas" w:cs="Consolas"/>
+        </w:rPr>
+        <w:t xml:space="preserve">double x</w:t>
+      </w:r>
+      <w:r>
+        <w:t xml:space="preserve"> (kiểu nguyên thủy), một khối thiếu </w:t>
+      </w:r>
+      <w:r>
+        <w:rPr>
+          <w:rFonts w:ascii="Consolas" w:eastAsia="Consolas" w:hAnsi="Consolas" w:cs="Consolas"/>
+        </w:rPr>
+        <w:t xml:space="preserve">x</w:t>
+      </w:r>
+      <w:r>
+        <w:t xml:space="preserve"> được đọc thành </w:t>
+      </w:r>
+      <w:r>
+        <w:rPr>
+          <w:rFonts w:ascii="Consolas" w:eastAsia="Consolas" w:hAnsi="Consolas" w:cs="Consolas"/>
+        </w:rPr>
+        <w:t xml:space="preserve">0.0</w:t>
+      </w:r>
+      <w:r>
+        <w:t xml:space="preserve"> chứ không báo thiếu. </w:t>
+      </w:r>
+      <w:r>
+        <w:rPr>
+          <w:rFonts w:ascii="Consolas" w:eastAsia="Consolas" w:hAnsi="Consolas" w:cs="Consolas"/>
+        </w:rPr>
+        <w:t xml:space="preserve">DiagramBody</w:t>
+      </w:r>
+      <w:r>
+        <w:t xml:space="preserve"> dùng </w:t>
+      </w:r>
+      <w:r>
+        <w:rPr>
+          <w:rFonts w:ascii="Consolas" w:eastAsia="Consolas" w:hAnsi="Consolas" w:cs="Consolas"/>
+        </w:rPr>
+        <w:t xml:space="preserve">Double</w:t>
+      </w:r>
+      <w:r>
+        <w:t xml:space="preserve"> và </w:t>
+      </w:r>
+      <w:r>
+        <w:rPr>
+          <w:rFonts w:ascii="Consolas" w:eastAsia="Consolas" w:hAnsi="Consolas" w:cs="Consolas"/>
+        </w:rPr>
+        <w:t xml:space="preserve">@NotNull</w:t>
+      </w:r>
+      <w:r>
+        <w:t xml:space="preserve">, nên thiếu là lỗi có tên trường.</w:t>
+      </w:r>
+    </w:p>
+    <w:p>
+      <w:r>
+        <w:rPr>
+          <w:b/>
+          <w:bCs/>
+        </w:rPr>
+        <w:t xml:space="preserve">Một ràng buộc tự viết, </w:t>
+      </w:r>
+      <w:r>
+        <w:rPr>
+          <w:rFonts w:ascii="Consolas" w:eastAsia="Consolas" w:hAnsi="Consolas" w:cs="Consolas"/>
+          <w:b/>
+          <w:bCs/>
+        </w:rPr>
+        <w:t xml:space="preserve">@FollowsDiagramRules</w:t>
+      </w:r>
+      <w:r>
+        <w:rPr>
+          <w:b/>
+          <w:bCs/>
+        </w:rPr>
+        <w:t xml:space="preserve">, để luật chỉ viết một lần.</w:t>
+      </w:r>
+      <w:r>
+        <w:t xml:space="preserve"> Luật của sơ đồ (300 khối, nối không tự nối, không trùng cặp...) đã nằm trong </w:t>
+      </w:r>
+      <w:r>
+        <w:rPr>
+          <w:rFonts w:ascii="Consolas" w:eastAsia="Consolas" w:hAnsi="Consolas" w:cs="Consolas"/>
+        </w:rPr>
+        <w:t xml:space="preserve">Diagram</w:t>
+      </w:r>
+      <w:r>
+        <w:t xml:space="preserve"> từ BE-90. Viết lại chúng thành annotation Bean Validation là viết hai lần, rồi hai bản sẽ lệch nhau. Nên </w:t>
+      </w:r>
+      <w:r>
+        <w:rPr>
+          <w:rFonts w:ascii="Consolas" w:eastAsia="Consolas" w:hAnsi="Consolas" w:cs="Consolas"/>
+        </w:rPr>
+        <w:t xml:space="preserve">DiagramRules</w:t>
+      </w:r>
+      <w:r>
+        <w:t xml:space="preserve"> (một </w:t>
+      </w:r>
+      <w:r>
+        <w:rPr>
+          <w:rFonts w:ascii="Consolas" w:eastAsia="Consolas" w:hAnsi="Consolas" w:cs="Consolas"/>
+        </w:rPr>
+        <w:t xml:space="preserve">ConstraintValidator</w:t>
+      </w:r>
+      <w:r>
+        <w:t xml:space="preserve">) chỉ thử dựng </w:t>
+      </w:r>
+      <w:r>
+        <w:rPr>
+          <w:rFonts w:ascii="Consolas" w:eastAsia="Consolas" w:hAnsi="Consolas" w:cs="Consolas"/>
+        </w:rPr>
+        <w:t xml:space="preserve">Diagram</w:t>
+      </w:r>
+      <w:r>
+        <w:t xml:space="preserve"> từ </w:t>
+      </w:r>
+      <w:r>
+        <w:rPr>
+          <w:rFonts w:ascii="Consolas" w:eastAsia="Consolas" w:hAnsi="Consolas" w:cs="Consolas"/>
+        </w:rPr>
+        <w:t xml:space="preserve">DiagramBody</w:t>
+      </w:r>
+      <w:r>
+        <w:t xml:space="preserve">; nếu </w:t>
+      </w:r>
+      <w:r>
+        <w:rPr>
+          <w:rFonts w:ascii="Consolas" w:eastAsia="Consolas" w:hAnsi="Consolas" w:cs="Consolas"/>
+        </w:rPr>
+        <w:t xml:space="preserve">IllegalArgumentException</w:t>
+      </w:r>
+      <w:r>
+        <w:t xml:space="preserve"> thì dùng đúng câu của luật làm câu báo lỗi:</w:t>
+      </w:r>
+    </w:p>
+    <w:p>
+      <w:pPr>
+        <w:shd w:val="clear" w:color="auto" w:fill="F2F3F5"/>
+        <w:ind w:left="0"/>
+      </w:pPr>
+      <w:r>
+        <w:rPr>
+          <w:rFonts w:ascii="Consolas" w:eastAsia="Consolas" w:hAnsi="Consolas" w:cs="Consolas"/>
+          <w:sz w:val="19"/>
+          <w:szCs w:val="19"/>
+        </w:rPr>
+        <w:t xml:space="preserve">catch (IllegalArgumentException broken) {</w:t>
+        <w:br/>
+        <w:t xml:space="preserve">    context.disableDefaultConstraintViolation();</w:t>
+        <w:br/>
+        <w:t xml:space="preserve">    context.buildConstraintViolationWithTemplate(broken.getMessage()).addConstraintViolation();</w:t>
+        <w:br/>
+        <w:t xml:space="preserve">    return false;</w:t>
+        <w:br/>
+        <w:t xml:space="preserve">}</w:t>
+      </w:r>
+    </w:p>
+    <w:p>
+      <w:r>
+        <w:t xml:space="preserve">Hai chi tiết: (1) trường thiếu làm </w:t>
+      </w:r>
+      <w:r>
+        <w:rPr>
+          <w:rFonts w:ascii="Consolas" w:eastAsia="Consolas" w:hAnsi="Consolas" w:cs="Consolas"/>
+        </w:rPr>
+        <w:t xml:space="preserve">toDiagram()</w:t>
+      </w:r>
+      <w:r>
+        <w:t xml:space="preserve"> ném </w:t>
+      </w:r>
+      <w:r>
+        <w:rPr>
+          <w:rFonts w:ascii="Consolas" w:eastAsia="Consolas" w:hAnsi="Consolas" w:cs="Consolas"/>
+        </w:rPr>
+        <w:t xml:space="preserve">NullPointerException</w:t>
+      </w:r>
+      <w:r>
+        <w:t xml:space="preserve">; validator trả </w:t>
+      </w:r>
+      <w:r>
+        <w:rPr>
+          <w:rFonts w:ascii="Consolas" w:eastAsia="Consolas" w:hAnsi="Consolas" w:cs="Consolas"/>
+        </w:rPr>
+        <w:t xml:space="preserve">true</w:t>
+      </w:r>
+      <w:r>
+        <w:t xml:space="preserve"> ở nhánh đó vì </w:t>
+      </w:r>
+      <w:r>
+        <w:rPr>
+          <w:rFonts w:ascii="Consolas" w:eastAsia="Consolas" w:hAnsi="Consolas" w:cs="Consolas"/>
+        </w:rPr>
+        <w:t xml:space="preserve">@NotNull</w:t>
+      </w:r>
+      <w:r>
+        <w:t xml:space="preserve"> đã báo đúng trường rồi, báo hai lần chỉ làm rối. (2) </w:t>
+      </w:r>
+      <w:r>
+        <w:rPr>
+          <w:rFonts w:ascii="Consolas" w:eastAsia="Consolas" w:hAnsi="Consolas" w:cs="Consolas"/>
+        </w:rPr>
+        <w:t xml:space="preserve">buildConstraintViolationWithTemplate</w:t>
+      </w:r>
+      <w:r>
+        <w:t xml:space="preserve"> coi chuỗi là </w:t>
+      </w:r>
+      <w:r>
+        <w:rPr>
+          <w:i/>
+          <w:iCs/>
+        </w:rPr>
+        <w:t xml:space="preserve">mẫu</w:t>
+      </w:r>
+      <w:r>
+        <w:t xml:space="preserve"> (có thể chứa </w:t>
+      </w:r>
+      <w:r>
+        <w:rPr>
+          <w:rFonts w:ascii="Consolas" w:eastAsia="Consolas" w:hAnsi="Consolas" w:cs="Consolas"/>
+        </w:rPr>
+        <w:t xml:space="preserve">${...}</w:t>
+      </w:r>
+      <w:r>
+        <w:t xml:space="preserve">); câu của domain do ta viết và không chứa chữ của người dùng nên an toàn, nhưng đây là chỗ không bao giờ được nối chữ người dùng vào.</w:t>
+      </w:r>
+    </w:p>
+    <w:p>
+      <w:r>
+        <w:rPr>
+          <w:rFonts w:ascii="Consolas" w:eastAsia="Consolas" w:hAnsi="Consolas" w:cs="Consolas"/>
+          <w:b/>
+          <w:bCs/>
+        </w:rPr>
+        <w:t xml:space="preserve">@AssertTrue</w:t>
+      </w:r>
+      <w:r>
+        <w:rPr>
+          <w:b/>
+          <w:bCs/>
+        </w:rPr>
+        <w:t xml:space="preserve"> trên </w:t>
+      </w:r>
+      <w:r>
+        <w:rPr>
+          <w:rFonts w:ascii="Consolas" w:eastAsia="Consolas" w:hAnsi="Consolas" w:cs="Consolas"/>
+          <w:b/>
+          <w:bCs/>
+        </w:rPr>
+        <w:t xml:space="preserve">record</w:t>
+      </w:r>
+      <w:r>
+        <w:rPr>
+          <w:b/>
+          <w:bCs/>
+        </w:rPr>
+        <w:t xml:space="preserve">, và quy tắc theo loại.</w:t>
+      </w:r>
+      <w:r>
+        <w:t xml:space="preserve"> Như </w:t>
+      </w:r>
+      <w:r>
+        <w:rPr>
+          <w:rFonts w:ascii="Consolas" w:eastAsia="Consolas" w:hAnsi="Consolas" w:cs="Consolas"/>
+        </w:rPr>
+        <w:t xml:space="preserve">CreateTaskRequest</w:t>
+      </w:r>
+      <w:r>
+        <w:t xml:space="preserve">, các luật nhiều trường là phương thức </w:t>
+      </w:r>
+      <w:r>
+        <w:rPr>
+          <w:rFonts w:ascii="Consolas" w:eastAsia="Consolas" w:hAnsi="Consolas" w:cs="Consolas"/>
+        </w:rPr>
+        <w:t xml:space="preserve">isXxx()</w:t>
+      </w:r>
+      <w:r>
+        <w:t xml:space="preserve"> có </w:t>
+      </w:r>
+      <w:r>
+        <w:rPr>
+          <w:rFonts w:ascii="Consolas" w:eastAsia="Consolas" w:hAnsi="Consolas" w:cs="Consolas"/>
+        </w:rPr>
+        <w:t xml:space="preserve">@AssertTrue</w:t>
+      </w:r>
+      <w:r>
+        <w:t xml:space="preserve">: "ghi chú chữ cần chữ và không có sơ đồ", "ghi chú sơ đồ cần sơ đồ và không có chữ". </w:t>
+      </w:r>
+      <w:r>
+        <w:rPr>
+          <w:rFonts w:ascii="Consolas" w:eastAsia="Consolas" w:hAnsi="Consolas" w:cs="Consolas"/>
+        </w:rPr>
+        <w:t xml:space="preserve">kind</w:t>
+      </w:r>
+      <w:r>
+        <w:t xml:space="preserve"> thiếu coi là </w:t>
+      </w:r>
+      <w:r>
+        <w:rPr>
+          <w:rFonts w:ascii="Consolas" w:eastAsia="Consolas" w:hAnsi="Consolas" w:cs="Consolas"/>
+        </w:rPr>
+        <w:t xml:space="preserve">TEXT</w:t>
+      </w:r>
+      <w:r>
+        <w:t xml:space="preserve"> để web cũ không đổi. </w:t>
+      </w:r>
+      <w:r>
+        <w:rPr>
+          <w:rFonts w:ascii="Consolas" w:eastAsia="Consolas" w:hAnsi="Consolas" w:cs="Consolas"/>
+        </w:rPr>
+        <w:t xml:space="preserve">body: ""</w:t>
+      </w:r>
+      <w:r>
+        <w:t xml:space="preserve"> cho một sơ đồ cũng bị từ chối: với sơ đồ, </w:t>
+      </w:r>
+      <w:r>
+        <w:rPr>
+          <w:rFonts w:ascii="Consolas" w:eastAsia="Consolas" w:hAnsi="Consolas" w:cs="Consolas"/>
+        </w:rPr>
+        <w:t xml:space="preserve">body</w:t>
+      </w:r>
+      <w:r>
+        <w:t xml:space="preserve"> phải vắng hẳn, nên chỉ có một cách đúng để gửi. </w:t>
+      </w:r>
+      <w:r>
+        <w:rPr>
+          <w:rFonts w:ascii="Consolas" w:eastAsia="Consolas" w:hAnsi="Consolas" w:cs="Consolas"/>
+        </w:rPr>
+        <w:t xml:space="preserve">UpdateNoteRequest</w:t>
+      </w:r>
+      <w:r>
+        <w:t xml:space="preserve"> không biết loại của ghi chú (chưa đọc nó), nên chỉ kiểm phần chắc chắn: </w:t>
+      </w:r>
+      <w:r>
+        <w:rPr>
+          <w:rFonts w:ascii="Consolas" w:eastAsia="Consolas" w:hAnsi="Consolas" w:cs="Consolas"/>
+        </w:rPr>
+        <w:t xml:space="preserve">version</w:t>
+      </w:r>
+      <w:r>
+        <w:t xml:space="preserve"> bắt buộc và không âm, ít nhất một trường, </w:t>
+      </w:r>
+      <w:r>
+        <w:rPr>
+          <w:rFonts w:ascii="Consolas" w:eastAsia="Consolas" w:hAnsi="Consolas" w:cs="Consolas"/>
+        </w:rPr>
+        <w:t xml:space="preserve">body</w:t>
+      </w:r>
+      <w:r>
+        <w:t xml:space="preserve"> nếu có thì có chữ; còn nhầm loại để </w:t>
+      </w:r>
+      <w:r>
+        <w:rPr>
+          <w:rFonts w:ascii="Consolas" w:eastAsia="Consolas" w:hAnsi="Consolas" w:cs="Consolas"/>
+        </w:rPr>
+        <w:t xml:space="preserve">NoteService</w:t>
+      </w:r>
+      <w:r>
+        <w:t xml:space="preserve"> trả </w:t>
+      </w:r>
+      <w:r>
+        <w:rPr>
+          <w:rFonts w:ascii="Consolas" w:eastAsia="Consolas" w:hAnsi="Consolas" w:cs="Consolas"/>
+        </w:rPr>
+        <w:t xml:space="preserve">422</w:t>
+      </w:r>
+      <w:r>
+        <w:t xml:space="preserve"> (xem F15.1).</w:t>
+      </w:r>
+    </w:p>
+    <w:p>
+      <w:r>
+        <w:rPr>
+          <w:rFonts w:ascii="Consolas" w:eastAsia="Consolas" w:hAnsi="Consolas" w:cs="Consolas"/>
+          <w:b/>
+          <w:bCs/>
+        </w:rPr>
+        <w:t xml:space="preserve">NoteResponse</w:t>
+      </w:r>
+      <w:r>
+        <w:rPr>
+          <w:b/>
+          <w:bCs/>
+        </w:rPr>
+        <w:t xml:space="preserve"> khớp </w:t>
+      </w:r>
+      <w:r>
+        <w:rPr>
+          <w:rFonts w:ascii="Consolas" w:eastAsia="Consolas" w:hAnsi="Consolas" w:cs="Consolas"/>
+          <w:b/>
+          <w:bCs/>
+        </w:rPr>
+        <w:t xml:space="preserve">NoteItem</w:t>
+      </w:r>
+      <w:r>
+        <w:rPr>
+          <w:b/>
+          <w:bCs/>
+        </w:rPr>
+        <w:t xml:space="preserve"> của web.</w:t>
+      </w:r>
+      <w:r>
+        <w:t xml:space="preserve"> </w:t>
+      </w:r>
+      <w:r>
+        <w:rPr>
+          <w:rFonts w:ascii="Consolas" w:eastAsia="Consolas" w:hAnsi="Consolas" w:cs="Consolas"/>
+        </w:rPr>
+        <w:t xml:space="preserve">anchor</w:t>
+      </w:r>
+      <w:r>
+        <w:t xml:space="preserve">, </w:t>
+      </w:r>
+      <w:r>
+        <w:rPr>
+          <w:rFonts w:ascii="Consolas" w:eastAsia="Consolas" w:hAnsi="Consolas" w:cs="Consolas"/>
+        </w:rPr>
+        <w:t xml:space="preserve">quote</w:t>
+      </w:r>
+      <w:r>
+        <w:t xml:space="preserve"> luôn </w:t>
+      </w:r>
+      <w:r>
+        <w:rPr>
+          <w:rFonts w:ascii="Consolas" w:eastAsia="Consolas" w:hAnsi="Consolas" w:cs="Consolas"/>
+        </w:rPr>
+        <w:t xml:space="preserve">null</w:t>
+      </w:r>
+      <w:r>
+        <w:t xml:space="preserve"> và </w:t>
+      </w:r>
+      <w:r>
+        <w:rPr>
+          <w:rFonts w:ascii="Consolas" w:eastAsia="Consolas" w:hAnsi="Consolas" w:cs="Consolas"/>
+        </w:rPr>
+        <w:t xml:space="preserve">linked</w:t>
+      </w:r>
+      <w:r>
+        <w:t xml:space="preserve"> luôn </w:t>
+      </w:r>
+      <w:r>
+        <w:rPr>
+          <w:rFonts w:ascii="Consolas" w:eastAsia="Consolas" w:hAnsi="Consolas" w:cs="Consolas"/>
+        </w:rPr>
+        <w:t xml:space="preserve">[]</w:t>
+      </w:r>
+      <w:r>
+        <w:t xml:space="preserve"> (D-177); khai báo là </w:t>
+      </w:r>
+      <w:r>
+        <w:rPr>
+          <w:rFonts w:ascii="Consolas" w:eastAsia="Consolas" w:hAnsi="Consolas" w:cs="Consolas"/>
+        </w:rPr>
+        <w:t xml:space="preserve">Object</w:t>
+      </w:r>
+      <w:r>
+        <w:t xml:space="preserve"> và </w:t>
+      </w:r>
+      <w:r>
+        <w:rPr>
+          <w:rFonts w:ascii="Consolas" w:eastAsia="Consolas" w:hAnsi="Consolas" w:cs="Consolas"/>
+        </w:rPr>
+        <w:t xml:space="preserve">List&lt;Object&gt;</w:t>
+      </w:r>
+      <w:r>
+        <w:t xml:space="preserve"> để khi có neo thật chỉ đổi kiểu, không đổi hình dạng JSON. </w:t>
+      </w:r>
+      <w:r>
+        <w:rPr>
+          <w:rFonts w:ascii="Consolas" w:eastAsia="Consolas" w:hAnsi="Consolas" w:cs="Consolas"/>
+        </w:rPr>
+        <w:t xml:space="preserve">body</w:t>
+      </w:r>
+      <w:r>
+        <w:t xml:space="preserve"> của sơ đồ là </w:t>
+      </w:r>
+      <w:r>
+        <w:rPr>
+          <w:rFonts w:ascii="Consolas" w:eastAsia="Consolas" w:hAnsi="Consolas" w:cs="Consolas"/>
+        </w:rPr>
+        <w:t xml:space="preserve">""</w:t>
+      </w:r>
+      <w:r>
+        <w:t xml:space="preserve"> và </w:t>
+      </w:r>
+      <w:r>
+        <w:rPr>
+          <w:rFonts w:ascii="Consolas" w:eastAsia="Consolas" w:hAnsi="Consolas" w:cs="Consolas"/>
+        </w:rPr>
+        <w:t xml:space="preserve">diagram</w:t>
+      </w:r>
+      <w:r>
+        <w:t xml:space="preserve"> của ghi chú chữ là </w:t>
+      </w:r>
+      <w:r>
+        <w:rPr>
+          <w:rFonts w:ascii="Consolas" w:eastAsia="Consolas" w:hAnsi="Consolas" w:cs="Consolas"/>
+        </w:rPr>
+        <w:t xml:space="preserve">null</w:t>
+      </w:r>
+      <w:r>
+        <w:t xml:space="preserve">: web cần phân biệt hai loại nên gửi cả hai trường chứ không bỏ trường nào.</w:t>
+      </w:r>
+    </w:p>
+    <w:p>
+      <w:r>
+        <w:rPr>
+          <w:b/>
+          <w:bCs/>
+        </w:rPr>
+        <w:t xml:space="preserve">Câu gợi ý của task: "vì sao </w:t>
+      </w:r>
+      <w:r>
+        <w:rPr>
+          <w:rFonts w:ascii="Consolas" w:eastAsia="Consolas" w:hAnsi="Consolas" w:cs="Consolas"/>
+          <w:b/>
+          <w:bCs/>
+        </w:rPr>
+        <w:t xml:space="preserve">version</w:t>
+      </w:r>
+      <w:r>
+        <w:rPr>
+          <w:b/>
+          <w:bCs/>
+        </w:rPr>
+        <w:t xml:space="preserve"> nằm trong body của </w:t>
+      </w:r>
+      <w:r>
+        <w:rPr>
+          <w:rFonts w:ascii="Consolas" w:eastAsia="Consolas" w:hAnsi="Consolas" w:cs="Consolas"/>
+          <w:b/>
+          <w:bCs/>
+        </w:rPr>
+        <w:t xml:space="preserve">PATCH</w:t>
+      </w:r>
+      <w:r>
+        <w:rPr>
+          <w:b/>
+          <w:bCs/>
+        </w:rPr>
+        <w:t xml:space="preserve"> mà không ở header </w:t>
+      </w:r>
+      <w:r>
+        <w:rPr>
+          <w:rFonts w:ascii="Consolas" w:eastAsia="Consolas" w:hAnsi="Consolas" w:cs="Consolas"/>
+          <w:b/>
+          <w:bCs/>
+        </w:rPr>
+        <w:t xml:space="preserve">If-Match</w:t>
+      </w:r>
+      <w:r>
+        <w:rPr>
+          <w:b/>
+          <w:bCs/>
+        </w:rPr>
+        <w:t xml:space="preserve">?"</w:t>
+      </w:r>
+      <w:r>
+        <w:t xml:space="preserve"> </w:t>
+      </w:r>
+      <w:r>
+        <w:rPr>
+          <w:rFonts w:ascii="Consolas" w:eastAsia="Consolas" w:hAnsi="Consolas" w:cs="Consolas"/>
+        </w:rPr>
+        <w:t xml:space="preserve">If-Match</w:t>
+      </w:r>
+      <w:r>
+        <w:t xml:space="preserve"> là cách chuẩn của HTTP: máy chủ so với </w:t>
+      </w:r>
+      <w:r>
+        <w:rPr>
+          <w:rFonts w:ascii="Consolas" w:eastAsia="Consolas" w:hAnsi="Consolas" w:cs="Consolas"/>
+        </w:rPr>
+        <w:t xml:space="preserve">ETag</w:t>
+      </w:r>
+      <w:r>
+        <w:t xml:space="preserve"> của tài nguyên, lệch thì trả </w:t>
+      </w:r>
+      <w:r>
+        <w:rPr>
+          <w:rFonts w:ascii="Consolas" w:eastAsia="Consolas" w:hAnsi="Consolas" w:cs="Consolas"/>
+        </w:rPr>
+        <w:t xml:space="preserve">412 Precondition Failed</w:t>
+      </w:r>
+      <w:r>
+        <w:t xml:space="preserve">. Nó đòi hai thứ ta chưa có: mỗi mục trong danh sách mang một </w:t>
+      </w:r>
+      <w:r>
+        <w:rPr>
+          <w:rFonts w:ascii="Consolas" w:eastAsia="Consolas" w:hAnsi="Consolas" w:cs="Consolas"/>
+        </w:rPr>
+        <w:t xml:space="preserve">ETag</w:t>
+      </w:r>
+      <w:r>
+        <w:t xml:space="preserve"> riêng (danh sách trả cả mảng ghi chú, web lấy </w:t>
+      </w:r>
+      <w:r>
+        <w:rPr>
+          <w:rFonts w:ascii="Consolas" w:eastAsia="Consolas" w:hAnsi="Consolas" w:cs="Consolas"/>
+        </w:rPr>
+        <w:t xml:space="preserve">version</w:t>
+      </w:r>
+      <w:r>
+        <w:t xml:space="preserve"> từ từng phần tử), và web phải đọc, giữ và gửi thêm một header. Lệch còn đi đường lỗi </w:t>
+      </w:r>
+      <w:r>
+        <w:rPr>
+          <w:rFonts w:ascii="Consolas" w:eastAsia="Consolas" w:hAnsi="Consolas" w:cs="Consolas"/>
+        </w:rPr>
+        <w:t xml:space="preserve">412</w:t>
+      </w:r>
+      <w:r>
+        <w:t xml:space="preserve"> mới, trong khi cả app đã dùng </w:t>
+      </w:r>
+      <w:r>
+        <w:rPr>
+          <w:rFonts w:ascii="Consolas" w:eastAsia="Consolas" w:hAnsi="Consolas" w:cs="Consolas"/>
+        </w:rPr>
+        <w:t xml:space="preserve">409 CONCURRENT_MODIFICATION</w:t>
+      </w:r>
+      <w:r>
+        <w:t xml:space="preserve"> cho cùng chuyện. Đặt </w:t>
+      </w:r>
+      <w:r>
+        <w:rPr>
+          <w:rFonts w:ascii="Consolas" w:eastAsia="Consolas" w:hAnsi="Consolas" w:cs="Consolas"/>
+        </w:rPr>
+        <w:t xml:space="preserve">version</w:t>
+      </w:r>
+      <w:r>
+        <w:t xml:space="preserve"> trong JSON cho web một chỗ duy nhất (</w:t>
+      </w:r>
+      <w:r>
+        <w:rPr>
+          <w:rFonts w:ascii="Consolas" w:eastAsia="Consolas" w:hAnsi="Consolas" w:cs="Consolas"/>
+        </w:rPr>
+        <w:t xml:space="preserve">NoteItem.version</w:t>
+      </w:r>
+      <w:r>
+        <w:t xml:space="preserve">) và dùng lại đường </w:t>
+      </w:r>
+      <w:r>
+        <w:rPr>
+          <w:rFonts w:ascii="Consolas" w:eastAsia="Consolas" w:hAnsi="Consolas" w:cs="Consolas"/>
+        </w:rPr>
+        <w:t xml:space="preserve">409</w:t>
+      </w:r>
+      <w:r>
+        <w:t xml:space="preserve"> sẵn có (D-172).</w:t>
+      </w:r>
+    </w:p>
+    <w:p>
+      <w:r>
+        <w:rPr>
+          <w:b/>
+          <w:bCs/>
+        </w:rPr>
+        <w:t xml:space="preserve">Bẫy khi viết test.</w:t>
+      </w:r>
+    </w:p>
+    <w:p>
+      <w:pPr>
+        <w:pStyle w:val="ListParagraph"/>
+        <w:numPr>
+          <w:ilvl w:val="0"/>
+          <w:numId w:val="1"/>
+        </w:numPr>
+      </w:pPr>
+      <w:r>
+        <w:rPr>
+          <w:rFonts w:ascii="Consolas" w:eastAsia="Consolas" w:hAnsi="Consolas" w:cs="Consolas"/>
+        </w:rPr>
+        <w:t xml:space="preserve">@SpringBootTest</w:t>
+      </w:r>
+      <w:r>
+        <w:t xml:space="preserve"> + </w:t>
+      </w:r>
+      <w:r>
+        <w:rPr>
+          <w:rFonts w:ascii="Consolas" w:eastAsia="Consolas" w:hAnsi="Consolas" w:cs="Consolas"/>
+        </w:rPr>
+        <w:t xml:space="preserve">MockMvc</w:t>
+      </w:r>
+      <w:r>
+        <w:t xml:space="preserve"> chạy cả ứng dụng, nên mỗi test phải xóa </w:t>
+      </w:r>
+      <w:r>
+        <w:rPr>
+          <w:rFonts w:ascii="Consolas" w:eastAsia="Consolas" w:hAnsi="Consolas" w:cs="Consolas"/>
+        </w:rPr>
+        <w:t xml:space="preserve">note</w:t>
+      </w:r>
+      <w:r>
+        <w:t xml:space="preserve"> và người dùng phụ trước (</w:t>
+      </w:r>
+      <w:r>
+        <w:rPr>
+          <w:rFonts w:ascii="Consolas" w:eastAsia="Consolas" w:hAnsi="Consolas" w:cs="Consolas"/>
+        </w:rPr>
+        <w:t xml:space="preserve">@BeforeEach</w:t>
+      </w:r>
+      <w:r>
+        <w:t xml:space="preserve">), nếu không ghi chú của test trước lẫn vào danh sách.</w:t>
+      </w:r>
+    </w:p>
+    <w:p>
+      <w:pPr>
+        <w:pStyle w:val="ListParagraph"/>
+        <w:numPr>
+          <w:ilvl w:val="0"/>
+          <w:numId w:val="1"/>
+        </w:numPr>
+      </w:pPr>
+      <w:r>
+        <w:t xml:space="preserve">Mã khối trong test là UUID cố định (</w:t>
+      </w:r>
+      <w:r>
+        <w:rPr>
+          <w:rFonts w:ascii="Consolas" w:eastAsia="Consolas" w:hAnsi="Consolas" w:cs="Consolas"/>
+        </w:rPr>
+        <w:t xml:space="preserve">new UUID(0x7000L, 0x8000000000000000L | n)</w:t>
+      </w:r>
+      <w:r>
+        <w:t xml:space="preserve">), để biết chắc mã nào có ở đâu; 301 khối và 601 nối được sinh bằng vòng lặp, không gõ tay.</w:t>
+      </w:r>
+    </w:p>
+    <w:p>
+      <w:pPr>
+        <w:pStyle w:val="ListParagraph"/>
+        <w:numPr>
+          <w:ilvl w:val="0"/>
+          <w:numId w:val="1"/>
+        </w:numPr>
+      </w:pPr>
+      <w:r>
+        <w:t xml:space="preserve">Biểu thức chính quy chặn NUL là </w:t>
+      </w:r>
+      <w:r>
+        <w:rPr>
+          <w:rFonts w:ascii="Consolas" w:eastAsia="Consolas" w:hAnsi="Consolas" w:cs="Consolas"/>
+        </w:rPr>
+        <w:t xml:space="preserve">[^\x00]*</w:t>
+      </w:r>
+      <w:r>
+        <w:t xml:space="preserve"> (mọi ký tự trừ NUL), không phải </w:t>
+      </w:r>
+      <w:r>
+        <w:rPr>
+          <w:rFonts w:ascii="Consolas" w:eastAsia="Consolas" w:hAnsi="Consolas" w:cs="Consolas"/>
+        </w:rPr>
+        <w:t xml:space="preserve">.*</w:t>
+      </w:r>
+      <w:r>
+        <w:t xml:space="preserve">: dấu </w:t>
+      </w:r>
+      <w:r>
+        <w:rPr>
+          <w:rFonts w:ascii="Consolas" w:eastAsia="Consolas" w:hAnsi="Consolas" w:cs="Consolas"/>
+        </w:rPr>
+        <w:t xml:space="preserve">.</w:t>
+      </w:r>
+      <w:r>
+        <w:t xml:space="preserve"> không khớp xuống dòng, và ghi chú nhiều dòng là chuyện bình thường. Lỗi gài đổi </w:t>
+      </w:r>
+      <w:r>
+        <w:rPr>
+          <w:rFonts w:ascii="Consolas" w:eastAsia="Consolas" w:hAnsi="Consolas" w:cs="Consolas"/>
+        </w:rPr>
+        <w:t xml:space="preserve">[^\x00]*</w:t>
+      </w:r>
+      <w:r>
+        <w:t xml:space="preserve"> thành </w:t>
+      </w:r>
+      <w:r>
+        <w:rPr>
+          <w:rFonts w:ascii="Consolas" w:eastAsia="Consolas" w:hAnsi="Consolas" w:cs="Consolas"/>
+        </w:rPr>
+        <w:t xml:space="preserve">.*</w:t>
+      </w:r>
+      <w:r>
+        <w:t xml:space="preserve"> làm đỏ cả test "giữ nguyên nội dung như đã gõ" (xuống dòng bị từ chối) lẫn các ca NUL (trả </w:t>
+      </w:r>
+      <w:r>
+        <w:rPr>
+          <w:rFonts w:ascii="Consolas" w:eastAsia="Consolas" w:hAnsi="Consolas" w:cs="Consolas"/>
+        </w:rPr>
+        <w:t xml:space="preserve">500</w:t>
+      </w:r>
+      <w:r>
+        <w:t xml:space="preserve"> thay vì </w:t>
+      </w:r>
+      <w:r>
+        <w:rPr>
+          <w:rFonts w:ascii="Consolas" w:eastAsia="Consolas" w:hAnsi="Consolas" w:cs="Consolas"/>
+        </w:rPr>
+        <w:t xml:space="preserve">400</w:t>
+      </w:r>
+      <w:r>
+        <w:t xml:space="preserve">, vì PostgreSQL từ chối NUL).</w:t>
+      </w:r>
+    </w:p>
+    <w:p>
+      <w:pPr>
+        <w:pStyle w:val="ListParagraph"/>
+        <w:numPr>
+          <w:ilvl w:val="0"/>
+          <w:numId w:val="1"/>
+        </w:numPr>
+      </w:pPr>
+      <w:r>
+        <w:t xml:space="preserve">Test bảng (</w:t>
+      </w:r>
+      <w:r>
+        <w:rPr>
+          <w:rFonts w:ascii="Consolas" w:eastAsia="Consolas" w:hAnsi="Consolas" w:cs="Consolas"/>
+        </w:rPr>
+        <w:t xml:space="preserve">@ParameterizedTest</w:t>
+      </w:r>
+      <w:r>
+        <w:t xml:space="preserve">) đặt tên cho từng dòng (</w:t>
+      </w:r>
+      <w:r>
+        <w:rPr>
+          <w:rFonts w:ascii="Consolas" w:eastAsia="Consolas" w:hAnsi="Consolas" w:cs="Consolas"/>
+        </w:rPr>
+        <w:t xml:space="preserve">"a link to a block that is not there"</w:t>
+      </w:r>
+      <w:r>
+        <w:t xml:space="preserve">): khi một ca đỏ, báo cáo nói ngay ca nào, không phải đếm chỉ số.</w:t>
+      </w:r>
+    </w:p>
+    <w:p>
+      <w:pPr>
+        <w:pStyle w:val="ListParagraph"/>
+        <w:numPr>
+          <w:ilvl w:val="0"/>
+          <w:numId w:val="1"/>
+        </w:numPr>
+      </w:pPr>
+      <w:r>
+        <w:t xml:space="preserve">Lỗi gài làm lộ một bẫy của chính việc gài lỗi: sau khi thử một lỗi gài, trả file nguồn lại bằng </w:t>
+      </w:r>
+      <w:r>
+        <w:rPr>
+          <w:rFonts w:ascii="Consolas" w:eastAsia="Consolas" w:hAnsi="Consolas" w:cs="Consolas"/>
+        </w:rPr>
+        <w:t xml:space="preserve">mv</w:t>
+      </w:r>
+      <w:r>
+        <w:t xml:space="preserve"> cho nó </w:t>
+      </w:r>
+      <w:r>
+        <w:rPr>
+          <w:b/>
+          <w:bCs/>
+        </w:rPr>
+        <w:t xml:space="preserve">giờ sửa cũ</w:t>
+      </w:r>
+      <w:r>
+        <w:t xml:space="preserve">. Maven thấy class đã biên dịch (từ bản gài lỗi) mới hơn nguồn nên không biên dịch lại, và lần </w:t>
+      </w:r>
+      <w:r>
+        <w:rPr>
+          <w:rFonts w:ascii="Consolas" w:eastAsia="Consolas" w:hAnsi="Consolas" w:cs="Consolas"/>
+        </w:rPr>
+        <w:t xml:space="preserve">verify</w:t>
+      </w:r>
+      <w:r>
+        <w:t xml:space="preserve"> sau chạy trên class còn gài lỗi, đỏ đúng những test của lỗi gài mà nguồn thì sạch. Dấu hiệu: nguồn đúng mà test đỏ như lúc gài. Cách chữa: </w:t>
+      </w:r>
+      <w:r>
+        <w:rPr>
+          <w:rFonts w:ascii="Consolas" w:eastAsia="Consolas" w:hAnsi="Consolas" w:cs="Consolas"/>
+        </w:rPr>
+        <w:t xml:space="preserve">clean</w:t>
+      </w:r>
+      <w:r>
+        <w:t xml:space="preserve">, hoặc </w:t>
+      </w:r>
+      <w:r>
+        <w:rPr>
+          <w:rFonts w:ascii="Consolas" w:eastAsia="Consolas" w:hAnsi="Consolas" w:cs="Consolas"/>
+        </w:rPr>
+        <w:t xml:space="preserve">touch</w:t>
+      </w:r>
+      <w:r>
+        <w:t xml:space="preserve"> file sau khi trả.</w:t>
+      </w:r>
+    </w:p>
+    <w:p>
+      <w:r>
+        <w:rPr>
+          <w:b/>
+          <w:bCs/>
+        </w:rPr>
+        <w:t xml:space="preserve">Kiểm chứng (BE-91).</w:t>
+      </w:r>
+    </w:p>
+    <w:p>
+      <w:pPr>
+        <w:pStyle w:val="ListParagraph"/>
+        <w:numPr>
+          <w:ilvl w:val="0"/>
+          <w:numId w:val="1"/>
+        </w:numPr>
+      </w:pPr>
+      <w:r>
+        <w:t xml:space="preserve">ĐỎ đúng lý do: 69 test viết trước, chạy khi chưa có controller: 66 đỏ và 2 lỗi, tất cả vì </w:t>
+      </w:r>
+      <w:r>
+        <w:rPr>
+          <w:rFonts w:ascii="Consolas" w:eastAsia="Consolas" w:hAnsi="Consolas" w:cs="Consolas"/>
+        </w:rPr>
+        <w:t xml:space="preserve">404 RESOURCE_NOT_FOUND</w:t>
+      </w:r>
+      <w:r>
+        <w:t xml:space="preserve"> (không có đường dẫn).</w:t>
+      </w:r>
+    </w:p>
+    <w:p>
+      <w:pPr>
+        <w:pStyle w:val="ListParagraph"/>
+        <w:numPr>
+          <w:ilvl w:val="0"/>
+          <w:numId w:val="1"/>
+        </w:numPr>
+      </w:pPr>
+      <w:r>
+        <w:t xml:space="preserve">XANH: </w:t>
+      </w:r>
+      <w:r>
+        <w:rPr>
+          <w:rFonts w:ascii="Consolas" w:eastAsia="Consolas" w:hAnsi="Consolas" w:cs="Consolas"/>
+        </w:rPr>
+        <w:t xml:space="preserve">NotesApiTests</w:t>
+      </w:r>
+      <w:r>
+        <w:t xml:space="preserve"> 69, </w:t>
+      </w:r>
+      <w:r>
+        <w:rPr>
+          <w:rFonts w:ascii="Consolas" w:eastAsia="Consolas" w:hAnsi="Consolas" w:cs="Consolas"/>
+        </w:rPr>
+        <w:t xml:space="preserve">ModularityTests</w:t>
+      </w:r>
+      <w:r>
+        <w:t xml:space="preserve"> 2. </w:t>
+      </w:r>
+      <w:r>
+        <w:rPr>
+          <w:rFonts w:ascii="Consolas" w:eastAsia="Consolas" w:hAnsi="Consolas" w:cs="Consolas"/>
+        </w:rPr>
+        <w:t xml:space="preserve">./mvnw -B -ntp clean verify</w:t>
+      </w:r>
+      <w:r>
+        <w:t xml:space="preserve"> trong worktree: 1965 test, 0 lỗi, 8 bỏ qua (sẵn có), BUILD SUCCESS.</w:t>
+      </w:r>
+    </w:p>
+    <w:p>
+      <w:pPr>
+        <w:pStyle w:val="ListParagraph"/>
+        <w:numPr>
+          <w:ilvl w:val="0"/>
+          <w:numId w:val="1"/>
+        </w:numPr>
+      </w:pPr>
+      <w:r>
+        <w:t xml:space="preserve">Gài lỗi: 10 lỗi ở lớp API, cả 10 làm đỏ đúng test của nó: bỏ luật ghi chú chữ, bỏ luật ghi chú sơ đồ, tắt </w:t>
+      </w:r>
+      <w:r>
+        <w:rPr>
+          <w:rFonts w:ascii="Consolas" w:eastAsia="Consolas" w:hAnsi="Consolas" w:cs="Consolas"/>
+        </w:rPr>
+        <w:t xml:space="preserve">@FollowsDiagramRules</w:t>
+      </w:r>
+      <w:r>
+        <w:t xml:space="preserve">, </w:t>
+      </w:r>
+      <w:r>
+        <w:rPr>
+          <w:rFonts w:ascii="Consolas" w:eastAsia="Consolas" w:hAnsi="Consolas" w:cs="Consolas"/>
+        </w:rPr>
+        <w:t xml:space="preserve">PATCH</w:t>
+      </w:r>
+      <w:r>
+        <w:t xml:space="preserve"> không cần trường nào, </w:t>
+      </w:r>
+      <w:r>
+        <w:rPr>
+          <w:rFonts w:ascii="Consolas" w:eastAsia="Consolas" w:hAnsi="Consolas" w:cs="Consolas"/>
+        </w:rPr>
+        <w:t xml:space="preserve">version</w:t>
+      </w:r>
+      <w:r>
+        <w:t xml:space="preserve"> không bắt buộc, </w:t>
+      </w:r>
+      <w:r>
+        <w:rPr>
+          <w:rFonts w:ascii="Consolas" w:eastAsia="Consolas" w:hAnsi="Consolas" w:cs="Consolas"/>
+        </w:rPr>
+        <w:t xml:space="preserve">version</w:t>
+      </w:r>
+      <w:r>
+        <w:t xml:space="preserve"> âm, cho phép NUL, response bỏ </w:t>
+      </w:r>
+      <w:r>
+        <w:rPr>
+          <w:rFonts w:ascii="Consolas" w:eastAsia="Consolas" w:hAnsi="Consolas" w:cs="Consolas"/>
+        </w:rPr>
+        <w:t xml:space="preserve">diagram</w:t>
+      </w:r>
+      <w:r>
+        <w:t xml:space="preserve">, </w:t>
+      </w:r>
+      <w:r>
+        <w:rPr>
+          <w:rFonts w:ascii="Consolas" w:eastAsia="Consolas" w:hAnsi="Consolas" w:cs="Consolas"/>
+        </w:rPr>
+        <w:t xml:space="preserve">body</w:t>
+      </w:r>
+      <w:r>
+        <w:t xml:space="preserve"> trắng ở </w:t>
+      </w:r>
+      <w:r>
+        <w:rPr>
+          <w:rFonts w:ascii="Consolas" w:eastAsia="Consolas" w:hAnsi="Consolas" w:cs="Consolas"/>
+        </w:rPr>
+        <w:t xml:space="preserve">PATCH</w:t>
+      </w:r>
+      <w:r>
+        <w:t xml:space="preserve">, bỏ </w:t>
+      </w:r>
+      <w:r>
+        <w:rPr>
+          <w:rFonts w:ascii="Consolas" w:eastAsia="Consolas" w:hAnsi="Consolas" w:cs="Consolas"/>
+        </w:rPr>
+        <w:t xml:space="preserve">Location</w:t>
+      </w:r>
+      <w:r>
+        <w:t xml:space="preserve">.</w:t>
+      </w:r>
+    </w:p>
+    <w:p>
+      <w:pPr>
+        <w:pStyle w:val="ListParagraph"/>
+        <w:numPr>
+          <w:ilvl w:val="0"/>
+          <w:numId w:val="1"/>
+        </w:numPr>
+      </w:pPr>
+      <w:r>
+        <w:t xml:space="preserve">Chưa kiểm: gọi API trên backend chạy thật; làm ở FE-90 cùng Chrome thật.</w:t>
       </w:r>
     </w:p>
     <w:p/>

</xml_diff>

<commit_message>
docs(f15): FE-90 done, F15.3 in the Phase 4 knowledge file
tasks.md 2.1 ticked with what was done differently and why (a base version per
editor, one request at a time, a delete of a gone note counts as deleted) and
its evidence (41 new tests red first, notes 122/122, 10 injected faults, Chrome
at 1440 and 375 on a throwaway backend); F15.3 added to phase-4-planner (md and
docx); PROJECT_STATE row updated.

Co-Authored-By: Claude Sonnet 5.5 <noreply@anthropic.com>
</commit_message>
<xml_diff>
--- a/docs/knowledge/phase-4-planner.docx
+++ b/docs/knowledge/phase-4-planner.docx
@@ -115,7 +115,7 @@
         <w:t xml:space="preserve">openspec/changes/f15-notes</w:t>
       </w:r>
       <w:r>
-        <w:t xml:space="preserve"> (ghi chú chữ và ghi chú dạng sơ đồ lưu trong database, chưa gắn tin nhắn), nằm ở phần cuối, mục "Ghi chú (F15)": BE-90, BE-91.</w:t>
+        <w:t xml:space="preserve"> (ghi chú chữ và ghi chú dạng sơ đồ lưu trong database, chưa gắn tin nhắn), nằm ở phần cuối, mục "Ghi chú (F15)": BE-90, BE-91, FE-90.</w:t>
         <w:br/>
       </w:r>
       <w:r>
@@ -9666,6 +9666,1577 @@
       </w:pPr>
       <w:r>
         <w:t xml:space="preserve">Chưa kiểm: gọi API trên backend chạy thật; làm ở FE-90 cùng Chrome thật.</w:t>
+      </w:r>
+    </w:p>
+    <w:p>
+      <w:pPr>
+        <w:pStyle w:val="Heading3"/>
+      </w:pPr>
+      <w:r>
+        <w:t xml:space="preserve">F15.3 Màn Ghi chú trên API, lưu có phiên bản (FE-90)</w:t>
+      </w:r>
+    </w:p>
+    <w:p>
+      <w:r>
+        <w:rPr>
+          <w:b/>
+          <w:bCs/>
+        </w:rPr>
+        <w:t xml:space="preserve">Ở đâu:</w:t>
+      </w:r>
+      <w:r>
+        <w:t xml:space="preserve"> </w:t>
+      </w:r>
+      <w:r>
+        <w:rPr>
+          <w:rFonts w:ascii="Consolas" w:eastAsia="Consolas" w:hAnsi="Consolas" w:cs="Consolas"/>
+        </w:rPr>
+        <w:t xml:space="preserve">apps/sino-web/src/features/notes/</w:t>
+      </w:r>
+      <w:r>
+        <w:t xml:space="preserve">: </w:t>
+      </w:r>
+      <w:r>
+        <w:rPr>
+          <w:rFonts w:ascii="Consolas" w:eastAsia="Consolas" w:hAnsi="Consolas" w:cs="Consolas"/>
+        </w:rPr>
+        <w:t xml:space="preserve">notes.api.ts</w:t>
+      </w:r>
+      <w:r>
+        <w:t xml:space="preserve">, </w:t>
+      </w:r>
+      <w:r>
+        <w:rPr>
+          <w:rFonts w:ascii="Consolas" w:eastAsia="Consolas" w:hAnsi="Consolas" w:cs="Consolas"/>
+        </w:rPr>
+        <w:t xml:space="preserve">useNotes.ts</w:t>
+      </w:r>
+      <w:r>
+        <w:t xml:space="preserve">, </w:t>
+      </w:r>
+      <w:r>
+        <w:rPr>
+          <w:rFonts w:ascii="Consolas" w:eastAsia="Consolas" w:hAnsi="Consolas" w:cs="Consolas"/>
+        </w:rPr>
+        <w:t xml:space="preserve">useAutosave.ts</w:t>
+      </w:r>
+      <w:r>
+        <w:t xml:space="preserve"> (mới), </w:t>
+      </w:r>
+      <w:r>
+        <w:rPr>
+          <w:rFonts w:ascii="Consolas" w:eastAsia="Consolas" w:hAnsi="Consolas" w:cs="Consolas"/>
+        </w:rPr>
+        <w:t xml:space="preserve">components/{NoteEditor, SyncNotice, NoteList}.tsx</w:t>
+      </w:r>
+      <w:r>
+        <w:t xml:space="preserve">, </w:t>
+      </w:r>
+      <w:r>
+        <w:rPr>
+          <w:rFonts w:ascii="Consolas" w:eastAsia="Consolas" w:hAnsi="Consolas" w:cs="Consolas"/>
+        </w:rPr>
+        <w:t xml:space="preserve">diagram/{DiagramEditor.tsx, diagram.ts}</w:t>
+      </w:r>
+      <w:r>
+        <w:t xml:space="preserve"> (</w:t>
+      </w:r>
+      <w:r>
+        <w:rPr>
+          <w:rFonts w:ascii="Consolas" w:eastAsia="Consolas" w:hAnsi="Consolas" w:cs="Consolas"/>
+        </w:rPr>
+        <w:t xml:space="preserve">sameDiagram</w:t>
+      </w:r>
+      <w:r>
+        <w:t xml:space="preserve">), </w:t>
+      </w:r>
+      <w:r>
+        <w:rPr>
+          <w:rFonts w:ascii="Consolas" w:eastAsia="Consolas" w:hAnsi="Consolas" w:cs="Consolas"/>
+        </w:rPr>
+        <w:t xml:space="preserve">format.ts</w:t>
+      </w:r>
+      <w:r>
+        <w:t xml:space="preserve"> (</w:t>
+      </w:r>
+      <w:r>
+        <w:rPr>
+          <w:rFonts w:ascii="Consolas" w:eastAsia="Consolas" w:hAnsi="Consolas" w:cs="Consolas"/>
+        </w:rPr>
+        <w:t xml:space="preserve">hasAnchoredNotes</w:t>
+      </w:r>
+      <w:r>
+        <w:t xml:space="preserve">). Test: </w:t>
+      </w:r>
+      <w:r>
+        <w:rPr>
+          <w:rFonts w:ascii="Consolas" w:eastAsia="Consolas" w:hAnsi="Consolas" w:cs="Consolas"/>
+        </w:rPr>
+        <w:t xml:space="preserve">NotesOnApi.test.tsx</w:t>
+      </w:r>
+      <w:r>
+        <w:t xml:space="preserve">, </w:t>
+      </w:r>
+      <w:r>
+        <w:rPr>
+          <w:rFonts w:ascii="Consolas" w:eastAsia="Consolas" w:hAnsi="Consolas" w:cs="Consolas"/>
+        </w:rPr>
+        <w:t xml:space="preserve">notes.api.test.ts</w:t>
+      </w:r>
+      <w:r>
+        <w:t xml:space="preserve">, </w:t>
+      </w:r>
+      <w:r>
+        <w:rPr>
+          <w:rFonts w:ascii="Consolas" w:eastAsia="Consolas" w:hAnsi="Consolas" w:cs="Consolas"/>
+        </w:rPr>
+        <w:t xml:space="preserve">src/test/{notesBackend.ts, notesSampleApi.ts, fixtures/notesApi.ts}</w:t>
+      </w:r>
+      <w:r>
+        <w:t xml:space="preserve">.</w:t>
+      </w:r>
+    </w:p>
+    <w:p>
+      <w:r>
+        <w:rPr>
+          <w:b/>
+          <w:bCs/>
+        </w:rPr>
+        <w:t xml:space="preserve">Hợp đồng không đổi, chỉ đổi thân hàm (D-42).</w:t>
+      </w:r>
+      <w:r>
+        <w:t xml:space="preserve"> Màn dựng trên dữ liệu mẫu từ NT-01; </w:t>
+      </w:r>
+      <w:r>
+        <w:rPr>
+          <w:rFonts w:ascii="Consolas" w:eastAsia="Consolas" w:hAnsi="Consolas" w:cs="Consolas"/>
+        </w:rPr>
+        <w:t xml:space="preserve">notes.api.ts</w:t>
+      </w:r>
+      <w:r>
+        <w:t xml:space="preserve"> là chỗ duy nhất gọi mạng, nên chuyển sang API thật chỉ là viết lại bốn hàm (</w:t>
+      </w:r>
+      <w:r>
+        <w:rPr>
+          <w:rFonts w:ascii="Consolas" w:eastAsia="Consolas" w:hAnsi="Consolas" w:cs="Consolas"/>
+        </w:rPr>
+        <w:t xml:space="preserve">fetchNotes</w:t>
+      </w:r>
+      <w:r>
+        <w:t xml:space="preserve">, </w:t>
+      </w:r>
+      <w:r>
+        <w:rPr>
+          <w:rFonts w:ascii="Consolas" w:eastAsia="Consolas" w:hAnsi="Consolas" w:cs="Consolas"/>
+        </w:rPr>
+        <w:t xml:space="preserve">createNote</w:t>
+      </w:r>
+      <w:r>
+        <w:t xml:space="preserve">, </w:t>
+      </w:r>
+      <w:r>
+        <w:rPr>
+          <w:rFonts w:ascii="Consolas" w:eastAsia="Consolas" w:hAnsi="Consolas" w:cs="Consolas"/>
+        </w:rPr>
+        <w:t xml:space="preserve">saveNote</w:t>
+      </w:r>
+      <w:r>
+        <w:t xml:space="preserve">, </w:t>
+      </w:r>
+      <w:r>
+        <w:rPr>
+          <w:rFonts w:ascii="Consolas" w:eastAsia="Consolas" w:hAnsi="Consolas" w:cs="Consolas"/>
+        </w:rPr>
+        <w:t xml:space="preserve">deleteNote</w:t>
+      </w:r>
+      <w:r>
+        <w:t xml:space="preserve">) và thêm </w:t>
+      </w:r>
+      <w:r>
+        <w:rPr>
+          <w:rFonts w:ascii="Consolas" w:eastAsia="Consolas" w:hAnsi="Consolas" w:cs="Consolas"/>
+        </w:rPr>
+        <w:t xml:space="preserve">version</w:t>
+      </w:r>
+      <w:r>
+        <w:t xml:space="preserve"> vào </w:t>
+      </w:r>
+      <w:r>
+        <w:rPr>
+          <w:rFonts w:ascii="Consolas" w:eastAsia="Consolas" w:hAnsi="Consolas" w:cs="Consolas"/>
+        </w:rPr>
+        <w:t xml:space="preserve">NoteItem</w:t>
+      </w:r>
+      <w:r>
+        <w:t xml:space="preserve">. </w:t>
+      </w:r>
+      <w:r>
+        <w:rPr>
+          <w:rFonts w:ascii="Consolas" w:eastAsia="Consolas" w:hAnsi="Consolas" w:cs="Consolas"/>
+        </w:rPr>
+        <w:t xml:space="preserve">saveNote</w:t>
+      </w:r>
+      <w:r>
+        <w:t xml:space="preserve"> chỉ gửi trường đã đổi cùng </w:t>
+      </w:r>
+      <w:r>
+        <w:rPr>
+          <w:rFonts w:ascii="Consolas" w:eastAsia="Consolas" w:hAnsi="Consolas" w:cs="Consolas"/>
+        </w:rPr>
+        <w:t xml:space="preserve">version</w:t>
+      </w:r>
+      <w:r>
+        <w:t xml:space="preserve"> (</w:t>
+      </w:r>
+      <w:r>
+        <w:rPr>
+          <w:rFonts w:ascii="Consolas" w:eastAsia="Consolas" w:hAnsi="Consolas" w:cs="Consolas"/>
+        </w:rPr>
+        <w:t xml:space="preserve">JSON.stringify</w:t>
+      </w:r>
+      <w:r>
+        <w:t xml:space="preserve"> bỏ trường </w:t>
+      </w:r>
+      <w:r>
+        <w:rPr>
+          <w:rFonts w:ascii="Consolas" w:eastAsia="Consolas" w:hAnsi="Consolas" w:cs="Consolas"/>
+        </w:rPr>
+        <w:t xml:space="preserve">undefined</w:t>
+      </w:r>
+      <w:r>
+        <w:t xml:space="preserve">, nên trường không gửi thì máy chủ giữ nguyên; </w:t>
+      </w:r>
+      <w:r>
+        <w:rPr>
+          <w:rFonts w:ascii="Consolas" w:eastAsia="Consolas" w:hAnsi="Consolas" w:cs="Consolas"/>
+        </w:rPr>
+        <w:t xml:space="preserve">title: ''</w:t>
+      </w:r>
+      <w:r>
+        <w:t xml:space="preserve"> được gửi để xóa tiêu đề). Ghi chú sơ đồ gửi </w:t>
+      </w:r>
+      <w:r>
+        <w:rPr>
+          <w:rFonts w:ascii="Consolas" w:eastAsia="Consolas" w:hAnsi="Consolas" w:cs="Consolas"/>
+        </w:rPr>
+        <w:t xml:space="preserve">{ kind: 'DIAGRAM', title, diagram }</w:t>
+      </w:r>
+      <w:r>
+        <w:t xml:space="preserve"> và không có </w:t>
+      </w:r>
+      <w:r>
+        <w:rPr>
+          <w:rFonts w:ascii="Consolas" w:eastAsia="Consolas" w:hAnsi="Consolas" w:cs="Consolas"/>
+        </w:rPr>
+        <w:t xml:space="preserve">body</w:t>
+      </w:r>
+      <w:r>
+        <w:t xml:space="preserve">.</w:t>
+      </w:r>
+    </w:p>
+    <w:p>
+      <w:pPr>
+        <w:shd w:val="clear" w:color="auto" w:fill="F2F3F5"/>
+        <w:ind w:left="0"/>
+      </w:pPr>
+      <w:r>
+        <w:rPr>
+          <w:rFonts w:ascii="Consolas" w:eastAsia="Consolas" w:hAnsi="Consolas" w:cs="Consolas"/>
+          <w:sz w:val="19"/>
+          <w:szCs w:val="19"/>
+        </w:rPr>
+        <w:t xml:space="preserve">gõ chữ / kéo khối</w:t>
+        <w:br/>
+        <w:t xml:space="preserve">   |  ngừng 600 ms, hoặc rời ô, hoặc rời ghi chú</w:t>
+        <w:br/>
+        <w:t xml:space="preserve">   v</w:t>
+        <w:br/>
+        <w:t xml:space="preserve">hàng đợi (mỗi lần một việc, theo thứ tự) --&gt; PATCH { version: base.version, ...phần đã đổi }</w:t>
+        <w:br/>
+        <w:t xml:space="preserve">                                                  |</w:t>
+        <w:br/>
+        <w:t xml:space="preserve">   200  --&gt; base = bản máy chủ trả về</w:t>
+        <w:br/>
+        <w:t xml:space="preserve">   409  --&gt; "Ghi chú này vừa được sửa ở nơi khác."  --&gt; [Tải bản mới] [Lưu bản của tôi]</w:t>
+        <w:br/>
+        <w:t xml:space="preserve">   404  --&gt; "Ghi chú này đã bị xóa ở nơi khác."     --&gt; [Lưu thành ghi chú mới]</w:t>
+        <w:br/>
+        <w:t xml:space="preserve">   khác --&gt; "Không lưu được thay đổi."              --&gt; [Thử lại]   (lần ngừng gõ sau cũng tự thử)</w:t>
+      </w:r>
+    </w:p>
+    <w:p>
+      <w:r>
+        <w:rPr>
+          <w:b/>
+          <w:bCs/>
+        </w:rPr>
+        <w:t xml:space="preserve">Khái niệm chính: </w:t>
+      </w:r>
+      <w:r>
+        <w:rPr>
+          <w:rFonts w:ascii="Consolas" w:eastAsia="Consolas" w:hAnsi="Consolas" w:cs="Consolas"/>
+          <w:b/>
+          <w:bCs/>
+        </w:rPr>
+        <w:t xml:space="preserve">base</w:t>
+      </w:r>
+      <w:r>
+        <w:rPr>
+          <w:b/>
+          <w:bCs/>
+        </w:rPr>
+        <w:t xml:space="preserve">, bản mà trình soạn xuất phát từ đó, khác với bản trong cache.</w:t>
+      </w:r>
+      <w:r>
+        <w:t xml:space="preserve"> Cache của danh sách (</w:t>
+      </w:r>
+      <w:r>
+        <w:rPr>
+          <w:rFonts w:ascii="Consolas" w:eastAsia="Consolas" w:hAnsi="Consolas" w:cs="Consolas"/>
+        </w:rPr>
+        <w:t xml:space="preserve">useNotes</w:t>
+      </w:r>
+      <w:r>
+        <w:t xml:space="preserve">) đọc lại mỗi khi tab trở lại phía trước. Nếu một lần lưu lấy </w:t>
+      </w:r>
+      <w:r>
+        <w:rPr>
+          <w:rFonts w:ascii="Consolas" w:eastAsia="Consolas" w:hAnsi="Consolas" w:cs="Consolas"/>
+        </w:rPr>
+        <w:t xml:space="preserve">version</w:t>
+      </w:r>
+      <w:r>
+        <w:t xml:space="preserve"> từ cache, thì: người dùng đang gõ dở, tab khác vừa sửa cùng ghi chú, danh sách đọc lại mang </w:t>
+      </w:r>
+      <w:r>
+        <w:rPr>
+          <w:rFonts w:ascii="Consolas" w:eastAsia="Consolas" w:hAnsi="Consolas" w:cs="Consolas"/>
+        </w:rPr>
+        <w:t xml:space="preserve">version</w:t>
+      </w:r>
+      <w:r>
+        <w:t xml:space="preserve"> mới của tab kia vào cache, lần tự lưu kế tiếp gửi </w:t>
+      </w:r>
+      <w:r>
+        <w:rPr>
+          <w:rFonts w:ascii="Consolas" w:eastAsia="Consolas" w:hAnsi="Consolas" w:cs="Consolas"/>
+        </w:rPr>
+        <w:t xml:space="preserve">version</w:t>
+      </w:r>
+      <w:r>
+        <w:t xml:space="preserve"> mới đó và </w:t>
+      </w:r>
+      <w:r>
+        <w:rPr>
+          <w:b/>
+          <w:bCs/>
+        </w:rPr>
+        <w:t xml:space="preserve">thắng im lặng</w:t>
+      </w:r>
+      <w:r>
+        <w:t xml:space="preserve">, ghi đè đoạn vừa sửa ở tab kia. Đúng cái mà D-172 sinh ra để chặn. Vì vậy </w:t>
+      </w:r>
+      <w:r>
+        <w:rPr>
+          <w:rFonts w:ascii="Consolas" w:eastAsia="Consolas" w:hAnsi="Consolas" w:cs="Consolas"/>
+        </w:rPr>
+        <w:t xml:space="preserve">useAutosave</w:t>
+      </w:r>
+      <w:r>
+        <w:t xml:space="preserve"> giữ </w:t>
+      </w:r>
+      <w:r>
+        <w:rPr>
+          <w:rFonts w:ascii="Consolas" w:eastAsia="Consolas" w:hAnsi="Consolas" w:cs="Consolas"/>
+        </w:rPr>
+        <w:t xml:space="preserve">base</w:t>
+      </w:r>
+      <w:r>
+        <w:t xml:space="preserve"> riêng:</w:t>
+      </w:r>
+    </w:p>
+    <w:p>
+      <w:pPr>
+        <w:pStyle w:val="ListParagraph"/>
+        <w:numPr>
+          <w:ilvl w:val="0"/>
+          <w:numId w:val="1"/>
+        </w:numPr>
+      </w:pPr>
+      <w:r>
+        <w:rPr>
+          <w:rFonts w:ascii="Consolas" w:eastAsia="Consolas" w:hAnsi="Consolas" w:cs="Consolas"/>
+        </w:rPr>
+        <w:t xml:space="preserve">base</w:t>
+      </w:r>
+      <w:r>
+        <w:t xml:space="preserve"> bắt đầu từ ghi chú lúc mở; mỗi lần lưu thành công đổi </w:t>
+      </w:r>
+      <w:r>
+        <w:rPr>
+          <w:rFonts w:ascii="Consolas" w:eastAsia="Consolas" w:hAnsi="Consolas" w:cs="Consolas"/>
+        </w:rPr>
+        <w:t xml:space="preserve">base</w:t>
+      </w:r>
+      <w:r>
+        <w:t xml:space="preserve"> thành bản máy chủ trả về;</w:t>
+      </w:r>
+    </w:p>
+    <w:p>
+      <w:pPr>
+        <w:pStyle w:val="ListParagraph"/>
+        <w:numPr>
+          <w:ilvl w:val="0"/>
+          <w:numId w:val="1"/>
+        </w:numPr>
+      </w:pPr>
+      <w:r>
+        <w:t xml:space="preserve">danh sách đọc lại </w:t>
+      </w:r>
+      <w:r>
+        <w:rPr>
+          <w:b/>
+          <w:bCs/>
+        </w:rPr>
+        <w:t xml:space="preserve">không</w:t>
+      </w:r>
+      <w:r>
+        <w:t xml:space="preserve"> đổi </w:t>
+      </w:r>
+      <w:r>
+        <w:rPr>
+          <w:rFonts w:ascii="Consolas" w:eastAsia="Consolas" w:hAnsi="Consolas" w:cs="Consolas"/>
+        </w:rPr>
+        <w:t xml:space="preserve">base</w:t>
+      </w:r>
+      <w:r>
+        <w:t xml:space="preserve"> khi còn thay đổi chưa lưu (</w:t>
+      </w:r>
+      <w:r>
+        <w:rPr>
+          <w:rFonts w:ascii="Consolas" w:eastAsia="Consolas" w:hAnsi="Consolas" w:cs="Consolas"/>
+        </w:rPr>
+        <w:t xml:space="preserve">changeOf(base, nội dung) !== null</w:t>
+      </w:r>
+      <w:r>
+        <w:t xml:space="preserve">), nên lần lưu sau đi với </w:t>
+      </w:r>
+      <w:r>
+        <w:rPr>
+          <w:rFonts w:ascii="Consolas" w:eastAsia="Consolas" w:hAnsi="Consolas" w:cs="Consolas"/>
+        </w:rPr>
+        <w:t xml:space="preserve">version</w:t>
+      </w:r>
+      <w:r>
+        <w:t xml:space="preserve"> cũ và nhận </w:t>
+      </w:r>
+      <w:r>
+        <w:rPr>
+          <w:rFonts w:ascii="Consolas" w:eastAsia="Consolas" w:hAnsi="Consolas" w:cs="Consolas"/>
+        </w:rPr>
+        <w:t xml:space="preserve">409</w:t>
+      </w:r>
+      <w:r>
+        <w:t xml:space="preserve">, còn chữ đang gõ vẫn nằm trong ô;</w:t>
+      </w:r>
+    </w:p>
+    <w:p>
+      <w:pPr>
+        <w:pStyle w:val="ListParagraph"/>
+        <w:numPr>
+          <w:ilvl w:val="0"/>
+          <w:numId w:val="1"/>
+        </w:numPr>
+      </w:pPr>
+      <w:r>
+        <w:t xml:space="preserve">khi không còn gì chưa lưu, trình soạn nhận bản mới (</w:t>
+      </w:r>
+      <w:r>
+        <w:rPr>
+          <w:rFonts w:ascii="Consolas" w:eastAsia="Consolas" w:hAnsi="Consolas" w:cs="Consolas"/>
+        </w:rPr>
+        <w:t xml:space="preserve">adopt</w:t>
+      </w:r>
+      <w:r>
+        <w:t xml:space="preserve">), nên không ai phải bấm gì chỉ để thấy chữ từ tab kia.</w:t>
+      </w:r>
+    </w:p>
+    <w:p>
+      <w:r>
+        <w:t xml:space="preserve">Cache chỉ để hiển thị ("Sửa lúc ...", chip, thẻ); </w:t>
+      </w:r>
+      <w:r>
+        <w:rPr>
+          <w:rFonts w:ascii="Consolas" w:eastAsia="Consolas" w:hAnsi="Consolas" w:cs="Consolas"/>
+        </w:rPr>
+        <w:t xml:space="preserve">base</w:t>
+      </w:r>
+      <w:r>
+        <w:t xml:space="preserve"> mới là cái để lưu. Test </w:t>
+      </w:r>
+      <w:r>
+        <w:rPr>
+          <w:rFonts w:ascii="Consolas" w:eastAsia="Consolas" w:hAnsi="Consolas" w:cs="Consolas"/>
+        </w:rPr>
+        <w:t xml:space="preserve">does not take the typing away when the list is read again, and the save that follows is refused, not silent</w:t>
+      </w:r>
+      <w:r>
+        <w:t xml:space="preserve"> kiểm đúng chuyện này: lần lưu đi với </w:t>
+      </w:r>
+      <w:r>
+        <w:rPr>
+          <w:rFonts w:ascii="Consolas" w:eastAsia="Consolas" w:hAnsi="Consolas" w:cs="Consolas"/>
+        </w:rPr>
+        <w:t xml:space="preserve">version</w:t>
+      </w:r>
+      <w:r>
+        <w:t xml:space="preserve"> 2, không phải 3 vừa đọc.</w:t>
+      </w:r>
+    </w:p>
+    <w:p>
+      <w:r>
+        <w:rPr>
+          <w:b/>
+          <w:bCs/>
+        </w:rPr>
+        <w:t xml:space="preserve">Hàng đợi, vì một lần lưu chồng lên lần lưu trước sẽ tự gây </w:t>
+      </w:r>
+      <w:r>
+        <w:rPr>
+          <w:rFonts w:ascii="Consolas" w:eastAsia="Consolas" w:hAnsi="Consolas" w:cs="Consolas"/>
+          <w:b/>
+          <w:bCs/>
+        </w:rPr>
+        <w:t xml:space="preserve">409</w:t>
+      </w:r>
+      <w:r>
+        <w:rPr>
+          <w:b/>
+          <w:bCs/>
+        </w:rPr>
+        <w:t xml:space="preserve"> cho chính mình.</w:t>
+      </w:r>
+      <w:r>
+        <w:t xml:space="preserve"> Gõ, rời ô (lưu bắt đầu), gõ tiếp, rời ô lần nữa trong lúc lần đầu chưa xong: hai </w:t>
+      </w:r>
+      <w:r>
+        <w:rPr>
+          <w:rFonts w:ascii="Consolas" w:eastAsia="Consolas" w:hAnsi="Consolas" w:cs="Consolas"/>
+        </w:rPr>
+        <w:t xml:space="preserve">PATCH</w:t>
+      </w:r>
+      <w:r>
+        <w:t xml:space="preserve"> cùng mang </w:t>
+      </w:r>
+      <w:r>
+        <w:rPr>
+          <w:rFonts w:ascii="Consolas" w:eastAsia="Consolas" w:hAnsi="Consolas" w:cs="Consolas"/>
+        </w:rPr>
+        <w:t xml:space="preserve">version</w:t>
+      </w:r>
+      <w:r>
+        <w:t xml:space="preserve"> cũ, cái sau bị </w:t>
+      </w:r>
+      <w:r>
+        <w:rPr>
+          <w:rFonts w:ascii="Consolas" w:eastAsia="Consolas" w:hAnsi="Consolas" w:cs="Consolas"/>
+        </w:rPr>
+        <w:t xml:space="preserve">409</w:t>
+      </w:r>
+      <w:r>
+        <w:t xml:space="preserve">. Mọi yêu cầu mạng của trình soạn (lưu, ghim, tải bản mới, lưu bản của tôi) đi qua một chuỗi </w:t>
+      </w:r>
+      <w:r>
+        <w:rPr>
+          <w:rFonts w:ascii="Consolas" w:eastAsia="Consolas" w:hAnsi="Consolas" w:cs="Consolas"/>
+        </w:rPr>
+        <w:t xml:space="preserve">Promise</w:t>
+      </w:r>
+      <w:r>
+        <w:t xml:space="preserve">:</w:t>
+      </w:r>
+    </w:p>
+    <w:p>
+      <w:pPr>
+        <w:shd w:val="clear" w:color="auto" w:fill="F2F3F5"/>
+        <w:ind w:left="0"/>
+      </w:pPr>
+      <w:r>
+        <w:rPr>
+          <w:rFonts w:ascii="Consolas" w:eastAsia="Consolas" w:hAnsi="Consolas" w:cs="Consolas"/>
+          <w:sz w:val="19"/>
+          <w:szCs w:val="19"/>
+        </w:rPr>
+        <w:t xml:space="preserve">queue.current = queue.current.then(task).catch(() =&gt; undefined).finally(() =&gt; { pending.current -= 1 })</w:t>
+      </w:r>
+    </w:p>
+    <w:p>
+      <w:r>
+        <w:t xml:space="preserve">Mỗi việc đọc nội dung và </w:t>
+      </w:r>
+      <w:r>
+        <w:rPr>
+          <w:rFonts w:ascii="Consolas" w:eastAsia="Consolas" w:hAnsi="Consolas" w:cs="Consolas"/>
+        </w:rPr>
+        <w:t xml:space="preserve">base</w:t>
+      </w:r>
+      <w:r>
+        <w:t xml:space="preserve"> </w:t>
+      </w:r>
+      <w:r>
+        <w:rPr>
+          <w:b/>
+          <w:bCs/>
+        </w:rPr>
+        <w:t xml:space="preserve">lúc đến lượt</w:t>
+      </w:r>
+      <w:r>
+        <w:t xml:space="preserve">, không lúc được xếp hàng, nên hai lần "lưu" liên tiếp thành một lần lưu thật và một lần không có gì để lưu. </w:t>
+      </w:r>
+      <w:r>
+        <w:rPr>
+          <w:rFonts w:ascii="Consolas" w:eastAsia="Consolas" w:hAnsi="Consolas" w:cs="Consolas"/>
+        </w:rPr>
+        <w:t xml:space="preserve">.catch(() =&gt; undefined)</w:t>
+      </w:r>
+      <w:r>
+        <w:t xml:space="preserve"> giữ chuỗi sống khi một việc lỗi (nếu không, mọi việc sau sẽ không bao giờ chạy). Đếm </w:t>
+      </w:r>
+      <w:r>
+        <w:rPr>
+          <w:rFonts w:ascii="Consolas" w:eastAsia="Consolas" w:hAnsi="Consolas" w:cs="Consolas"/>
+        </w:rPr>
+        <w:t xml:space="preserve">pending</w:t>
+      </w:r>
+      <w:r>
+        <w:t xml:space="preserve"> để biết lúc nào là "đang có lần lưu trên đường đi": lúc đó lần đọc lại danh sách chưa được nhận làm </w:t>
+      </w:r>
+      <w:r>
+        <w:rPr>
+          <w:rFonts w:ascii="Consolas" w:eastAsia="Consolas" w:hAnsi="Consolas" w:cs="Consolas"/>
+        </w:rPr>
+        <w:t xml:space="preserve">base</w:t>
+      </w:r>
+      <w:r>
+        <w:t xml:space="preserve">.</w:t>
+      </w:r>
+    </w:p>
+    <w:p>
+      <w:r>
+        <w:rPr>
+          <w:b/>
+          <w:bCs/>
+        </w:rPr>
+        <w:t xml:space="preserve">So nội dung, không so tham chiếu.</w:t>
+      </w:r>
+      <w:r>
+        <w:t xml:space="preserve"> Sau mỗi lần lưu, máy chủ trả một bản sao sơ đồ (đối tượng khác, khóa có thể khác thứ tự). Nếu trình soạn so </w:t>
+      </w:r>
+      <w:r>
+        <w:rPr>
+          <w:rFonts w:ascii="Consolas" w:eastAsia="Consolas" w:hAnsi="Consolas" w:cs="Consolas"/>
+        </w:rPr>
+        <w:t xml:space="preserve">diagram !== base.diagram</w:t>
+      </w:r>
+      <w:r>
+        <w:t xml:space="preserve">, mọi lần ngừng gõ đều thấy "đã đổi" và lại </w:t>
+      </w:r>
+      <w:r>
+        <w:rPr>
+          <w:rFonts w:ascii="Consolas" w:eastAsia="Consolas" w:hAnsi="Consolas" w:cs="Consolas"/>
+        </w:rPr>
+        <w:t xml:space="preserve">PATCH</w:t>
+      </w:r>
+      <w:r>
+        <w:t xml:space="preserve">. </w:t>
+      </w:r>
+      <w:r>
+        <w:rPr>
+          <w:rFonts w:ascii="Consolas" w:eastAsia="Consolas" w:hAnsi="Consolas" w:cs="Consolas"/>
+        </w:rPr>
+        <w:t xml:space="preserve">sameDiagram</w:t>
+      </w:r>
+      <w:r>
+        <w:t xml:space="preserve"> so từng khối và nối theo trường; tiêu đề so sau khi bỏ khoảng trắng hai đầu, vì máy chủ lưu tiêu đề đã cắt.</w:t>
+      </w:r>
+    </w:p>
+    <w:p>
+      <w:r>
+        <w:rPr>
+          <w:rFonts w:ascii="Consolas" w:eastAsia="Consolas" w:hAnsi="Consolas" w:cs="Consolas"/>
+          <w:b/>
+          <w:bCs/>
+        </w:rPr>
+        <w:t xml:space="preserve">409</w:t>
+      </w:r>
+      <w:r>
+        <w:rPr>
+          <w:b/>
+          <w:bCs/>
+        </w:rPr>
+        <w:t xml:space="preserve">, </w:t>
+      </w:r>
+      <w:r>
+        <w:rPr>
+          <w:rFonts w:ascii="Consolas" w:eastAsia="Consolas" w:hAnsi="Consolas" w:cs="Consolas"/>
+          <w:b/>
+          <w:bCs/>
+        </w:rPr>
+        <w:t xml:space="preserve">404</w:t>
+      </w:r>
+      <w:r>
+        <w:rPr>
+          <w:b/>
+          <w:bCs/>
+        </w:rPr>
+        <w:t xml:space="preserve">, lỗi khác: ba trạng thái, ba lối ra.</w:t>
+      </w:r>
+      <w:r>
+        <w:t xml:space="preserve"> </w:t>
+      </w:r>
+      <w:r>
+        <w:rPr>
+          <w:rFonts w:ascii="Consolas" w:eastAsia="Consolas" w:hAnsi="Consolas" w:cs="Consolas"/>
+        </w:rPr>
+        <w:t xml:space="preserve">SyncNotice</w:t>
+      </w:r>
+      <w:r>
+        <w:t xml:space="preserve"> hiện dòng báo ở đầu trình soạn (cả chữ lẫn sơ đồ; chữ báo khác một câu: "Chữ bạn đang gõ chưa được lưu" và "Thay đổi bạn vừa vẽ chưa được lưu"). Trong lúc </w:t>
+      </w:r>
+      <w:r>
+        <w:rPr>
+          <w:rFonts w:ascii="Consolas" w:eastAsia="Consolas" w:hAnsi="Consolas" w:cs="Consolas"/>
+        </w:rPr>
+        <w:t xml:space="preserve">409</w:t>
+      </w:r>
+      <w:r>
+        <w:t xml:space="preserve"> hoặc </w:t>
+      </w:r>
+      <w:r>
+        <w:rPr>
+          <w:rFonts w:ascii="Consolas" w:eastAsia="Consolas" w:hAnsi="Consolas" w:cs="Consolas"/>
+        </w:rPr>
+        <w:t xml:space="preserve">404</w:t>
+      </w:r>
+      <w:r>
+        <w:t xml:space="preserve">, tự lưu dừng hẳn (</w:t>
+      </w:r>
+      <w:r>
+        <w:rPr>
+          <w:rFonts w:ascii="Consolas" w:eastAsia="Consolas" w:hAnsi="Consolas" w:cs="Consolas"/>
+        </w:rPr>
+        <w:t xml:space="preserve">blocked()</w:t>
+      </w:r>
+      <w:r>
+        <w:t xml:space="preserve">), nhưng nội dung vẫn ở trong ô. "Tải bản mới" đọc lại danh sách và nạp bản máy chủ; "Lưu bản của tôi" đọc lại để lấy </w:t>
+      </w:r>
+      <w:r>
+        <w:rPr>
+          <w:rFonts w:ascii="Consolas" w:eastAsia="Consolas" w:hAnsi="Consolas" w:cs="Consolas"/>
+        </w:rPr>
+        <w:t xml:space="preserve">version</w:t>
+      </w:r>
+      <w:r>
+        <w:t xml:space="preserve"> mới rồi lưu nội dung đang có lên đó (ghi đè có chủ ý, người dùng đã chọn); "Lưu thành ghi chú mới" xóa </w:t>
+      </w:r>
+      <w:r>
+        <w:rPr>
+          <w:rFonts w:ascii="Consolas" w:eastAsia="Consolas" w:hAnsi="Consolas" w:cs="Consolas"/>
+        </w:rPr>
+        <w:t xml:space="preserve">base</w:t>
+      </w:r>
+      <w:r>
+        <w:t xml:space="preserve"> và tạo ghi chú mới từ chữ hoặc sơ đồ đang có. Lỗi mạng hay </w:t>
+      </w:r>
+      <w:r>
+        <w:rPr>
+          <w:rFonts w:ascii="Consolas" w:eastAsia="Consolas" w:hAnsi="Consolas" w:cs="Consolas"/>
+        </w:rPr>
+        <w:t xml:space="preserve">5xx</w:t>
+      </w:r>
+      <w:r>
+        <w:t xml:space="preserve"> chỉ hiện dòng báo, không dừng gì: lần ngừng gõ sau tự thử lại.</w:t>
+      </w:r>
+    </w:p>
+    <w:p>
+      <w:r>
+        <w:rPr>
+          <w:b/>
+          <w:bCs/>
+        </w:rPr>
+        <w:t xml:space="preserve">Một ghi chú đã bị xóa ở nơi khác thì coi như đã xóa.</w:t>
+      </w:r>
+      <w:r>
+        <w:t xml:space="preserve"> </w:t>
+      </w:r>
+      <w:r>
+        <w:rPr>
+          <w:rFonts w:ascii="Consolas" w:eastAsia="Consolas" w:hAnsi="Consolas" w:cs="Consolas"/>
+        </w:rPr>
+        <w:t xml:space="preserve">deleteNote</w:t>
+      </w:r>
+      <w:r>
+        <w:t xml:space="preserve"> trả </w:t>
+      </w:r>
+      <w:r>
+        <w:rPr>
+          <w:rFonts w:ascii="Consolas" w:eastAsia="Consolas" w:hAnsi="Consolas" w:cs="Consolas"/>
+        </w:rPr>
+        <w:t xml:space="preserve">404</w:t>
+      </w:r>
+      <w:r>
+        <w:t xml:space="preserve"> khi ghi chú không còn; nếu hiện "Không xóa được ghi chú" thì người dùng kẹt, vì thử lại cũng </w:t>
+      </w:r>
+      <w:r>
+        <w:rPr>
+          <w:rFonts w:ascii="Consolas" w:eastAsia="Consolas" w:hAnsi="Consolas" w:cs="Consolas"/>
+        </w:rPr>
+        <w:t xml:space="preserve">404</w:t>
+      </w:r>
+      <w:r>
+        <w:t xml:space="preserve"> mãi. </w:t>
+      </w:r>
+      <w:r>
+        <w:rPr>
+          <w:rFonts w:ascii="Consolas" w:eastAsia="Consolas" w:hAnsi="Consolas" w:cs="Consolas"/>
+        </w:rPr>
+        <w:t xml:space="preserve">useDeleteNote</w:t>
+      </w:r>
+      <w:r>
+        <w:t xml:space="preserve"> nuốt đúng </w:t>
+      </w:r>
+      <w:r>
+        <w:rPr>
+          <w:rFonts w:ascii="Consolas" w:eastAsia="Consolas" w:hAnsi="Consolas" w:cs="Consolas"/>
+        </w:rPr>
+        <w:t xml:space="preserve">404</w:t>
+      </w:r>
+      <w:r>
+        <w:t xml:space="preserve"> (và chỉ </w:t>
+      </w:r>
+      <w:r>
+        <w:rPr>
+          <w:rFonts w:ascii="Consolas" w:eastAsia="Consolas" w:hAnsi="Consolas" w:cs="Consolas"/>
+        </w:rPr>
+        <w:t xml:space="preserve">404</w:t>
+      </w:r>
+      <w:r>
+        <w:t xml:space="preserve">) nên màn đi về danh sách như bình thường.</w:t>
+      </w:r>
+    </w:p>
+    <w:p>
+      <w:r>
+        <w:rPr>
+          <w:b/>
+          <w:bCs/>
+        </w:rPr>
+        <w:t xml:space="preserve">Ẩn phần chưa có dữ liệu.</w:t>
+      </w:r>
+      <w:r>
+        <w:t xml:space="preserve"> </w:t>
+      </w:r>
+      <w:r>
+        <w:rPr>
+          <w:rFonts w:ascii="Consolas" w:eastAsia="Consolas" w:hAnsi="Consolas" w:cs="Consolas"/>
+        </w:rPr>
+        <w:t xml:space="preserve">hasAnchoredNotes</w:t>
+      </w:r>
+      <w:r>
+        <w:t xml:space="preserve"> là hàm thuần: chip "Gắn tin nhắn" và dòng nguồn "Ghi chú độc lập" chỉ hiện khi có ít nhất một ghi chú có neo (D-178); </w:t>
+      </w:r>
+      <w:r>
+        <w:rPr>
+          <w:rFonts w:ascii="Consolas" w:eastAsia="Consolas" w:hAnsi="Consolas" w:cs="Consolas"/>
+        </w:rPr>
+        <w:t xml:space="preserve">?filter=linked</w:t>
+      </w:r>
+      <w:r>
+        <w:t xml:space="preserve"> khi chưa có neo hiện tất cả thay vì một danh sách rỗng khó hiểu. "Thêm thao tác" bỏ hẳn khỏi trình soạn chữ, như FE-70 với việc.</w:t>
+      </w:r>
+    </w:p>
+    <w:p>
+      <w:r>
+        <w:rPr>
+          <w:b/>
+          <w:bCs/>
+        </w:rPr>
+        <w:t xml:space="preserve">Hạ tầng test.</w:t>
+      </w:r>
+    </w:p>
+    <w:p>
+      <w:pPr>
+        <w:pStyle w:val="ListParagraph"/>
+        <w:numPr>
+          <w:ilvl w:val="0"/>
+          <w:numId w:val="1"/>
+        </w:numPr>
+      </w:pPr>
+      <w:r>
+        <w:rPr>
+          <w:rFonts w:ascii="Consolas" w:eastAsia="Consolas" w:hAnsi="Consolas" w:cs="Consolas"/>
+        </w:rPr>
+        <w:t xml:space="preserve">notesBackend</w:t>
+      </w:r>
+      <w:r>
+        <w:t xml:space="preserve"> (MSW) giữ ghi chú trong bộ nhớ </w:t>
+      </w:r>
+      <w:r>
+        <w:rPr>
+          <w:b/>
+          <w:bCs/>
+        </w:rPr>
+        <w:t xml:space="preserve">với luật của máy chủ thật</w:t>
+      </w:r>
+      <w:r>
+        <w:t xml:space="preserve">: </w:t>
+      </w:r>
+      <w:r>
+        <w:rPr>
+          <w:rFonts w:ascii="Consolas" w:eastAsia="Consolas" w:hAnsi="Consolas" w:cs="Consolas"/>
+        </w:rPr>
+        <w:t xml:space="preserve">PATCH</w:t>
+      </w:r>
+      <w:r>
+        <w:t xml:space="preserve"> đi với </w:t>
+      </w:r>
+      <w:r>
+        <w:rPr>
+          <w:rFonts w:ascii="Consolas" w:eastAsia="Consolas" w:hAnsi="Consolas" w:cs="Consolas"/>
+        </w:rPr>
+        <w:t xml:space="preserve">version</w:t>
+      </w:r>
+      <w:r>
+        <w:t xml:space="preserve">, cũ hơn thì </w:t>
+      </w:r>
+      <w:r>
+        <w:rPr>
+          <w:rFonts w:ascii="Consolas" w:eastAsia="Consolas" w:hAnsi="Consolas" w:cs="Consolas"/>
+        </w:rPr>
+        <w:t xml:space="preserve">409</w:t>
+      </w:r>
+      <w:r>
+        <w:t xml:space="preserve">, không đổi gì thì giữ </w:t>
+      </w:r>
+      <w:r>
+        <w:rPr>
+          <w:rFonts w:ascii="Consolas" w:eastAsia="Consolas" w:hAnsi="Consolas" w:cs="Consolas"/>
+        </w:rPr>
+        <w:t xml:space="preserve">version</w:t>
+      </w:r>
+      <w:r>
+        <w:t xml:space="preserve">, ghim giữ giờ sửa. Có "tay" để làm như tab khác: </w:t>
+      </w:r>
+      <w:r>
+        <w:rPr>
+          <w:rFonts w:ascii="Consolas" w:eastAsia="Consolas" w:hAnsi="Consolas" w:cs="Consolas"/>
+        </w:rPr>
+        <w:t xml:space="preserve">editElsewhere</w:t>
+      </w:r>
+      <w:r>
+        <w:t xml:space="preserve">, </w:t>
+      </w:r>
+      <w:r>
+        <w:rPr>
+          <w:rFonts w:ascii="Consolas" w:eastAsia="Consolas" w:hAnsi="Consolas" w:cs="Consolas"/>
+        </w:rPr>
+        <w:t xml:space="preserve">removeElsewhere</w:t>
+      </w:r>
+      <w:r>
+        <w:t xml:space="preserve">, </w:t>
+      </w:r>
+      <w:r>
+        <w:rPr>
+          <w:rFonts w:ascii="Consolas" w:eastAsia="Consolas" w:hAnsi="Consolas" w:cs="Consolas"/>
+        </w:rPr>
+        <w:t xml:space="preserve">fail(n)</w:t>
+      </w:r>
+      <w:r>
+        <w:t xml:space="preserve">, </w:t>
+      </w:r>
+      <w:r>
+        <w:rPr>
+          <w:rFonts w:ascii="Consolas" w:eastAsia="Consolas" w:hAnsi="Consolas" w:cs="Consolas"/>
+        </w:rPr>
+        <w:t xml:space="preserve">setDown(true)</w:t>
+      </w:r>
+      <w:r>
+        <w:t xml:space="preserve"> (lỗi mạng), </w:t>
+      </w:r>
+      <w:r>
+        <w:rPr>
+          <w:rFonts w:ascii="Consolas" w:eastAsia="Consolas" w:hAnsi="Consolas" w:cs="Consolas"/>
+        </w:rPr>
+        <w:t xml:space="preserve">slowSaves(ms)</w:t>
+      </w:r>
+      <w:r>
+        <w:t xml:space="preserve"> (để hai lần lưu có thể chồng nhau).</w:t>
+      </w:r>
+    </w:p>
+    <w:p>
+      <w:pPr>
+        <w:pStyle w:val="ListParagraph"/>
+        <w:numPr>
+          <w:ilvl w:val="0"/>
+          <w:numId w:val="1"/>
+        </w:numPr>
+      </w:pPr>
+      <w:r>
+        <w:t xml:space="preserve">Các test cũ (NT-01 đến DG-04) viết trên dữ liệu mẫu, nên dùng </w:t>
+      </w:r>
+      <w:r>
+        <w:rPr>
+          <w:rFonts w:ascii="Consolas" w:eastAsia="Consolas" w:hAnsi="Consolas" w:cs="Consolas"/>
+        </w:rPr>
+        <w:t xml:space="preserve">vi.mock('./notes.api', ...)</w:t>
+      </w:r>
+      <w:r>
+        <w:t xml:space="preserve"> với </w:t>
+      </w:r>
+      <w:r>
+        <w:rPr>
+          <w:rFonts w:ascii="Consolas" w:eastAsia="Consolas" w:hAnsi="Consolas" w:cs="Consolas"/>
+        </w:rPr>
+        <w:t xml:space="preserve">sampleNotesApi</w:t>
+      </w:r>
+      <w:r>
+        <w:t xml:space="preserve">, cùng cách </w:t>
+      </w:r>
+      <w:r>
+        <w:rPr>
+          <w:rFonts w:ascii="Consolas" w:eastAsia="Consolas" w:hAnsi="Consolas" w:cs="Consolas"/>
+        </w:rPr>
+        <w:t xml:space="preserve">sampleTasksApi</w:t>
+      </w:r>
+      <w:r>
+        <w:t xml:space="preserve"> của FE-70. Một test bên ngoài thư mục </w:t>
+      </w:r>
+      <w:r>
+        <w:rPr>
+          <w:rFonts w:ascii="Consolas" w:eastAsia="Consolas" w:hAnsi="Consolas" w:cs="Consolas"/>
+        </w:rPr>
+        <w:t xml:space="preserve">notes</w:t>
+      </w:r>
+      <w:r>
+        <w:t xml:space="preserve"> cũng mở màn Ghi chú thật (</w:t>
+      </w:r>
+      <w:r>
+        <w:rPr>
+          <w:rFonts w:ascii="Consolas" w:eastAsia="Consolas" w:hAnsi="Consolas" w:cs="Consolas"/>
+        </w:rPr>
+        <w:t xml:space="preserve">MobileSubPage.test.tsx</w:t>
+      </w:r>
+      <w:r>
+        <w:t xml:space="preserve">) và phải mock tương tự: lỗi hiện ra là "Requests without an MSW handler: GET /api/notes".</w:t>
+      </w:r>
+    </w:p>
+    <w:p>
+      <w:pPr>
+        <w:pStyle w:val="ListParagraph"/>
+        <w:numPr>
+          <w:ilvl w:val="0"/>
+          <w:numId w:val="1"/>
+        </w:numPr>
+      </w:pPr>
+      <w:r>
+        <w:t xml:space="preserve">Đọc lại danh sách trong test: </w:t>
+      </w:r>
+      <w:r>
+        <w:rPr>
+          <w:rFonts w:ascii="Consolas" w:eastAsia="Consolas" w:hAnsi="Consolas" w:cs="Consolas"/>
+        </w:rPr>
+        <w:t xml:space="preserve">await act(() =&gt; queryClient.invalidateQueries({ queryKey: NOTES_QUERY_KEY }))</w:t>
+      </w:r>
+      <w:r>
+        <w:t xml:space="preserve">.</w:t>
+      </w:r>
+    </w:p>
+    <w:p>
+      <w:r>
+        <w:rPr>
+          <w:b/>
+          <w:bCs/>
+        </w:rPr>
+        <w:t xml:space="preserve">Câu gợi ý của task: "khi danh sách đọc lại trong lúc đang gõ, ô soạn nên tin bản nào, và vì sao?"</w:t>
+      </w:r>
+      <w:r>
+        <w:t xml:space="preserve"> Tin </w:t>
+      </w:r>
+      <w:r>
+        <w:rPr>
+          <w:b/>
+          <w:bCs/>
+        </w:rPr>
+        <w:t xml:space="preserve">chữ của chính nó</w:t>
+      </w:r>
+      <w:r>
+        <w:t xml:space="preserve"> và </w:t>
+      </w:r>
+      <w:r>
+        <w:rPr>
+          <w:rFonts w:ascii="Consolas" w:eastAsia="Consolas" w:hAnsi="Consolas" w:cs="Consolas"/>
+          <w:b/>
+          <w:bCs/>
+        </w:rPr>
+        <w:t xml:space="preserve">base</w:t>
+      </w:r>
+      <w:r>
+        <w:rPr>
+          <w:b/>
+          <w:bCs/>
+        </w:rPr>
+        <w:t xml:space="preserve"> của chính nó</w:t>
+      </w:r>
+      <w:r>
+        <w:t xml:space="preserve">, không tin danh sách. Danh sách chỉ nói "máy chủ đang có gì"; ô soạn cần biết "tôi xuất phát từ đâu". Khi hai điều đó khác nhau mà còn chữ chưa lưu thì đó chính là xung đột, và chỉ máy chủ (bằng </w:t>
+      </w:r>
+      <w:r>
+        <w:rPr>
+          <w:rFonts w:ascii="Consolas" w:eastAsia="Consolas" w:hAnsi="Consolas" w:cs="Consolas"/>
+        </w:rPr>
+        <w:t xml:space="preserve">409</w:t>
+      </w:r>
+      <w:r>
+        <w:t xml:space="preserve">) hay người dùng (bằng hai nút) mới có quyền quyết ai thắng.</w:t>
+      </w:r>
+    </w:p>
+    <w:p>
+      <w:r>
+        <w:rPr>
+          <w:b/>
+          <w:bCs/>
+        </w:rPr>
+        <w:t xml:space="preserve">Bẫy khi chạy trình duyệt thật.</w:t>
+      </w:r>
+    </w:p>
+    <w:p>
+      <w:pPr>
+        <w:pStyle w:val="ListParagraph"/>
+        <w:numPr>
+          <w:ilvl w:val="0"/>
+          <w:numId w:val="1"/>
+        </w:numPr>
+      </w:pPr>
+      <w:r>
+        <w:t xml:space="preserve">Chuyển sang tab khác rồi quay lại kích hoạt đọc lại danh sách, và trình soạn không còn gì chưa lưu sẽ nhận bản mới: đúng ý, nhưng nghĩa là muốn thấy </w:t>
+      </w:r>
+      <w:r>
+        <w:rPr>
+          <w:rFonts w:ascii="Consolas" w:eastAsia="Consolas" w:hAnsi="Consolas" w:cs="Consolas"/>
+        </w:rPr>
+        <w:t xml:space="preserve">409</w:t>
+      </w:r>
+      <w:r>
+        <w:t xml:space="preserve"> thì phải để máy chủ đổi </w:t>
+      </w:r>
+      <w:r>
+        <w:rPr>
+          <w:b/>
+          <w:bCs/>
+        </w:rPr>
+        <w:t xml:space="preserve">sau</w:t>
+      </w:r>
+      <w:r>
+        <w:t xml:space="preserve"> khi tab này đã đọc xong và </w:t>
+      </w:r>
+      <w:r>
+        <w:rPr>
+          <w:b/>
+          <w:bCs/>
+        </w:rPr>
+        <w:t xml:space="preserve">trước</w:t>
+      </w:r>
+      <w:r>
+        <w:t xml:space="preserve"> khi nó lưu. Cách làm: </w:t>
+      </w:r>
+      <w:r>
+        <w:rPr>
+          <w:rFonts w:ascii="Consolas" w:eastAsia="Consolas" w:hAnsi="Consolas" w:cs="Consolas"/>
+        </w:rPr>
+        <w:t xml:space="preserve">fetch</w:t>
+      </w:r>
+      <w:r>
+        <w:t xml:space="preserve"> một </w:t>
+      </w:r>
+      <w:r>
+        <w:rPr>
+          <w:rFonts w:ascii="Consolas" w:eastAsia="Consolas" w:hAnsi="Consolas" w:cs="Consolas"/>
+        </w:rPr>
+        <w:t xml:space="preserve">PATCH</w:t>
+      </w:r>
+      <w:r>
+        <w:t xml:space="preserve"> từ chính trang (có token </w:t>
+      </w:r>
+      <w:r>
+        <w:rPr>
+          <w:rFonts w:ascii="Consolas" w:eastAsia="Consolas" w:hAnsi="Consolas" w:cs="Consolas"/>
+        </w:rPr>
+        <w:t xml:space="preserve">X-XSRF-TOKEN</w:t>
+      </w:r>
+      <w:r>
+        <w:t xml:space="preserve"> đọc từ cookie) rồi gõ vào ô.</w:t>
+      </w:r>
+    </w:p>
+    <w:p>
+      <w:pPr>
+        <w:pStyle w:val="ListParagraph"/>
+        <w:numPr>
+          <w:ilvl w:val="0"/>
+          <w:numId w:val="1"/>
+        </w:numPr>
+      </w:pPr>
+      <w:r>
+        <w:t xml:space="preserve">Nếu ngăn trình duyệt của ứng dụng bị ẩn, thao tác bấm báo "không vẽ được trang"; thử lại, hoặc nhờ người dùng đưa ngăn đó lên.</w:t>
+      </w:r>
+    </w:p>
+    <w:p>
+      <w:pPr>
+        <w:pStyle w:val="ListParagraph"/>
+        <w:numPr>
+          <w:ilvl w:val="0"/>
+          <w:numId w:val="1"/>
+        </w:numPr>
+      </w:pPr>
+      <w:r>
+        <w:t xml:space="preserve">Backend thử dùng </w:t>
+      </w:r>
+      <w:r>
+        <w:rPr>
+          <w:rFonts w:ascii="Consolas" w:eastAsia="Consolas" w:hAnsi="Consolas" w:cs="Consolas"/>
+        </w:rPr>
+        <w:t xml:space="preserve">./mvnw spring-boot:test-run -Dspring-boot.run.arguments=--server.port=18080</w:t>
+      </w:r>
+      <w:r>
+        <w:t xml:space="preserve"> (PostgreSQL tạm bằng Testcontainers, hồ sơ </w:t>
+      </w:r>
+      <w:r>
+        <w:rPr>
+          <w:rFonts w:ascii="Consolas" w:eastAsia="Consolas" w:hAnsi="Consolas" w:cs="Consolas"/>
+        </w:rPr>
+        <w:t xml:space="preserve">test</w:t>
+      </w:r>
+      <w:r>
+        <w:t xml:space="preserve"> có sẵn tài khoản thử) và Vite chạy bằng một cấu hình tạm đổi cổng và địa chỉ proxy, nên không đụng backend trên cổng 8080 của người dùng.</w:t>
+      </w:r>
+    </w:p>
+    <w:p>
+      <w:r>
+        <w:rPr>
+          <w:b/>
+          <w:bCs/>
+        </w:rPr>
+        <w:t xml:space="preserve">Kiểm chứng (FE-90).</w:t>
+      </w:r>
+    </w:p>
+    <w:p>
+      <w:pPr>
+        <w:pStyle w:val="ListParagraph"/>
+        <w:numPr>
+          <w:ilvl w:val="0"/>
+          <w:numId w:val="1"/>
+        </w:numPr>
+      </w:pPr>
+      <w:r>
+        <w:t xml:space="preserve">ĐỎ đúng lý do: viết trước 41 test mới, chạy khi chưa có cài đặt: 39 đỏ (adapter 7, </w:t>
+      </w:r>
+      <w:r>
+        <w:rPr>
+          <w:rFonts w:ascii="Consolas" w:eastAsia="Consolas" w:hAnsi="Consolas" w:cs="Consolas"/>
+        </w:rPr>
+        <w:t xml:space="preserve">sameDiagram</w:t>
+      </w:r>
+      <w:r>
+        <w:t xml:space="preserve"> 4, </w:t>
+      </w:r>
+      <w:r>
+        <w:rPr>
+          <w:rFonts w:ascii="Consolas" w:eastAsia="Consolas" w:hAnsi="Consolas" w:cs="Consolas"/>
+        </w:rPr>
+        <w:t xml:space="preserve">hasAnchoredNotes</w:t>
+      </w:r>
+      <w:r>
+        <w:t xml:space="preserve"> 2, màn trên API 26), 2 xanh sẵn (chúng kiểm điều chưa từng xảy ra, như "không gọi API khi chữ trống"); 81 test cũ vẫn xanh nhờ mock dữ liệu mẫu.</w:t>
+      </w:r>
+    </w:p>
+    <w:p>
+      <w:pPr>
+        <w:pStyle w:val="ListParagraph"/>
+        <w:numPr>
+          <w:ilvl w:val="0"/>
+          <w:numId w:val="1"/>
+        </w:numPr>
+      </w:pPr>
+      <w:r>
+        <w:t xml:space="preserve">XANH: thư mục </w:t>
+      </w:r>
+      <w:r>
+        <w:rPr>
+          <w:rFonts w:ascii="Consolas" w:eastAsia="Consolas" w:hAnsi="Consolas" w:cs="Consolas"/>
+        </w:rPr>
+        <w:t xml:space="preserve">notes</w:t>
+      </w:r>
+      <w:r>
+        <w:t xml:space="preserve"> 122/122 (11 file). Cả dự án: 998 test, 994 xanh và 4 đỏ ngoài phạm vi: </w:t>
+      </w:r>
+      <w:r>
+        <w:rPr>
+          <w:rFonts w:ascii="Consolas" w:eastAsia="Consolas" w:hAnsi="Consolas" w:cs="Consolas"/>
+        </w:rPr>
+        <w:t xml:space="preserve">client.test.ts</w:t>
+      </w:r>
+      <w:r>
+        <w:t xml:space="preserve"> (2) và </w:t>
+      </w:r>
+      <w:r>
+        <w:rPr>
+          <w:rFonts w:ascii="Consolas" w:eastAsia="Consolas" w:hAnsi="Consolas" w:cs="Consolas"/>
+        </w:rPr>
+        <w:t xml:space="preserve">useStickers.test.tsx</w:t>
+      </w:r>
+      <w:r>
+        <w:t xml:space="preserve"> (1) về tải tệp multipart (cũng đỏ trên bản không có thay đổi của mình, trong thư mục dùng chung), và </w:t>
+      </w:r>
+      <w:r>
+        <w:rPr>
+          <w:rFonts w:ascii="Consolas" w:eastAsia="Consolas" w:hAnsi="Consolas" w:cs="Consolas"/>
+        </w:rPr>
+        <w:t xml:space="preserve">useShellData.test.tsx</w:t>
+      </w:r>
+      <w:r>
+        <w:t xml:space="preserve"> (1) so hai </w:t>
+      </w:r>
+      <w:r>
+        <w:rPr>
+          <w:rFonts w:ascii="Consolas" w:eastAsia="Consolas" w:hAnsi="Consolas" w:cs="Consolas"/>
+        </w:rPr>
+        <w:t xml:space="preserve">new Date()</w:t>
+      </w:r>
+      <w:r>
+        <w:t xml:space="preserve"> lệch 1 ms (chạy riêng 7/7 xanh).</w:t>
+      </w:r>
+    </w:p>
+    <w:p>
+      <w:pPr>
+        <w:pStyle w:val="ListParagraph"/>
+        <w:numPr>
+          <w:ilvl w:val="0"/>
+          <w:numId w:val="1"/>
+        </w:numPr>
+      </w:pPr>
+      <w:r>
+        <w:rPr>
+          <w:rFonts w:ascii="Consolas" w:eastAsia="Consolas" w:hAnsi="Consolas" w:cs="Consolas"/>
+        </w:rPr>
+        <w:t xml:space="preserve">pnpm lint</w:t>
+      </w:r>
+      <w:r>
+        <w:t xml:space="preserve">: 0 lỗi, 2 cảnh báo có sẵn ở </w:t>
+      </w:r>
+      <w:r>
+        <w:rPr>
+          <w:rFonts w:ascii="Consolas" w:eastAsia="Consolas" w:hAnsi="Consolas" w:cs="Consolas"/>
+        </w:rPr>
+        <w:t xml:space="preserve">features/public/*</w:t>
+      </w:r>
+      <w:r>
+        <w:t xml:space="preserve"> (không đụng); </w:t>
+      </w:r>
+      <w:r>
+        <w:rPr>
+          <w:rFonts w:ascii="Consolas" w:eastAsia="Consolas" w:hAnsi="Consolas" w:cs="Consolas"/>
+        </w:rPr>
+        <w:t xml:space="preserve">tsc -b</w:t>
+      </w:r>
+      <w:r>
+        <w:t xml:space="preserve"> 0; </w:t>
+      </w:r>
+      <w:r>
+        <w:rPr>
+          <w:rFonts w:ascii="Consolas" w:eastAsia="Consolas" w:hAnsi="Consolas" w:cs="Consolas"/>
+        </w:rPr>
+        <w:t xml:space="preserve">pnpm build</w:t>
+      </w:r>
+      <w:r>
+        <w:t xml:space="preserve"> thành công.</w:t>
+      </w:r>
+    </w:p>
+    <w:p>
+      <w:pPr>
+        <w:pStyle w:val="ListParagraph"/>
+        <w:numPr>
+          <w:ilvl w:val="0"/>
+          <w:numId w:val="1"/>
+        </w:numPr>
+      </w:pPr>
+      <w:r>
+        <w:t xml:space="preserve">Gài lỗi (một lần, cho logic lưu): 10 lỗi, cả 10 làm đỏ đúng test của chúng: nhận bản mới của danh sách dù còn chữ chưa lưu, bỏ hàng đợi, </w:t>
+      </w:r>
+      <w:r>
+        <w:rPr>
+          <w:rFonts w:ascii="Consolas" w:eastAsia="Consolas" w:hAnsi="Consolas" w:cs="Consolas"/>
+        </w:rPr>
+        <w:t xml:space="preserve">409</w:t>
+      </w:r>
+      <w:r>
+        <w:t xml:space="preserve"> không thành "xung đột", không bao giờ chặn, không đổi </w:t>
+      </w:r>
+      <w:r>
+        <w:rPr>
+          <w:rFonts w:ascii="Consolas" w:eastAsia="Consolas" w:hAnsi="Consolas" w:cs="Consolas"/>
+        </w:rPr>
+        <w:t xml:space="preserve">base</w:t>
+      </w:r>
+      <w:r>
+        <w:t xml:space="preserve"> sau khi lưu, "Lưu bản của tôi" không lấy </w:t>
+      </w:r>
+      <w:r>
+        <w:rPr>
+          <w:rFonts w:ascii="Consolas" w:eastAsia="Consolas" w:hAnsi="Consolas" w:cs="Consolas"/>
+        </w:rPr>
+        <w:t xml:space="preserve">version</w:t>
+      </w:r>
+      <w:r>
+        <w:t xml:space="preserve"> mới, </w:t>
+      </w:r>
+      <w:r>
+        <w:rPr>
+          <w:rFonts w:ascii="Consolas" w:eastAsia="Consolas" w:hAnsi="Consolas" w:cs="Consolas"/>
+        </w:rPr>
+        <w:t xml:space="preserve">hasAnchoredNotes</w:t>
+      </w:r>
+      <w:r>
+        <w:t xml:space="preserve"> luôn đúng, xóa </w:t>
+      </w:r>
+      <w:r>
+        <w:rPr>
+          <w:rFonts w:ascii="Consolas" w:eastAsia="Consolas" w:hAnsi="Consolas" w:cs="Consolas"/>
+        </w:rPr>
+        <w:t xml:space="preserve">404</w:t>
+      </w:r>
+      <w:r>
+        <w:t xml:space="preserve"> bị coi là lỗi, </w:t>
+      </w:r>
+      <w:r>
+        <w:rPr>
+          <w:rFonts w:ascii="Consolas" w:eastAsia="Consolas" w:hAnsi="Consolas" w:cs="Consolas"/>
+        </w:rPr>
+        <w:t xml:space="preserve">sameDiagram</w:t>
+      </w:r>
+      <w:r>
+        <w:t xml:space="preserve"> bỏ qua nhãn nối, </w:t>
+      </w:r>
+      <w:r>
+        <w:rPr>
+          <w:rFonts w:ascii="Consolas" w:eastAsia="Consolas" w:hAnsi="Consolas" w:cs="Consolas"/>
+        </w:rPr>
+        <w:t xml:space="preserve">saveNote</w:t>
+      </w:r>
+      <w:r>
+        <w:t xml:space="preserve"> quên gửi </w:t>
+      </w:r>
+      <w:r>
+        <w:rPr>
+          <w:rFonts w:ascii="Consolas" w:eastAsia="Consolas" w:hAnsi="Consolas" w:cs="Consolas"/>
+        </w:rPr>
+        <w:t xml:space="preserve">version</w:t>
+      </w:r>
+      <w:r>
+        <w:t xml:space="preserve">.</w:t>
+      </w:r>
+    </w:p>
+    <w:p>
+      <w:pPr>
+        <w:pStyle w:val="ListParagraph"/>
+        <w:numPr>
+          <w:ilvl w:val="0"/>
+          <w:numId w:val="1"/>
+        </w:numPr>
+      </w:pPr>
+      <w:r>
+        <w:t xml:space="preserve">Chrome thật (backend </w:t>
+      </w:r>
+      <w:r>
+        <w:rPr>
+          <w:rFonts w:ascii="Consolas" w:eastAsia="Consolas" w:hAnsi="Consolas" w:cs="Consolas"/>
+        </w:rPr>
+        <w:t xml:space="preserve">test-run</w:t>
+      </w:r>
+      <w:r>
+        <w:t xml:space="preserve"> cổng 18080, 1440 và 375): tạo ghi chú chữ rồi tải lại vẫn còn; sửa từ tab khác rồi quay lại tab này (không còn chữ chưa lưu) thì ô soạn nhận chữ mới; </w:t>
+      </w:r>
+      <w:r>
+        <w:rPr>
+          <w:rFonts w:ascii="Consolas" w:eastAsia="Consolas" w:hAnsi="Consolas" w:cs="Consolas"/>
+        </w:rPr>
+        <w:t xml:space="preserve">PATCH</w:t>
+      </w:r>
+      <w:r>
+        <w:t xml:space="preserve"> từ ngoài trang rồi gõ thêm: dòng báo đúng chữ, hai nút, chữ đang gõ còn nguyên, máy chủ chưa bị ghi đè (version 2 vẫn là bản của "điện thoại"); "Lưu bản của tôi" cho version 3 chứa chữ của tab này và dòng báo biến mất; sơ đồ tạo ở thay đổi đầu tiên, tải lại thấy đủ khối, thẻ "Sơ đồ · 2 khối · 0 nối", ghim (version 2, chip "Đã ghim · 1"), xóa về </w:t>
+      </w:r>
+      <w:r>
+        <w:rPr>
+          <w:rFonts w:ascii="Consolas" w:eastAsia="Consolas" w:hAnsi="Consolas" w:cs="Consolas"/>
+        </w:rPr>
+        <w:t xml:space="preserve">/notes</w:t>
+      </w:r>
+      <w:r>
+        <w:t xml:space="preserve">; ở 375 dòng báo nằm gọn một khối trên trang với hai nút; chip chỉ có "Tất cả", "Đã ghim", "Sơ đồ" và thẻ không có "Ghi chú độc lập"; console chỉ có </w:t>
+      </w:r>
+      <w:r>
+        <w:rPr>
+          <w:rFonts w:ascii="Consolas" w:eastAsia="Consolas" w:hAnsi="Consolas" w:cs="Consolas"/>
+        </w:rPr>
+        <w:t xml:space="preserve">401</w:t>
+      </w:r>
+      <w:r>
+        <w:t xml:space="preserve"> trước khi đăng nhập và </w:t>
+      </w:r>
+      <w:r>
+        <w:rPr>
+          <w:rFonts w:ascii="Consolas" w:eastAsia="Consolas" w:hAnsi="Consolas" w:cs="Consolas"/>
+        </w:rPr>
+        <w:t xml:space="preserve">409</w:t>
+      </w:r>
+      <w:r>
+        <w:t xml:space="preserve"> do chính mình gây ra.</w:t>
+      </w:r>
+    </w:p>
+    <w:p>
+      <w:pPr>
+        <w:pStyle w:val="ListParagraph"/>
+        <w:numPr>
+          <w:ilvl w:val="0"/>
+          <w:numId w:val="1"/>
+        </w:numPr>
+      </w:pPr>
+      <w:r>
+        <w:rPr>
+          <w:rFonts w:ascii="Consolas" w:eastAsia="Consolas" w:hAnsi="Consolas" w:cs="Consolas"/>
+        </w:rPr>
+        <w:t xml:space="preserve">NOT VERIFIED</w:t>
+      </w:r>
+      <w:r>
+        <w:t xml:space="preserve">: kéo và nối khối, nhấn giữ trên cảm ứng thật (như DG-04); "Tải bản mới", </w:t>
+      </w:r>
+      <w:r>
+        <w:rPr>
+          <w:rFonts w:ascii="Consolas" w:eastAsia="Consolas" w:hAnsi="Consolas" w:cs="Consolas"/>
+        </w:rPr>
+        <w:t xml:space="preserve">404</w:t>
+      </w:r>
+      <w:r>
+        <w:t xml:space="preserve"> ("Lưu thành ghi chú mới") và lỗi mạng chỉ kiểm bằng test jsdom, chưa trên Chrome thật; 2 thiết bị thật; mọi cỡ màn × 2 theme (để dành cho nghiệm thu).</w:t>
+      </w:r>
+    </w:p>
+    <w:p>
+      <w:pPr>
+        <w:pStyle w:val="ListParagraph"/>
+        <w:numPr>
+          <w:ilvl w:val="0"/>
+          <w:numId w:val="1"/>
+        </w:numPr>
+      </w:pPr>
+      <w:r>
+        <w:t xml:space="preserve">Hạn chế đã biết: rời trình soạn khi dòng báo xung đột còn đó thì chữ chưa lưu mất (dòng báo đã nói "chưa được lưu", nhưng không có hộp hỏi khi rời).</w:t>
       </w:r>
     </w:p>
     <w:p/>

</xml_diff>